<commit_message>
RATIONALE: final submission revision
Restructured per Aman's edited draft: executive summary, time spent
(~4h), expanded judge-validation and lexical-metrics sections, run
history renumbered 1-11 including rejudges and cite baseline, residual
failures and lessons rewritten, extensions now include human-judge
inter-annotator agreement and APO/AlphaEvolve comparison. Docx export
regenerated in sync.

Co-Authored-By: Claude Fable 5 <noreply@anthropic.com>
</commit_message>
<xml_diff>
--- a/RATIONALE.docx
+++ b/RATIONALE.docx
@@ -6,11 +6,51 @@
       <w:pPr>
         <w:pStyle w:val="Heading1"/>
       </w:pPr>
-      <w:bookmarkStart w:id="20" w:name="design-rationale"/>
+      <w:bookmarkStart w:id="20" w:name="Xa5149350a05f1d6153f696465f148c53f3642d4"/>
+      <w:r>
+        <w:t xml:space="preserve">Rationale • Prompt Engineering Take-Home Assignment</w:t>
+      </w:r>
+      <w:bookmarkEnd w:id="20"/>
+    </w:p>
+    <w:p>
+      <w:pPr>
+        <w:pStyle w:val="FirstParagraph"/>
+      </w:pPr>
+      <w:hyperlink r:id="rId21">
+        <w:r>
+          <w:rPr>
+            <w:rStyle w:val="Hyperlink"/>
+          </w:rPr>
+          <w:t xml:space="preserve">wiki-chatbot-pi.vercel.app</w:t>
+        </w:r>
+      </w:hyperlink>
+      <w:r>
+        <w:t xml:space="preserve"> </w:t>
+      </w:r>
+      <w:r>
+        <w:t xml:space="preserve">•</w:t>
+      </w:r>
+      <w:r>
+        <w:t xml:space="preserve"> </w:t>
+      </w:r>
+      <w:hyperlink r:id="rId22">
+        <w:r>
+          <w:rPr>
+            <w:rStyle w:val="Hyperlink"/>
+          </w:rPr>
+          <w:t xml:space="preserve">github.com/amanchadha/wiki-chatbot</w:t>
+        </w:r>
+      </w:hyperlink>
+    </w:p>
+    <w:p>
+      <w:pPr>
+        <w:pStyle w:val="Heading1"/>
+      </w:pPr>
+      <w:bookmarkStart w:id="23" w:name="design-rationale"/>
       <w:r>
         <w:t xml:space="preserve">Design Rationale</w:t>
       </w:r>
-      <w:bookmarkEnd w:id="20"/>
+      <w:bookmarkEnd w:id="23"/>
     </w:p>
     <w:p>
       <w:pPr>
@@ -20,31 +60,31 @@
         <w:rPr>
           <w:b/>
         </w:rPr>
-        <w:t xml:space="preserve">Approach in one line:</w:t>
-      </w:r>
-      <w:r>
-        <w:t xml:space="preserve"> </w:t>
-      </w:r>
-      <w:r>
-        <w:t xml:space="preserve">treat this as loop engineering, not prompt</w:t>
-      </w:r>
-      <w:r>
-        <w:t xml:space="preserve"> </w:t>
-      </w:r>
-      <w:r>
-        <w:t xml:space="preserve">authoring — build a deliberately simple v0, build an eval that decomposes</w:t>
-      </w:r>
-      <w:r>
-        <w:t xml:space="preserve"> </w:t>
-      </w:r>
-      <w:r>
-        <w:t xml:space="preserve">failures into decision → retrieval → generation stages, and let clustered</w:t>
-      </w:r>
-      <w:r>
-        <w:t xml:space="preserve"> </w:t>
-      </w:r>
-      <w:r>
-        <w:t xml:space="preserve">eval failures pick every iteration target.</w:t>
+        <w:t xml:space="preserve">Executive summary:</w:t>
+      </w:r>
+      <w:r>
+        <w:t xml:space="preserve"> </w:t>
+      </w:r>
+      <w:r>
+        <w:t xml:space="preserve">We use loop engineering to set up an eval-driven loop.</w:t>
+      </w:r>
+      <w:r>
+        <w:t xml:space="preserve"> </w:t>
+      </w:r>
+      <w:r>
+        <w:t xml:space="preserve">Start with a deliberately simple v0, build an eval that decomposes failures</w:t>
+      </w:r>
+      <w:r>
+        <w:t xml:space="preserve"> </w:t>
+      </w:r>
+      <w:r>
+        <w:t xml:space="preserve">into decision → retrieval → generation stages, and let clustered eval</w:t>
+      </w:r>
+      <w:r>
+        <w:t xml:space="preserve"> </w:t>
+      </w:r>
+      <w:r>
+        <w:t xml:space="preserve">failures pick every iteration target in a data-driven way.</w:t>
       </w:r>
     </w:p>
     <w:p>
@@ -61,16 +101,7 @@
         <w:t xml:space="preserve"> </w:t>
       </w:r>
       <w:r>
-        <w:t xml:space="preserve">~[X] hours.</w:t>
-      </w:r>
-      <w:r>
-        <w:t xml:space="preserve"> </w:t>
-      </w:r>
-      <w:r>
-        <w:rPr>
-          <w:i/>
-        </w:rPr>
-        <w:t xml:space="preserve">(fill in before submission)</w:t>
+        <w:t xml:space="preserve">~4 hours.</w:t>
       </w:r>
     </w:p>
     <w:p>
@@ -121,34 +152,21 @@
       </w:r>
     </w:p>
     <w:p>
-      <w:r>
-        <w:pict>
-          <v:rect style="width:0;height:1.5pt" o:hralign="center" o:hrstd="t" o:hr="t"/>
-        </w:pict>
-      </w:r>
-    </w:p>
-    <w:p>
       <w:pPr>
         <w:pStyle w:val="Heading2"/>
       </w:pPr>
-      <w:bookmarkStart w:id="21" w:name="prompt-engineering-approach"/>
+      <w:bookmarkStart w:id="24" w:name="prompt-engineering-approach"/>
       <w:r>
         <w:t xml:space="preserve">1. Prompt-engineering approach</w:t>
       </w:r>
-      <w:bookmarkEnd w:id="21"/>
+      <w:bookmarkEnd w:id="24"/>
     </w:p>
     <w:p>
       <w:pPr>
         <w:pStyle w:val="FirstParagraph"/>
       </w:pPr>
       <w:r>
-        <w:t xml:space="preserve">The system prompt was never hand-tuned in the abstract; every change is a</w:t>
-      </w:r>
-      <w:r>
-        <w:t xml:space="preserve"> </w:t>
-      </w:r>
-      <w:r>
-        <w:t xml:space="preserve">diff to</w:t>
+        <w:t xml:space="preserve">The prompt was not tuned based on intuition alone. Every change to</w:t>
       </w:r>
       <w:r>
         <w:t xml:space="preserve"> </w:t>
@@ -163,13 +181,21 @@
         <w:t xml:space="preserve"> </w:t>
       </w:r>
       <w:r>
-        <w:t xml:space="preserve">motivated by a clustered eval failure, tagged with a</w:t>
-      </w:r>
-      <w:r>
-        <w:t xml:space="preserve"> </w:t>
-      </w:r>
-      <w:r>
-        <w:t xml:space="preserve">version, and verified by rerunning the suite. Key design decisions:</w:t>
+        <w:t xml:space="preserve">addressed a recurring failure identified by the evals, was</w:t>
+      </w:r>
+      <w:r>
+        <w:t xml:space="preserve"> </w:t>
+      </w:r>
+      <w:r>
+        <w:t xml:space="preserve">assigned a version, and was validated by rerunning the same suite.</w:t>
+      </w:r>
+    </w:p>
+    <w:p>
+      <w:pPr>
+        <w:pStyle w:val="BodyText"/>
+      </w:pPr>
+      <w:r>
+        <w:t xml:space="preserve">Key iterations:</w:t>
       </w:r>
     </w:p>
     <w:p>
@@ -184,13 +210,19 @@
         <w:rPr>
           <w:b/>
         </w:rPr>
-        <w:t xml:space="preserve">v0 was intentionally minimal</w:t>
-      </w:r>
-      <w:r>
-        <w:t xml:space="preserve"> </w:t>
-      </w:r>
-      <w:r>
-        <w:t xml:space="preserve">—</w:t>
+        <w:t xml:space="preserve">v0 established the baseline:</w:t>
+      </w:r>
+      <w:r>
+        <w:t xml:space="preserve"> </w:t>
+      </w:r>
+      <w:r>
+        <w:t xml:space="preserve">The initial prompt was intentionally</w:t>
+      </w:r>
+      <w:r>
+        <w:t xml:space="preserve"> </w:t>
+      </w:r>
+      <w:r>
+        <w:t xml:space="preserve">minimal:</w:t>
       </w:r>
       <w:r>
         <w:t xml:space="preserve"> </w:t>
@@ -199,7 +231,7 @@
         <w:t xml:space="preserve">“</w:t>
       </w:r>
       <w:r>
-        <w:t xml:space="preserve">search when you’re not certain</w:t>
+        <w:t xml:space="preserve">Search when you’re not certain.</w:t>
       </w:r>
       <w:r>
         <w:t xml:space="preserve">”</w:t>
@@ -208,61 +240,31 @@
         <w:t xml:space="preserve"> </w:t>
       </w:r>
       <w:r>
-        <w:t xml:space="preserve">— to</w:t>
-      </w:r>
-      <w:r>
-        <w:t xml:space="preserve"> </w:t>
-      </w:r>
-      <w:r>
-        <w:t xml:space="preserve">measure the model’s native calibration rather than assume it’s broken.</w:t>
-      </w:r>
-      <w:r>
-        <w:t xml:space="preserve"> </w:t>
-      </w:r>
-      <w:r>
-        <w:t xml:space="preserve">The baseline proved it</w:t>
-      </w:r>
-      <w:r>
-        <w:t xml:space="preserve"> </w:t>
-      </w:r>
-      <w:r>
-        <w:rPr>
-          <w:i/>
-        </w:rPr>
-        <w:t xml:space="preserve">is</w:t>
-      </w:r>
-      <w:r>
-        <w:t xml:space="preserve"> </w:t>
-      </w:r>
-      <w:r>
-        <w:t xml:space="preserve">broken in a specific way: Opus 4.8’s</w:t>
-      </w:r>
-      <w:r>
-        <w:t xml:space="preserve"> </w:t>
-      </w:r>
-      <w:r>
-        <w:rPr>
-          <w:i/>
-        </w:rPr>
-        <w:t xml:space="preserve">confidence</w:t>
-      </w:r>
-      <w:r>
-        <w:t xml:space="preserve"> </w:t>
-      </w:r>
-      <w:r>
-        <w:t xml:space="preserve">is miscalibrated on volatile/specific facts (it felt certain</w:t>
-      </w:r>
-      <w:r>
-        <w:t xml:space="preserve"> </w:t>
-      </w:r>
-      <w:r>
-        <w:t xml:space="preserve">about a stale Saturn moon count, and about a Mercury Records founder it</w:t>
-      </w:r>
-      <w:r>
-        <w:t xml:space="preserve"> </w:t>
-      </w:r>
-      <w:r>
-        <w:t xml:space="preserve">had wrong).</w:t>
+        <w:t xml:space="preserve">This tested whether the model</w:t>
+      </w:r>
+      <w:r>
+        <w:t xml:space="preserve"> </w:t>
+      </w:r>
+      <w:r>
+        <w:t xml:space="preserve">could reliably judge its own knowledge. It could not. Opus 4.8 confidently</w:t>
+      </w:r>
+      <w:r>
+        <w:t xml:space="preserve"> </w:t>
+      </w:r>
+      <w:r>
+        <w:t xml:space="preserve">answered volatile or highly specific questions incorrectly, including</w:t>
+      </w:r>
+      <w:r>
+        <w:t xml:space="preserve"> </w:t>
+      </w:r>
+      <w:r>
+        <w:t xml:space="preserve">using an outdated Saturn moon count and naming the wrong Mercury Records</w:t>
+      </w:r>
+      <w:r>
+        <w:t xml:space="preserve"> </w:t>
+      </w:r>
+      <w:r>
+        <w:t xml:space="preserve">founder.</w:t>
       </w:r>
     </w:p>
     <w:p>
@@ -277,104 +279,43 @@
         <w:rPr>
           <w:b/>
         </w:rPr>
-        <w:t xml:space="preserve">v1 keyed the search decision on the</w:t>
-      </w:r>
-      <w:r>
-        <w:rPr>
-          <w:b/>
-        </w:rPr>
-        <w:t xml:space="preserve"> </w:t>
-      </w:r>
-      <w:r>
-        <w:rPr>
-          <w:i/>
-          <w:b/>
-        </w:rPr>
-        <w:t xml:space="preserve">kind</w:t>
-      </w:r>
-      <w:r>
-        <w:rPr>
-          <w:b/>
-        </w:rPr>
-        <w:t xml:space="preserve"> </w:t>
-      </w:r>
-      <w:r>
-        <w:rPr>
-          <w:b/>
-        </w:rPr>
-        <w:t xml:space="preserve">of fact, not felt</w:t>
-      </w:r>
-      <w:r>
-        <w:rPr>
-          <w:b/>
-        </w:rPr>
-        <w:t xml:space="preserve"> </w:t>
-      </w:r>
-      <w:r>
-        <w:rPr>
-          <w:b/>
-        </w:rPr>
-        <w:t xml:space="preserve">confidence</w:t>
-      </w:r>
-      <w:r>
-        <w:t xml:space="preserve"> </w:t>
-      </w:r>
-      <w:r>
-        <w:t xml:space="preserve">— a closed list of verify-required shapes (current</w:t>
-      </w:r>
-      <w:r>
-        <w:t xml:space="preserve"> </w:t>
-      </w:r>
-      <w:r>
-        <w:t xml:space="preserve">officeholders, counts/statistics, named specifics) against a closed list</w:t>
-      </w:r>
-      <w:r>
-        <w:t xml:space="preserve"> </w:t>
-      </w:r>
-      <w:r>
-        <w:t xml:space="preserve">of answer-directly categories (arithmetic, language, stable common</w:t>
-      </w:r>
-      <w:r>
-        <w:t xml:space="preserve"> </w:t>
-      </w:r>
-      <w:r>
-        <w:t xml:space="preserve">knowledge, creative, not-in-Wikipedia). Deliberately symmetric — no</w:t>
-      </w:r>
-      <w:r>
-        <w:t xml:space="preserve"> </w:t>
-      </w:r>
-      <w:r>
-        <w:t xml:space="preserve">“</w:t>
-      </w:r>
-      <w:r>
-        <w:t xml:space="preserve">CRITICAL/MUST</w:t>
-      </w:r>
-      <w:r>
-        <w:t xml:space="preserve">”</w:t>
-      </w:r>
-      <w:r>
-        <w:t xml:space="preserve"> </w:t>
-      </w:r>
-      <w:r>
-        <w:t xml:space="preserve">asymmetry — because Opus 4.8 follows instructions</w:t>
-      </w:r>
-      <w:r>
-        <w:t xml:space="preserve"> </w:t>
-      </w:r>
-      <w:r>
-        <w:t xml:space="preserve">literally and an aggressive push toward the tool would have destroyed</w:t>
-      </w:r>
-      <w:r>
-        <w:t xml:space="preserve"> </w:t>
-      </w:r>
-      <w:r>
-        <w:t xml:space="preserve">precision. Result: recall 0.33 → 0.93 with precision staying 1.0 and zero</w:t>
-      </w:r>
-      <w:r>
-        <w:t xml:space="preserve"> </w:t>
-      </w:r>
-      <w:r>
-        <w:t xml:space="preserve">spurious searches.</w:t>
+        <w:t xml:space="preserve">v1 replaced confidence with fact-based rules:</w:t>
+      </w:r>
+      <w:r>
+        <w:t xml:space="preserve"> </w:t>
+      </w:r>
+      <w:r>
+        <w:t xml:space="preserve">Instead of asking the</w:t>
+      </w:r>
+      <w:r>
+        <w:t xml:space="preserve"> </w:t>
+      </w:r>
+      <w:r>
+        <w:t xml:space="preserve">model to search when uncertain, the prompt defined categories that require</w:t>
+      </w:r>
+      <w:r>
+        <w:t xml:space="preserve"> </w:t>
+      </w:r>
+      <w:r>
+        <w:t xml:space="preserve">verification, such as current officeholders, counts, statistics, exact</w:t>
+      </w:r>
+      <w:r>
+        <w:t xml:space="preserve"> </w:t>
+      </w:r>
+      <w:r>
+        <w:t xml:space="preserve">dates, and named specifics. It also defined categories that could be</w:t>
+      </w:r>
+      <w:r>
+        <w:t xml:space="preserve"> </w:t>
+      </w:r>
+      <w:r>
+        <w:t xml:space="preserve">answered directly, including arithmetic, language tasks, stable common</w:t>
+      </w:r>
+      <w:r>
+        <w:t xml:space="preserve"> </w:t>
+      </w:r>
+      <w:r>
+        <w:t xml:space="preserve">knowledge, creative requests, and questions outside Wikipedia’s scope.</w:t>
       </w:r>
     </w:p>
     <w:p>
@@ -389,10 +330,25 @@
         <w:rPr>
           <w:b/>
         </w:rPr>
-        <w:t xml:space="preserve">Evidence discipline came from the same failure family</w:t>
-      </w:r>
-      <w:r>
-        <w:t xml:space="preserve">:</w:t>
+        <w:t xml:space="preserve">The decision rules were deliberately balanced:</w:t>
+      </w:r>
+      <w:r>
+        <w:t xml:space="preserve"> </w:t>
+      </w:r>
+      <w:r>
+        <w:t xml:space="preserve">The search and</w:t>
+      </w:r>
+      <w:r>
+        <w:t xml:space="preserve"> </w:t>
+      </w:r>
+      <w:r>
+        <w:t xml:space="preserve">no-search categories were presented symmetrically, without aggressive</w:t>
+      </w:r>
+      <w:r>
+        <w:t xml:space="preserve"> </w:t>
+      </w:r>
+      <w:r>
+        <w:t xml:space="preserve">language such as</w:t>
       </w:r>
       <w:r>
         <w:t xml:space="preserve"> </w:t>
@@ -401,19 +357,7 @@
         <w:t xml:space="preserve">“</w:t>
       </w:r>
       <w:r>
-        <w:t xml:space="preserve">your answer</w:t>
-      </w:r>
-      <w:r>
-        <w:t xml:space="preserve"> </w:t>
-      </w:r>
-      <w:r>
-        <w:t xml:space="preserve">must come from the retrieved text; re-search or say the search did not</w:t>
-      </w:r>
-      <w:r>
-        <w:t xml:space="preserve"> </w:t>
-      </w:r>
-      <w:r>
-        <w:t xml:space="preserve">confirm it</w:t>
+        <w:t xml:space="preserve">CRITICAL</w:t>
       </w:r>
       <w:r>
         <w:t xml:space="preserve">”</w:t>
@@ -422,25 +366,49 @@
         <w:t xml:space="preserve"> </w:t>
       </w:r>
       <w:r>
-        <w:t xml:space="preserve">(v1), an explicit outage policy — don’t guess on volatile</w:t>
-      </w:r>
-      <w:r>
-        <w:t xml:space="preserve"> </w:t>
-      </w:r>
-      <w:r>
-        <w:t xml:space="preserve">facts, labeled-unverified memory OK for stable facts (v1.1), and per-hop</w:t>
-      </w:r>
-      <w:r>
-        <w:t xml:space="preserve"> </w:t>
-      </w:r>
-      <w:r>
-        <w:t xml:space="preserve">verification for chained questions after multi-hop cases showed the model</w:t>
-      </w:r>
-      <w:r>
-        <w:t xml:space="preserve"> </w:t>
-      </w:r>
-      <w:r>
-        <w:t xml:space="preserve">verifying hop 1 and back-filling hop 2 from memory (v1.3).</w:t>
+        <w:t xml:space="preserve">or</w:t>
+      </w:r>
+      <w:r>
+        <w:t xml:space="preserve"> </w:t>
+      </w:r>
+      <w:r>
+        <w:t xml:space="preserve">“</w:t>
+      </w:r>
+      <w:r>
+        <w:t xml:space="preserve">MUST.</w:t>
+      </w:r>
+      <w:r>
+        <w:t xml:space="preserve">”</w:t>
+      </w:r>
+      <w:r>
+        <w:t xml:space="preserve"> </w:t>
+      </w:r>
+      <w:r>
+        <w:t xml:space="preserve">Opus 4.8 follows strong</w:t>
+      </w:r>
+      <w:r>
+        <w:t xml:space="preserve"> </w:t>
+      </w:r>
+      <w:r>
+        <w:t xml:space="preserve">instructions literally, so overemphasizing retrieval could have caused</w:t>
+      </w:r>
+      <w:r>
+        <w:t xml:space="preserve"> </w:t>
+      </w:r>
+      <w:r>
+        <w:t xml:space="preserve">unnecessary searches and reduced precision. This change improved search</w:t>
+      </w:r>
+      <w:r>
+        <w:t xml:space="preserve"> </w:t>
+      </w:r>
+      <w:r>
+        <w:t xml:space="preserve">recall from 0.33 to 0.93 while maintaining 1.0 precision with no spurious</w:t>
+      </w:r>
+      <w:r>
+        <w:t xml:space="preserve"> </w:t>
+      </w:r>
+      <w:r>
+        <w:t xml:space="preserve">searches.</w:t>
       </w:r>
     </w:p>
     <w:p>
@@ -455,7 +423,136 @@
         <w:rPr>
           <w:b/>
         </w:rPr>
-        <w:t xml:space="preserve">Two of the five fixes were tool fixes, not prompt fixes.</w:t>
+        <w:t xml:space="preserve">v1 added evidence discipline:</w:t>
+      </w:r>
+      <w:r>
+        <w:t xml:space="preserve"> </w:t>
+      </w:r>
+      <w:r>
+        <w:t xml:space="preserve">Once retrieval was used, the prompt</w:t>
+      </w:r>
+      <w:r>
+        <w:t xml:space="preserve"> </w:t>
+      </w:r>
+      <w:r>
+        <w:t xml:space="preserve">required the answer to come from the retrieved text. If the evidence was</w:t>
+      </w:r>
+      <w:r>
+        <w:t xml:space="preserve"> </w:t>
+      </w:r>
+      <w:r>
+        <w:t xml:space="preserve">insufficient, the model had to search again or state that the search did</w:t>
+      </w:r>
+      <w:r>
+        <w:t xml:space="preserve"> </w:t>
+      </w:r>
+      <w:r>
+        <w:t xml:space="preserve">not confirm the answer. This prevented the model from retrieving evidence</w:t>
+      </w:r>
+      <w:r>
+        <w:t xml:space="preserve"> </w:t>
+      </w:r>
+      <w:r>
+        <w:t xml:space="preserve">but then filling gaps from memory.</w:t>
+      </w:r>
+    </w:p>
+    <w:p>
+      <w:pPr>
+        <w:numPr>
+          <w:ilvl w:val="0"/>
+          <w:numId w:val="1001"/>
+        </w:numPr>
+        <w:pStyle w:val="Compact"/>
+      </w:pPr>
+      <w:r>
+        <w:rPr>
+          <w:b/>
+        </w:rPr>
+        <w:t xml:space="preserve">v1.1 defined behavior during retrieval failures:</w:t>
+      </w:r>
+      <w:r>
+        <w:t xml:space="preserve"> </w:t>
+      </w:r>
+      <w:r>
+        <w:t xml:space="preserve">For volatile facts,</w:t>
+      </w:r>
+      <w:r>
+        <w:t xml:space="preserve"> </w:t>
+      </w:r>
+      <w:r>
+        <w:t xml:space="preserve">the model was instructed not to guess when Wikipedia was unavailable. For</w:t>
+      </w:r>
+      <w:r>
+        <w:t xml:space="preserve"> </w:t>
+      </w:r>
+      <w:r>
+        <w:t xml:space="preserve">stable facts, it could answer from memory only if it clearly labeled the</w:t>
+      </w:r>
+      <w:r>
+        <w:t xml:space="preserve"> </w:t>
+      </w:r>
+      <w:r>
+        <w:t xml:space="preserve">answer as unverified. This separated infrastructure failures from</w:t>
+      </w:r>
+      <w:r>
+        <w:t xml:space="preserve"> </w:t>
+      </w:r>
+      <w:r>
+        <w:t xml:space="preserve">factual-answering behavior.</w:t>
+      </w:r>
+    </w:p>
+    <w:p>
+      <w:pPr>
+        <w:numPr>
+          <w:ilvl w:val="0"/>
+          <w:numId w:val="1001"/>
+        </w:numPr>
+        <w:pStyle w:val="Compact"/>
+      </w:pPr>
+      <w:r>
+        <w:rPr>
+          <w:b/>
+        </w:rPr>
+        <w:t xml:space="preserve">v1.3 enforced per-hop verification:</w:t>
+      </w:r>
+      <w:r>
+        <w:t xml:space="preserve"> </w:t>
+      </w:r>
+      <w:r>
+        <w:t xml:space="preserve">Multi-hop evals showed that the</w:t>
+      </w:r>
+      <w:r>
+        <w:t xml:space="preserve"> </w:t>
+      </w:r>
+      <w:r>
+        <w:t xml:space="preserve">model sometimes verified the first step of a chain and answered the second</w:t>
+      </w:r>
+      <w:r>
+        <w:t xml:space="preserve"> </w:t>
+      </w:r>
+      <w:r>
+        <w:t xml:space="preserve">from memory. The prompt was updated to require evidence for every hop</w:t>
+      </w:r>
+      <w:r>
+        <w:t xml:space="preserve"> </w:t>
+      </w:r>
+      <w:r>
+        <w:t xml:space="preserve">before producing the final answer.</w:t>
+      </w:r>
+    </w:p>
+    <w:p>
+      <w:pPr>
+        <w:numPr>
+          <w:ilvl w:val="0"/>
+          <w:numId w:val="1001"/>
+        </w:numPr>
+        <w:pStyle w:val="Compact"/>
+      </w:pPr>
+      <w:r>
+        <w:rPr>
+          <w:b/>
+        </w:rPr>
+        <w:t xml:space="preserve">Some failures required tool changes, not prompt changes:</w:t>
       </w:r>
       <w:r>
         <w:t xml:space="preserve"> </w:t>
@@ -467,171 +564,75 @@
         <w:t xml:space="preserve"> </w:t>
       </w:r>
       <w:r>
-        <w:t xml:space="preserve">extracts strip tables and infoboxes, so award winners and settlement</w:t>
-      </w:r>
-      <w:r>
-        <w:t xml:space="preserve"> </w:t>
-      </w:r>
-      <w:r>
-        <w:t xml:space="preserve">populations were structurally invisible; search snippets (v1.2) and</w:t>
-      </w:r>
-      <w:r>
-        <w:t xml:space="preserve"> </w:t>
-      </w:r>
-      <w:r>
-        <w:t xml:space="preserve">infobox extraction (v1.3) fixed retrieval classes no prompt wording could</w:t>
-      </w:r>
-      <w:r>
-        <w:t xml:space="preserve"> </w:t>
-      </w:r>
-      <w:r>
-        <w:t xml:space="preserve">reach. Knowing</w:t>
-      </w:r>
-      <w:r>
-        <w:t xml:space="preserve"> </w:t>
-      </w:r>
-      <w:r>
-        <w:rPr>
-          <w:i/>
-        </w:rPr>
-        <w:t xml:space="preserve">which</w:t>
-      </w:r>
-      <w:r>
-        <w:t xml:space="preserve"> </w:t>
-      </w:r>
-      <w:r>
-        <w:t xml:space="preserve">layer to fix is exactly what the staged metrics</w:t>
-      </w:r>
-      <w:r>
-        <w:t xml:space="preserve"> </w:t>
-      </w:r>
-      <w:r>
-        <w:t xml:space="preserve">bought us.</w:t>
+        <w:t xml:space="preserve">Wikipedia extracts omit tables and infoboxes, making facts such as award</w:t>
+      </w:r>
+      <w:r>
+        <w:t xml:space="preserve"> </w:t>
+      </w:r>
+      <w:r>
+        <w:t xml:space="preserve">winners and settlement populations unavailable to the model. Adding search</w:t>
+      </w:r>
+      <w:r>
+        <w:t xml:space="preserve"> </w:t>
+      </w:r>
+      <w:r>
+        <w:t xml:space="preserve">snippets in v1.2 and infobox extraction in v1.3 fixed these retrieval</w:t>
+      </w:r>
+      <w:r>
+        <w:t xml:space="preserve"> </w:t>
+      </w:r>
+      <w:r>
+        <w:t xml:space="preserve">gaps. No amount of prompt refinement could recover evidence that the tool</w:t>
+      </w:r>
+      <w:r>
+        <w:t xml:space="preserve"> </w:t>
+      </w:r>
+      <w:r>
+        <w:t xml:space="preserve">never returned.</w:t>
+      </w:r>
+    </w:p>
+    <w:p>
+      <w:pPr>
+        <w:pStyle w:val="FirstParagraph"/>
+      </w:pPr>
+      <w:r>
+        <w:t xml:space="preserve">The main design principle was to use staged metrics to identify whether each</w:t>
+      </w:r>
+      <w:r>
+        <w:t xml:space="preserve"> </w:t>
+      </w:r>
+      <w:r>
+        <w:t xml:space="preserve">failure came from the search decision, retrieval layer, or answer</w:t>
+      </w:r>
+      <w:r>
+        <w:t xml:space="preserve"> </w:t>
+      </w:r>
+      <w:r>
+        <w:t xml:space="preserve">generation, and then change only the responsible layer.</w:t>
       </w:r>
     </w:p>
     <w:p>
       <w:pPr>
         <w:pStyle w:val="Heading2"/>
       </w:pPr>
-      <w:bookmarkStart w:id="22" w:name="eval-design"/>
+      <w:bookmarkStart w:id="25" w:name="eval-design"/>
       <w:r>
         <w:t xml:space="preserve">2. Eval design</w:t>
       </w:r>
-      <w:bookmarkEnd w:id="22"/>
+      <w:bookmarkEnd w:id="25"/>
     </w:p>
     <w:p>
       <w:pPr>
         <w:pStyle w:val="FirstParagraph"/>
       </w:pPr>
       <w:r>
-        <w:t xml:space="preserve">Three graded dimensions per case, so each failure is attributable to a</w:t>
-      </w:r>
-      <w:r>
-        <w:t xml:space="preserve"> </w:t>
-      </w:r>
-      <w:r>
-        <w:t xml:space="preserve">stage:</w:t>
-      </w:r>
-      <w:r>
-        <w:t xml:space="preserve"> </w:t>
-      </w:r>
-      <w:r>
-        <w:rPr>
-          <w:b/>
-        </w:rPr>
-        <w:t xml:space="preserve">search decision</w:t>
-      </w:r>
-      <w:r>
-        <w:t xml:space="preserve"> </w:t>
-      </w:r>
-      <w:r>
-        <w:t xml:space="preserve">(pure code: recall/precision vs a three-valued</w:t>
-      </w:r>
-      <w:r>
-        <w:t xml:space="preserve"> </w:t>
-      </w:r>
-      <w:r>
-        <w:rPr>
-          <w:rStyle w:val="VerbatimChar"/>
-        </w:rPr>
-        <w:t xml:space="preserve">expect_search</w:t>
-      </w:r>
-      <w:r>
-        <w:t xml:space="preserve">, with</w:t>
-      </w:r>
-      <w:r>
-        <w:t xml:space="preserve"> </w:t>
-      </w:r>
-      <w:r>
-        <w:t xml:space="preserve">“</w:t>
-      </w:r>
-      <w:r>
-        <w:t xml:space="preserve">optional</w:t>
-      </w:r>
-      <w:r>
-        <w:t xml:space="preserve">”</w:t>
-      </w:r>
-      <w:r>
-        <w:t xml:space="preserve"> </w:t>
-      </w:r>
-      <w:r>
-        <w:t xml:space="preserve">cases excluded),</w:t>
-      </w:r>
-      <w:r>
-        <w:t xml:space="preserve"> </w:t>
-      </w:r>
-      <w:r>
-        <w:rPr>
-          <w:b/>
-        </w:rPr>
-        <w:t xml:space="preserve">retrieval quality</w:t>
-      </w:r>
-      <w:r>
-        <w:t xml:space="preserve"> </w:t>
-      </w:r>
-      <w:r>
-        <w:t xml:space="preserve">(judge: evidence sufficiency, right-article; plus code-level tool-error rate</w:t>
-      </w:r>
-      <w:r>
-        <w:t xml:space="preserve"> </w:t>
-      </w:r>
-      <w:r>
-        <w:t xml:space="preserve">so infra failures never masquerade as retrieval failures), and</w:t>
-      </w:r>
-      <w:r>
-        <w:t xml:space="preserve"> </w:t>
-      </w:r>
-      <w:r>
-        <w:rPr>
-          <w:b/>
-        </w:rPr>
-        <w:t xml:space="preserve">answer</w:t>
-      </w:r>
-      <w:r>
-        <w:rPr>
-          <w:b/>
-        </w:rPr>
-        <w:t xml:space="preserve"> </w:t>
-      </w:r>
-      <w:r>
-        <w:rPr>
-          <w:b/>
-        </w:rPr>
-        <w:t xml:space="preserve">quality</w:t>
-      </w:r>
-      <w:r>
-        <w:t xml:space="preserve"> </w:t>
-      </w:r>
-      <w:r>
-        <w:t xml:space="preserve">(judge: verdict, faithfulness, abstention appropriateness).</w:t>
-      </w:r>
-    </w:p>
-    <w:p>
-      <w:pPr>
-        <w:pStyle w:val="BodyText"/>
-      </w:pPr>
-      <w:r>
-        <w:t xml:space="preserve">Case design choices that mattered:</w:t>
+        <w:t xml:space="preserve">The eval was designed to identify where each failure occurred, not just</w:t>
+      </w:r>
+      <w:r>
+        <w:t xml:space="preserve"> </w:t>
+      </w:r>
+      <w:r>
+        <w:t xml:space="preserve">whether the final answer passed. Every case was graded across three stages:</w:t>
       </w:r>
     </w:p>
     <w:p>
@@ -646,79 +647,43 @@
         <w:rPr>
           <w:b/>
         </w:rPr>
-        <w:t xml:space="preserve">Stale-memory traps</w:t>
-      </w:r>
-      <w:r>
-        <w:t xml:space="preserve"> </w:t>
-      </w:r>
-      <w:r>
-        <w:t xml:space="preserve">(current officeholders/CEOs changed in 2024–2025)</w:t>
-      </w:r>
-      <w:r>
-        <w:t xml:space="preserve"> </w:t>
-      </w:r>
-      <w:r>
-        <w:t xml:space="preserve">where the</w:t>
-      </w:r>
-      <w:r>
-        <w:t xml:space="preserve"> </w:t>
-      </w:r>
-      <w:r>
-        <w:rPr>
-          <w:i/>
-        </w:rPr>
-        <w:t xml:space="preserve">anticipated failure</w:t>
-      </w:r>
-      <w:r>
-        <w:t xml:space="preserve"> </w:t>
-      </w:r>
-      <w:r>
-        <w:t xml:space="preserve">is a confident wrong answer — these</w:t>
-      </w:r>
-      <w:r>
-        <w:t xml:space="preserve"> </w:t>
-      </w:r>
-      <w:r>
-        <w:t xml:space="preserve">separate</w:t>
-      </w:r>
-      <w:r>
-        <w:t xml:space="preserve"> </w:t>
-      </w:r>
-      <w:r>
-        <w:t xml:space="preserve">“</w:t>
-      </w:r>
-      <w:r>
-        <w:t xml:space="preserve">confident</w:t>
-      </w:r>
-      <w:r>
-        <w:t xml:space="preserve">”</w:t>
-      </w:r>
-      <w:r>
-        <w:t xml:space="preserve"> </w:t>
-      </w:r>
-      <w:r>
-        <w:t xml:space="preserve">from</w:t>
-      </w:r>
-      <w:r>
-        <w:t xml:space="preserve"> </w:t>
-      </w:r>
-      <w:r>
-        <w:t xml:space="preserve">“</w:t>
-      </w:r>
-      <w:r>
-        <w:t xml:space="preserve">correct</w:t>
-      </w:r>
-      <w:r>
-        <w:t xml:space="preserve">”</w:t>
-      </w:r>
-      <w:r>
-        <w:t xml:space="preserve">, which a generic obscure-facts set</w:t>
-      </w:r>
-      <w:r>
-        <w:t xml:space="preserve"> </w:t>
-      </w:r>
-      <w:r>
-        <w:t xml:space="preserve">cannot.</w:t>
+        <w:t xml:space="preserve">Search decision:</w:t>
+      </w:r>
+      <w:r>
+        <w:t xml:space="preserve"> </w:t>
+      </w:r>
+      <w:r>
+        <w:t xml:space="preserve">Code calculates recall and precision by comparing</w:t>
+      </w:r>
+      <w:r>
+        <w:t xml:space="preserve"> </w:t>
+      </w:r>
+      <w:r>
+        <w:t xml:space="preserve">actual tool use against</w:t>
+      </w:r>
+      <w:r>
+        <w:t xml:space="preserve"> </w:t>
+      </w:r>
+      <w:r>
+        <w:rPr>
+          <w:rStyle w:val="VerbatimChar"/>
+        </w:rPr>
+        <w:t xml:space="preserve">expect_search</w:t>
+      </w:r>
+      <w:r>
+        <w:t xml:space="preserve">. Each case is labeled required,</w:t>
+      </w:r>
+      <w:r>
+        <w:t xml:space="preserve"> </w:t>
+      </w:r>
+      <w:r>
+        <w:t xml:space="preserve">not_required, or optional, with optional cases excluded from search</w:t>
+      </w:r>
+      <w:r>
+        <w:t xml:space="preserve"> </w:t>
+      </w:r>
+      <w:r>
+        <w:t xml:space="preserve">precision and recall.</w:t>
       </w:r>
     </w:p>
     <w:p>
@@ -733,154 +698,31 @@
         <w:rPr>
           <w:b/>
         </w:rPr>
-        <w:t xml:space="preserve">“</w:t>
-      </w:r>
-      <w:r>
-        <w:rPr>
-          <w:b/>
-        </w:rPr>
-        <w:t xml:space="preserve">Optional</w:t>
-      </w:r>
-      <w:r>
-        <w:rPr>
-          <w:b/>
-        </w:rPr>
-        <w:t xml:space="preserve">”</w:t>
-      </w:r>
-      <w:r>
-        <w:rPr>
-          <w:b/>
-        </w:rPr>
-        <w:t xml:space="preserve"> </w:t>
-      </w:r>
-      <w:r>
-        <w:rPr>
-          <w:b/>
-        </w:rPr>
-        <w:t xml:space="preserve">is a deliberate third value, not indecision.</w:t>
-      </w:r>
-      <w:r>
-        <w:t xml:space="preserve"> </w:t>
-      </w:r>
-      <w:r>
-        <w:t xml:space="preserve">Cases like</w:t>
-      </w:r>
-      <w:r>
-        <w:t xml:space="preserve"> </w:t>
-      </w:r>
-      <w:r>
-        <w:t xml:space="preserve">“</w:t>
-      </w:r>
-      <w:r>
-        <w:t xml:space="preserve">Who painted the Mona Lisa?</w:t>
-      </w:r>
-      <w:r>
-        <w:t xml:space="preserve">”</w:t>
-      </w:r>
-      <w:r>
-        <w:t xml:space="preserve"> </w:t>
-      </w:r>
-      <w:r>
-        <w:t xml:space="preserve">sit exactly on the boundary of the prompt’s</w:t>
-      </w:r>
-      <w:r>
-        <w:t xml:space="preserve"> </w:t>
-      </w:r>
-      <w:r>
-        <w:t xml:space="preserve">two decision lists: they are stable, pre-cutoff common knowledge (the</w:t>
-      </w:r>
-      <w:r>
-        <w:t xml:space="preserve"> </w:t>
-      </w:r>
-      <w:r>
-        <w:t xml:space="preserve">answer-directly list)</w:t>
-      </w:r>
-      <w:r>
-        <w:t xml:space="preserve"> </w:t>
-      </w:r>
-      <w:r>
-        <w:rPr>
-          <w:i/>
-        </w:rPr>
-        <w:t xml:space="preserve">and</w:t>
-      </w:r>
-      <w:r>
-        <w:t xml:space="preserve"> </w:t>
-      </w:r>
-      <w:r>
-        <w:t xml:space="preserve">literally</w:t>
-      </w:r>
-      <w:r>
-        <w:t xml:space="preserve"> </w:t>
-      </w:r>
-      <w:r>
-        <w:t xml:space="preserve">“</w:t>
-      </w:r>
-      <w:r>
-        <w:t xml:space="preserve">named specifics about a particular</w:t>
-      </w:r>
-      <w:r>
-        <w:t xml:space="preserve"> </w:t>
-      </w:r>
-      <w:r>
-        <w:t xml:space="preserve">work</w:t>
-      </w:r>
-      <w:r>
-        <w:t xml:space="preserve">”</w:t>
-      </w:r>
-      <w:r>
-        <w:t xml:space="preserve"> </w:t>
-      </w:r>
-      <w:r>
-        <w:t xml:space="preserve">(the search-first list). Since either behavior is defensible, these</w:t>
-      </w:r>
-      <w:r>
-        <w:t xml:space="preserve"> </w:t>
-      </w:r>
-      <w:r>
-        <w:t xml:space="preserve">cases are excluded from search precision and recall in both directions —</w:t>
-      </w:r>
-      <w:r>
-        <w:t xml:space="preserve"> </w:t>
-      </w:r>
-      <w:r>
-        <w:t xml:space="preserve">punishing either choice would make the eval arbitrary — while answer</w:t>
-      </w:r>
-      <w:r>
-        <w:t xml:space="preserve"> </w:t>
-      </w:r>
-      <w:r>
-        <w:t xml:space="preserve">correctness (and, if the model does search, right-article and</w:t>
-      </w:r>
-      <w:r>
-        <w:t xml:space="preserve"> </w:t>
-      </w:r>
-      <w:r>
-        <w:t xml:space="preserve">faithfulness) is still graded. In practice the model answers all four</w:t>
-      </w:r>
-      <w:r>
-        <w:t xml:space="preserve"> </w:t>
-      </w:r>
-      <w:r>
-        <w:t xml:space="preserve">optional cases from memory, correctly, in every final run: the useful</w:t>
-      </w:r>
-      <w:r>
-        <w:t xml:space="preserve"> </w:t>
-      </w:r>
-      <w:r>
-        <w:t xml:space="preserve">thing these cases demonstrate is calibrated restraint — not burning a</w:t>
-      </w:r>
-      <w:r>
-        <w:t xml:space="preserve"> </w:t>
-      </w:r>
-      <w:r>
-        <w:t xml:space="preserve">search on a fact that pattern-matches the trigger list but is bedrock</w:t>
-      </w:r>
-      <w:r>
-        <w:t xml:space="preserve"> </w:t>
-      </w:r>
-      <w:r>
-        <w:t xml:space="preserve">knowledge — which is the live face of the suite’s 1.0 search precision.</w:t>
+        <w:t xml:space="preserve">Retrieval quality:</w:t>
+      </w:r>
+      <w:r>
+        <w:t xml:space="preserve"> </w:t>
+      </w:r>
+      <w:r>
+        <w:t xml:space="preserve">The judge evaluates whether the retrieved evidence</w:t>
+      </w:r>
+      <w:r>
+        <w:t xml:space="preserve"> </w:t>
+      </w:r>
+      <w:r>
+        <w:t xml:space="preserve">is sufficient and whether the system selected the correct article. Tool</w:t>
+      </w:r>
+      <w:r>
+        <w:t xml:space="preserve"> </w:t>
+      </w:r>
+      <w:r>
+        <w:t xml:space="preserve">errors are measured separately in code so infrastructure failures do not</w:t>
+      </w:r>
+      <w:r>
+        <w:t xml:space="preserve"> </w:t>
+      </w:r>
+      <w:r>
+        <w:t xml:space="preserve">appear as retrieval-quality failures.</w:t>
       </w:r>
     </w:p>
     <w:p>
@@ -895,26 +737,34 @@
         <w:rPr>
           <w:b/>
         </w:rPr>
-        <w:t xml:space="preserve">Forced disambiguation</w:t>
-      </w:r>
-      <w:r>
-        <w:t xml:space="preserve"> </w:t>
-      </w:r>
-      <w:r>
-        <w:t xml:space="preserve">(Mercury Records vs the planet, Odessa TX vs</w:t>
-      </w:r>
-      <w:r>
-        <w:t xml:space="preserve"> </w:t>
-      </w:r>
-      <w:r>
-        <w:t xml:space="preserve">Odesa UA, Java SD vs the language) to exercise wrong-article retrieval.</w:t>
+        <w:t xml:space="preserve">Answer quality:</w:t>
+      </w:r>
+      <w:r>
+        <w:t xml:space="preserve"> </w:t>
+      </w:r>
+      <w:r>
+        <w:t xml:space="preserve">The judge evaluates overall correctness, faithfulness</w:t>
+      </w:r>
+      <w:r>
+        <w:t xml:space="preserve"> </w:t>
+      </w:r>
+      <w:r>
+        <w:t xml:space="preserve">to the retrieved evidence, and whether abstention was appropriate.</w:t>
+      </w:r>
+    </w:p>
+    <w:p>
+      <w:pPr>
+        <w:pStyle w:val="FirstParagraph"/>
+      </w:pPr>
+      <w:r>
+        <w:t xml:space="preserve">Case design choices that mattered:</w:t>
       </w:r>
     </w:p>
     <w:p>
       <w:pPr>
         <w:numPr>
           <w:ilvl w:val="0"/>
-          <w:numId w:val="1002"/>
+          <w:numId w:val="1003"/>
         </w:numPr>
         <w:pStyle w:val="Compact"/>
       </w:pPr>
@@ -922,32 +772,38 @@
         <w:rPr>
           <w:b/>
         </w:rPr>
-        <w:t xml:space="preserve">Unanswerables</w:t>
-      </w:r>
-      <w:r>
-        <w:t xml:space="preserve"> </w:t>
-      </w:r>
-      <w:r>
-        <w:t xml:space="preserve">where honest abstention is the pass condition, graded</w:t>
-      </w:r>
-      <w:r>
-        <w:t xml:space="preserve"> </w:t>
-      </w:r>
-      <w:r>
-        <w:t xml:space="preserve">separately in both directions (abstained-when-unanswerable, and wrong</w:t>
-      </w:r>
-      <w:r>
-        <w:t xml:space="preserve"> </w:t>
-      </w:r>
-      <w:r>
-        <w:t xml:space="preserve">abstentions on answerable cases).</w:t>
+        <w:t xml:space="preserve">Stale-memory traps:</w:t>
+      </w:r>
+      <w:r>
+        <w:t xml:space="preserve"> </w:t>
+      </w:r>
+      <w:r>
+        <w:t xml:space="preserve">Cases involving officeholders and CEOs who changed</w:t>
+      </w:r>
+      <w:r>
+        <w:t xml:space="preserve"> </w:t>
+      </w:r>
+      <w:r>
+        <w:t xml:space="preserve">in 2024 or 2025 test whether the model confidently answers from outdated</w:t>
+      </w:r>
+      <w:r>
+        <w:t xml:space="preserve"> </w:t>
+      </w:r>
+      <w:r>
+        <w:t xml:space="preserve">memory. These cases distinguish confidence from correctness more</w:t>
+      </w:r>
+      <w:r>
+        <w:t xml:space="preserve"> </w:t>
+      </w:r>
+      <w:r>
+        <w:t xml:space="preserve">effectively than a generic set of obscure facts.</w:t>
       </w:r>
     </w:p>
     <w:p>
       <w:pPr>
         <w:numPr>
           <w:ilvl w:val="0"/>
-          <w:numId w:val="1002"/>
+          <w:numId w:val="1003"/>
         </w:numPr>
         <w:pStyle w:val="Compact"/>
       </w:pPr>
@@ -955,19 +811,7 @@
         <w:rPr>
           <w:b/>
         </w:rPr>
-        <w:t xml:space="preserve">Multi-hop</w:t>
-      </w:r>
-      <w:r>
-        <w:t xml:space="preserve"> </w:t>
-      </w:r>
-      <w:r>
-        <w:t xml:space="preserve">(added after single-hop converged): chained searches with</w:t>
-      </w:r>
-      <w:r>
-        <w:t xml:space="preserve"> </w:t>
-      </w:r>
-      <w:r>
-        <w:t xml:space="preserve">per-case</w:t>
+        <w:t xml:space="preserve">Optional search cases:</w:t>
       </w:r>
       <w:r>
         <w:t xml:space="preserve"> </w:t>
@@ -976,16 +820,19 @@
         <w:rPr>
           <w:rStyle w:val="VerbatimChar"/>
         </w:rPr>
-        <w:t xml:space="preserve">min_searches</w:t>
-      </w:r>
-      <w:r>
-        <w:t xml:space="preserve">, two chains with intermediates too obscure to</w:t>
-      </w:r>
-      <w:r>
-        <w:t xml:space="preserve"> </w:t>
-      </w:r>
-      <w:r>
-        <w:t xml:space="preserve">skip from memory, and one dead-end chain where the right answer is</w:t>
+        <w:t xml:space="preserve">optional</w:t>
+      </w:r>
+      <w:r>
+        <w:t xml:space="preserve"> </w:t>
+      </w:r>
+      <w:r>
+        <w:t xml:space="preserve">is a deliberate third label, not</w:t>
+      </w:r>
+      <w:r>
+        <w:t xml:space="preserve"> </w:t>
+      </w:r>
+      <w:r>
+        <w:t xml:space="preserve">uncertainty in the eval design. A question such as</w:t>
       </w:r>
       <w:r>
         <w:t xml:space="preserve"> </w:t>
@@ -994,13 +841,13 @@
         <w:t xml:space="preserve">“</w:t>
       </w:r>
       <w:r>
-        <w:t xml:space="preserve">not</w:t>
-      </w:r>
-      <w:r>
-        <w:t xml:space="preserve"> </w:t>
-      </w:r>
-      <w:r>
-        <w:t xml:space="preserve">recorded</w:t>
+        <w:t xml:space="preserve">Who painted the Mona</w:t>
+      </w:r>
+      <w:r>
+        <w:t xml:space="preserve"> </w:t>
+      </w:r>
+      <w:r>
+        <w:t xml:space="preserve">Lisa?</w:t>
       </w:r>
       <w:r>
         <w:t xml:space="preserve">”</w:t>
@@ -1009,120 +856,89 @@
         <w:t xml:space="preserve"> </w:t>
       </w:r>
       <w:r>
-        <w:t xml:space="preserve">(</w:t>
-      </w:r>
-      <w:r>
-        <w:rPr>
-          <w:rStyle w:val="VerbatimChar"/>
-        </w:rPr>
-        <w:t xml:space="preserve">abstention_ok</w:t>
-      </w:r>
-      <w:r>
-        <w:t xml:space="preserve">).</w:t>
+        <w:t xml:space="preserve">is both stable common knowledge and a named fact about a specific</w:t>
+      </w:r>
+      <w:r>
+        <w:t xml:space="preserve"> </w:t>
+      </w:r>
+      <w:r>
+        <w:t xml:space="preserve">work, so either searching or answering directly is reasonable. These cases</w:t>
+      </w:r>
+      <w:r>
+        <w:t xml:space="preserve"> </w:t>
+      </w:r>
+      <w:r>
+        <w:t xml:space="preserve">are excluded from search precision and recall, but answer correctness and,</w:t>
+      </w:r>
+      <w:r>
+        <w:t xml:space="preserve"> </w:t>
+      </w:r>
+      <w:r>
+        <w:t xml:space="preserve">when applicable, retrieval quality are still graded. In every final run,</w:t>
+      </w:r>
+      <w:r>
+        <w:t xml:space="preserve"> </w:t>
+      </w:r>
+      <w:r>
+        <w:t xml:space="preserve">the model answered all four optional cases correctly from memory,</w:t>
+      </w:r>
+      <w:r>
+        <w:t xml:space="preserve"> </w:t>
+      </w:r>
+      <w:r>
+        <w:t xml:space="preserve">demonstrating the calibrated restraint reflected in its 1.0 search</w:t>
+      </w:r>
+      <w:r>
+        <w:t xml:space="preserve"> </w:t>
+      </w:r>
+      <w:r>
+        <w:t xml:space="preserve">precision.</w:t>
       </w:r>
     </w:p>
     <w:p>
       <w:pPr>
         <w:numPr>
           <w:ilvl w:val="0"/>
-          <w:numId w:val="1002"/>
+          <w:numId w:val="1003"/>
         </w:numPr>
         <w:pStyle w:val="Compact"/>
       </w:pPr>
       <w:r>
         <w:rPr>
-          <w:rStyle w:val="VerbatimChar"/>
-          <w:b/>
-        </w:rPr>
-        <w:t xml:space="preserve">notes</w:t>
-      </w:r>
-      <w:r>
-        <w:rPr>
-          <w:b/>
-        </w:rPr>
-        <w:t xml:space="preserve"> </w:t>
-      </w:r>
-      <w:r>
-        <w:rPr>
-          <w:b/>
-        </w:rPr>
-        <w:t xml:space="preserve">are authoritative over the judge’s own knowledge</w:t>
-      </w:r>
-      <w:r>
-        <w:t xml:space="preserve"> </w:t>
-      </w:r>
-      <w:r>
-        <w:t xml:space="preserve">— this is</w:t>
-      </w:r>
-      <w:r>
-        <w:t xml:space="preserve"> </w:t>
-      </w:r>
-      <w:r>
-        <w:t xml:space="preserve">what makes trap grading reliable — and the judge must flag (not act on)</w:t>
-      </w:r>
-      <w:r>
-        <w:t xml:space="preserve"> </w:t>
-      </w:r>
-      <w:r>
-        <w:t xml:space="preserve">disagreement with an expected answer. Judge prompt changes are</w:t>
-      </w:r>
-      <w:r>
-        <w:t xml:space="preserve"> </w:t>
-      </w:r>
-      <w:r>
-        <w:t xml:space="preserve">version-tagged (judge-v1 → judge-v5; see the README for the numbering,</w:t>
-      </w:r>
-      <w:r>
-        <w:t xml:space="preserve"> </w:t>
-      </w:r>
-      <w:r>
-        <w:t xml:space="preserve">which spans both the default and citation grading modes) for cross-run</w:t>
-      </w:r>
-      <w:r>
-        <w:t xml:space="preserve"> </w:t>
-      </w:r>
-      <w:r>
-        <w:t xml:space="preserve">comparability, and a</w:t>
-      </w:r>
-      <w:r>
-        <w:t xml:space="preserve"> </w:t>
-      </w:r>
-      <w:r>
-        <w:rPr>
-          <w:rStyle w:val="VerbatimChar"/>
-        </w:rPr>
-        <w:t xml:space="preserve">--rejudge</w:t>
-      </w:r>
-      <w:r>
-        <w:t xml:space="preserve"> </w:t>
-      </w:r>
-      <w:r>
-        <w:t xml:space="preserve">mode replays a newer judge over a</w:t>
-      </w:r>
-      <w:r>
-        <w:t xml:space="preserve"> </w:t>
-      </w:r>
-      <w:r>
-        <w:t xml:space="preserve">finished run’s frozen transcripts — grading improvements never require</w:t>
-      </w:r>
-      <w:r>
-        <w:t xml:space="preserve"> </w:t>
-      </w:r>
-      <w:r>
-        <w:t xml:space="preserve">re-running the agent. A 10-case blind human spot-check, selected before</w:t>
-      </w:r>
-      <w:r>
-        <w:t xml:space="preserve"> </w:t>
-      </w:r>
-      <w:r>
-        <w:t xml:space="preserve">any verdicts existed, matched the judge 10/10.</w:t>
+          <w:b/>
+        </w:rPr>
+        <w:t xml:space="preserve">Forced disambiguation:</w:t>
+      </w:r>
+      <w:r>
+        <w:t xml:space="preserve"> </w:t>
+      </w:r>
+      <w:r>
+        <w:t xml:space="preserve">Cases such as Mercury Records versus the planet</w:t>
+      </w:r>
+      <w:r>
+        <w:t xml:space="preserve"> </w:t>
+      </w:r>
+      <w:r>
+        <w:t xml:space="preserve">Mercury, Odessa, Texas versus Odesa, Ukraine, and Java, South Dakota</w:t>
+      </w:r>
+      <w:r>
+        <w:t xml:space="preserve"> </w:t>
+      </w:r>
+      <w:r>
+        <w:t xml:space="preserve">versus the programming language test whether retrieval selects the</w:t>
+      </w:r>
+      <w:r>
+        <w:t xml:space="preserve"> </w:t>
+      </w:r>
+      <w:r>
+        <w:t xml:space="preserve">intended article rather than a more prominent entity with the same name.</w:t>
       </w:r>
     </w:p>
     <w:p>
       <w:pPr>
         <w:numPr>
           <w:ilvl w:val="0"/>
-          <w:numId w:val="1002"/>
+          <w:numId w:val="1003"/>
         </w:numPr>
         <w:pStyle w:val="Compact"/>
       </w:pPr>
@@ -1130,81 +946,447 @@
         <w:rPr>
           <w:b/>
         </w:rPr>
-        <w:t xml:space="preserve">Lexical metrics were run as a falsifiable experiment, not assumed</w:t>
-      </w:r>
-      <w:r>
-        <w:rPr>
-          <w:b/>
-        </w:rPr>
-        <w:t xml:space="preserve"> </w:t>
-      </w:r>
-      <w:r>
-        <w:rPr>
-          <w:b/>
-        </w:rPr>
-        <w:t xml:space="preserve">useful.</w:t>
-      </w:r>
-      <w:r>
-        <w:t xml:space="preserve"> </w:t>
-      </w:r>
-      <w:r>
-        <w:t xml:space="preserve">BLEU/ROUGE were dropped on evidence: the baseline’s one</w:t>
-      </w:r>
-      <w:r>
-        <w:t xml:space="preserve"> </w:t>
-      </w:r>
-      <w:r>
-        <w:t xml:space="preserve">incorrect answer scored</w:t>
-      </w:r>
-      <w:r>
-        <w:t xml:space="preserve"> </w:t>
-      </w:r>
-      <w:r>
-        <w:rPr>
-          <w:i/>
-        </w:rPr>
-        <w:t xml:space="preserve">above</w:t>
-      </w:r>
-      <w:r>
-        <w:t xml:space="preserve"> </w:t>
-      </w:r>
-      <w:r>
-        <w:t xml:space="preserve">the correct-group mean on ROUGE-1</w:t>
-      </w:r>
-      <w:r>
-        <w:t xml:space="preserve"> </w:t>
-      </w:r>
-      <w:r>
-        <w:t xml:space="preserve">(fluent-wrong overlaps a short factual reference as well as right), and</w:t>
-      </w:r>
-      <w:r>
-        <w:t xml:space="preserve"> </w:t>
-      </w:r>
-      <w:r>
-        <w:t xml:space="preserve">correct answers spanned 0.00–0.76, so no threshold can separate the</w:t>
-      </w:r>
-      <w:r>
-        <w:t xml:space="preserve"> </w:t>
-      </w:r>
-      <w:r>
-        <w:t xml:space="preserve">groups. BERTScore is deferred (dev-network download failure; recomputable</w:t>
-      </w:r>
-      <w:r>
-        <w:t xml:space="preserve"> </w:t>
-      </w:r>
-      <w:r>
-        <w:t xml:space="preserve">offline from saved artifacts), MoverScore was unbuildable.</w:t>
+        <w:t xml:space="preserve">Unanswerable questions:</w:t>
+      </w:r>
+      <w:r>
+        <w:t xml:space="preserve"> </w:t>
+      </w:r>
+      <w:r>
+        <w:t xml:space="preserve">Some cases are designed so that abstaining is</w:t>
+      </w:r>
+      <w:r>
+        <w:t xml:space="preserve"> </w:t>
+      </w:r>
+      <w:r>
+        <w:t xml:space="preserve">the correct response. The eval measures both directions separately:</w:t>
+      </w:r>
+      <w:r>
+        <w:t xml:space="preserve"> </w:t>
+      </w:r>
+      <w:r>
+        <w:t xml:space="preserve">whether the model abstains when evidence is unavailable and whether it</w:t>
+      </w:r>
+      <w:r>
+        <w:t xml:space="preserve"> </w:t>
+      </w:r>
+      <w:r>
+        <w:t xml:space="preserve">incorrectly abstains when the question is answerable.</w:t>
+      </w:r>
+    </w:p>
+    <w:p>
+      <w:pPr>
+        <w:numPr>
+          <w:ilvl w:val="0"/>
+          <w:numId w:val="1003"/>
+        </w:numPr>
+        <w:pStyle w:val="Compact"/>
+      </w:pPr>
+      <w:r>
+        <w:rPr>
+          <w:b/>
+        </w:rPr>
+        <w:t xml:space="preserve">Multi-hop questions:</w:t>
+      </w:r>
+      <w:r>
+        <w:t xml:space="preserve"> </w:t>
+      </w:r>
+      <w:r>
+        <w:t xml:space="preserve">These were added only after the single-hop suite</w:t>
+      </w:r>
+      <w:r>
+        <w:t xml:space="preserve"> </w:t>
+      </w:r>
+      <w:r>
+        <w:t xml:space="preserve">had converged. Each case specifies a minimum number of searches, and two</w:t>
+      </w:r>
+      <w:r>
+        <w:t xml:space="preserve"> </w:t>
+      </w:r>
+      <w:r>
+        <w:t xml:space="preserve">cases use intermediate facts that are intentionally too obscure to skip</w:t>
+      </w:r>
+      <w:r>
+        <w:t xml:space="preserve"> </w:t>
+      </w:r>
+      <w:r>
+        <w:t xml:space="preserve">using memory. Another ends in a genuine dead end, where the correct</w:t>
+      </w:r>
+      <w:r>
+        <w:t xml:space="preserve"> </w:t>
+      </w:r>
+      <w:r>
+        <w:t xml:space="preserve">response is that the requested fact is not recorded.</w:t>
+      </w:r>
+    </w:p>
+    <w:p>
+      <w:pPr>
+        <w:pStyle w:val="FirstParagraph"/>
+      </w:pPr>
+      <w:r>
+        <w:t xml:space="preserve">Judge design and validation:</w:t>
+      </w:r>
+    </w:p>
+    <w:p>
+      <w:pPr>
+        <w:numPr>
+          <w:ilvl w:val="0"/>
+          <w:numId w:val="1004"/>
+        </w:numPr>
+        <w:pStyle w:val="Compact"/>
+      </w:pPr>
+      <w:r>
+        <w:rPr>
+          <w:b/>
+        </w:rPr>
+        <w:t xml:space="preserve">Eval notes override model knowledge:</w:t>
+      </w:r>
+      <w:r>
+        <w:t xml:space="preserve"> </w:t>
+      </w:r>
+      <w:r>
+        <w:t xml:space="preserve">Case-level notes are</w:t>
+      </w:r>
+      <w:r>
+        <w:t xml:space="preserve"> </w:t>
+      </w:r>
+      <w:r>
+        <w:t xml:space="preserve">authoritative when they conflict with the judge’s internal knowledge. The</w:t>
+      </w:r>
+      <w:r>
+        <w:t xml:space="preserve"> </w:t>
+      </w:r>
+      <w:r>
+        <w:t xml:space="preserve">judge must flag the disagreement but grade according to the eval evidence.</w:t>
+      </w:r>
+      <w:r>
+        <w:t xml:space="preserve"> </w:t>
+      </w:r>
+      <w:r>
+        <w:t xml:space="preserve">This is essential for reliably grading stale-memory traps and source</w:t>
+      </w:r>
+      <w:r>
+        <w:t xml:space="preserve"> </w:t>
+      </w:r>
+      <w:r>
+        <w:t xml:space="preserve">inconsistencies.</w:t>
+      </w:r>
+    </w:p>
+    <w:p>
+      <w:pPr>
+        <w:numPr>
+          <w:ilvl w:val="0"/>
+          <w:numId w:val="1004"/>
+        </w:numPr>
+        <w:pStyle w:val="Compact"/>
+      </w:pPr>
+      <w:r>
+        <w:rPr>
+          <w:b/>
+        </w:rPr>
+        <w:t xml:space="preserve">Judge versions are tracked:</w:t>
+      </w:r>
+      <w:r>
+        <w:t xml:space="preserve"> </w:t>
+      </w:r>
+      <w:r>
+        <w:t xml:space="preserve">Judge prompt changes are versioned from</w:t>
+      </w:r>
+      <w:r>
+        <w:t xml:space="preserve"> </w:t>
+      </w:r>
+      <w:r>
+        <w:t xml:space="preserve">judge-v1 through judge-v5, covering both default and citation modes. This</w:t>
+      </w:r>
+      <w:r>
+        <w:t xml:space="preserve"> </w:t>
+      </w:r>
+      <w:r>
+        <w:t xml:space="preserve">preserves comparability across runs and makes grading changes explicit.</w:t>
+      </w:r>
+    </w:p>
+    <w:p>
+      <w:pPr>
+        <w:numPr>
+          <w:ilvl w:val="0"/>
+          <w:numId w:val="1004"/>
+        </w:numPr>
+        <w:pStyle w:val="Compact"/>
+      </w:pPr>
+      <w:r>
+        <w:rPr>
+          <w:b/>
+        </w:rPr>
+        <w:t xml:space="preserve">Completed runs can be regraded:</w:t>
+      </w:r>
+      <w:r>
+        <w:t xml:space="preserve"> </w:t>
+      </w:r>
+      <w:r>
+        <w:t xml:space="preserve">The</w:t>
+      </w:r>
+      <w:r>
+        <w:t xml:space="preserve"> </w:t>
+      </w:r>
+      <w:r>
+        <w:rPr>
+          <w:rStyle w:val="VerbatimChar"/>
+        </w:rPr>
+        <w:t xml:space="preserve">--rejudge</w:t>
+      </w:r>
+      <w:r>
+        <w:t xml:space="preserve"> </w:t>
+      </w:r>
+      <w:r>
+        <w:t xml:space="preserve">mode applies a newer</w:t>
+      </w:r>
+      <w:r>
+        <w:t xml:space="preserve"> </w:t>
+      </w:r>
+      <w:r>
+        <w:t xml:space="preserve">judge to saved transcripts from an earlier run. This allows the grading</w:t>
+      </w:r>
+      <w:r>
+        <w:t xml:space="preserve"> </w:t>
+      </w:r>
+      <w:r>
+        <w:t xml:space="preserve">rubric to improve without rerunning the agent or changing its recorded</w:t>
+      </w:r>
+      <w:r>
+        <w:t xml:space="preserve"> </w:t>
+      </w:r>
+      <w:r>
+        <w:t xml:space="preserve">behavior.</w:t>
+      </w:r>
+    </w:p>
+    <w:p>
+      <w:pPr>
+        <w:numPr>
+          <w:ilvl w:val="0"/>
+          <w:numId w:val="1004"/>
+        </w:numPr>
+        <w:pStyle w:val="Compact"/>
+      </w:pPr>
+      <w:r>
+        <w:rPr>
+          <w:b/>
+        </w:rPr>
+        <w:t xml:space="preserve">Human validation checks the judge:</w:t>
+      </w:r>
+      <w:r>
+        <w:t xml:space="preserve"> </w:t>
+      </w:r>
+      <w:r>
+        <w:t xml:space="preserve">A blind human review of 10 cases</w:t>
+      </w:r>
+      <w:r>
+        <w:t xml:space="preserve"> </w:t>
+      </w:r>
+      <w:r>
+        <w:t xml:space="preserve">was selected before any judge verdicts were examined. The human grades</w:t>
+      </w:r>
+      <w:r>
+        <w:t xml:space="preserve"> </w:t>
+      </w:r>
+      <w:r>
+        <w:t xml:space="preserve">matched the judge on all 10 cases.</w:t>
+      </w:r>
+    </w:p>
+    <w:p>
+      <w:pPr>
+        <w:pStyle w:val="FirstParagraph"/>
+      </w:pPr>
+      <w:r>
+        <w:t xml:space="preserve">We prefer an LLM-as-a-judge because it can evaluate factual correctness,</w:t>
+      </w:r>
+      <w:r>
+        <w:t xml:space="preserve"> </w:t>
+      </w:r>
+      <w:r>
+        <w:t xml:space="preserve">evidence faithfulness, and appropriate abstention in context, which simple</w:t>
+      </w:r>
+      <w:r>
+        <w:t xml:space="preserve"> </w:t>
+      </w:r>
+      <w:r>
+        <w:t xml:space="preserve">reference-overlap metrics cannot reliably capture. However, we still</w:t>
+      </w:r>
+      <w:r>
+        <w:t xml:space="preserve"> </w:t>
+      </w:r>
+      <w:r>
+        <w:t xml:space="preserve">evaluated traditional lexical and semantic metrics empirically rather than</w:t>
+      </w:r>
+      <w:r>
+        <w:t xml:space="preserve"> </w:t>
+      </w:r>
+      <w:r>
+        <w:t xml:space="preserve">dismissing or adopting them by assumption.</w:t>
+      </w:r>
+    </w:p>
+    <w:p>
+      <w:pPr>
+        <w:pStyle w:val="BodyText"/>
+      </w:pPr>
+      <w:r>
+        <w:t xml:space="preserve">Traditional lexical/semantic metrics findings:</w:t>
+      </w:r>
+    </w:p>
+    <w:p>
+      <w:pPr>
+        <w:numPr>
+          <w:ilvl w:val="0"/>
+          <w:numId w:val="1005"/>
+        </w:numPr>
+        <w:pStyle w:val="Compact"/>
+      </w:pPr>
+      <w:r>
+        <w:rPr>
+          <w:b/>
+        </w:rPr>
+        <w:t xml:space="preserve">Lexical metrics:</w:t>
+      </w:r>
+    </w:p>
+    <w:p>
+      <w:pPr>
+        <w:numPr>
+          <w:ilvl w:val="1"/>
+          <w:numId w:val="1006"/>
+        </w:numPr>
+        <w:pStyle w:val="Compact"/>
+      </w:pPr>
+      <w:r>
+        <w:rPr>
+          <w:b/>
+        </w:rPr>
+        <w:t xml:space="preserve">BLEU and ROUGE were tested and rejected:</w:t>
+      </w:r>
+      <w:r>
+        <w:t xml:space="preserve"> </w:t>
+      </w:r>
+      <w:r>
+        <w:t xml:space="preserve">They were treated as</w:t>
+      </w:r>
+      <w:r>
+        <w:t xml:space="preserve"> </w:t>
+      </w:r>
+      <w:r>
+        <w:t xml:space="preserve">falsifiable metrics rather than assumed to be useful, which aligns with</w:t>
+      </w:r>
+      <w:r>
+        <w:t xml:space="preserve"> </w:t>
+      </w:r>
+      <w:r>
+        <w:t xml:space="preserve">our expectations. The baseline’s incorrect answer scored above the</w:t>
+      </w:r>
+      <w:r>
+        <w:t xml:space="preserve"> </w:t>
+      </w:r>
+      <w:r>
+        <w:t xml:space="preserve">average correct answer on ROUGE-1, while correct answers ranged from</w:t>
+      </w:r>
+      <w:r>
+        <w:t xml:space="preserve"> </w:t>
+      </w:r>
+      <w:r>
+        <w:t xml:space="preserve">0.00 to 0.76. Because fluent but incorrect answers can overlap heavily</w:t>
+      </w:r>
+      <w:r>
+        <w:t xml:space="preserve"> </w:t>
+      </w:r>
+      <w:r>
+        <w:t xml:space="preserve">with short reference answers, no useful threshold separated correct from</w:t>
+      </w:r>
+      <w:r>
+        <w:t xml:space="preserve"> </w:t>
+      </w:r>
+      <w:r>
+        <w:t xml:space="preserve">incorrect responses.</w:t>
+      </w:r>
+    </w:p>
+    <w:p>
+      <w:pPr>
+        <w:numPr>
+          <w:ilvl w:val="0"/>
+          <w:numId w:val="1005"/>
+        </w:numPr>
+        <w:pStyle w:val="Compact"/>
+      </w:pPr>
+      <w:r>
+        <w:rPr>
+          <w:b/>
+        </w:rPr>
+        <w:t xml:space="preserve">Semantic metrics:</w:t>
+      </w:r>
+    </w:p>
+    <w:p>
+      <w:pPr>
+        <w:numPr>
+          <w:ilvl w:val="1"/>
+          <w:numId w:val="1007"/>
+        </w:numPr>
+        <w:pStyle w:val="Compact"/>
+      </w:pPr>
+      <w:r>
+        <w:rPr>
+          <w:b/>
+        </w:rPr>
+        <w:t xml:space="preserve">BERTScore was deferred:</w:t>
+      </w:r>
+      <w:r>
+        <w:t xml:space="preserve"> </w:t>
+      </w:r>
+      <w:r>
+        <w:t xml:space="preserve">Its model files could not be downloaded in</w:t>
+      </w:r>
+      <w:r>
+        <w:t xml:space="preserve"> </w:t>
+      </w:r>
+      <w:r>
+        <w:t xml:space="preserve">the development environment, but it can be recomputed later from the</w:t>
+      </w:r>
+      <w:r>
+        <w:t xml:space="preserve"> </w:t>
+      </w:r>
+      <w:r>
+        <w:t xml:space="preserve">saved artifacts.</w:t>
+      </w:r>
+    </w:p>
+    <w:p>
+      <w:pPr>
+        <w:numPr>
+          <w:ilvl w:val="1"/>
+          <w:numId w:val="1007"/>
+        </w:numPr>
+        <w:pStyle w:val="Compact"/>
+      </w:pPr>
+      <w:r>
+        <w:rPr>
+          <w:b/>
+        </w:rPr>
+        <w:t xml:space="preserve">MoverScore was excluded:</w:t>
+      </w:r>
+      <w:r>
+        <w:t xml:space="preserve"> </w:t>
+      </w:r>
+      <w:r>
+        <w:t xml:space="preserve">Its dependencies could not be built</w:t>
+      </w:r>
+      <w:r>
+        <w:t xml:space="preserve"> </w:t>
+      </w:r>
+      <w:r>
+        <w:t xml:space="preserve">successfully in the development environment.</w:t>
       </w:r>
     </w:p>
     <w:p>
       <w:pPr>
         <w:pStyle w:val="Heading2"/>
       </w:pPr>
-      <w:bookmarkStart w:id="23" w:name="run-history-and-key-iterations"/>
-      <w:r>
-        <w:t xml:space="preserve">3. Run history and key iterations</w:t>
-      </w:r>
-      <w:bookmarkEnd w:id="23"/>
+      <w:bookmarkStart w:id="26" w:name="key-iterations"/>
+      <w:r>
+        <w:t xml:space="preserve">3. Key iterations</w:t>
+      </w:r>
+      <w:bookmarkEnd w:id="26"/>
     </w:p>
     <w:tbl>
       <w:tblPr>
@@ -1236,7 +1418,7 @@
               <w:jc w:val="left"/>
             </w:pPr>
             <w:r>
-              <w:t xml:space="preserve">Run</w:t>
+              <w:t xml:space="preserve">#</w:t>
             </w:r>
           </w:p>
         </w:tc>
@@ -1916,19 +2098,7 @@
               <w:jc w:val="left"/>
             </w:pPr>
             <w:r>
-              <w:t xml:space="preserve">Citation coverage 1.0,</w:t>
-            </w:r>
-            <w:r>
-              <w:t xml:space="preserve"> </w:t>
-            </w:r>
-            <w:r>
-              <w:rPr>
-                <w:b/>
-              </w:rPr>
-              <w:t xml:space="preserve">zero invented/misattributed citations</w:t>
-            </w:r>
-            <w:r>
-              <w:t xml:space="preserve">; default-mode metrics identical (cite instructions append only under the flag); side claims dropped to 0/21 — requiring a marker per claim appears to suppress memory embellishment</w:t>
+              <w:t xml:space="preserve">Citation coverage 1.0, zero invented/misattributed citations; default-mode metrics identical (cite instructions append only under the flag); side claims dropped to 0/21 — requiring a marker per claim appears to suppress memory embellishment</w:t>
             </w:r>
           </w:p>
         </w:tc>
@@ -1968,64 +2138,49 @@
         <w:rPr>
           <w:b/>
         </w:rPr>
-        <w:t xml:space="preserve">Transparency note on the final 40/40:</w:t>
-      </w:r>
-      <w:r>
-        <w:t xml:space="preserve"> </w:t>
-      </w:r>
-      <w:r>
-        <w:t xml:space="preserve">run 8’s perfect score came after</w:t>
-      </w:r>
-      <w:r>
-        <w:t xml:space="preserve"> </w:t>
-      </w:r>
-      <w:r>
-        <w:t xml:space="preserve">two</w:t>
-      </w:r>
-      <w:r>
-        <w:t xml:space="preserve"> </w:t>
-      </w:r>
-      <w:r>
-        <w:rPr>
-          <w:i/>
-        </w:rPr>
-        <w:t xml:space="preserve">eval-side</w:t>
-      </w:r>
-      <w:r>
-        <w:t xml:space="preserve"> </w:t>
-      </w:r>
-      <w:r>
-        <w:t xml:space="preserve">calibrations made between runs 7 and 8 — (a) r09’s grading</w:t>
-      </w:r>
-      <w:r>
-        <w:t xml:space="preserve"> </w:t>
-      </w:r>
-      <w:r>
-        <w:t xml:space="preserve">notes now accept either 1906 or 1907 because the Wikipedia article itself</w:t>
-      </w:r>
-      <w:r>
-        <w:t xml:space="preserve"> </w:t>
-      </w:r>
-      <w:r>
-        <w:t xml:space="preserve">states both (our infobox feature exposed the discrepancy; the model’s answer</w:t>
-      </w:r>
-      <w:r>
-        <w:t xml:space="preserve"> </w:t>
-      </w:r>
-      <w:r>
-        <w:t xml:space="preserve">was faithful to retrieved evidence), and (b) a metric labeling fix so the</w:t>
-      </w:r>
-      <w:r>
-        <w:t xml:space="preserve"> </w:t>
-      </w:r>
-      <w:r>
-        <w:t xml:space="preserve">by-design dead-end abstention isn’t counted as a wrong abstention. The agent</w:t>
-      </w:r>
-      <w:r>
-        <w:t xml:space="preserve"> </w:t>
-      </w:r>
-      <w:r>
-        <w:t xml:space="preserve">configuration was byte-identical across runs 7 and 8; without the r09</w:t>
+        <w:t xml:space="preserve">Transparency note on the final 40/40 score:</w:t>
+      </w:r>
+      <w:r>
+        <w:t xml:space="preserve"> </w:t>
+      </w:r>
+      <w:r>
+        <w:t xml:space="preserve">run 8’s perfect score came</w:t>
+      </w:r>
+      <w:r>
+        <w:t xml:space="preserve"> </w:t>
+      </w:r>
+      <w:r>
+        <w:t xml:space="preserve">after two eval-side calibrations made between runs 7 and 8 — (a) r09’s</w:t>
+      </w:r>
+      <w:r>
+        <w:t xml:space="preserve"> </w:t>
+      </w:r>
+      <w:r>
+        <w:t xml:space="preserve">grading notes now accept either 1906 or 1907 because the Wikipedia article</w:t>
+      </w:r>
+      <w:r>
+        <w:t xml:space="preserve"> </w:t>
+      </w:r>
+      <w:r>
+        <w:t xml:space="preserve">itself states both (our infobox feature exposed the discrepancy; the model’s</w:t>
+      </w:r>
+      <w:r>
+        <w:t xml:space="preserve"> </w:t>
+      </w:r>
+      <w:r>
+        <w:t xml:space="preserve">answer was faithful to retrieved evidence), and (b) a metric labeling fix so</w:t>
+      </w:r>
+      <w:r>
+        <w:t xml:space="preserve"> </w:t>
+      </w:r>
+      <w:r>
+        <w:t xml:space="preserve">the by-design dead-end abstention isn’t counted as a wrong abstention. The</w:t>
+      </w:r>
+      <w:r>
+        <w:t xml:space="preserve"> </w:t>
+      </w:r>
+      <w:r>
+        <w:t xml:space="preserve">agent configuration was byte-identical across runs 7 and 8; without the r09</w:t>
       </w:r>
       <w:r>
         <w:t xml:space="preserve"> </w:t>
@@ -2050,526 +2205,802 @@
       <w:pPr>
         <w:pStyle w:val="Heading2"/>
       </w:pPr>
-      <w:bookmarkStart w:id="24" w:name="Xc3247faa838c2ddbf5d26769fcdacd2a0e69eee"/>
+      <w:bookmarkStart w:id="27" w:name="Xc3247faa838c2ddbf5d26769fcdacd2a0e69eee"/>
       <w:r>
         <w:t xml:space="preserve">4. Where it succeeds, where it fails, what we learned</w:t>
       </w:r>
-      <w:bookmarkEnd w:id="24"/>
+      <w:bookmarkEnd w:id="27"/>
     </w:p>
     <w:p>
       <w:pPr>
         <w:pStyle w:val="FirstParagraph"/>
       </w:pPr>
       <w:r>
-        <w:rPr>
-          <w:b/>
-        </w:rPr>
-        <w:t xml:space="preserve">Succeeds:</w:t>
-      </w:r>
-      <w:r>
-        <w:t xml:space="preserve"> </w:t>
-      </w:r>
-      <w:r>
-        <w:t xml:space="preserve">search-decision calibration (recall 0.96, precision 1.0 on</w:t>
-      </w:r>
-      <w:r>
-        <w:t xml:space="preserve"> </w:t>
-      </w:r>
-      <w:r>
-        <w:t xml:space="preserve">every run of the project); disambiguation (right-article 1.0 once actually</w:t>
-      </w:r>
-      <w:r>
-        <w:t xml:space="preserve"> </w:t>
-      </w:r>
-      <w:r>
-        <w:t xml:space="preserve">exercised); evidence grounding (zero faithfulness violations in the final</w:t>
-      </w:r>
-      <w:r>
-        <w:t xml:space="preserve"> </w:t>
-      </w:r>
-      <w:r>
-        <w:t xml:space="preserve">config); honest abstention on unanswerables and dead-end chains; multi-hop</w:t>
-      </w:r>
-      <w:r>
-        <w:t xml:space="preserve"> </w:t>
-      </w:r>
-      <w:r>
-        <w:t xml:space="preserve">chaining including memory-proof intermediates; citation mode (opt-in</w:t>
-      </w:r>
-      <w:r>
-        <w:t xml:space="preserve"> </w:t>
-      </w:r>
-      <w:r>
-        <w:rPr>
-          <w:rStyle w:val="VerbatimChar"/>
-        </w:rPr>
-        <w:t xml:space="preserve">--cite</w:t>
-      </w:r>
-      <w:r>
-        <w:t xml:space="preserve">): complete coverage with zero invented citations on its baseline,</w:t>
-      </w:r>
-      <w:r>
-        <w:t xml:space="preserve"> </w:t>
-      </w:r>
-      <w:r>
-        <w:t xml:space="preserve">and — a design finding worth keeping — the citation requirement eliminated</w:t>
-      </w:r>
-      <w:r>
-        <w:t xml:space="preserve"> </w:t>
-      </w:r>
-      <w:r>
-        <w:t xml:space="preserve">the residual unsupported side claims (0/21 vs ~1 per default-mode run),</w:t>
-      </w:r>
-      <w:r>
-        <w:t xml:space="preserve"> </w:t>
-      </w:r>
-      <w:r>
-        <w:t xml:space="preserve">because a claim that needs a marker to justify itself doesn’t get written</w:t>
-      </w:r>
-      <w:r>
-        <w:t xml:space="preserve"> </w:t>
-      </w:r>
-      <w:r>
-        <w:t xml:space="preserve">from memory.</w:t>
-      </w:r>
-    </w:p>
-    <w:p>
-      <w:pPr>
-        <w:pStyle w:val="BodyText"/>
-      </w:pPr>
-      <w:r>
-        <w:rPr>
-          <w:b/>
-        </w:rPr>
-        <w:t xml:space="preserve">Known residual failures, consciously accepted:</w:t>
+        <w:t xml:space="preserve">Where it succeeds:</w:t>
       </w:r>
     </w:p>
     <w:p>
       <w:pPr>
         <w:numPr>
           <w:ilvl w:val="0"/>
-          <w:numId w:val="1003"/>
+          <w:numId w:val="1008"/>
         </w:numPr>
         <w:pStyle w:val="Compact"/>
       </w:pPr>
       <w:r>
-        <w:t xml:space="preserve">r08-class: stable decades-old historical years are sometimes answered</w:t>
-      </w:r>
-      <w:r>
-        <w:t xml:space="preserve"> </w:t>
-      </w:r>
-      <w:r>
-        <w:t xml:space="preserve">from memory (correctly) despite the</w:t>
-      </w:r>
-      <w:r>
-        <w:t xml:space="preserve"> </w:t>
-      </w:r>
-      <w:r>
-        <w:t xml:space="preserve">“</w:t>
-      </w:r>
-      <w:r>
-        <w:t xml:space="preserve">specific years</w:t>
-      </w:r>
-      <w:r>
-        <w:t xml:space="preserve">”</w:t>
-      </w:r>
-      <w:r>
-        <w:t xml:space="preserve"> </w:t>
-      </w:r>
-      <w:r>
-        <w:t xml:space="preserve">trigger — a ±1-case</w:t>
-      </w:r>
-      <w:r>
-        <w:t xml:space="preserve"> </w:t>
-      </w:r>
-      <w:r>
-        <w:t xml:space="preserve">noise band we kept, because tightening the wording risks the precision</w:t>
-      </w:r>
-      <w:r>
-        <w:t xml:space="preserve"> </w:t>
-      </w:r>
-      <w:r>
-        <w:t xml:space="preserve">that never dropped.</w:t>
+        <w:rPr>
+          <w:b/>
+        </w:rPr>
+        <w:t xml:space="preserve">Search decisions:</w:t>
+      </w:r>
+      <w:r>
+        <w:t xml:space="preserve"> </w:t>
+      </w:r>
+      <w:r>
+        <w:t xml:space="preserve">The final system achieved 0.96 recall and 1.0</w:t>
+      </w:r>
+      <w:r>
+        <w:t xml:space="preserve"> </w:t>
+      </w:r>
+      <w:r>
+        <w:t xml:space="preserve">precision, meaning it retrieved information when needed with almost no</w:t>
+      </w:r>
+      <w:r>
+        <w:t xml:space="preserve"> </w:t>
+      </w:r>
+      <w:r>
+        <w:t xml:space="preserve">unnecessary searches.</w:t>
       </w:r>
     </w:p>
     <w:p>
       <w:pPr>
         <w:numPr>
           <w:ilvl w:val="0"/>
-          <w:numId w:val="1003"/>
+          <w:numId w:val="1008"/>
         </w:numPr>
         <w:pStyle w:val="Compact"/>
       </w:pPr>
       <w:r>
-        <w:t xml:space="preserve">Unsupported side details on otherwise-grounded answers, measured at ~5%</w:t>
-      </w:r>
-      <w:r>
-        <w:t xml:space="preserve"> </w:t>
-      </w:r>
-      <w:r>
-        <w:t xml:space="preserve">of searched answers by the judge-v4 hallucination rubric — small memory</w:t>
-      </w:r>
-      <w:r>
-        <w:t xml:space="preserve"> </w:t>
-      </w:r>
-      <w:r>
-        <w:t xml:space="preserve">embellishments like a</w:t>
-      </w:r>
-      <w:r>
-        <w:t xml:space="preserve"> </w:t>
-      </w:r>
-      <w:r>
-        <w:t xml:space="preserve">“</w:t>
-      </w:r>
-      <w:r>
-        <w:t xml:space="preserve">(France/PSG)</w:t>
-      </w:r>
-      <w:r>
-        <w:t xml:space="preserve">”</w:t>
-      </w:r>
-      <w:r>
-        <w:t xml:space="preserve"> </w:t>
-      </w:r>
-      <w:r>
-        <w:t xml:space="preserve">affiliation or a</w:t>
-      </w:r>
-      <w:r>
-        <w:t xml:space="preserve"> </w:t>
-      </w:r>
-      <w:r>
-        <w:t xml:space="preserve">“</w:t>
-      </w:r>
-      <w:r>
-        <w:t xml:space="preserve">(12 August 1970)</w:t>
-      </w:r>
-      <w:r>
-        <w:t xml:space="preserve">”</w:t>
-      </w:r>
-      <w:r>
-        <w:t xml:space="preserve"> </w:t>
-      </w:r>
-      <w:r>
-        <w:t xml:space="preserve">day-and-month where evidence gave only the year. True facts in both</w:t>
-      </w:r>
-      <w:r>
-        <w:t xml:space="preserve"> </w:t>
-      </w:r>
-      <w:r>
-        <w:t xml:space="preserve">observed instances, but unverified specifics of exactly the class that</w:t>
-      </w:r>
-      <w:r>
-        <w:t xml:space="preserve"> </w:t>
-      </w:r>
-      <w:r>
-        <w:t xml:space="preserve">eventually goes wrong. Tracked in every run; a one-line prompt remedy is</w:t>
-      </w:r>
-      <w:r>
-        <w:t xml:space="preserve"> </w:t>
-      </w:r>
-      <w:r>
-        <w:t xml:space="preserve">ready if the rate climbs on a larger case set.</w:t>
+        <w:rPr>
+          <w:b/>
+        </w:rPr>
+        <w:t xml:space="preserve">Disambiguation:</w:t>
+      </w:r>
+      <w:r>
+        <w:t xml:space="preserve"> </w:t>
+      </w:r>
+      <w:r>
+        <w:t xml:space="preserve">When retrieval was used, the system consistently</w:t>
+      </w:r>
+      <w:r>
+        <w:t xml:space="preserve"> </w:t>
+      </w:r>
+      <w:r>
+        <w:t xml:space="preserve">selected the correct article, achieving a right-article score of 1.0.</w:t>
       </w:r>
     </w:p>
     <w:p>
       <w:pPr>
         <w:numPr>
           <w:ilvl w:val="0"/>
-          <w:numId w:val="1003"/>
+          <w:numId w:val="1008"/>
         </w:numPr>
         <w:pStyle w:val="Compact"/>
       </w:pPr>
       <w:r>
-        <w:t xml:space="preserve">Facts deep in very long articles can fall below the 6k-char extract</w:t>
-      </w:r>
-      <w:r>
-        <w:t xml:space="preserve"> </w:t>
-      </w:r>
-      <w:r>
-        <w:t xml:space="preserve">cut; snippets and infoboxes cover the common cases (tables, infoboxes)</w:t>
-      </w:r>
-      <w:r>
-        <w:t xml:space="preserve"> </w:t>
-      </w:r>
-      <w:r>
-        <w:t xml:space="preserve">but not all of them.</w:t>
+        <w:rPr>
+          <w:b/>
+        </w:rPr>
+        <w:t xml:space="preserve">Evidence grounding:</w:t>
+      </w:r>
+      <w:r>
+        <w:t xml:space="preserve"> </w:t>
+      </w:r>
+      <w:r>
+        <w:t xml:space="preserve">The final configuration had no faithfulness</w:t>
+      </w:r>
+      <w:r>
+        <w:t xml:space="preserve"> </w:t>
+      </w:r>
+      <w:r>
+        <w:t xml:space="preserve">violations. Answers remained supported by the retrieved evidence rather</w:t>
+      </w:r>
+      <w:r>
+        <w:t xml:space="preserve"> </w:t>
+      </w:r>
+      <w:r>
+        <w:t xml:space="preserve">than relying on unverified model memory.</w:t>
       </w:r>
     </w:p>
     <w:p>
       <w:pPr>
         <w:numPr>
           <w:ilvl w:val="0"/>
-          <w:numId w:val="1003"/>
+          <w:numId w:val="1008"/>
         </w:numPr>
         <w:pStyle w:val="Compact"/>
       </w:pPr>
       <w:r>
-        <w:t xml:space="preserve">Live-Wikipedia ground truth drifts (and is occasionally</w:t>
-      </w:r>
-      <w:r>
-        <w:t xml:space="preserve"> </w:t>
-      </w:r>
-      <w:r>
-        <w:t xml:space="preserve">self-contradictory, per r09) — the eval mitigates with</w:t>
-      </w:r>
-      <w:r>
-        <w:t xml:space="preserve"> </w:t>
-      </w:r>
-      <w:r>
-        <w:t xml:space="preserve">grade-against-evidence notes, not immunity.</w:t>
-      </w:r>
-    </w:p>
-    <w:p>
-      <w:pPr>
-        <w:pStyle w:val="FirstParagraph"/>
-      </w:pPr>
-      <w:r>
-        <w:rPr>
-          <w:b/>
-        </w:rPr>
-        <w:t xml:space="preserve">Biggest lessons:</w:t>
-      </w:r>
-      <w:r>
-        <w:t xml:space="preserve"> </w:t>
-      </w:r>
-      <w:r>
-        <w:t xml:space="preserve">(1) pass rate without staged metrics is actively</w:t>
-      </w:r>
-      <w:r>
-        <w:t xml:space="preserve"> </w:t>
-      </w:r>
-      <w:r>
-        <w:t xml:space="preserve">misleading — the v0 run</w:t>
-      </w:r>
-      <w:r>
-        <w:t xml:space="preserve"> </w:t>
-      </w:r>
-      <w:r>
-        <w:t xml:space="preserve">“</w:t>
-      </w:r>
-      <w:r>
-        <w:t xml:space="preserve">passed</w:t>
-      </w:r>
-      <w:r>
-        <w:t xml:space="preserve">”</w:t>
-      </w:r>
-      <w:r>
-        <w:t xml:space="preserve"> </w:t>
-      </w:r>
-      <w:r>
-        <w:t xml:space="preserve">97% while silently skipping verification on</w:t>
-      </w:r>
-      <w:r>
-        <w:t xml:space="preserve"> </w:t>
-      </w:r>
-      <w:r>
-        <w:t xml:space="preserve">two-thirds of the facts that needed it; (2) the model’s confidence is not a</w:t>
-      </w:r>
-      <w:r>
-        <w:t xml:space="preserve"> </w:t>
-      </w:r>
-      <w:r>
-        <w:t xml:space="preserve">usable search trigger, but fact-shape is; (3) a meaningful share of</w:t>
-      </w:r>
-      <w:r>
-        <w:t xml:space="preserve"> </w:t>
-      </w:r>
-      <w:r>
-        <w:t xml:space="preserve">“</w:t>
-      </w:r>
-      <w:r>
-        <w:t xml:space="preserve">prompt</w:t>
-      </w:r>
-      <w:r>
-        <w:t xml:space="preserve"> </w:t>
-      </w:r>
-      <w:r>
-        <w:t xml:space="preserve">problems</w:t>
-      </w:r>
-      <w:r>
-        <w:t xml:space="preserve">”</w:t>
-      </w:r>
-      <w:r>
-        <w:t xml:space="preserve"> </w:t>
-      </w:r>
-      <w:r>
-        <w:t xml:space="preserve">were retrieval-layer problems (rate limits, stripped tables and</w:t>
-      </w:r>
-      <w:r>
-        <w:t xml:space="preserve"> </w:t>
-      </w:r>
-      <w:r>
-        <w:t xml:space="preserve">infoboxes) that no prompt could fix; (4) grade the grader — version-tagged</w:t>
-      </w:r>
-      <w:r>
-        <w:t xml:space="preserve"> </w:t>
-      </w:r>
-      <w:r>
-        <w:t xml:space="preserve">judge changes plus judge-only replay over frozen transcripts let</w:t>
-      </w:r>
-      <w:r>
-        <w:t xml:space="preserve"> </w:t>
-      </w:r>
-      <w:r>
-        <w:t xml:space="preserve">hallucination coverage be added retroactively, and measuring that residual</w:t>
-      </w:r>
-      <w:r>
-        <w:t xml:space="preserve"> </w:t>
-      </w:r>
-      <w:r>
-        <w:t xml:space="preserve">(~5%)</w:t>
-      </w:r>
-      <w:r>
-        <w:t xml:space="preserve"> </w:t>
-      </w:r>
-      <w:r>
-        <w:rPr>
-          <w:i/>
-        </w:rPr>
-        <w:t xml:space="preserve">before</w:t>
-      </w:r>
-      <w:r>
-        <w:t xml:space="preserve"> </w:t>
-      </w:r>
-      <w:r>
-        <w:t xml:space="preserve">prompting against it kept us from trading answer quality for</w:t>
-      </w:r>
-      <w:r>
-        <w:t xml:space="preserve"> </w:t>
-      </w:r>
-      <w:r>
-        <w:t xml:space="preserve">a two-claim problem.</w:t>
-      </w:r>
-    </w:p>
-    <w:p>
-      <w:pPr>
-        <w:pStyle w:val="Heading2"/>
-      </w:pPr>
-      <w:bookmarkStart w:id="25" w:name="with-more-time"/>
-      <w:r>
-        <w:t xml:space="preserve">5. With more time</w:t>
-      </w:r>
-      <w:bookmarkEnd w:id="25"/>
+        <w:rPr>
+          <w:b/>
+        </w:rPr>
+        <w:t xml:space="preserve">Abstention:</w:t>
+      </w:r>
+      <w:r>
+        <w:t xml:space="preserve"> </w:t>
+      </w:r>
+      <w:r>
+        <w:t xml:space="preserve">The system correctly declined to answer unanswerable</w:t>
+      </w:r>
+      <w:r>
+        <w:t xml:space="preserve"> </w:t>
+      </w:r>
+      <w:r>
+        <w:t xml:space="preserve">questions and multi-hop questions whose evidence chains ended without a</w:t>
+      </w:r>
+      <w:r>
+        <w:t xml:space="preserve"> </w:t>
+      </w:r>
+      <w:r>
+        <w:t xml:space="preserve">supported answer.</w:t>
+      </w:r>
     </w:p>
     <w:p>
       <w:pPr>
         <w:numPr>
           <w:ilvl w:val="0"/>
-          <w:numId w:val="1004"/>
+          <w:numId w:val="1008"/>
         </w:numPr>
         <w:pStyle w:val="Compact"/>
       </w:pPr>
       <w:r>
-        <w:t xml:space="preserve">Expand the case set (the honest next step once a 40-case suite saturates);</w:t>
-      </w:r>
-      <w:r>
-        <w:t xml:space="preserve"> </w:t>
-      </w:r>
-      <w:r>
-        <w:t xml:space="preserve">multiple eval repetitions per config for confidence intervals.</w:t>
+        <w:rPr>
+          <w:b/>
+        </w:rPr>
+        <w:t xml:space="preserve">Multi-hop reasoning:</w:t>
+      </w:r>
+      <w:r>
+        <w:t xml:space="preserve"> </w:t>
+      </w:r>
+      <w:r>
+        <w:t xml:space="preserve">It successfully completed chained searches,</w:t>
+      </w:r>
+      <w:r>
+        <w:t xml:space="preserve"> </w:t>
+      </w:r>
+      <w:r>
+        <w:t xml:space="preserve">including cases where intermediate answers were intentionally too obscure</w:t>
+      </w:r>
+      <w:r>
+        <w:t xml:space="preserve"> </w:t>
+      </w:r>
+      <w:r>
+        <w:t xml:space="preserve">to recover reliably from memory.</w:t>
       </w:r>
     </w:p>
     <w:p>
       <w:pPr>
         <w:numPr>
           <w:ilvl w:val="0"/>
-          <w:numId w:val="1004"/>
+          <w:numId w:val="1008"/>
         </w:numPr>
         <w:pStyle w:val="Compact"/>
       </w:pPr>
       <w:r>
-        <w:t xml:space="preserve">Recompute BERTScore offline and finish the semantic-metric verdict.</w:t>
+        <w:rPr>
+          <w:b/>
+        </w:rPr>
+        <w:t xml:space="preserve">Citation mode:</w:t>
+      </w:r>
+      <w:r>
+        <w:t xml:space="preserve"> </w:t>
+      </w:r>
+      <w:r>
+        <w:t xml:space="preserve">The optional</w:t>
+      </w:r>
+      <w:r>
+        <w:t xml:space="preserve"> </w:t>
+      </w:r>
+      <w:r>
+        <w:rPr>
+          <w:rStyle w:val="VerbatimChar"/>
+        </w:rPr>
+        <w:t xml:space="preserve">--cite</w:t>
+      </w:r>
+      <w:r>
+        <w:t xml:space="preserve"> </w:t>
+      </w:r>
+      <w:r>
+        <w:t xml:space="preserve">mode achieved complete citation</w:t>
+      </w:r>
+      <w:r>
+        <w:t xml:space="preserve"> </w:t>
+      </w:r>
+      <w:r>
+        <w:t xml:space="preserve">coverage with no invented or misattributed citations. It also eliminated</w:t>
+      </w:r>
+      <w:r>
+        <w:t xml:space="preserve"> </w:t>
+      </w:r>
+      <w:r>
+        <w:t xml:space="preserve">unsupported side claims, reducing them from roughly one per default-mode</w:t>
+      </w:r>
+      <w:r>
+        <w:t xml:space="preserve"> </w:t>
+      </w:r>
+      <w:r>
+        <w:t xml:space="preserve">run to 0 out of 21 searched answers. Requiring a citation for each claim</w:t>
+      </w:r>
+      <w:r>
+        <w:t xml:space="preserve"> </w:t>
+      </w:r>
+      <w:r>
+        <w:t xml:space="preserve">appears to discourage the model from adding details from memory.</w:t>
+      </w:r>
+    </w:p>
+    <w:p>
+      <w:pPr>
+        <w:pStyle w:val="FirstParagraph"/>
+      </w:pPr>
+      <w:r>
+        <w:t xml:space="preserve">Known residual failures:</w:t>
       </w:r>
     </w:p>
     <w:p>
       <w:pPr>
         <w:numPr>
           <w:ilvl w:val="0"/>
-          <w:numId w:val="1004"/>
+          <w:numId w:val="1009"/>
         </w:numPr>
         <w:pStyle w:val="Compact"/>
       </w:pPr>
       <w:r>
-        <w:t xml:space="preserve">Query rewriting and &gt;2-hop planning (deferred from v0 by design; the eval</w:t>
-      </w:r>
-      <w:r>
-        <w:t xml:space="preserve"> </w:t>
-      </w:r>
-      <w:r>
-        <w:t xml:space="preserve">now exists to justify them the moment cases demand it).</w:t>
+        <w:rPr>
+          <w:b/>
+        </w:rPr>
+        <w:t xml:space="preserve">Occasional missed searches:</w:t>
+      </w:r>
+      <w:r>
+        <w:t xml:space="preserve"> </w:t>
+      </w:r>
+      <w:r>
+        <w:t xml:space="preserve">The model sometimes answers stable,</w:t>
+      </w:r>
+      <w:r>
+        <w:t xml:space="preserve"> </w:t>
+      </w:r>
+      <w:r>
+        <w:t xml:space="preserve">decades-old historical dates from memory despite the prompt’s</w:t>
+      </w:r>
+      <w:r>
+        <w:t xml:space="preserve"> </w:t>
+      </w:r>
+      <w:r>
+        <w:t xml:space="preserve">“</w:t>
+      </w:r>
+      <w:r>
+        <w:t xml:space="preserve">specific</w:t>
+      </w:r>
+      <w:r>
+        <w:t xml:space="preserve"> </w:t>
+      </w:r>
+      <w:r>
+        <w:t xml:space="preserve">years</w:t>
+      </w:r>
+      <w:r>
+        <w:t xml:space="preserve">”</w:t>
+      </w:r>
+      <w:r>
+        <w:t xml:space="preserve"> </w:t>
+      </w:r>
+      <w:r>
+        <w:t xml:space="preserve">search trigger. These answers have remained correct, and the</w:t>
+      </w:r>
+      <w:r>
+        <w:t xml:space="preserve"> </w:t>
+      </w:r>
+      <w:r>
+        <w:t xml:space="preserve">roughly one-case variation was accepted because stronger wording could</w:t>
+      </w:r>
+      <w:r>
+        <w:t xml:space="preserve"> </w:t>
+      </w:r>
+      <w:r>
+        <w:t xml:space="preserve">reduce search precision.</w:t>
       </w:r>
     </w:p>
     <w:p>
       <w:pPr>
         <w:numPr>
           <w:ilvl w:val="0"/>
-          <w:numId w:val="1004"/>
+          <w:numId w:val="1009"/>
         </w:numPr>
         <w:pStyle w:val="Compact"/>
       </w:pPr>
       <w:r>
-        <w:t xml:space="preserve">Decide whether citation mode becomes the default: its eval gate has now</w:t>
-      </w:r>
-      <w:r>
-        <w:t xml:space="preserve"> </w:t>
-      </w:r>
-      <w:r>
-        <w:t xml:space="preserve">been passed (coverage 1.0, zero invented citations, side claims</w:t>
-      </w:r>
-      <w:r>
-        <w:t xml:space="preserve"> </w:t>
-      </w:r>
-      <w:r>
-        <w:t xml:space="preserve">suppressed to zero), so the remaining question is product taste — the</w:t>
-      </w:r>
-      <w:r>
-        <w:t xml:space="preserve"> </w:t>
-      </w:r>
-      <w:r>
-        <w:t xml:space="preserve">~10% token overhead and the visual weight of markers — plus validation on</w:t>
-      </w:r>
-      <w:r>
-        <w:t xml:space="preserve"> </w:t>
-      </w:r>
-      <w:r>
-        <w:t xml:space="preserve">a larger case set before flipping the default.</w:t>
+        <w:rPr>
+          <w:b/>
+        </w:rPr>
+        <w:t xml:space="preserve">Unsupported side details:</w:t>
+      </w:r>
+      <w:r>
+        <w:t xml:space="preserve"> </w:t>
+      </w:r>
+      <w:r>
+        <w:t xml:space="preserve">Roughly 5% of searched answers contain a</w:t>
+      </w:r>
+      <w:r>
+        <w:t xml:space="preserve"> </w:t>
+      </w:r>
+      <w:r>
+        <w:t xml:space="preserve">small detail not supported by the retrieved evidence, such as adding</w:t>
+      </w:r>
+      <w:r>
+        <w:t xml:space="preserve"> </w:t>
+      </w:r>
+      <w:r>
+        <w:t xml:space="preserve">“</w:t>
+      </w:r>
+      <w:r>
+        <w:t xml:space="preserve">France/PSG</w:t>
+      </w:r>
+      <w:r>
+        <w:t xml:space="preserve">”</w:t>
+      </w:r>
+      <w:r>
+        <w:t xml:space="preserve"> </w:t>
+      </w:r>
+      <w:r>
+        <w:t xml:space="preserve">or providing a full date when the source includes only the</w:t>
+      </w:r>
+      <w:r>
+        <w:t xml:space="preserve"> </w:t>
+      </w:r>
+      <w:r>
+        <w:t xml:space="preserve">year. The observed details happened to be correct, but they represent the</w:t>
+      </w:r>
+      <w:r>
+        <w:t xml:space="preserve"> </w:t>
+      </w:r>
+      <w:r>
+        <w:t xml:space="preserve">same kind of unverified embellishment that could eventually produce an</w:t>
+      </w:r>
+      <w:r>
+        <w:t xml:space="preserve"> </w:t>
+      </w:r>
+      <w:r>
+        <w:t xml:space="preserve">error. The rate is tracked across runs, with a prompt-level fix ready if</w:t>
+      </w:r>
+      <w:r>
+        <w:t xml:space="preserve"> </w:t>
+      </w:r>
+      <w:r>
+        <w:t xml:space="preserve">it increases on a larger eval set.</w:t>
       </w:r>
     </w:p>
     <w:p>
       <w:pPr>
         <w:numPr>
           <w:ilvl w:val="0"/>
-          <w:numId w:val="1004"/>
+          <w:numId w:val="1009"/>
         </w:numPr>
         <w:pStyle w:val="Compact"/>
       </w:pPr>
       <w:r>
-        <w:t xml:space="preserve">A second human grading pass on the full 40 cases to bound judge error, and</w:t>
-      </w:r>
-      <w:r>
-        <w:t xml:space="preserve"> </w:t>
-      </w:r>
-      <w:r>
-        <w:t xml:space="preserve">an agent-model ablation (Sonnet/Haiku as agent) on the same suite.</w:t>
+        <w:rPr>
+          <w:b/>
+        </w:rPr>
+        <w:t xml:space="preserve">Long-article truncation:</w:t>
+      </w:r>
+      <w:r>
+        <w:t xml:space="preserve"> </w:t>
+      </w:r>
+      <w:r>
+        <w:t xml:space="preserve">Relevant facts located deep within long</w:t>
+      </w:r>
+      <w:r>
+        <w:t xml:space="preserve"> </w:t>
+      </w:r>
+      <w:r>
+        <w:t xml:space="preserve">Wikipedia articles may fall beyond the 6,000-character extract limit.</w:t>
+      </w:r>
+      <w:r>
+        <w:t xml:space="preserve"> </w:t>
+      </w:r>
+      <w:r>
+        <w:t xml:space="preserve">Search snippets and infobox extraction recover many facts omitted from the</w:t>
+      </w:r>
+      <w:r>
+        <w:t xml:space="preserve"> </w:t>
+      </w:r>
+      <w:r>
+        <w:t xml:space="preserve">main extract, especially those in tables and infoboxes, but they do not</w:t>
+      </w:r>
+      <w:r>
+        <w:t xml:space="preserve"> </w:t>
+      </w:r>
+      <w:r>
+        <w:t xml:space="preserve">cover every case.</w:t>
       </w:r>
     </w:p>
     <w:p>
       <w:pPr>
         <w:numPr>
           <w:ilvl w:val="0"/>
-          <w:numId w:val="1004"/>
+          <w:numId w:val="1009"/>
         </w:numPr>
         <w:pStyle w:val="Compact"/>
       </w:pPr>
       <w:r>
-        <w:t xml:space="preserve">Automated prompt optimization, using</w:t>
-      </w:r>
-      <w:r>
-        <w:t xml:space="preserve"> </w:t>
-      </w:r>
-      <w:r>
-        <w:t xml:space="preserve">APO (</w:t>
-      </w:r>
-      <w:hyperlink r:id="rId26">
+        <w:rPr>
+          <w:b/>
+        </w:rPr>
+        <w:t xml:space="preserve">Changing or inconsistent sources:</w:t>
+      </w:r>
+      <w:r>
+        <w:t xml:space="preserve"> </w:t>
+      </w:r>
+      <w:r>
+        <w:t xml:space="preserve">Wikipedia content changes over time</w:t>
+      </w:r>
+      <w:r>
+        <w:t xml:space="preserve"> </w:t>
+      </w:r>
+      <w:r>
+        <w:t xml:space="preserve">and can occasionally contradict itself. In the r09 case, the article</w:t>
+      </w:r>
+      <w:r>
+        <w:t xml:space="preserve"> </w:t>
+      </w:r>
+      <w:r>
+        <w:t xml:space="preserve">listed different years in its prose and infobox. The eval handles known</w:t>
+      </w:r>
+      <w:r>
+        <w:t xml:space="preserve"> </w:t>
+      </w:r>
+      <w:r>
+        <w:t xml:space="preserve">conflicts by grading against the retrieved evidence and documenting</w:t>
+      </w:r>
+      <w:r>
+        <w:t xml:space="preserve"> </w:t>
+      </w:r>
+      <w:r>
+        <w:t xml:space="preserve">acceptable answers, but it cannot eliminate source-level inconsistency.</w:t>
+      </w:r>
+    </w:p>
+    <w:p>
+      <w:pPr>
+        <w:pStyle w:val="FirstParagraph"/>
+      </w:pPr>
+      <w:r>
+        <w:t xml:space="preserve">Biggest lessons:</w:t>
+      </w:r>
+    </w:p>
+    <w:p>
+      <w:pPr>
+        <w:numPr>
+          <w:ilvl w:val="0"/>
+          <w:numId w:val="1010"/>
+        </w:numPr>
+        <w:pStyle w:val="Compact"/>
+      </w:pPr>
+      <w:r>
+        <w:rPr>
+          <w:b/>
+        </w:rPr>
+        <w:t xml:space="preserve">Use staged metrics, not pass rate alone:</w:t>
+      </w:r>
+      <w:r>
+        <w:t xml:space="preserve"> </w:t>
+      </w:r>
+      <w:r>
+        <w:t xml:space="preserve">The v0 system passed 97% of</w:t>
+      </w:r>
+      <w:r>
+        <w:t xml:space="preserve"> </w:t>
+      </w:r>
+      <w:r>
+        <w:t xml:space="preserve">cases, but that number hid a major search-decision failure. It skipped</w:t>
+      </w:r>
+      <w:r>
+        <w:t xml:space="preserve"> </w:t>
+      </w:r>
+      <w:r>
+        <w:t xml:space="preserve">retrieval for two-thirds of the facts that required verification and often</w:t>
+      </w:r>
+      <w:r>
+        <w:t xml:space="preserve"> </w:t>
+      </w:r>
+      <w:r>
+        <w:t xml:space="preserve">passed only because the model happened to recall the correct answer.</w:t>
+      </w:r>
+      <w:r>
+        <w:t xml:space="preserve"> </w:t>
+      </w:r>
+      <w:r>
+        <w:t xml:space="preserve">Separately measuring search decisions, retrieval quality, and answer</w:t>
+      </w:r>
+      <w:r>
+        <w:t xml:space="preserve"> </w:t>
+      </w:r>
+      <w:r>
+        <w:t xml:space="preserve">quality exposed these latent failures.</w:t>
+      </w:r>
+    </w:p>
+    <w:p>
+      <w:pPr>
+        <w:numPr>
+          <w:ilvl w:val="0"/>
+          <w:numId w:val="1010"/>
+        </w:numPr>
+        <w:pStyle w:val="Compact"/>
+      </w:pPr>
+      <w:r>
+        <w:rPr>
+          <w:b/>
+        </w:rPr>
+        <w:t xml:space="preserve">Trigger search based on the type of fact:</w:t>
+      </w:r>
+      <w:r>
+        <w:t xml:space="preserve"> </w:t>
+      </w:r>
+      <w:r>
+        <w:t xml:space="preserve">The model’s confidence was</w:t>
+      </w:r>
+      <w:r>
+        <w:t xml:space="preserve"> </w:t>
+      </w:r>
+      <w:r>
+        <w:t xml:space="preserve">not a reliable signal because it could be highly confident about stale or</w:t>
+      </w:r>
+      <w:r>
+        <w:t xml:space="preserve"> </w:t>
+      </w:r>
+      <w:r>
+        <w:t xml:space="preserve">incorrect information. Search decisions became more reliable when based on</w:t>
+      </w:r>
+      <w:r>
+        <w:t xml:space="preserve"> </w:t>
+      </w:r>
+      <w:r>
+        <w:t xml:space="preserve">observable fact categories, such as current officeholders, changing</w:t>
+      </w:r>
+      <w:r>
+        <w:t xml:space="preserve"> </w:t>
+      </w:r>
+      <w:r>
+        <w:t xml:space="preserve">statistics, exact dates, and named specifics, rather than the model’s</w:t>
+      </w:r>
+      <w:r>
+        <w:t xml:space="preserve"> </w:t>
+      </w:r>
+      <w:r>
+        <w:t xml:space="preserve">subjective certainty.</w:t>
+      </w:r>
+    </w:p>
+    <w:p>
+      <w:pPr>
+        <w:numPr>
+          <w:ilvl w:val="0"/>
+          <w:numId w:val="1010"/>
+        </w:numPr>
+        <w:pStyle w:val="Compact"/>
+      </w:pPr>
+      <w:r>
+        <w:rPr>
+          <w:b/>
+        </w:rPr>
+        <w:t xml:space="preserve">Fix the right layer:</w:t>
+      </w:r>
+      <w:r>
+        <w:t xml:space="preserve"> </w:t>
+      </w:r>
+      <w:r>
+        <w:t xml:space="preserve">Several apparent prompt failures were actually</w:t>
+      </w:r>
+      <w:r>
+        <w:t xml:space="preserve"> </w:t>
+      </w:r>
+      <w:r>
+        <w:t xml:space="preserve">retrieval problems. Rate limits prevented evidence from being returned,</w:t>
+      </w:r>
+      <w:r>
+        <w:t xml:space="preserve"> </w:t>
+      </w:r>
+      <w:r>
+        <w:t xml:space="preserve">while plain-text Wikipedia extracts omitted tables and infoboxes</w:t>
+      </w:r>
+      <w:r>
+        <w:t xml:space="preserve"> </w:t>
+      </w:r>
+      <w:r>
+        <w:t xml:space="preserve">containing facts such as award winners and population figures. Adding</w:t>
+      </w:r>
+      <w:r>
+        <w:t xml:space="preserve"> </w:t>
+      </w:r>
+      <w:r>
+        <w:t xml:space="preserve">retries, search snippets, and infobox extraction addressed these failures</w:t>
+      </w:r>
+      <w:r>
+        <w:t xml:space="preserve"> </w:t>
+      </w:r>
+      <w:r>
+        <w:t xml:space="preserve">more effectively than additional prompt instructions.</w:t>
+      </w:r>
+    </w:p>
+    <w:p>
+      <w:pPr>
+        <w:numPr>
+          <w:ilvl w:val="0"/>
+          <w:numId w:val="1010"/>
+        </w:numPr>
+        <w:pStyle w:val="Compact"/>
+      </w:pPr>
+      <w:r>
+        <w:rPr>
+          <w:b/>
+        </w:rPr>
+        <w:t xml:space="preserve">Evaluate the evaluator:</w:t>
+      </w:r>
+      <w:r>
+        <w:t xml:space="preserve"> </w:t>
+      </w:r>
+      <w:r>
+        <w:t xml:space="preserve">Judge prompts and rubrics can have blind</w:t>
+      </w:r>
+      <w:r>
+        <w:t xml:space="preserve"> </w:t>
+      </w:r>
+      <w:r>
+        <w:t xml:space="preserve">spots, so they should be versioned and tested like the agent itself.</w:t>
+      </w:r>
+      <w:r>
+        <w:t xml:space="preserve"> </w:t>
+      </w:r>
+      <w:r>
+        <w:t xml:space="preserve">Replaying updated judges over frozen transcripts allowed us to improve</w:t>
+      </w:r>
+      <w:r>
+        <w:t xml:space="preserve"> </w:t>
+      </w:r>
+      <w:r>
+        <w:t xml:space="preserve">grading and add hallucination analysis without rerunning the agent.</w:t>
+      </w:r>
+      <w:r>
+        <w:t xml:space="preserve"> </w:t>
+      </w:r>
+      <w:r>
+        <w:t xml:space="preserve">Measuring the roughly 5% unsupported-side-claim rate before changing the</w:t>
+      </w:r>
+      <w:r>
+        <w:t xml:space="preserve"> </w:t>
+      </w:r>
+      <w:r>
+        <w:t xml:space="preserve">prompt also prevented us from overcorrecting for a small residual issue</w:t>
+      </w:r>
+      <w:r>
+        <w:t xml:space="preserve"> </w:t>
+      </w:r>
+      <w:r>
+        <w:t xml:space="preserve">and potentially reducing overall answer quality.</w:t>
+      </w:r>
+    </w:p>
+    <w:p>
+      <w:pPr>
+        <w:pStyle w:val="Heading2"/>
+      </w:pPr>
+      <w:bookmarkStart w:id="28" w:name="with-more-time"/>
+      <w:r>
+        <w:t xml:space="preserve">5. With more time</w:t>
+      </w:r>
+      <w:bookmarkEnd w:id="28"/>
+    </w:p>
+    <w:p>
+      <w:pPr>
+        <w:numPr>
+          <w:ilvl w:val="0"/>
+          <w:numId w:val="1011"/>
+        </w:numPr>
+        <w:pStyle w:val="Compact"/>
+      </w:pPr>
+      <w:r>
+        <w:rPr>
+          <w:b/>
+        </w:rPr>
+        <w:t xml:space="preserve">Larger, repeated evals:</w:t>
+      </w:r>
+      <w:r>
+        <w:t xml:space="preserve"> </w:t>
+      </w:r>
+      <w:r>
+        <w:t xml:space="preserve">Expand beyond the 40-case suite and run each</w:t>
+      </w:r>
+      <w:r>
+        <w:t xml:space="preserve"> </w:t>
+      </w:r>
+      <w:r>
+        <w:t xml:space="preserve">configuration multiple times to measure variance and report confidence</w:t>
+      </w:r>
+      <w:r>
+        <w:t xml:space="preserve"> </w:t>
+      </w:r>
+      <w:r>
+        <w:t xml:space="preserve">intervals, rather than relying on a single saturated run.</w:t>
+      </w:r>
+    </w:p>
+    <w:p>
+      <w:pPr>
+        <w:numPr>
+          <w:ilvl w:val="0"/>
+          <w:numId w:val="1011"/>
+        </w:numPr>
+        <w:pStyle w:val="Compact"/>
+      </w:pPr>
+      <w:r>
+        <w:rPr>
+          <w:b/>
+        </w:rPr>
+        <w:t xml:space="preserve">Human-judge inter-annotator agreement:</w:t>
+      </w:r>
+      <w:r>
+        <w:t xml:space="preserve"> </w:t>
+      </w:r>
+      <w:r>
+        <w:t xml:space="preserve">Have a human independently</w:t>
+      </w:r>
+      <w:r>
+        <w:t xml:space="preserve"> </w:t>
+      </w:r>
+      <w:r>
+        <w:t xml:space="preserve">grade a stratified 20–30% sample of the test suite, then measure agreement</w:t>
+      </w:r>
+      <w:r>
+        <w:t xml:space="preserve"> </w:t>
+      </w:r>
+      <w:r>
+        <w:t xml:space="preserve">with the LLM judge using percent agreement and Cohen’s kappa. Manually</w:t>
+      </w:r>
+      <w:r>
+        <w:t xml:space="preserve"> </w:t>
+      </w:r>
+      <w:r>
+        <w:t xml:space="preserve">review disagreements to identify systematic judge errors and refine the</w:t>
+      </w:r>
+      <w:r>
+        <w:t xml:space="preserve"> </w:t>
+      </w:r>
+      <w:r>
+        <w:t xml:space="preserve">rubric.</w:t>
+      </w:r>
+    </w:p>
+    <w:p>
+      <w:pPr>
+        <w:numPr>
+          <w:ilvl w:val="0"/>
+          <w:numId w:val="1011"/>
+        </w:numPr>
+        <w:pStyle w:val="Compact"/>
+      </w:pPr>
+      <w:r>
+        <w:rPr>
+          <w:b/>
+        </w:rPr>
+        <w:t xml:space="preserve">Automated prompt optimization:</w:t>
+      </w:r>
+      <w:r>
+        <w:t xml:space="preserve"> </w:t>
+      </w:r>
+      <w:r>
+        <w:t xml:space="preserve">Compare the manual loop-engineering</w:t>
+      </w:r>
+      <w:r>
+        <w:t xml:space="preserve"> </w:t>
+      </w:r>
+      <w:r>
+        <w:t xml:space="preserve">approach with APO (</w:t>
+      </w:r>
+      <w:hyperlink r:id="rId29">
         <w:r>
           <w:rPr>
             <w:rStyle w:val="Hyperlink"/>
@@ -2578,13 +3009,13 @@
         </w:r>
       </w:hyperlink>
       <w:r>
-        <w:t xml:space="preserve">) and</w:t>
-      </w:r>
-      <w:r>
-        <w:t xml:space="preserve"> </w:t>
-      </w:r>
-      <w:r>
-        <w:t xml:space="preserve">AlphaEvolve-style prompt evolution</w:t>
+        <w:t xml:space="preserve">)</w:t>
+      </w:r>
+      <w:r>
+        <w:t xml:space="preserve"> </w:t>
+      </w:r>
+      <w:r>
+        <w:t xml:space="preserve">and AlphaEvolve-style prompt evolution</w:t>
       </w:r>
       <w:r>
         <w:t xml:space="preserve"> </w:t>
@@ -2592,7 +3023,7 @@
       <w:r>
         <w:t xml:space="preserve">(</w:t>
       </w:r>
-      <w:hyperlink r:id="rId27">
+      <w:hyperlink r:id="rId30">
         <w:r>
           <w:rPr>
             <w:rStyle w:val="Hyperlink"/>
@@ -2601,103 +3032,130 @@
         </w:r>
       </w:hyperlink>
       <w:r>
-        <w:t xml:space="preserve">). I’ve used</w:t>
-      </w:r>
-      <w:r>
-        <w:t xml:space="preserve"> </w:t>
-      </w:r>
-      <w:r>
-        <w:t xml:space="preserve">AlphaEvolve to evolve an optimized prompt with its evolutionary approach,</w:t>
-      </w:r>
-      <w:r>
-        <w:t xml:space="preserve"> </w:t>
-      </w:r>
-      <w:r>
-        <w:t xml:space="preserve">and APO’s textual-feedback loop is similarly good at refining prompts. We</w:t>
-      </w:r>
-      <w:r>
-        <w:t xml:space="preserve"> </w:t>
-      </w:r>
-      <w:r>
-        <w:t xml:space="preserve">should run a comparative analysis against our manual loop-engineering</w:t>
-      </w:r>
-      <w:r>
-        <w:t xml:space="preserve"> </w:t>
-      </w:r>
-      <w:r>
-        <w:t xml:space="preserve">method with the same eval suite.</w:t>
+        <w:t xml:space="preserve">) using the same</w:t>
+      </w:r>
+      <w:r>
+        <w:t xml:space="preserve"> </w:t>
+      </w:r>
+      <w:r>
+        <w:t xml:space="preserve">eval suite and token budget. I have used AlphaEvolve’s evolutionary</w:t>
+      </w:r>
+      <w:r>
+        <w:t xml:space="preserve"> </w:t>
+      </w:r>
+      <w:r>
+        <w:t xml:space="preserve">approach to optimize prompts in my work at DeepMind, while APO’s</w:t>
+      </w:r>
+      <w:r>
+        <w:t xml:space="preserve"> </w:t>
+      </w:r>
+      <w:r>
+        <w:t xml:space="preserve">textual-feedback loop offers a complementary method for iterative</w:t>
+      </w:r>
+      <w:r>
+        <w:t xml:space="preserve"> </w:t>
+      </w:r>
+      <w:r>
+        <w:t xml:space="preserve">refinement.</w:t>
       </w:r>
     </w:p>
     <w:p>
       <w:pPr>
         <w:numPr>
           <w:ilvl w:val="0"/>
-          <w:numId w:val="1004"/>
+          <w:numId w:val="1011"/>
         </w:numPr>
         <w:pStyle w:val="Compact"/>
       </w:pPr>
       <w:r>
-        <w:t xml:space="preserve">Multilingual coverage — all our cases are English right now.</w:t>
+        <w:rPr>
+          <w:b/>
+        </w:rPr>
+        <w:t xml:space="preserve">Multilingual coverage:</w:t>
+      </w:r>
+      <w:r>
+        <w:t xml:space="preserve"> </w:t>
+      </w:r>
+      <w:r>
+        <w:t xml:space="preserve">Extend the currently English-only suite across</w:t>
+      </w:r>
+      <w:r>
+        <w:t xml:space="preserve"> </w:t>
+      </w:r>
+      <w:r>
+        <w:t xml:space="preserve">languages and test retrieval, disambiguation, grounding, and abstention</w:t>
+      </w:r>
+      <w:r>
+        <w:t xml:space="preserve"> </w:t>
+      </w:r>
+      <w:r>
+        <w:t xml:space="preserve">separately for each language.</w:t>
       </w:r>
     </w:p>
     <w:p>
       <w:pPr>
         <w:numPr>
           <w:ilvl w:val="0"/>
-          <w:numId w:val="1004"/>
+          <w:numId w:val="1011"/>
         </w:numPr>
         <w:pStyle w:val="Compact"/>
       </w:pPr>
       <w:r>
-        <w:t xml:space="preserve">A failure-analysis dashboard: the per-case transcripts are already</w:t>
-      </w:r>
-      <w:r>
-        <w:t xml:space="preserve"> </w:t>
-      </w:r>
-      <w:r>
-        <w:t xml:space="preserve">structured, so slicing failures by category and prompt version is easy.</w:t>
+        <w:rPr>
+          <w:b/>
+        </w:rPr>
+        <w:t xml:space="preserve">Failure-analysis dashboard:</w:t>
+      </w:r>
+      <w:r>
+        <w:t xml:space="preserve"> </w:t>
+      </w:r>
+      <w:r>
+        <w:t xml:space="preserve">Build a dashboard over the existing</w:t>
+      </w:r>
+      <w:r>
+        <w:t xml:space="preserve"> </w:t>
+      </w:r>
+      <w:r>
+        <w:t xml:space="preserve">structured per-case transcripts to slice failures by category, pipeline</w:t>
+      </w:r>
+      <w:r>
+        <w:t xml:space="preserve"> </w:t>
+      </w:r>
+      <w:r>
+        <w:t xml:space="preserve">stage, prompt version, model, and run.</w:t>
       </w:r>
     </w:p>
     <w:p>
       <w:pPr>
         <w:numPr>
           <w:ilvl w:val="0"/>
-          <w:numId w:val="1004"/>
+          <w:numId w:val="1011"/>
         </w:numPr>
         <w:pStyle w:val="Compact"/>
       </w:pPr>
       <w:r>
-        <w:t xml:space="preserve">Domain-specific evals for specialized areas like healthcare, legal, and</w:t>
-      </w:r>
-      <w:r>
-        <w:t xml:space="preserve"> </w:t>
-      </w:r>
-      <w:r>
-        <w:t xml:space="preserve">finance, where the bar for faithfulness and for knowing when to say</w:t>
-      </w:r>
-      <w:r>
-        <w:t xml:space="preserve"> </w:t>
-      </w:r>
-      <w:r>
-        <w:t xml:space="preserve">“</w:t>
-      </w:r>
-      <w:r>
-        <w:t xml:space="preserve">I</w:t>
-      </w:r>
-      <w:r>
-        <w:t xml:space="preserve"> </w:t>
-      </w:r>
-      <w:r>
-        <w:t xml:space="preserve">don’t know</w:t>
-      </w:r>
-      <w:r>
-        <w:t xml:space="preserve">”</w:t>
-      </w:r>
-      <w:r>
-        <w:t xml:space="preserve"> </w:t>
-      </w:r>
-      <w:r>
-        <w:t xml:space="preserve">should be higher.</w:t>
+        <w:rPr>
+          <w:b/>
+        </w:rPr>
+        <w:t xml:space="preserve">Specialized domain evals:</w:t>
+      </w:r>
+      <w:r>
+        <w:t xml:space="preserve"> </w:t>
+      </w:r>
+      <w:r>
+        <w:t xml:space="preserve">Add healthcare, legal, and finance cases,</w:t>
+      </w:r>
+      <w:r>
+        <w:t xml:space="preserve"> </w:t>
+      </w:r>
+      <w:r>
+        <w:t xml:space="preserve">where requirements for faithfulness, source quality, uncertainty</w:t>
+      </w:r>
+      <w:r>
+        <w:t xml:space="preserve"> </w:t>
+      </w:r>
+      <w:r>
+        <w:t xml:space="preserve">calibration, and appropriate abstention should be stricter.</w:t>
       </w:r>
     </w:p>
     <w:sectPr/>
@@ -2949,6 +3407,27 @@
     <w:abstractNumId w:val="991"/>
   </w:num>
   <w:num w:numId="1004">
+    <w:abstractNumId w:val="991"/>
+  </w:num>
+  <w:num w:numId="1005">
+    <w:abstractNumId w:val="991"/>
+  </w:num>
+  <w:num w:numId="1006">
+    <w:abstractNumId w:val="991"/>
+  </w:num>
+  <w:num w:numId="1007">
+    <w:abstractNumId w:val="991"/>
+  </w:num>
+  <w:num w:numId="1008">
+    <w:abstractNumId w:val="991"/>
+  </w:num>
+  <w:num w:numId="1009">
+    <w:abstractNumId w:val="991"/>
+  </w:num>
+  <w:num w:numId="1010">
+    <w:abstractNumId w:val="991"/>
+  </w:num>
+  <w:num w:numId="1011">
     <w:abstractNumId w:val="991"/>
   </w:num>
 </w:numbering>

</xml_diff>

<commit_message>
Docs: tracked-metrics list in README and RATIONALE
Enumerates every per-run metric by dimension (search decision, retrieval,
answer quality incl. faithfulness/groundedness and the side-claims
hallucination rubric, citation coverage/integrity, cost, experimental
sidecar), with prompt_version/judge_version tagging noted. Docx regenerated.

Co-Authored-By: Claude Fable 5 <noreply@anthropic.com>
</commit_message>
<xml_diff>
--- a/RATIONALE.docx
+++ b/RATIONALE.docx
@@ -757,7 +757,22 @@
         <w:pStyle w:val="FirstParagraph"/>
       </w:pPr>
       <w:r>
-        <w:t xml:space="preserve">Case design choices that mattered:</w:t>
+        <w:t xml:space="preserve">Tracked metrics: every run’s</w:t>
+      </w:r>
+      <w:r>
+        <w:t xml:space="preserve"> </w:t>
+      </w:r>
+      <w:r>
+        <w:rPr>
+          <w:rStyle w:val="VerbatimChar"/>
+        </w:rPr>
+        <w:t xml:space="preserve">summary.json</w:t>
+      </w:r>
+      <w:r>
+        <w:t xml:space="preserve"> </w:t>
+      </w:r>
+      <w:r>
+        <w:t xml:space="preserve">records, per dimension:</w:t>
       </w:r>
     </w:p>
     <w:p>
@@ -772,31 +787,25 @@
         <w:rPr>
           <w:b/>
         </w:rPr>
-        <w:t xml:space="preserve">Stale-memory traps:</w:t>
-      </w:r>
-      <w:r>
-        <w:t xml:space="preserve"> </w:t>
-      </w:r>
-      <w:r>
-        <w:t xml:space="preserve">Cases involving officeholders and CEOs who changed</w:t>
-      </w:r>
-      <w:r>
-        <w:t xml:space="preserve"> </w:t>
-      </w:r>
-      <w:r>
-        <w:t xml:space="preserve">in 2024 or 2025 test whether the model confidently answers from outdated</w:t>
-      </w:r>
-      <w:r>
-        <w:t xml:space="preserve"> </w:t>
-      </w:r>
-      <w:r>
-        <w:t xml:space="preserve">memory. These cases distinguish confidence from correctness more</w:t>
-      </w:r>
-      <w:r>
-        <w:t xml:space="preserve"> </w:t>
-      </w:r>
-      <w:r>
-        <w:t xml:space="preserve">effectively than a generic set of obscure facts.</w:t>
+        <w:t xml:space="preserve">Search decision:</w:t>
+      </w:r>
+      <w:r>
+        <w:t xml:space="preserve"> </w:t>
+      </w:r>
+      <w:r>
+        <w:t xml:space="preserve">search recall and precision, spurious and missed</w:t>
+      </w:r>
+      <w:r>
+        <w:t xml:space="preserve"> </w:t>
+      </w:r>
+      <w:r>
+        <w:t xml:space="preserve">search ids, multi-hop under-chaining, and mean searches per case (overall</w:t>
+      </w:r>
+      <w:r>
+        <w:t xml:space="preserve"> </w:t>
+      </w:r>
+      <w:r>
+        <w:t xml:space="preserve">and multi-hop).</w:t>
       </w:r>
     </w:p>
     <w:p>
@@ -811,88 +820,25 @@
         <w:rPr>
           <w:b/>
         </w:rPr>
-        <w:t xml:space="preserve">Optional search cases:</w:t>
-      </w:r>
-      <w:r>
-        <w:t xml:space="preserve"> </w:t>
-      </w:r>
-      <w:r>
-        <w:rPr>
-          <w:rStyle w:val="VerbatimChar"/>
-        </w:rPr>
-        <w:t xml:space="preserve">optional</w:t>
-      </w:r>
-      <w:r>
-        <w:t xml:space="preserve"> </w:t>
-      </w:r>
-      <w:r>
-        <w:t xml:space="preserve">is a deliberate third label, not</w:t>
-      </w:r>
-      <w:r>
-        <w:t xml:space="preserve"> </w:t>
-      </w:r>
-      <w:r>
-        <w:t xml:space="preserve">uncertainty in the eval design. A question such as</w:t>
-      </w:r>
-      <w:r>
-        <w:t xml:space="preserve"> </w:t>
-      </w:r>
-      <w:r>
-        <w:t xml:space="preserve">“</w:t>
-      </w:r>
-      <w:r>
-        <w:t xml:space="preserve">Who painted the Mona</w:t>
-      </w:r>
-      <w:r>
-        <w:t xml:space="preserve"> </w:t>
-      </w:r>
-      <w:r>
-        <w:t xml:space="preserve">Lisa?</w:t>
-      </w:r>
-      <w:r>
-        <w:t xml:space="preserve">”</w:t>
-      </w:r>
-      <w:r>
-        <w:t xml:space="preserve"> </w:t>
-      </w:r>
-      <w:r>
-        <w:t xml:space="preserve">is both stable common knowledge and a named fact about a specific</w:t>
-      </w:r>
-      <w:r>
-        <w:t xml:space="preserve"> </w:t>
-      </w:r>
-      <w:r>
-        <w:t xml:space="preserve">work, so either searching or answering directly is reasonable. These cases</w:t>
-      </w:r>
-      <w:r>
-        <w:t xml:space="preserve"> </w:t>
-      </w:r>
-      <w:r>
-        <w:t xml:space="preserve">are excluded from search precision and recall, but answer correctness and,</w:t>
-      </w:r>
-      <w:r>
-        <w:t xml:space="preserve"> </w:t>
-      </w:r>
-      <w:r>
-        <w:t xml:space="preserve">when applicable, retrieval quality are still graded. In every final run,</w:t>
-      </w:r>
-      <w:r>
-        <w:t xml:space="preserve"> </w:t>
-      </w:r>
-      <w:r>
-        <w:t xml:space="preserve">the model answered all four optional cases correctly from memory,</w:t>
-      </w:r>
-      <w:r>
-        <w:t xml:space="preserve"> </w:t>
-      </w:r>
-      <w:r>
-        <w:t xml:space="preserve">demonstrating the calibrated restraint reflected in its 1.0 search</w:t>
-      </w:r>
-      <w:r>
-        <w:t xml:space="preserve"> </w:t>
-      </w:r>
-      <w:r>
-        <w:t xml:space="preserve">precision.</w:t>
+        <w:t xml:space="preserve">Retrieval quality:</w:t>
+      </w:r>
+      <w:r>
+        <w:t xml:space="preserve"> </w:t>
+      </w:r>
+      <w:r>
+        <w:t xml:space="preserve">evidence-sufficiency rate, right-article rate, and</w:t>
+      </w:r>
+      <w:r>
+        <w:t xml:space="preserve"> </w:t>
+      </w:r>
+      <w:r>
+        <w:t xml:space="preserve">code-counted tool calls/errors (tool_error_rate), so infrastructure</w:t>
+      </w:r>
+      <w:r>
+        <w:t xml:space="preserve"> </w:t>
+      </w:r>
+      <w:r>
+        <w:t xml:space="preserve">failures never masquerade as retrieval failures.</w:t>
       </w:r>
     </w:p>
     <w:p>
@@ -907,31 +853,55 @@
         <w:rPr>
           <w:b/>
         </w:rPr>
-        <w:t xml:space="preserve">Forced disambiguation:</w:t>
-      </w:r>
-      <w:r>
-        <w:t xml:space="preserve"> </w:t>
-      </w:r>
-      <w:r>
-        <w:t xml:space="preserve">Cases such as Mercury Records versus the planet</w:t>
-      </w:r>
-      <w:r>
-        <w:t xml:space="preserve"> </w:t>
-      </w:r>
-      <w:r>
-        <w:t xml:space="preserve">Mercury, Odessa, Texas versus Odesa, Ukraine, and Java, South Dakota</w:t>
-      </w:r>
-      <w:r>
-        <w:t xml:space="preserve"> </w:t>
-      </w:r>
-      <w:r>
-        <w:t xml:space="preserve">versus the programming language test whether retrieval selects the</w:t>
-      </w:r>
-      <w:r>
-        <w:t xml:space="preserve"> </w:t>
-      </w:r>
-      <w:r>
-        <w:t xml:space="preserve">intended article rather than a more prominent entity with the same name.</w:t>
+        <w:t xml:space="preserve">Answer quality:</w:t>
+      </w:r>
+      <w:r>
+        <w:t xml:space="preserve"> </w:t>
+      </w:r>
+      <w:r>
+        <w:t xml:space="preserve">pass rate overall and per category; verdicts</w:t>
+      </w:r>
+      <w:r>
+        <w:t xml:space="preserve"> </w:t>
+      </w:r>
+      <w:r>
+        <w:t xml:space="preserve">(correct / partially_correct / incorrect / honest_abstention);</w:t>
+      </w:r>
+      <w:r>
+        <w:t xml:space="preserve"> </w:t>
+      </w:r>
+      <w:r>
+        <w:rPr>
+          <w:b/>
+        </w:rPr>
+        <w:t xml:space="preserve">faithfulness (groundedness)</w:t>
+      </w:r>
+      <w:r>
+        <w:t xml:space="preserve">, i.e., whether the key claim is supported</w:t>
+      </w:r>
+      <w:r>
+        <w:t xml:space="preserve"> </w:t>
+      </w:r>
+      <w:r>
+        <w:t xml:space="preserve">by the retrieved evidence rather than model memory; unsupported side</w:t>
+      </w:r>
+      <w:r>
+        <w:t xml:space="preserve"> </w:t>
+      </w:r>
+      <w:r>
+        <w:t xml:space="preserve">claims (the hallucination rubric: rate and total count of specific</w:t>
+      </w:r>
+      <w:r>
+        <w:t xml:space="preserve"> </w:t>
+      </w:r>
+      <w:r>
+        <w:t xml:space="preserve">details asserted beyond the evidence); and abstention in both directions</w:t>
+      </w:r>
+      <w:r>
+        <w:t xml:space="preserve"> </w:t>
+      </w:r>
+      <w:r>
+        <w:t xml:space="preserve">(abstained-on-unanswerable, wrong abstentions).</w:t>
       </w:r>
     </w:p>
     <w:p>
@@ -946,31 +916,19 @@
         <w:rPr>
           <w:b/>
         </w:rPr>
-        <w:t xml:space="preserve">Unanswerable questions:</w:t>
-      </w:r>
-      <w:r>
-        <w:t xml:space="preserve"> </w:t>
-      </w:r>
-      <w:r>
-        <w:t xml:space="preserve">Some cases are designed so that abstaining is</w:t>
-      </w:r>
-      <w:r>
-        <w:t xml:space="preserve"> </w:t>
-      </w:r>
-      <w:r>
-        <w:t xml:space="preserve">the correct response. The eval measures both directions separately:</w:t>
-      </w:r>
-      <w:r>
-        <w:t xml:space="preserve"> </w:t>
-      </w:r>
-      <w:r>
-        <w:t xml:space="preserve">whether the model abstains when evidence is unavailable and whether it</w:t>
-      </w:r>
-      <w:r>
-        <w:t xml:space="preserve"> </w:t>
-      </w:r>
-      <w:r>
-        <w:t xml:space="preserve">incorrectly abstains when the question is answerable.</w:t>
+        <w:t xml:space="preserve">Citations (cite mode):</w:t>
+      </w:r>
+      <w:r>
+        <w:t xml:space="preserve"> </w:t>
+      </w:r>
+      <w:r>
+        <w:t xml:space="preserve">citation coverage (complete/partial/uncited)</w:t>
+      </w:r>
+      <w:r>
+        <w:t xml:space="preserve"> </w:t>
+      </w:r>
+      <w:r>
+        <w:t xml:space="preserve">and citation integrity (invented and misattributed citation ids).</w:t>
       </w:r>
     </w:p>
     <w:p>
@@ -985,37 +943,40 @@
         <w:rPr>
           <w:b/>
         </w:rPr>
-        <w:t xml:space="preserve">Multi-hop questions:</w:t>
-      </w:r>
-      <w:r>
-        <w:t xml:space="preserve"> </w:t>
-      </w:r>
-      <w:r>
-        <w:t xml:space="preserve">These were added only after the single-hop suite</w:t>
-      </w:r>
-      <w:r>
-        <w:t xml:space="preserve"> </w:t>
-      </w:r>
-      <w:r>
-        <w:t xml:space="preserve">had converged. Each case specifies a minimum number of searches, and two</w:t>
-      </w:r>
-      <w:r>
-        <w:t xml:space="preserve"> </w:t>
-      </w:r>
-      <w:r>
-        <w:t xml:space="preserve">cases use intermediate facts that are intentionally too obscure to skip</w:t>
-      </w:r>
-      <w:r>
-        <w:t xml:space="preserve"> </w:t>
-      </w:r>
-      <w:r>
-        <w:t xml:space="preserve">using memory. Another ends in a genuine dead end, where the correct</w:t>
-      </w:r>
-      <w:r>
-        <w:t xml:space="preserve"> </w:t>
-      </w:r>
-      <w:r>
-        <w:t xml:space="preserve">response is that the requested fact is not recorded.</w:t>
+        <w:t xml:space="preserve">Cost:</w:t>
+      </w:r>
+      <w:r>
+        <w:t xml:space="preserve"> </w:t>
+      </w:r>
+      <w:r>
+        <w:t xml:space="preserve">total input/output tokens per run.</w:t>
+      </w:r>
+    </w:p>
+    <w:p>
+      <w:pPr>
+        <w:numPr>
+          <w:ilvl w:val="0"/>
+          <w:numId w:val="1003"/>
+        </w:numPr>
+        <w:pStyle w:val="Compact"/>
+      </w:pPr>
+      <w:r>
+        <w:rPr>
+          <w:b/>
+        </w:rPr>
+        <w:t xml:space="preserve">Experimental sidecar:</w:t>
+      </w:r>
+      <w:r>
+        <w:t xml:space="preserve"> </w:t>
+      </w:r>
+      <w:r>
+        <w:t xml:space="preserve">per-case BLEU/ROUGE/BERTScore (BLEU and ROUGE</w:t>
+      </w:r>
+      <w:r>
+        <w:t xml:space="preserve"> </w:t>
+      </w:r>
+      <w:r>
+        <w:t xml:space="preserve">dropped after the agreement analysis below; BERTScore deferred).</w:t>
       </w:r>
     </w:p>
     <w:p>
@@ -1023,7 +984,48 @@
         <w:pStyle w:val="FirstParagraph"/>
       </w:pPr>
       <w:r>
-        <w:t xml:space="preserve">Judge design and validation:</w:t>
+        <w:t xml:space="preserve">Every summary row carries</w:t>
+      </w:r>
+      <w:r>
+        <w:t xml:space="preserve"> </w:t>
+      </w:r>
+      <w:r>
+        <w:rPr>
+          <w:rStyle w:val="VerbatimChar"/>
+        </w:rPr>
+        <w:t xml:space="preserve">prompt_version</w:t>
+      </w:r>
+      <w:r>
+        <w:t xml:space="preserve"> </w:t>
+      </w:r>
+      <w:r>
+        <w:t xml:space="preserve">and</w:t>
+      </w:r>
+      <w:r>
+        <w:t xml:space="preserve"> </w:t>
+      </w:r>
+      <w:r>
+        <w:rPr>
+          <w:rStyle w:val="VerbatimChar"/>
+        </w:rPr>
+        <w:t xml:space="preserve">judge_version</w:t>
+      </w:r>
+      <w:r>
+        <w:t xml:space="preserve">, so metric</w:t>
+      </w:r>
+      <w:r>
+        <w:t xml:space="preserve"> </w:t>
+      </w:r>
+      <w:r>
+        <w:t xml:space="preserve">movements are attributable to a specific prompt or grading change.</w:t>
+      </w:r>
+    </w:p>
+    <w:p>
+      <w:pPr>
+        <w:pStyle w:val="BodyText"/>
+      </w:pPr>
+      <w:r>
+        <w:t xml:space="preserve">Case design choices that mattered:</w:t>
       </w:r>
     </w:p>
     <w:p>
@@ -1038,37 +1040,31 @@
         <w:rPr>
           <w:b/>
         </w:rPr>
-        <w:t xml:space="preserve">Eval notes override model knowledge:</w:t>
-      </w:r>
-      <w:r>
-        <w:t xml:space="preserve"> </w:t>
-      </w:r>
-      <w:r>
-        <w:t xml:space="preserve">Case-level notes are</w:t>
-      </w:r>
-      <w:r>
-        <w:t xml:space="preserve"> </w:t>
-      </w:r>
-      <w:r>
-        <w:t xml:space="preserve">authoritative when they conflict with the judge’s internal knowledge. The</w:t>
-      </w:r>
-      <w:r>
-        <w:t xml:space="preserve"> </w:t>
-      </w:r>
-      <w:r>
-        <w:t xml:space="preserve">judge must flag the disagreement but grade according to the eval evidence.</w:t>
-      </w:r>
-      <w:r>
-        <w:t xml:space="preserve"> </w:t>
-      </w:r>
-      <w:r>
-        <w:t xml:space="preserve">This is essential for reliably grading stale-memory traps and source</w:t>
-      </w:r>
-      <w:r>
-        <w:t xml:space="preserve"> </w:t>
-      </w:r>
-      <w:r>
-        <w:t xml:space="preserve">inconsistencies.</w:t>
+        <w:t xml:space="preserve">Stale-memory traps:</w:t>
+      </w:r>
+      <w:r>
+        <w:t xml:space="preserve"> </w:t>
+      </w:r>
+      <w:r>
+        <w:t xml:space="preserve">Cases involving officeholders and CEOs who changed</w:t>
+      </w:r>
+      <w:r>
+        <w:t xml:space="preserve"> </w:t>
+      </w:r>
+      <w:r>
+        <w:t xml:space="preserve">in 2024 or 2025 test whether the model confidently answers from outdated</w:t>
+      </w:r>
+      <w:r>
+        <w:t xml:space="preserve"> </w:t>
+      </w:r>
+      <w:r>
+        <w:t xml:space="preserve">memory. These cases distinguish confidence from correctness more</w:t>
+      </w:r>
+      <w:r>
+        <w:t xml:space="preserve"> </w:t>
+      </w:r>
+      <w:r>
+        <w:t xml:space="preserve">effectively than a generic set of obscure facts.</w:t>
       </w:r>
     </w:p>
     <w:p>
@@ -1083,25 +1079,88 @@
         <w:rPr>
           <w:b/>
         </w:rPr>
-        <w:t xml:space="preserve">Judge versions are tracked:</w:t>
-      </w:r>
-      <w:r>
-        <w:t xml:space="preserve"> </w:t>
-      </w:r>
-      <w:r>
-        <w:t xml:space="preserve">Judge prompt changes are versioned from</w:t>
-      </w:r>
-      <w:r>
-        <w:t xml:space="preserve"> </w:t>
-      </w:r>
-      <w:r>
-        <w:t xml:space="preserve">judge-v1 through judge-v5, covering both default and citation modes. This</w:t>
-      </w:r>
-      <w:r>
-        <w:t xml:space="preserve"> </w:t>
-      </w:r>
-      <w:r>
-        <w:t xml:space="preserve">preserves comparability across runs and makes grading changes explicit.</w:t>
+        <w:t xml:space="preserve">Optional search cases:</w:t>
+      </w:r>
+      <w:r>
+        <w:t xml:space="preserve"> </w:t>
+      </w:r>
+      <w:r>
+        <w:rPr>
+          <w:rStyle w:val="VerbatimChar"/>
+        </w:rPr>
+        <w:t xml:space="preserve">optional</w:t>
+      </w:r>
+      <w:r>
+        <w:t xml:space="preserve"> </w:t>
+      </w:r>
+      <w:r>
+        <w:t xml:space="preserve">is a deliberate third label, not</w:t>
+      </w:r>
+      <w:r>
+        <w:t xml:space="preserve"> </w:t>
+      </w:r>
+      <w:r>
+        <w:t xml:space="preserve">uncertainty in the eval design. A question such as</w:t>
+      </w:r>
+      <w:r>
+        <w:t xml:space="preserve"> </w:t>
+      </w:r>
+      <w:r>
+        <w:t xml:space="preserve">“</w:t>
+      </w:r>
+      <w:r>
+        <w:t xml:space="preserve">Who painted the Mona</w:t>
+      </w:r>
+      <w:r>
+        <w:t xml:space="preserve"> </w:t>
+      </w:r>
+      <w:r>
+        <w:t xml:space="preserve">Lisa?</w:t>
+      </w:r>
+      <w:r>
+        <w:t xml:space="preserve">”</w:t>
+      </w:r>
+      <w:r>
+        <w:t xml:space="preserve"> </w:t>
+      </w:r>
+      <w:r>
+        <w:t xml:space="preserve">is both stable common knowledge and a named fact about a specific</w:t>
+      </w:r>
+      <w:r>
+        <w:t xml:space="preserve"> </w:t>
+      </w:r>
+      <w:r>
+        <w:t xml:space="preserve">work, so either searching or answering directly is reasonable. These cases</w:t>
+      </w:r>
+      <w:r>
+        <w:t xml:space="preserve"> </w:t>
+      </w:r>
+      <w:r>
+        <w:t xml:space="preserve">are excluded from search precision and recall, but answer correctness and,</w:t>
+      </w:r>
+      <w:r>
+        <w:t xml:space="preserve"> </w:t>
+      </w:r>
+      <w:r>
+        <w:t xml:space="preserve">when applicable, retrieval quality are still graded. In every final run,</w:t>
+      </w:r>
+      <w:r>
+        <w:t xml:space="preserve"> </w:t>
+      </w:r>
+      <w:r>
+        <w:t xml:space="preserve">the model answered all four optional cases correctly from memory,</w:t>
+      </w:r>
+      <w:r>
+        <w:t xml:space="preserve"> </w:t>
+      </w:r>
+      <w:r>
+        <w:t xml:space="preserve">demonstrating the calibrated restraint reflected in its 1.0 search</w:t>
+      </w:r>
+      <w:r>
+        <w:t xml:space="preserve"> </w:t>
+      </w:r>
+      <w:r>
+        <w:t xml:space="preserve">precision.</w:t>
       </w:r>
     </w:p>
     <w:p>
@@ -1116,46 +1175,31 @@
         <w:rPr>
           <w:b/>
         </w:rPr>
-        <w:t xml:space="preserve">Completed runs can be regraded:</w:t>
-      </w:r>
-      <w:r>
-        <w:t xml:space="preserve"> </w:t>
-      </w:r>
-      <w:r>
-        <w:t xml:space="preserve">The</w:t>
-      </w:r>
-      <w:r>
-        <w:t xml:space="preserve"> </w:t>
-      </w:r>
-      <w:r>
-        <w:rPr>
-          <w:rStyle w:val="VerbatimChar"/>
-        </w:rPr>
-        <w:t xml:space="preserve">--rejudge</w:t>
-      </w:r>
-      <w:r>
-        <w:t xml:space="preserve"> </w:t>
-      </w:r>
-      <w:r>
-        <w:t xml:space="preserve">mode applies a newer</w:t>
-      </w:r>
-      <w:r>
-        <w:t xml:space="preserve"> </w:t>
-      </w:r>
-      <w:r>
-        <w:t xml:space="preserve">judge to saved transcripts from an earlier run. This allows the grading</w:t>
-      </w:r>
-      <w:r>
-        <w:t xml:space="preserve"> </w:t>
-      </w:r>
-      <w:r>
-        <w:t xml:space="preserve">rubric to improve without rerunning the agent or changing its recorded</w:t>
-      </w:r>
-      <w:r>
-        <w:t xml:space="preserve"> </w:t>
-      </w:r>
-      <w:r>
-        <w:t xml:space="preserve">behavior.</w:t>
+        <w:t xml:space="preserve">Forced disambiguation:</w:t>
+      </w:r>
+      <w:r>
+        <w:t xml:space="preserve"> </w:t>
+      </w:r>
+      <w:r>
+        <w:t xml:space="preserve">Cases such as Mercury Records versus the planet</w:t>
+      </w:r>
+      <w:r>
+        <w:t xml:space="preserve"> </w:t>
+      </w:r>
+      <w:r>
+        <w:t xml:space="preserve">Mercury, Odessa, Texas versus Odesa, Ukraine, and Java, South Dakota</w:t>
+      </w:r>
+      <w:r>
+        <w:t xml:space="preserve"> </w:t>
+      </w:r>
+      <w:r>
+        <w:t xml:space="preserve">versus the programming language test whether retrieval selects the</w:t>
+      </w:r>
+      <w:r>
+        <w:t xml:space="preserve"> </w:t>
+      </w:r>
+      <w:r>
+        <w:t xml:space="preserve">intended article rather than a more prominent entity with the same name.</w:t>
       </w:r>
     </w:p>
     <w:p>
@@ -1170,25 +1214,76 @@
         <w:rPr>
           <w:b/>
         </w:rPr>
-        <w:t xml:space="preserve">Human validation checks the judge:</w:t>
-      </w:r>
-      <w:r>
-        <w:t xml:space="preserve"> </w:t>
-      </w:r>
-      <w:r>
-        <w:t xml:space="preserve">A blind human review of 10 cases</w:t>
-      </w:r>
-      <w:r>
-        <w:t xml:space="preserve"> </w:t>
-      </w:r>
-      <w:r>
-        <w:t xml:space="preserve">was selected before any judge verdicts were examined. The human grades</w:t>
-      </w:r>
-      <w:r>
-        <w:t xml:space="preserve"> </w:t>
-      </w:r>
-      <w:r>
-        <w:t xml:space="preserve">matched the judge on all 10 cases.</w:t>
+        <w:t xml:space="preserve">Unanswerable questions:</w:t>
+      </w:r>
+      <w:r>
+        <w:t xml:space="preserve"> </w:t>
+      </w:r>
+      <w:r>
+        <w:t xml:space="preserve">Some cases are designed so that abstaining is</w:t>
+      </w:r>
+      <w:r>
+        <w:t xml:space="preserve"> </w:t>
+      </w:r>
+      <w:r>
+        <w:t xml:space="preserve">the correct response. The eval measures both directions separately:</w:t>
+      </w:r>
+      <w:r>
+        <w:t xml:space="preserve"> </w:t>
+      </w:r>
+      <w:r>
+        <w:t xml:space="preserve">whether the model abstains when evidence is unavailable and whether it</w:t>
+      </w:r>
+      <w:r>
+        <w:t xml:space="preserve"> </w:t>
+      </w:r>
+      <w:r>
+        <w:t xml:space="preserve">incorrectly abstains when the question is answerable.</w:t>
+      </w:r>
+    </w:p>
+    <w:p>
+      <w:pPr>
+        <w:numPr>
+          <w:ilvl w:val="0"/>
+          <w:numId w:val="1004"/>
+        </w:numPr>
+        <w:pStyle w:val="Compact"/>
+      </w:pPr>
+      <w:r>
+        <w:rPr>
+          <w:b/>
+        </w:rPr>
+        <w:t xml:space="preserve">Multi-hop questions:</w:t>
+      </w:r>
+      <w:r>
+        <w:t xml:space="preserve"> </w:t>
+      </w:r>
+      <w:r>
+        <w:t xml:space="preserve">These were added only after the single-hop suite</w:t>
+      </w:r>
+      <w:r>
+        <w:t xml:space="preserve"> </w:t>
+      </w:r>
+      <w:r>
+        <w:t xml:space="preserve">had converged. Each case specifies a minimum number of searches, and two</w:t>
+      </w:r>
+      <w:r>
+        <w:t xml:space="preserve"> </w:t>
+      </w:r>
+      <w:r>
+        <w:t xml:space="preserve">cases use intermediate facts that are intentionally too obscure to skip</w:t>
+      </w:r>
+      <w:r>
+        <w:t xml:space="preserve"> </w:t>
+      </w:r>
+      <w:r>
+        <w:t xml:space="preserve">using memory. Another ends in a genuine dead end, where the correct</w:t>
+      </w:r>
+      <w:r>
+        <w:t xml:space="preserve"> </w:t>
+      </w:r>
+      <w:r>
+        <w:t xml:space="preserve">response is that the requested fact is not recorded.</w:t>
       </w:r>
     </w:p>
     <w:p>
@@ -1196,39 +1291,7 @@
         <w:pStyle w:val="FirstParagraph"/>
       </w:pPr>
       <w:r>
-        <w:t xml:space="preserve">We prefer an LLM-as-a-judge because it can evaluate factual correctness,</w:t>
-      </w:r>
-      <w:r>
-        <w:t xml:space="preserve"> </w:t>
-      </w:r>
-      <w:r>
-        <w:t xml:space="preserve">evidence faithfulness, and appropriate abstention in context, which simple</w:t>
-      </w:r>
-      <w:r>
-        <w:t xml:space="preserve"> </w:t>
-      </w:r>
-      <w:r>
-        <w:t xml:space="preserve">reference-overlap metrics cannot reliably capture. However, we still</w:t>
-      </w:r>
-      <w:r>
-        <w:t xml:space="preserve"> </w:t>
-      </w:r>
-      <w:r>
-        <w:t xml:space="preserve">evaluated traditional lexical and semantic metrics empirically rather than</w:t>
-      </w:r>
-      <w:r>
-        <w:t xml:space="preserve"> </w:t>
-      </w:r>
-      <w:r>
-        <w:t xml:space="preserve">dismissing or adopting them by assumption.</w:t>
-      </w:r>
-    </w:p>
-    <w:p>
-      <w:pPr>
-        <w:pStyle w:val="BodyText"/>
-      </w:pPr>
-      <w:r>
-        <w:t xml:space="preserve">Traditional lexical/semantic metrics findings:</w:t>
+        <w:t xml:space="preserve">Judge design and validation:</w:t>
       </w:r>
     </w:p>
     <w:p>
@@ -1243,64 +1306,37 @@
         <w:rPr>
           <w:b/>
         </w:rPr>
-        <w:t xml:space="preserve">Lexical metrics:</w:t>
-      </w:r>
-    </w:p>
-    <w:p>
-      <w:pPr>
-        <w:numPr>
-          <w:ilvl w:val="1"/>
-          <w:numId w:val="1006"/>
-        </w:numPr>
-        <w:pStyle w:val="Compact"/>
-      </w:pPr>
-      <w:r>
-        <w:rPr>
-          <w:b/>
-        </w:rPr>
-        <w:t xml:space="preserve">BLEU and ROUGE were tested and rejected:</w:t>
-      </w:r>
-      <w:r>
-        <w:t xml:space="preserve"> </w:t>
-      </w:r>
-      <w:r>
-        <w:t xml:space="preserve">They were treated as</w:t>
-      </w:r>
-      <w:r>
-        <w:t xml:space="preserve"> </w:t>
-      </w:r>
-      <w:r>
-        <w:t xml:space="preserve">falsifiable metrics rather than assumed to be useful, which aligns with</w:t>
-      </w:r>
-      <w:r>
-        <w:t xml:space="preserve"> </w:t>
-      </w:r>
-      <w:r>
-        <w:t xml:space="preserve">our expectations. The baseline’s incorrect answer scored above the</w:t>
-      </w:r>
-      <w:r>
-        <w:t xml:space="preserve"> </w:t>
-      </w:r>
-      <w:r>
-        <w:t xml:space="preserve">average correct answer on ROUGE-1, while correct answers ranged from</w:t>
-      </w:r>
-      <w:r>
-        <w:t xml:space="preserve"> </w:t>
-      </w:r>
-      <w:r>
-        <w:t xml:space="preserve">0.00 to 0.76. Because fluent but incorrect answers can overlap heavily</w:t>
-      </w:r>
-      <w:r>
-        <w:t xml:space="preserve"> </w:t>
-      </w:r>
-      <w:r>
-        <w:t xml:space="preserve">with short reference answers, no useful threshold separated correct from</w:t>
-      </w:r>
-      <w:r>
-        <w:t xml:space="preserve"> </w:t>
-      </w:r>
-      <w:r>
-        <w:t xml:space="preserve">incorrect responses.</w:t>
+        <w:t xml:space="preserve">Eval notes override model knowledge:</w:t>
+      </w:r>
+      <w:r>
+        <w:t xml:space="preserve"> </w:t>
+      </w:r>
+      <w:r>
+        <w:t xml:space="preserve">Case-level notes are</w:t>
+      </w:r>
+      <w:r>
+        <w:t xml:space="preserve"> </w:t>
+      </w:r>
+      <w:r>
+        <w:t xml:space="preserve">authoritative when they conflict with the judge’s internal knowledge. The</w:t>
+      </w:r>
+      <w:r>
+        <w:t xml:space="preserve"> </w:t>
+      </w:r>
+      <w:r>
+        <w:t xml:space="preserve">judge must flag the disagreement but grade according to the eval evidence.</w:t>
+      </w:r>
+      <w:r>
+        <w:t xml:space="preserve"> </w:t>
+      </w:r>
+      <w:r>
+        <w:t xml:space="preserve">This is essential for reliably grading stale-memory traps and source</w:t>
+      </w:r>
+      <w:r>
+        <w:t xml:space="preserve"> </w:t>
+      </w:r>
+      <w:r>
+        <w:t xml:space="preserve">inconsistencies.</w:t>
       </w:r>
     </w:p>
     <w:p>
@@ -1315,7 +1351,167 @@
         <w:rPr>
           <w:b/>
         </w:rPr>
-        <w:t xml:space="preserve">Semantic metrics:</w:t>
+        <w:t xml:space="preserve">Judge versions are tracked:</w:t>
+      </w:r>
+      <w:r>
+        <w:t xml:space="preserve"> </w:t>
+      </w:r>
+      <w:r>
+        <w:t xml:space="preserve">Judge prompt changes are versioned from</w:t>
+      </w:r>
+      <w:r>
+        <w:t xml:space="preserve"> </w:t>
+      </w:r>
+      <w:r>
+        <w:t xml:space="preserve">judge-v1 through judge-v5, covering both default and citation modes. This</w:t>
+      </w:r>
+      <w:r>
+        <w:t xml:space="preserve"> </w:t>
+      </w:r>
+      <w:r>
+        <w:t xml:space="preserve">preserves comparability across runs and makes grading changes explicit.</w:t>
+      </w:r>
+    </w:p>
+    <w:p>
+      <w:pPr>
+        <w:numPr>
+          <w:ilvl w:val="0"/>
+          <w:numId w:val="1005"/>
+        </w:numPr>
+        <w:pStyle w:val="Compact"/>
+      </w:pPr>
+      <w:r>
+        <w:rPr>
+          <w:b/>
+        </w:rPr>
+        <w:t xml:space="preserve">Completed runs can be regraded:</w:t>
+      </w:r>
+      <w:r>
+        <w:t xml:space="preserve"> </w:t>
+      </w:r>
+      <w:r>
+        <w:t xml:space="preserve">The</w:t>
+      </w:r>
+      <w:r>
+        <w:t xml:space="preserve"> </w:t>
+      </w:r>
+      <w:r>
+        <w:rPr>
+          <w:rStyle w:val="VerbatimChar"/>
+        </w:rPr>
+        <w:t xml:space="preserve">--rejudge</w:t>
+      </w:r>
+      <w:r>
+        <w:t xml:space="preserve"> </w:t>
+      </w:r>
+      <w:r>
+        <w:t xml:space="preserve">mode applies a newer</w:t>
+      </w:r>
+      <w:r>
+        <w:t xml:space="preserve"> </w:t>
+      </w:r>
+      <w:r>
+        <w:t xml:space="preserve">judge to saved transcripts from an earlier run. This allows the grading</w:t>
+      </w:r>
+      <w:r>
+        <w:t xml:space="preserve"> </w:t>
+      </w:r>
+      <w:r>
+        <w:t xml:space="preserve">rubric to improve without rerunning the agent or changing its recorded</w:t>
+      </w:r>
+      <w:r>
+        <w:t xml:space="preserve"> </w:t>
+      </w:r>
+      <w:r>
+        <w:t xml:space="preserve">behavior.</w:t>
+      </w:r>
+    </w:p>
+    <w:p>
+      <w:pPr>
+        <w:numPr>
+          <w:ilvl w:val="0"/>
+          <w:numId w:val="1005"/>
+        </w:numPr>
+        <w:pStyle w:val="Compact"/>
+      </w:pPr>
+      <w:r>
+        <w:rPr>
+          <w:b/>
+        </w:rPr>
+        <w:t xml:space="preserve">Human validation checks the judge:</w:t>
+      </w:r>
+      <w:r>
+        <w:t xml:space="preserve"> </w:t>
+      </w:r>
+      <w:r>
+        <w:t xml:space="preserve">A blind human review of 10 cases</w:t>
+      </w:r>
+      <w:r>
+        <w:t xml:space="preserve"> </w:t>
+      </w:r>
+      <w:r>
+        <w:t xml:space="preserve">was selected before any judge verdicts were examined. The human grades</w:t>
+      </w:r>
+      <w:r>
+        <w:t xml:space="preserve"> </w:t>
+      </w:r>
+      <w:r>
+        <w:t xml:space="preserve">matched the judge on all 10 cases.</w:t>
+      </w:r>
+    </w:p>
+    <w:p>
+      <w:pPr>
+        <w:pStyle w:val="FirstParagraph"/>
+      </w:pPr>
+      <w:r>
+        <w:t xml:space="preserve">We prefer an LLM-as-a-judge because it can evaluate factual correctness,</w:t>
+      </w:r>
+      <w:r>
+        <w:t xml:space="preserve"> </w:t>
+      </w:r>
+      <w:r>
+        <w:t xml:space="preserve">evidence faithfulness, and appropriate abstention in context, which simple</w:t>
+      </w:r>
+      <w:r>
+        <w:t xml:space="preserve"> </w:t>
+      </w:r>
+      <w:r>
+        <w:t xml:space="preserve">reference-overlap metrics cannot reliably capture. However, we still</w:t>
+      </w:r>
+      <w:r>
+        <w:t xml:space="preserve"> </w:t>
+      </w:r>
+      <w:r>
+        <w:t xml:space="preserve">evaluated traditional lexical and semantic metrics empirically rather than</w:t>
+      </w:r>
+      <w:r>
+        <w:t xml:space="preserve"> </w:t>
+      </w:r>
+      <w:r>
+        <w:t xml:space="preserve">dismissing or adopting them by assumption.</w:t>
+      </w:r>
+    </w:p>
+    <w:p>
+      <w:pPr>
+        <w:pStyle w:val="BodyText"/>
+      </w:pPr>
+      <w:r>
+        <w:t xml:space="preserve">Traditional lexical/semantic metrics findings:</w:t>
+      </w:r>
+    </w:p>
+    <w:p>
+      <w:pPr>
+        <w:numPr>
+          <w:ilvl w:val="0"/>
+          <w:numId w:val="1006"/>
+        </w:numPr>
+        <w:pStyle w:val="Compact"/>
+      </w:pPr>
+      <w:r>
+        <w:rPr>
+          <w:b/>
+        </w:rPr>
+        <w:t xml:space="preserve">Lexical metrics:</w:t>
       </w:r>
     </w:p>
     <w:p>
@@ -1330,6 +1526,78 @@
         <w:rPr>
           <w:b/>
         </w:rPr>
+        <w:t xml:space="preserve">BLEU and ROUGE were tested and rejected:</w:t>
+      </w:r>
+      <w:r>
+        <w:t xml:space="preserve"> </w:t>
+      </w:r>
+      <w:r>
+        <w:t xml:space="preserve">They were treated as</w:t>
+      </w:r>
+      <w:r>
+        <w:t xml:space="preserve"> </w:t>
+      </w:r>
+      <w:r>
+        <w:t xml:space="preserve">falsifiable metrics rather than assumed to be useful, which aligns with</w:t>
+      </w:r>
+      <w:r>
+        <w:t xml:space="preserve"> </w:t>
+      </w:r>
+      <w:r>
+        <w:t xml:space="preserve">our expectations. The baseline’s incorrect answer scored above the</w:t>
+      </w:r>
+      <w:r>
+        <w:t xml:space="preserve"> </w:t>
+      </w:r>
+      <w:r>
+        <w:t xml:space="preserve">average correct answer on ROUGE-1, while correct answers ranged from</w:t>
+      </w:r>
+      <w:r>
+        <w:t xml:space="preserve"> </w:t>
+      </w:r>
+      <w:r>
+        <w:t xml:space="preserve">0.00 to 0.76. Because fluent but incorrect answers can overlap heavily</w:t>
+      </w:r>
+      <w:r>
+        <w:t xml:space="preserve"> </w:t>
+      </w:r>
+      <w:r>
+        <w:t xml:space="preserve">with short reference answers, no useful threshold separated correct from</w:t>
+      </w:r>
+      <w:r>
+        <w:t xml:space="preserve"> </w:t>
+      </w:r>
+      <w:r>
+        <w:t xml:space="preserve">incorrect responses.</w:t>
+      </w:r>
+    </w:p>
+    <w:p>
+      <w:pPr>
+        <w:numPr>
+          <w:ilvl w:val="0"/>
+          <w:numId w:val="1006"/>
+        </w:numPr>
+        <w:pStyle w:val="Compact"/>
+      </w:pPr>
+      <w:r>
+        <w:rPr>
+          <w:b/>
+        </w:rPr>
+        <w:t xml:space="preserve">Semantic metrics:</w:t>
+      </w:r>
+    </w:p>
+    <w:p>
+      <w:pPr>
+        <w:numPr>
+          <w:ilvl w:val="1"/>
+          <w:numId w:val="1008"/>
+        </w:numPr>
+        <w:pStyle w:val="Compact"/>
+      </w:pPr>
+      <w:r>
+        <w:rPr>
+          <w:b/>
+        </w:rPr>
         <w:t xml:space="preserve">BERTScore was deferred:</w:t>
       </w:r>
       <w:r>
@@ -1355,7 +1623,7 @@
       <w:pPr>
         <w:numPr>
           <w:ilvl w:val="1"/>
-          <w:numId w:val="1007"/>
+          <w:numId w:val="1008"/>
         </w:numPr>
         <w:pStyle w:val="Compact"/>
       </w:pPr>
@@ -2223,7 +2491,7 @@
       <w:pPr>
         <w:numPr>
           <w:ilvl w:val="0"/>
-          <w:numId w:val="1008"/>
+          <w:numId w:val="1009"/>
         </w:numPr>
         <w:pStyle w:val="Compact"/>
       </w:pPr>
@@ -2250,200 +2518,6 @@
       </w:r>
       <w:r>
         <w:t xml:space="preserve">unnecessary searches.</w:t>
-      </w:r>
-    </w:p>
-    <w:p>
-      <w:pPr>
-        <w:numPr>
-          <w:ilvl w:val="0"/>
-          <w:numId w:val="1008"/>
-        </w:numPr>
-        <w:pStyle w:val="Compact"/>
-      </w:pPr>
-      <w:r>
-        <w:rPr>
-          <w:b/>
-        </w:rPr>
-        <w:t xml:space="preserve">Disambiguation:</w:t>
-      </w:r>
-      <w:r>
-        <w:t xml:space="preserve"> </w:t>
-      </w:r>
-      <w:r>
-        <w:t xml:space="preserve">When retrieval was used, the system consistently</w:t>
-      </w:r>
-      <w:r>
-        <w:t xml:space="preserve"> </w:t>
-      </w:r>
-      <w:r>
-        <w:t xml:space="preserve">selected the correct article, achieving a right-article score of 1.0.</w:t>
-      </w:r>
-    </w:p>
-    <w:p>
-      <w:pPr>
-        <w:numPr>
-          <w:ilvl w:val="0"/>
-          <w:numId w:val="1008"/>
-        </w:numPr>
-        <w:pStyle w:val="Compact"/>
-      </w:pPr>
-      <w:r>
-        <w:rPr>
-          <w:b/>
-        </w:rPr>
-        <w:t xml:space="preserve">Evidence grounding:</w:t>
-      </w:r>
-      <w:r>
-        <w:t xml:space="preserve"> </w:t>
-      </w:r>
-      <w:r>
-        <w:t xml:space="preserve">The final configuration had no faithfulness</w:t>
-      </w:r>
-      <w:r>
-        <w:t xml:space="preserve"> </w:t>
-      </w:r>
-      <w:r>
-        <w:t xml:space="preserve">violations. Answers remained supported by the retrieved evidence rather</w:t>
-      </w:r>
-      <w:r>
-        <w:t xml:space="preserve"> </w:t>
-      </w:r>
-      <w:r>
-        <w:t xml:space="preserve">than relying on unverified model memory.</w:t>
-      </w:r>
-    </w:p>
-    <w:p>
-      <w:pPr>
-        <w:numPr>
-          <w:ilvl w:val="0"/>
-          <w:numId w:val="1008"/>
-        </w:numPr>
-        <w:pStyle w:val="Compact"/>
-      </w:pPr>
-      <w:r>
-        <w:rPr>
-          <w:b/>
-        </w:rPr>
-        <w:t xml:space="preserve">Abstention:</w:t>
-      </w:r>
-      <w:r>
-        <w:t xml:space="preserve"> </w:t>
-      </w:r>
-      <w:r>
-        <w:t xml:space="preserve">The system correctly declined to answer unanswerable</w:t>
-      </w:r>
-      <w:r>
-        <w:t xml:space="preserve"> </w:t>
-      </w:r>
-      <w:r>
-        <w:t xml:space="preserve">questions and multi-hop questions whose evidence chains ended without a</w:t>
-      </w:r>
-      <w:r>
-        <w:t xml:space="preserve"> </w:t>
-      </w:r>
-      <w:r>
-        <w:t xml:space="preserve">supported answer.</w:t>
-      </w:r>
-    </w:p>
-    <w:p>
-      <w:pPr>
-        <w:numPr>
-          <w:ilvl w:val="0"/>
-          <w:numId w:val="1008"/>
-        </w:numPr>
-        <w:pStyle w:val="Compact"/>
-      </w:pPr>
-      <w:r>
-        <w:rPr>
-          <w:b/>
-        </w:rPr>
-        <w:t xml:space="preserve">Multi-hop reasoning:</w:t>
-      </w:r>
-      <w:r>
-        <w:t xml:space="preserve"> </w:t>
-      </w:r>
-      <w:r>
-        <w:t xml:space="preserve">It successfully completed chained searches,</w:t>
-      </w:r>
-      <w:r>
-        <w:t xml:space="preserve"> </w:t>
-      </w:r>
-      <w:r>
-        <w:t xml:space="preserve">including cases where intermediate answers were intentionally too obscure</w:t>
-      </w:r>
-      <w:r>
-        <w:t xml:space="preserve"> </w:t>
-      </w:r>
-      <w:r>
-        <w:t xml:space="preserve">to recover reliably from memory.</w:t>
-      </w:r>
-    </w:p>
-    <w:p>
-      <w:pPr>
-        <w:numPr>
-          <w:ilvl w:val="0"/>
-          <w:numId w:val="1008"/>
-        </w:numPr>
-        <w:pStyle w:val="Compact"/>
-      </w:pPr>
-      <w:r>
-        <w:rPr>
-          <w:b/>
-        </w:rPr>
-        <w:t xml:space="preserve">Citation mode:</w:t>
-      </w:r>
-      <w:r>
-        <w:t xml:space="preserve"> </w:t>
-      </w:r>
-      <w:r>
-        <w:t xml:space="preserve">The optional</w:t>
-      </w:r>
-      <w:r>
-        <w:t xml:space="preserve"> </w:t>
-      </w:r>
-      <w:r>
-        <w:rPr>
-          <w:rStyle w:val="VerbatimChar"/>
-        </w:rPr>
-        <w:t xml:space="preserve">--cite</w:t>
-      </w:r>
-      <w:r>
-        <w:t xml:space="preserve"> </w:t>
-      </w:r>
-      <w:r>
-        <w:t xml:space="preserve">mode achieved complete citation</w:t>
-      </w:r>
-      <w:r>
-        <w:t xml:space="preserve"> </w:t>
-      </w:r>
-      <w:r>
-        <w:t xml:space="preserve">coverage with no invented or misattributed citations. It also eliminated</w:t>
-      </w:r>
-      <w:r>
-        <w:t xml:space="preserve"> </w:t>
-      </w:r>
-      <w:r>
-        <w:t xml:space="preserve">unsupported side claims, reducing them from roughly one per default-mode</w:t>
-      </w:r>
-      <w:r>
-        <w:t xml:space="preserve"> </w:t>
-      </w:r>
-      <w:r>
-        <w:t xml:space="preserve">run to 0 out of 21 searched answers. Requiring a citation for each claim</w:t>
-      </w:r>
-      <w:r>
-        <w:t xml:space="preserve"> </w:t>
-      </w:r>
-      <w:r>
-        <w:t xml:space="preserve">appears to discourage the model from adding details from memory.</w:t>
-      </w:r>
-    </w:p>
-    <w:p>
-      <w:pPr>
-        <w:pStyle w:val="FirstParagraph"/>
-      </w:pPr>
-      <w:r>
-        <w:t xml:space="preserve">Known residual failures:</w:t>
       </w:r>
     </w:p>
     <w:p>
@@ -2458,55 +2532,19 @@
         <w:rPr>
           <w:b/>
         </w:rPr>
-        <w:t xml:space="preserve">Occasional missed searches:</w:t>
-      </w:r>
-      <w:r>
-        <w:t xml:space="preserve"> </w:t>
-      </w:r>
-      <w:r>
-        <w:t xml:space="preserve">The model sometimes answers stable,</w:t>
-      </w:r>
-      <w:r>
-        <w:t xml:space="preserve"> </w:t>
-      </w:r>
-      <w:r>
-        <w:t xml:space="preserve">decades-old historical dates from memory despite the prompt’s</w:t>
-      </w:r>
-      <w:r>
-        <w:t xml:space="preserve"> </w:t>
-      </w:r>
-      <w:r>
-        <w:t xml:space="preserve">“</w:t>
-      </w:r>
-      <w:r>
-        <w:t xml:space="preserve">specific</w:t>
-      </w:r>
-      <w:r>
-        <w:t xml:space="preserve"> </w:t>
-      </w:r>
-      <w:r>
-        <w:t xml:space="preserve">years</w:t>
-      </w:r>
-      <w:r>
-        <w:t xml:space="preserve">”</w:t>
-      </w:r>
-      <w:r>
-        <w:t xml:space="preserve"> </w:t>
-      </w:r>
-      <w:r>
-        <w:t xml:space="preserve">search trigger. These answers have remained correct, and the</w:t>
-      </w:r>
-      <w:r>
-        <w:t xml:space="preserve"> </w:t>
-      </w:r>
-      <w:r>
-        <w:t xml:space="preserve">roughly one-case variation was accepted because stronger wording could</w:t>
-      </w:r>
-      <w:r>
-        <w:t xml:space="preserve"> </w:t>
-      </w:r>
-      <w:r>
-        <w:t xml:space="preserve">reduce search precision.</w:t>
+        <w:t xml:space="preserve">Disambiguation:</w:t>
+      </w:r>
+      <w:r>
+        <w:t xml:space="preserve"> </w:t>
+      </w:r>
+      <w:r>
+        <w:t xml:space="preserve">When retrieval was used, the system consistently</w:t>
+      </w:r>
+      <w:r>
+        <w:t xml:space="preserve"> </w:t>
+      </w:r>
+      <w:r>
+        <w:t xml:space="preserve">selected the correct article, achieving a right-article score of 1.0.</w:t>
       </w:r>
     </w:p>
     <w:p>
@@ -2521,61 +2559,25 @@
         <w:rPr>
           <w:b/>
         </w:rPr>
-        <w:t xml:space="preserve">Unsupported side details:</w:t>
-      </w:r>
-      <w:r>
-        <w:t xml:space="preserve"> </w:t>
-      </w:r>
-      <w:r>
-        <w:t xml:space="preserve">Roughly 5% of searched answers contain a</w:t>
-      </w:r>
-      <w:r>
-        <w:t xml:space="preserve"> </w:t>
-      </w:r>
-      <w:r>
-        <w:t xml:space="preserve">small detail not supported by the retrieved evidence, such as adding</w:t>
-      </w:r>
-      <w:r>
-        <w:t xml:space="preserve"> </w:t>
-      </w:r>
-      <w:r>
-        <w:t xml:space="preserve">“</w:t>
-      </w:r>
-      <w:r>
-        <w:t xml:space="preserve">France/PSG</w:t>
-      </w:r>
-      <w:r>
-        <w:t xml:space="preserve">”</w:t>
-      </w:r>
-      <w:r>
-        <w:t xml:space="preserve"> </w:t>
-      </w:r>
-      <w:r>
-        <w:t xml:space="preserve">or providing a full date when the source includes only the</w:t>
-      </w:r>
-      <w:r>
-        <w:t xml:space="preserve"> </w:t>
-      </w:r>
-      <w:r>
-        <w:t xml:space="preserve">year. The observed details happened to be correct, but they represent the</w:t>
-      </w:r>
-      <w:r>
-        <w:t xml:space="preserve"> </w:t>
-      </w:r>
-      <w:r>
-        <w:t xml:space="preserve">same kind of unverified embellishment that could eventually produce an</w:t>
-      </w:r>
-      <w:r>
-        <w:t xml:space="preserve"> </w:t>
-      </w:r>
-      <w:r>
-        <w:t xml:space="preserve">error. The rate is tracked across runs, with a prompt-level fix ready if</w:t>
-      </w:r>
-      <w:r>
-        <w:t xml:space="preserve"> </w:t>
-      </w:r>
-      <w:r>
-        <w:t xml:space="preserve">it increases on a larger eval set.</w:t>
+        <w:t xml:space="preserve">Evidence grounding:</w:t>
+      </w:r>
+      <w:r>
+        <w:t xml:space="preserve"> </w:t>
+      </w:r>
+      <w:r>
+        <w:t xml:space="preserve">The final configuration had no faithfulness</w:t>
+      </w:r>
+      <w:r>
+        <w:t xml:space="preserve"> </w:t>
+      </w:r>
+      <w:r>
+        <w:t xml:space="preserve">violations. Answers remained supported by the retrieved evidence rather</w:t>
+      </w:r>
+      <w:r>
+        <w:t xml:space="preserve"> </w:t>
+      </w:r>
+      <w:r>
+        <w:t xml:space="preserve">than relying on unverified model memory.</w:t>
       </w:r>
     </w:p>
     <w:p>
@@ -2590,37 +2592,25 @@
         <w:rPr>
           <w:b/>
         </w:rPr>
-        <w:t xml:space="preserve">Long-article truncation:</w:t>
-      </w:r>
-      <w:r>
-        <w:t xml:space="preserve"> </w:t>
-      </w:r>
-      <w:r>
-        <w:t xml:space="preserve">Relevant facts located deep within long</w:t>
-      </w:r>
-      <w:r>
-        <w:t xml:space="preserve"> </w:t>
-      </w:r>
-      <w:r>
-        <w:t xml:space="preserve">Wikipedia articles may fall beyond the 6,000-character extract limit.</w:t>
-      </w:r>
-      <w:r>
-        <w:t xml:space="preserve"> </w:t>
-      </w:r>
-      <w:r>
-        <w:t xml:space="preserve">Search snippets and infobox extraction recover many facts omitted from the</w:t>
-      </w:r>
-      <w:r>
-        <w:t xml:space="preserve"> </w:t>
-      </w:r>
-      <w:r>
-        <w:t xml:space="preserve">main extract, especially those in tables and infoboxes, but they do not</w:t>
-      </w:r>
-      <w:r>
-        <w:t xml:space="preserve"> </w:t>
-      </w:r>
-      <w:r>
-        <w:t xml:space="preserve">cover every case.</w:t>
+        <w:t xml:space="preserve">Abstention:</w:t>
+      </w:r>
+      <w:r>
+        <w:t xml:space="preserve"> </w:t>
+      </w:r>
+      <w:r>
+        <w:t xml:space="preserve">The system correctly declined to answer unanswerable</w:t>
+      </w:r>
+      <w:r>
+        <w:t xml:space="preserve"> </w:t>
+      </w:r>
+      <w:r>
+        <w:t xml:space="preserve">questions and multi-hop questions whose evidence chains ended without a</w:t>
+      </w:r>
+      <w:r>
+        <w:t xml:space="preserve"> </w:t>
+      </w:r>
+      <w:r>
+        <w:t xml:space="preserve">supported answer.</w:t>
       </w:r>
     </w:p>
     <w:p>
@@ -2635,37 +2625,85 @@
         <w:rPr>
           <w:b/>
         </w:rPr>
-        <w:t xml:space="preserve">Changing or inconsistent sources:</w:t>
-      </w:r>
-      <w:r>
-        <w:t xml:space="preserve"> </w:t>
-      </w:r>
-      <w:r>
-        <w:t xml:space="preserve">Wikipedia content changes over time</w:t>
-      </w:r>
-      <w:r>
-        <w:t xml:space="preserve"> </w:t>
-      </w:r>
-      <w:r>
-        <w:t xml:space="preserve">and can occasionally contradict itself. In the r09 case, the article</w:t>
-      </w:r>
-      <w:r>
-        <w:t xml:space="preserve"> </w:t>
-      </w:r>
-      <w:r>
-        <w:t xml:space="preserve">listed different years in its prose and infobox. The eval handles known</w:t>
-      </w:r>
-      <w:r>
-        <w:t xml:space="preserve"> </w:t>
-      </w:r>
-      <w:r>
-        <w:t xml:space="preserve">conflicts by grading against the retrieved evidence and documenting</w:t>
-      </w:r>
-      <w:r>
-        <w:t xml:space="preserve"> </w:t>
-      </w:r>
-      <w:r>
-        <w:t xml:space="preserve">acceptable answers, but it cannot eliminate source-level inconsistency.</w:t>
+        <w:t xml:space="preserve">Multi-hop reasoning:</w:t>
+      </w:r>
+      <w:r>
+        <w:t xml:space="preserve"> </w:t>
+      </w:r>
+      <w:r>
+        <w:t xml:space="preserve">It successfully completed chained searches,</w:t>
+      </w:r>
+      <w:r>
+        <w:t xml:space="preserve"> </w:t>
+      </w:r>
+      <w:r>
+        <w:t xml:space="preserve">including cases where intermediate answers were intentionally too obscure</w:t>
+      </w:r>
+      <w:r>
+        <w:t xml:space="preserve"> </w:t>
+      </w:r>
+      <w:r>
+        <w:t xml:space="preserve">to recover reliably from memory.</w:t>
+      </w:r>
+    </w:p>
+    <w:p>
+      <w:pPr>
+        <w:numPr>
+          <w:ilvl w:val="0"/>
+          <w:numId w:val="1009"/>
+        </w:numPr>
+        <w:pStyle w:val="Compact"/>
+      </w:pPr>
+      <w:r>
+        <w:rPr>
+          <w:b/>
+        </w:rPr>
+        <w:t xml:space="preserve">Citation mode:</w:t>
+      </w:r>
+      <w:r>
+        <w:t xml:space="preserve"> </w:t>
+      </w:r>
+      <w:r>
+        <w:t xml:space="preserve">The optional</w:t>
+      </w:r>
+      <w:r>
+        <w:t xml:space="preserve"> </w:t>
+      </w:r>
+      <w:r>
+        <w:rPr>
+          <w:rStyle w:val="VerbatimChar"/>
+        </w:rPr>
+        <w:t xml:space="preserve">--cite</w:t>
+      </w:r>
+      <w:r>
+        <w:t xml:space="preserve"> </w:t>
+      </w:r>
+      <w:r>
+        <w:t xml:space="preserve">mode achieved complete citation</w:t>
+      </w:r>
+      <w:r>
+        <w:t xml:space="preserve"> </w:t>
+      </w:r>
+      <w:r>
+        <w:t xml:space="preserve">coverage with no invented or misattributed citations. It also eliminated</w:t>
+      </w:r>
+      <w:r>
+        <w:t xml:space="preserve"> </w:t>
+      </w:r>
+      <w:r>
+        <w:t xml:space="preserve">unsupported side claims, reducing them from roughly one per default-mode</w:t>
+      </w:r>
+      <w:r>
+        <w:t xml:space="preserve"> </w:t>
+      </w:r>
+      <w:r>
+        <w:t xml:space="preserve">run to 0 out of 21 searched answers. Requiring a citation for each claim</w:t>
+      </w:r>
+      <w:r>
+        <w:t xml:space="preserve"> </w:t>
+      </w:r>
+      <w:r>
+        <w:t xml:space="preserve">appears to discourage the model from adding details from memory.</w:t>
       </w:r>
     </w:p>
     <w:p>
@@ -2673,7 +2711,7 @@
         <w:pStyle w:val="FirstParagraph"/>
       </w:pPr>
       <w:r>
-        <w:t xml:space="preserve">Biggest lessons:</w:t>
+        <w:t xml:space="preserve">Known residual failures:</w:t>
       </w:r>
     </w:p>
     <w:p>
@@ -2688,43 +2726,55 @@
         <w:rPr>
           <w:b/>
         </w:rPr>
-        <w:t xml:space="preserve">Use staged metrics, not pass rate alone:</w:t>
-      </w:r>
-      <w:r>
-        <w:t xml:space="preserve"> </w:t>
-      </w:r>
-      <w:r>
-        <w:t xml:space="preserve">The v0 system passed 97% of</w:t>
-      </w:r>
-      <w:r>
-        <w:t xml:space="preserve"> </w:t>
-      </w:r>
-      <w:r>
-        <w:t xml:space="preserve">cases, but that number hid a major search-decision failure. It skipped</w:t>
-      </w:r>
-      <w:r>
-        <w:t xml:space="preserve"> </w:t>
-      </w:r>
-      <w:r>
-        <w:t xml:space="preserve">retrieval for two-thirds of the facts that required verification and often</w:t>
-      </w:r>
-      <w:r>
-        <w:t xml:space="preserve"> </w:t>
-      </w:r>
-      <w:r>
-        <w:t xml:space="preserve">passed only because the model happened to recall the correct answer.</w:t>
-      </w:r>
-      <w:r>
-        <w:t xml:space="preserve"> </w:t>
-      </w:r>
-      <w:r>
-        <w:t xml:space="preserve">Separately measuring search decisions, retrieval quality, and answer</w:t>
-      </w:r>
-      <w:r>
-        <w:t xml:space="preserve"> </w:t>
-      </w:r>
-      <w:r>
-        <w:t xml:space="preserve">quality exposed these latent failures.</w:t>
+        <w:t xml:space="preserve">Occasional missed searches:</w:t>
+      </w:r>
+      <w:r>
+        <w:t xml:space="preserve"> </w:t>
+      </w:r>
+      <w:r>
+        <w:t xml:space="preserve">The model sometimes answers stable,</w:t>
+      </w:r>
+      <w:r>
+        <w:t xml:space="preserve"> </w:t>
+      </w:r>
+      <w:r>
+        <w:t xml:space="preserve">decades-old historical dates from memory despite the prompt’s</w:t>
+      </w:r>
+      <w:r>
+        <w:t xml:space="preserve"> </w:t>
+      </w:r>
+      <w:r>
+        <w:t xml:space="preserve">“</w:t>
+      </w:r>
+      <w:r>
+        <w:t xml:space="preserve">specific</w:t>
+      </w:r>
+      <w:r>
+        <w:t xml:space="preserve"> </w:t>
+      </w:r>
+      <w:r>
+        <w:t xml:space="preserve">years</w:t>
+      </w:r>
+      <w:r>
+        <w:t xml:space="preserve">”</w:t>
+      </w:r>
+      <w:r>
+        <w:t xml:space="preserve"> </w:t>
+      </w:r>
+      <w:r>
+        <w:t xml:space="preserve">search trigger. These answers have remained correct, and the</w:t>
+      </w:r>
+      <w:r>
+        <w:t xml:space="preserve"> </w:t>
+      </w:r>
+      <w:r>
+        <w:t xml:space="preserve">roughly one-case variation was accepted because stronger wording could</w:t>
+      </w:r>
+      <w:r>
+        <w:t xml:space="preserve"> </w:t>
+      </w:r>
+      <w:r>
+        <w:t xml:space="preserve">reduce search precision.</w:t>
       </w:r>
     </w:p>
     <w:p>
@@ -2739,43 +2789,61 @@
         <w:rPr>
           <w:b/>
         </w:rPr>
-        <w:t xml:space="preserve">Trigger search based on the type of fact:</w:t>
-      </w:r>
-      <w:r>
-        <w:t xml:space="preserve"> </w:t>
-      </w:r>
-      <w:r>
-        <w:t xml:space="preserve">The model’s confidence was</w:t>
-      </w:r>
-      <w:r>
-        <w:t xml:space="preserve"> </w:t>
-      </w:r>
-      <w:r>
-        <w:t xml:space="preserve">not a reliable signal because it could be highly confident about stale or</w:t>
-      </w:r>
-      <w:r>
-        <w:t xml:space="preserve"> </w:t>
-      </w:r>
-      <w:r>
-        <w:t xml:space="preserve">incorrect information. Search decisions became more reliable when based on</w:t>
-      </w:r>
-      <w:r>
-        <w:t xml:space="preserve"> </w:t>
-      </w:r>
-      <w:r>
-        <w:t xml:space="preserve">observable fact categories, such as current officeholders, changing</w:t>
-      </w:r>
-      <w:r>
-        <w:t xml:space="preserve"> </w:t>
-      </w:r>
-      <w:r>
-        <w:t xml:space="preserve">statistics, exact dates, and named specifics, rather than the model’s</w:t>
-      </w:r>
-      <w:r>
-        <w:t xml:space="preserve"> </w:t>
-      </w:r>
-      <w:r>
-        <w:t xml:space="preserve">subjective certainty.</w:t>
+        <w:t xml:space="preserve">Unsupported side details:</w:t>
+      </w:r>
+      <w:r>
+        <w:t xml:space="preserve"> </w:t>
+      </w:r>
+      <w:r>
+        <w:t xml:space="preserve">Roughly 5% of searched answers contain a</w:t>
+      </w:r>
+      <w:r>
+        <w:t xml:space="preserve"> </w:t>
+      </w:r>
+      <w:r>
+        <w:t xml:space="preserve">small detail not supported by the retrieved evidence, such as adding</w:t>
+      </w:r>
+      <w:r>
+        <w:t xml:space="preserve"> </w:t>
+      </w:r>
+      <w:r>
+        <w:t xml:space="preserve">“</w:t>
+      </w:r>
+      <w:r>
+        <w:t xml:space="preserve">France/PSG</w:t>
+      </w:r>
+      <w:r>
+        <w:t xml:space="preserve">”</w:t>
+      </w:r>
+      <w:r>
+        <w:t xml:space="preserve"> </w:t>
+      </w:r>
+      <w:r>
+        <w:t xml:space="preserve">or providing a full date when the source includes only the</w:t>
+      </w:r>
+      <w:r>
+        <w:t xml:space="preserve"> </w:t>
+      </w:r>
+      <w:r>
+        <w:t xml:space="preserve">year. The observed details happened to be correct, but they represent the</w:t>
+      </w:r>
+      <w:r>
+        <w:t xml:space="preserve"> </w:t>
+      </w:r>
+      <w:r>
+        <w:t xml:space="preserve">same kind of unverified embellishment that could eventually produce an</w:t>
+      </w:r>
+      <w:r>
+        <w:t xml:space="preserve"> </w:t>
+      </w:r>
+      <w:r>
+        <w:t xml:space="preserve">error. The rate is tracked across runs, with a prompt-level fix ready if</w:t>
+      </w:r>
+      <w:r>
+        <w:t xml:space="preserve"> </w:t>
+      </w:r>
+      <w:r>
+        <w:t xml:space="preserve">it increases on a larger eval set.</w:t>
       </w:r>
     </w:p>
     <w:p>
@@ -2790,43 +2858,37 @@
         <w:rPr>
           <w:b/>
         </w:rPr>
-        <w:t xml:space="preserve">Fix the right layer:</w:t>
-      </w:r>
-      <w:r>
-        <w:t xml:space="preserve"> </w:t>
-      </w:r>
-      <w:r>
-        <w:t xml:space="preserve">Several apparent prompt failures were actually</w:t>
-      </w:r>
-      <w:r>
-        <w:t xml:space="preserve"> </w:t>
-      </w:r>
-      <w:r>
-        <w:t xml:space="preserve">retrieval problems. Rate limits prevented evidence from being returned,</w:t>
-      </w:r>
-      <w:r>
-        <w:t xml:space="preserve"> </w:t>
-      </w:r>
-      <w:r>
-        <w:t xml:space="preserve">while plain-text Wikipedia extracts omitted tables and infoboxes</w:t>
-      </w:r>
-      <w:r>
-        <w:t xml:space="preserve"> </w:t>
-      </w:r>
-      <w:r>
-        <w:t xml:space="preserve">containing facts such as award winners and population figures. Adding</w:t>
-      </w:r>
-      <w:r>
-        <w:t xml:space="preserve"> </w:t>
-      </w:r>
-      <w:r>
-        <w:t xml:space="preserve">retries, search snippets, and infobox extraction addressed these failures</w:t>
-      </w:r>
-      <w:r>
-        <w:t xml:space="preserve"> </w:t>
-      </w:r>
-      <w:r>
-        <w:t xml:space="preserve">more effectively than additional prompt instructions.</w:t>
+        <w:t xml:space="preserve">Long-article truncation:</w:t>
+      </w:r>
+      <w:r>
+        <w:t xml:space="preserve"> </w:t>
+      </w:r>
+      <w:r>
+        <w:t xml:space="preserve">Relevant facts located deep within long</w:t>
+      </w:r>
+      <w:r>
+        <w:t xml:space="preserve"> </w:t>
+      </w:r>
+      <w:r>
+        <w:t xml:space="preserve">Wikipedia articles may fall beyond the 6,000-character extract limit.</w:t>
+      </w:r>
+      <w:r>
+        <w:t xml:space="preserve"> </w:t>
+      </w:r>
+      <w:r>
+        <w:t xml:space="preserve">Search snippets and infobox extraction recover many facts omitted from the</w:t>
+      </w:r>
+      <w:r>
+        <w:t xml:space="preserve"> </w:t>
+      </w:r>
+      <w:r>
+        <w:t xml:space="preserve">main extract, especially those in tables and infoboxes, but they do not</w:t>
+      </w:r>
+      <w:r>
+        <w:t xml:space="preserve"> </w:t>
+      </w:r>
+      <w:r>
+        <w:t xml:space="preserve">cover every case.</w:t>
       </w:r>
     </w:p>
     <w:p>
@@ -2841,60 +2903,46 @@
         <w:rPr>
           <w:b/>
         </w:rPr>
-        <w:t xml:space="preserve">Evaluate the evaluator:</w:t>
-      </w:r>
-      <w:r>
-        <w:t xml:space="preserve"> </w:t>
-      </w:r>
-      <w:r>
-        <w:t xml:space="preserve">Judge prompts and rubrics can have blind</w:t>
-      </w:r>
-      <w:r>
-        <w:t xml:space="preserve"> </w:t>
-      </w:r>
-      <w:r>
-        <w:t xml:space="preserve">spots, so they should be versioned and tested like the agent itself.</w:t>
-      </w:r>
-      <w:r>
-        <w:t xml:space="preserve"> </w:t>
-      </w:r>
-      <w:r>
-        <w:t xml:space="preserve">Replaying updated judges over frozen transcripts allowed us to improve</w:t>
-      </w:r>
-      <w:r>
-        <w:t xml:space="preserve"> </w:t>
-      </w:r>
-      <w:r>
-        <w:t xml:space="preserve">grading and add hallucination analysis without rerunning the agent.</w:t>
-      </w:r>
-      <w:r>
-        <w:t xml:space="preserve"> </w:t>
-      </w:r>
-      <w:r>
-        <w:t xml:space="preserve">Measuring the roughly 5% unsupported-side-claim rate before changing the</w:t>
-      </w:r>
-      <w:r>
-        <w:t xml:space="preserve"> </w:t>
-      </w:r>
-      <w:r>
-        <w:t xml:space="preserve">prompt also prevented us from overcorrecting for a small residual issue</w:t>
-      </w:r>
-      <w:r>
-        <w:t xml:space="preserve"> </w:t>
-      </w:r>
-      <w:r>
-        <w:t xml:space="preserve">and potentially reducing overall answer quality.</w:t>
-      </w:r>
-    </w:p>
-    <w:p>
-      <w:pPr>
-        <w:pStyle w:val="Heading2"/>
-      </w:pPr>
-      <w:bookmarkStart w:id="28" w:name="with-more-time"/>
-      <w:r>
-        <w:t xml:space="preserve">5. With more time</w:t>
-      </w:r>
-      <w:bookmarkEnd w:id="28"/>
+        <w:t xml:space="preserve">Changing or inconsistent sources:</w:t>
+      </w:r>
+      <w:r>
+        <w:t xml:space="preserve"> </w:t>
+      </w:r>
+      <w:r>
+        <w:t xml:space="preserve">Wikipedia content changes over time</w:t>
+      </w:r>
+      <w:r>
+        <w:t xml:space="preserve"> </w:t>
+      </w:r>
+      <w:r>
+        <w:t xml:space="preserve">and can occasionally contradict itself. In the r09 case, the article</w:t>
+      </w:r>
+      <w:r>
+        <w:t xml:space="preserve"> </w:t>
+      </w:r>
+      <w:r>
+        <w:t xml:space="preserve">listed different years in its prose and infobox. The eval handles known</w:t>
+      </w:r>
+      <w:r>
+        <w:t xml:space="preserve"> </w:t>
+      </w:r>
+      <w:r>
+        <w:t xml:space="preserve">conflicts by grading against the retrieved evidence and documenting</w:t>
+      </w:r>
+      <w:r>
+        <w:t xml:space="preserve"> </w:t>
+      </w:r>
+      <w:r>
+        <w:t xml:space="preserve">acceptable answers, but it cannot eliminate source-level inconsistency.</w:t>
+      </w:r>
+    </w:p>
+    <w:p>
+      <w:pPr>
+        <w:pStyle w:val="FirstParagraph"/>
+      </w:pPr>
+      <w:r>
+        <w:t xml:space="preserve">Biggest lessons:</w:t>
+      </w:r>
     </w:p>
     <w:p>
       <w:pPr>
@@ -2908,25 +2956,43 @@
         <w:rPr>
           <w:b/>
         </w:rPr>
-        <w:t xml:space="preserve">Larger, repeated evals:</w:t>
-      </w:r>
-      <w:r>
-        <w:t xml:space="preserve"> </w:t>
-      </w:r>
-      <w:r>
-        <w:t xml:space="preserve">Expand beyond the 40-case suite and run each</w:t>
-      </w:r>
-      <w:r>
-        <w:t xml:space="preserve"> </w:t>
-      </w:r>
-      <w:r>
-        <w:t xml:space="preserve">configuration multiple times to measure variance and report confidence</w:t>
-      </w:r>
-      <w:r>
-        <w:t xml:space="preserve"> </w:t>
-      </w:r>
-      <w:r>
-        <w:t xml:space="preserve">intervals, rather than relying on a single saturated run.</w:t>
+        <w:t xml:space="preserve">Use staged metrics, not pass rate alone:</w:t>
+      </w:r>
+      <w:r>
+        <w:t xml:space="preserve"> </w:t>
+      </w:r>
+      <w:r>
+        <w:t xml:space="preserve">The v0 system passed 97% of</w:t>
+      </w:r>
+      <w:r>
+        <w:t xml:space="preserve"> </w:t>
+      </w:r>
+      <w:r>
+        <w:t xml:space="preserve">cases, but that number hid a major search-decision failure. It skipped</w:t>
+      </w:r>
+      <w:r>
+        <w:t xml:space="preserve"> </w:t>
+      </w:r>
+      <w:r>
+        <w:t xml:space="preserve">retrieval for two-thirds of the facts that required verification and often</w:t>
+      </w:r>
+      <w:r>
+        <w:t xml:space="preserve"> </w:t>
+      </w:r>
+      <w:r>
+        <w:t xml:space="preserve">passed only because the model happened to recall the correct answer.</w:t>
+      </w:r>
+      <w:r>
+        <w:t xml:space="preserve"> </w:t>
+      </w:r>
+      <w:r>
+        <w:t xml:space="preserve">Separately measuring search decisions, retrieval quality, and answer</w:t>
+      </w:r>
+      <w:r>
+        <w:t xml:space="preserve"> </w:t>
+      </w:r>
+      <w:r>
+        <w:t xml:space="preserve">quality exposed these latent failures.</w:t>
       </w:r>
     </w:p>
     <w:p>
@@ -2941,37 +3007,43 @@
         <w:rPr>
           <w:b/>
         </w:rPr>
-        <w:t xml:space="preserve">Human-judge inter-annotator agreement:</w:t>
-      </w:r>
-      <w:r>
-        <w:t xml:space="preserve"> </w:t>
-      </w:r>
-      <w:r>
-        <w:t xml:space="preserve">Have a human independently</w:t>
-      </w:r>
-      <w:r>
-        <w:t xml:space="preserve"> </w:t>
-      </w:r>
-      <w:r>
-        <w:t xml:space="preserve">grade a stratified 20–30% sample of the test suite, then measure agreement</w:t>
-      </w:r>
-      <w:r>
-        <w:t xml:space="preserve"> </w:t>
-      </w:r>
-      <w:r>
-        <w:t xml:space="preserve">with the LLM judge using percent agreement and Cohen’s kappa. Manually</w:t>
-      </w:r>
-      <w:r>
-        <w:t xml:space="preserve"> </w:t>
-      </w:r>
-      <w:r>
-        <w:t xml:space="preserve">review disagreements to identify systematic judge errors and refine the</w:t>
-      </w:r>
-      <w:r>
-        <w:t xml:space="preserve"> </w:t>
-      </w:r>
-      <w:r>
-        <w:t xml:space="preserve">rubric.</w:t>
+        <w:t xml:space="preserve">Trigger search based on the type of fact:</w:t>
+      </w:r>
+      <w:r>
+        <w:t xml:space="preserve"> </w:t>
+      </w:r>
+      <w:r>
+        <w:t xml:space="preserve">The model’s confidence was</w:t>
+      </w:r>
+      <w:r>
+        <w:t xml:space="preserve"> </w:t>
+      </w:r>
+      <w:r>
+        <w:t xml:space="preserve">not a reliable signal because it could be highly confident about stale or</w:t>
+      </w:r>
+      <w:r>
+        <w:t xml:space="preserve"> </w:t>
+      </w:r>
+      <w:r>
+        <w:t xml:space="preserve">incorrect information. Search decisions became more reliable when based on</w:t>
+      </w:r>
+      <w:r>
+        <w:t xml:space="preserve"> </w:t>
+      </w:r>
+      <w:r>
+        <w:t xml:space="preserve">observable fact categories, such as current officeholders, changing</w:t>
+      </w:r>
+      <w:r>
+        <w:t xml:space="preserve"> </w:t>
+      </w:r>
+      <w:r>
+        <w:t xml:space="preserve">statistics, exact dates, and named specifics, rather than the model’s</w:t>
+      </w:r>
+      <w:r>
+        <w:t xml:space="preserve"> </w:t>
+      </w:r>
+      <w:r>
+        <w:t xml:space="preserve">subjective certainty.</w:t>
       </w:r>
     </w:p>
     <w:p>
@@ -2979,6 +3051,202 @@
         <w:numPr>
           <w:ilvl w:val="0"/>
           <w:numId w:val="1011"/>
+        </w:numPr>
+        <w:pStyle w:val="Compact"/>
+      </w:pPr>
+      <w:r>
+        <w:rPr>
+          <w:b/>
+        </w:rPr>
+        <w:t xml:space="preserve">Fix the right layer:</w:t>
+      </w:r>
+      <w:r>
+        <w:t xml:space="preserve"> </w:t>
+      </w:r>
+      <w:r>
+        <w:t xml:space="preserve">Several apparent prompt failures were actually</w:t>
+      </w:r>
+      <w:r>
+        <w:t xml:space="preserve"> </w:t>
+      </w:r>
+      <w:r>
+        <w:t xml:space="preserve">retrieval problems. Rate limits prevented evidence from being returned,</w:t>
+      </w:r>
+      <w:r>
+        <w:t xml:space="preserve"> </w:t>
+      </w:r>
+      <w:r>
+        <w:t xml:space="preserve">while plain-text Wikipedia extracts omitted tables and infoboxes</w:t>
+      </w:r>
+      <w:r>
+        <w:t xml:space="preserve"> </w:t>
+      </w:r>
+      <w:r>
+        <w:t xml:space="preserve">containing facts such as award winners and population figures. Adding</w:t>
+      </w:r>
+      <w:r>
+        <w:t xml:space="preserve"> </w:t>
+      </w:r>
+      <w:r>
+        <w:t xml:space="preserve">retries, search snippets, and infobox extraction addressed these failures</w:t>
+      </w:r>
+      <w:r>
+        <w:t xml:space="preserve"> </w:t>
+      </w:r>
+      <w:r>
+        <w:t xml:space="preserve">more effectively than additional prompt instructions.</w:t>
+      </w:r>
+    </w:p>
+    <w:p>
+      <w:pPr>
+        <w:numPr>
+          <w:ilvl w:val="0"/>
+          <w:numId w:val="1011"/>
+        </w:numPr>
+        <w:pStyle w:val="Compact"/>
+      </w:pPr>
+      <w:r>
+        <w:rPr>
+          <w:b/>
+        </w:rPr>
+        <w:t xml:space="preserve">Evaluate the evaluator:</w:t>
+      </w:r>
+      <w:r>
+        <w:t xml:space="preserve"> </w:t>
+      </w:r>
+      <w:r>
+        <w:t xml:space="preserve">Judge prompts and rubrics can have blind</w:t>
+      </w:r>
+      <w:r>
+        <w:t xml:space="preserve"> </w:t>
+      </w:r>
+      <w:r>
+        <w:t xml:space="preserve">spots, so they should be versioned and tested like the agent itself.</w:t>
+      </w:r>
+      <w:r>
+        <w:t xml:space="preserve"> </w:t>
+      </w:r>
+      <w:r>
+        <w:t xml:space="preserve">Replaying updated judges over frozen transcripts allowed us to improve</w:t>
+      </w:r>
+      <w:r>
+        <w:t xml:space="preserve"> </w:t>
+      </w:r>
+      <w:r>
+        <w:t xml:space="preserve">grading and add hallucination analysis without rerunning the agent.</w:t>
+      </w:r>
+      <w:r>
+        <w:t xml:space="preserve"> </w:t>
+      </w:r>
+      <w:r>
+        <w:t xml:space="preserve">Measuring the roughly 5% unsupported-side-claim rate before changing the</w:t>
+      </w:r>
+      <w:r>
+        <w:t xml:space="preserve"> </w:t>
+      </w:r>
+      <w:r>
+        <w:t xml:space="preserve">prompt also prevented us from overcorrecting for a small residual issue</w:t>
+      </w:r>
+      <w:r>
+        <w:t xml:space="preserve"> </w:t>
+      </w:r>
+      <w:r>
+        <w:t xml:space="preserve">and potentially reducing overall answer quality.</w:t>
+      </w:r>
+    </w:p>
+    <w:p>
+      <w:pPr>
+        <w:pStyle w:val="Heading2"/>
+      </w:pPr>
+      <w:bookmarkStart w:id="28" w:name="with-more-time"/>
+      <w:r>
+        <w:t xml:space="preserve">5. With more time</w:t>
+      </w:r>
+      <w:bookmarkEnd w:id="28"/>
+    </w:p>
+    <w:p>
+      <w:pPr>
+        <w:numPr>
+          <w:ilvl w:val="0"/>
+          <w:numId w:val="1012"/>
+        </w:numPr>
+        <w:pStyle w:val="Compact"/>
+      </w:pPr>
+      <w:r>
+        <w:rPr>
+          <w:b/>
+        </w:rPr>
+        <w:t xml:space="preserve">Larger, repeated evals:</w:t>
+      </w:r>
+      <w:r>
+        <w:t xml:space="preserve"> </w:t>
+      </w:r>
+      <w:r>
+        <w:t xml:space="preserve">Expand beyond the 40-case suite and run each</w:t>
+      </w:r>
+      <w:r>
+        <w:t xml:space="preserve"> </w:t>
+      </w:r>
+      <w:r>
+        <w:t xml:space="preserve">configuration multiple times to measure variance and report confidence</w:t>
+      </w:r>
+      <w:r>
+        <w:t xml:space="preserve"> </w:t>
+      </w:r>
+      <w:r>
+        <w:t xml:space="preserve">intervals, rather than relying on a single saturated run.</w:t>
+      </w:r>
+    </w:p>
+    <w:p>
+      <w:pPr>
+        <w:numPr>
+          <w:ilvl w:val="0"/>
+          <w:numId w:val="1012"/>
+        </w:numPr>
+        <w:pStyle w:val="Compact"/>
+      </w:pPr>
+      <w:r>
+        <w:rPr>
+          <w:b/>
+        </w:rPr>
+        <w:t xml:space="preserve">Human-judge inter-annotator agreement:</w:t>
+      </w:r>
+      <w:r>
+        <w:t xml:space="preserve"> </w:t>
+      </w:r>
+      <w:r>
+        <w:t xml:space="preserve">Have a human independently</w:t>
+      </w:r>
+      <w:r>
+        <w:t xml:space="preserve"> </w:t>
+      </w:r>
+      <w:r>
+        <w:t xml:space="preserve">grade a stratified 20–30% sample of the test suite, then measure agreement</w:t>
+      </w:r>
+      <w:r>
+        <w:t xml:space="preserve"> </w:t>
+      </w:r>
+      <w:r>
+        <w:t xml:space="preserve">with the LLM judge using percent agreement and Cohen’s kappa. Manually</w:t>
+      </w:r>
+      <w:r>
+        <w:t xml:space="preserve"> </w:t>
+      </w:r>
+      <w:r>
+        <w:t xml:space="preserve">review disagreements to identify systematic judge errors and refine the</w:t>
+      </w:r>
+      <w:r>
+        <w:t xml:space="preserve"> </w:t>
+      </w:r>
+      <w:r>
+        <w:t xml:space="preserve">rubric.</w:t>
+      </w:r>
+    </w:p>
+    <w:p>
+      <w:pPr>
+        <w:numPr>
+          <w:ilvl w:val="0"/>
+          <w:numId w:val="1012"/>
         </w:numPr>
         <w:pStyle w:val="Compact"/>
       </w:pPr>
@@ -3063,7 +3331,7 @@
       <w:pPr>
         <w:numPr>
           <w:ilvl w:val="0"/>
-          <w:numId w:val="1011"/>
+          <w:numId w:val="1012"/>
         </w:numPr>
         <w:pStyle w:val="Compact"/>
       </w:pPr>
@@ -3096,7 +3364,7 @@
       <w:pPr>
         <w:numPr>
           <w:ilvl w:val="0"/>
-          <w:numId w:val="1011"/>
+          <w:numId w:val="1012"/>
         </w:numPr>
         <w:pStyle w:val="Compact"/>
       </w:pPr>
@@ -3129,7 +3397,7 @@
       <w:pPr>
         <w:numPr>
           <w:ilvl w:val="0"/>
-          <w:numId w:val="1011"/>
+          <w:numId w:val="1012"/>
         </w:numPr>
         <w:pStyle w:val="Compact"/>
       </w:pPr>
@@ -3428,6 +3696,9 @@
     <w:abstractNumId w:val="991"/>
   </w:num>
   <w:num w:numId="1011">
+    <w:abstractNumId w:val="991"/>
+  </w:num>
+  <w:num w:numId="1012">
     <w:abstractNumId w:val="991"/>
   </w:num>
 </w:numbering>

</xml_diff>

<commit_message>
RATIONALE: priority-sort 'With more time'; domain-expert IAA note
P0: repeated evals, human-judge IAA. P1: APO/AlphaEvolve comparison.
P2: failure dashboard, multilingual. P3: domain evals, now ending with a
note that judge agreement must be re-measured against domain-expert
graders (per-domain Cohen's kappa) before trusting LLM-judge verdicts in
healthcare/legal/finance. Docx regenerated.

Co-Authored-By: Claude Fable 5 <noreply@anthropic.com>
</commit_message>
<xml_diff>
--- a/RATIONALE.docx
+++ b/RATIONALE.docx
@@ -3166,6 +3166,14 @@
     </w:p>
     <w:p>
       <w:pPr>
+        <w:pStyle w:val="FirstParagraph"/>
+      </w:pPr>
+      <w:r>
+        <w:t xml:space="preserve">Priority-sorted (P0 = first):</w:t>
+      </w:r>
+    </w:p>
+    <w:p>
+      <w:pPr>
         <w:numPr>
           <w:ilvl w:val="0"/>
           <w:numId w:val="1012"/>
@@ -3176,25 +3184,25 @@
         <w:rPr>
           <w:b/>
         </w:rPr>
-        <w:t xml:space="preserve">Larger, repeated evals:</w:t>
-      </w:r>
-      <w:r>
-        <w:t xml:space="preserve"> </w:t>
-      </w:r>
-      <w:r>
-        <w:t xml:space="preserve">Expand beyond the 40-case suite and run each</w:t>
-      </w:r>
-      <w:r>
-        <w:t xml:space="preserve"> </w:t>
-      </w:r>
-      <w:r>
-        <w:t xml:space="preserve">configuration multiple times to measure variance and report confidence</w:t>
-      </w:r>
-      <w:r>
-        <w:t xml:space="preserve"> </w:t>
-      </w:r>
-      <w:r>
-        <w:t xml:space="preserve">intervals, rather than relying on a single saturated run.</w:t>
+        <w:t xml:space="preserve">[P0] Larger, repeated evals:</w:t>
+      </w:r>
+      <w:r>
+        <w:t xml:space="preserve"> </w:t>
+      </w:r>
+      <w:r>
+        <w:t xml:space="preserve">Expand beyond the 40-case suite and run</w:t>
+      </w:r>
+      <w:r>
+        <w:t xml:space="preserve"> </w:t>
+      </w:r>
+      <w:r>
+        <w:t xml:space="preserve">each configuration multiple times to measure variance and report</w:t>
+      </w:r>
+      <w:r>
+        <w:t xml:space="preserve"> </w:t>
+      </w:r>
+      <w:r>
+        <w:t xml:space="preserve">confidence intervals, rather than relying on a single saturated run.</w:t>
       </w:r>
     </w:p>
     <w:p>
@@ -3209,7 +3217,7 @@
         <w:rPr>
           <w:b/>
         </w:rPr>
-        <w:t xml:space="preserve">Human-judge inter-annotator agreement:</w:t>
+        <w:t xml:space="preserve">[P0] Human-judge inter-annotator agreement:</w:t>
       </w:r>
       <w:r>
         <w:t xml:space="preserve"> </w:t>
@@ -3254,7 +3262,7 @@
         <w:rPr>
           <w:b/>
         </w:rPr>
-        <w:t xml:space="preserve">Automated prompt optimization:</w:t>
+        <w:t xml:space="preserve">[P1] Automated prompt optimization:</w:t>
       </w:r>
       <w:r>
         <w:t xml:space="preserve"> </w:t>
@@ -3339,25 +3347,25 @@
         <w:rPr>
           <w:b/>
         </w:rPr>
-        <w:t xml:space="preserve">Multilingual coverage:</w:t>
-      </w:r>
-      <w:r>
-        <w:t xml:space="preserve"> </w:t>
-      </w:r>
-      <w:r>
-        <w:t xml:space="preserve">Extend the currently English-only suite across</w:t>
-      </w:r>
-      <w:r>
-        <w:t xml:space="preserve"> </w:t>
-      </w:r>
-      <w:r>
-        <w:t xml:space="preserve">languages and test retrieval, disambiguation, grounding, and abstention</w:t>
-      </w:r>
-      <w:r>
-        <w:t xml:space="preserve"> </w:t>
-      </w:r>
-      <w:r>
-        <w:t xml:space="preserve">separately for each language.</w:t>
+        <w:t xml:space="preserve">[P2] Failure-analysis dashboard:</w:t>
+      </w:r>
+      <w:r>
+        <w:t xml:space="preserve"> </w:t>
+      </w:r>
+      <w:r>
+        <w:t xml:space="preserve">Build a dashboard over the existing</w:t>
+      </w:r>
+      <w:r>
+        <w:t xml:space="preserve"> </w:t>
+      </w:r>
+      <w:r>
+        <w:t xml:space="preserve">structured per-case transcripts to slice failures by category, pipeline</w:t>
+      </w:r>
+      <w:r>
+        <w:t xml:space="preserve"> </w:t>
+      </w:r>
+      <w:r>
+        <w:t xml:space="preserve">stage, prompt version, model, and run.</w:t>
       </w:r>
     </w:p>
     <w:p>
@@ -3372,25 +3380,25 @@
         <w:rPr>
           <w:b/>
         </w:rPr>
-        <w:t xml:space="preserve">Failure-analysis dashboard:</w:t>
-      </w:r>
-      <w:r>
-        <w:t xml:space="preserve"> </w:t>
-      </w:r>
-      <w:r>
-        <w:t xml:space="preserve">Build a dashboard over the existing</w:t>
-      </w:r>
-      <w:r>
-        <w:t xml:space="preserve"> </w:t>
-      </w:r>
-      <w:r>
-        <w:t xml:space="preserve">structured per-case transcripts to slice failures by category, pipeline</w:t>
-      </w:r>
-      <w:r>
-        <w:t xml:space="preserve"> </w:t>
-      </w:r>
-      <w:r>
-        <w:t xml:space="preserve">stage, prompt version, model, and run.</w:t>
+        <w:t xml:space="preserve">[P2] Multilingual coverage:</w:t>
+      </w:r>
+      <w:r>
+        <w:t xml:space="preserve"> </w:t>
+      </w:r>
+      <w:r>
+        <w:t xml:space="preserve">Extend the currently English-only suite</w:t>
+      </w:r>
+      <w:r>
+        <w:t xml:space="preserve"> </w:t>
+      </w:r>
+      <w:r>
+        <w:t xml:space="preserve">across languages and test retrieval, disambiguation, grounding, and</w:t>
+      </w:r>
+      <w:r>
+        <w:t xml:space="preserve"> </w:t>
+      </w:r>
+      <w:r>
+        <w:t xml:space="preserve">abstention separately for each language.</w:t>
       </w:r>
     </w:p>
     <w:p>
@@ -3405,25 +3413,43 @@
         <w:rPr>
           <w:b/>
         </w:rPr>
-        <w:t xml:space="preserve">Specialized domain evals:</w:t>
-      </w:r>
-      <w:r>
-        <w:t xml:space="preserve"> </w:t>
-      </w:r>
-      <w:r>
-        <w:t xml:space="preserve">Add healthcare, legal, and finance cases,</w:t>
-      </w:r>
-      <w:r>
-        <w:t xml:space="preserve"> </w:t>
-      </w:r>
-      <w:r>
-        <w:t xml:space="preserve">where requirements for faithfulness, source quality, uncertainty</w:t>
-      </w:r>
-      <w:r>
-        <w:t xml:space="preserve"> </w:t>
-      </w:r>
-      <w:r>
-        <w:t xml:space="preserve">calibration, and appropriate abstention should be stricter.</w:t>
+        <w:t xml:space="preserve">[P3] Specialized domain evals:</w:t>
+      </w:r>
+      <w:r>
+        <w:t xml:space="preserve"> </w:t>
+      </w:r>
+      <w:r>
+        <w:t xml:space="preserve">Add healthcare, legal, and finance</w:t>
+      </w:r>
+      <w:r>
+        <w:t xml:space="preserve"> </w:t>
+      </w:r>
+      <w:r>
+        <w:t xml:space="preserve">cases, where requirements for faithfulness, source quality, uncertainty</w:t>
+      </w:r>
+      <w:r>
+        <w:t xml:space="preserve"> </w:t>
+      </w:r>
+      <w:r>
+        <w:t xml:space="preserve">calibration, and appropriate abstention should be stricter. IAA matters</w:t>
+      </w:r>
+      <w:r>
+        <w:t xml:space="preserve"> </w:t>
+      </w:r>
+      <w:r>
+        <w:t xml:space="preserve">most here: judge agreement should be re-measured against domain-expert</w:t>
+      </w:r>
+      <w:r>
+        <w:t xml:space="preserve"> </w:t>
+      </w:r>
+      <w:r>
+        <w:t xml:space="preserve">human graders (clinicians, lawyers, financial analysts) with per-domain</w:t>
+      </w:r>
+      <w:r>
+        <w:t xml:space="preserve"> </w:t>
+      </w:r>
+      <w:r>
+        <w:t xml:space="preserve">Cohen’s kappa before trusting LLM-judge verdicts in these settings.</w:t>
       </w:r>
     </w:p>
     <w:sectPr/>

</xml_diff>

<commit_message>
Note multi-hop latency; add latency optimization as a P1 next step
Co-Authored-By: Claude Fable 5 <noreply@anthropic.com>
</commit_message>
<xml_diff>
--- a/RATIONALE.docx
+++ b/RATIONALE.docx
@@ -3248,6 +3248,45 @@
       </w:r>
       <w:r>
         <w:t xml:space="preserve">rubric.</w:t>
+      </w:r>
+    </w:p>
+    <w:p>
+      <w:pPr>
+        <w:numPr>
+          <w:ilvl w:val="0"/>
+          <w:numId w:val="1012"/>
+        </w:numPr>
+        <w:pStyle w:val="Compact"/>
+      </w:pPr>
+      <w:r>
+        <w:rPr>
+          <w:b/>
+        </w:rPr>
+        <w:t xml:space="preserve">[P1] Latency optimization:</w:t>
+      </w:r>
+      <w:r>
+        <w:t xml:space="preserve"> </w:t>
+      </w:r>
+      <w:r>
+        <w:t xml:space="preserve">Multi-hop queries currently take up to</w:t>
+      </w:r>
+      <w:r>
+        <w:t xml:space="preserve"> </w:t>
+      </w:r>
+      <w:r>
+        <w:t xml:space="preserve">~30s because each hop is a sequential, rate-limit-throttled live</w:t>
+      </w:r>
+      <w:r>
+        <w:t xml:space="preserve"> </w:t>
+      </w:r>
+      <w:r>
+        <w:t xml:space="preserve">Wikipedia search; parallelizing independent hops, caching hot articles,</w:t>
+      </w:r>
+      <w:r>
+        <w:t xml:space="preserve"> </w:t>
+      </w:r>
+      <w:r>
+        <w:t xml:space="preserve">and tuning per-turn effort are the obvious levers.</w:t>
       </w:r>
     </w:p>
     <w:p>

</xml_diff>

<commit_message>
RATIONALE: expand P1 latency bullet with concrete levers
End-to-end and per-tool-call measurement, parallel independent hops,
two-layer caching (prompt/KV prefix caching + Wikipedia response
memoization), tighter extracts, latency-aware search budgets with early
stopping, adaptive backoff over the fixed throttle, and streaming for
perceived latency. Docx regenerated.

Co-Authored-By: Claude Fable 5 <noreply@anthropic.com>
</commit_message>
<xml_diff>
--- a/RATIONALE.docx
+++ b/RATIONALE.docx
@@ -3268,25 +3268,85 @@
         <w:t xml:space="preserve"> </w:t>
       </w:r>
       <w:r>
-        <w:t xml:space="preserve">Multi-hop queries currently take up to</w:t>
-      </w:r>
-      <w:r>
-        <w:t xml:space="preserve"> </w:t>
-      </w:r>
-      <w:r>
-        <w:t xml:space="preserve">~30s because each hop is a sequential, rate-limit-throttled live</w:t>
-      </w:r>
-      <w:r>
-        <w:t xml:space="preserve"> </w:t>
-      </w:r>
-      <w:r>
-        <w:t xml:space="preserve">Wikipedia search; parallelizing independent hops, caching hot articles,</w:t>
-      </w:r>
-      <w:r>
-        <w:t xml:space="preserve"> </w:t>
-      </w:r>
-      <w:r>
-        <w:t xml:space="preserve">and tuning per-turn effort are the obvious levers.</w:t>
+        <w:t xml:space="preserve">Measure and reduce end-to-end and</w:t>
+      </w:r>
+      <w:r>
+        <w:t xml:space="preserve"> </w:t>
+      </w:r>
+      <w:r>
+        <w:t xml:space="preserve">per-tool-call latency, especially for interactive use cases. Multi-hop</w:t>
+      </w:r>
+      <w:r>
+        <w:t xml:space="preserve"> </w:t>
+      </w:r>
+      <w:r>
+        <w:t xml:space="preserve">queries require sequential searches and can take noticeably longer (up to</w:t>
+      </w:r>
+      <w:r>
+        <w:t xml:space="preserve"> </w:t>
+      </w:r>
+      <w:r>
+        <w:t xml:space="preserve">~30s), as seen occasionally in the Vercel demo; each hop is a</w:t>
+      </w:r>
+      <w:r>
+        <w:t xml:space="preserve"> </w:t>
+      </w:r>
+      <w:r>
+        <w:t xml:space="preserve">rate-limit-throttled live Wikipedia round trip stacked on an agent turn.</w:t>
+      </w:r>
+      <w:r>
+        <w:t xml:space="preserve"> </w:t>
+      </w:r>
+      <w:r>
+        <w:t xml:space="preserve">Potential improvements include parallel retrieval where hops are</w:t>
+      </w:r>
+      <w:r>
+        <w:t xml:space="preserve"> </w:t>
+      </w:r>
+      <w:r>
+        <w:t xml:space="preserve">independent, caching at both layers (prompt/KV caching of the static</w:t>
+      </w:r>
+      <w:r>
+        <w:t xml:space="preserve"> </w:t>
+      </w:r>
+      <w:r>
+        <w:t xml:space="preserve">system-prompt and tool-definition prefix so each agent turn skips</w:t>
+      </w:r>
+      <w:r>
+        <w:t xml:space="preserve"> </w:t>
+      </w:r>
+      <w:r>
+        <w:t xml:space="preserve">re-processing it, plus memoizing hot Wikipedia responses server-side),</w:t>
+      </w:r>
+      <w:r>
+        <w:t xml:space="preserve"> </w:t>
+      </w:r>
+      <w:r>
+        <w:t xml:space="preserve">tighter extracts to cut per-turn input tokens, latency-aware search</w:t>
+      </w:r>
+      <w:r>
+        <w:t xml:space="preserve"> </w:t>
+      </w:r>
+      <w:r>
+        <w:t xml:space="preserve">limits (a per-question search budget with early stopping once evidence</w:t>
+      </w:r>
+      <w:r>
+        <w:t xml:space="preserve"> </w:t>
+      </w:r>
+      <w:r>
+        <w:t xml:space="preserve">suffices), relaxing the fixed 0.6s throttle in favor of adaptive backoff,</w:t>
+      </w:r>
+      <w:r>
+        <w:t xml:space="preserve"> </w:t>
+      </w:r>
+      <w:r>
+        <w:t xml:space="preserve">and streaming answers so perceived latency drops even when total time</w:t>
+      </w:r>
+      <w:r>
+        <w:t xml:space="preserve"> </w:t>
+      </w:r>
+      <w:r>
+        <w:t xml:space="preserve">does not.</w:t>
       </w:r>
     </w:p>
     <w:p>

</xml_diff>

<commit_message>
RATIONALE: tighten latency bullet
Co-Authored-By: Claude Fable 5 <noreply@anthropic.com>
</commit_message>
<xml_diff>
--- a/RATIONALE.docx
+++ b/RATIONALE.docx
@@ -3274,79 +3274,37 @@
         <w:t xml:space="preserve"> </w:t>
       </w:r>
       <w:r>
-        <w:t xml:space="preserve">per-tool-call latency, especially for interactive use cases. Multi-hop</w:t>
-      </w:r>
-      <w:r>
-        <w:t xml:space="preserve"> </w:t>
-      </w:r>
-      <w:r>
-        <w:t xml:space="preserve">queries require sequential searches and can take noticeably longer (up to</w:t>
-      </w:r>
-      <w:r>
-        <w:t xml:space="preserve"> </w:t>
-      </w:r>
-      <w:r>
-        <w:t xml:space="preserve">~30s), as seen occasionally in the Vercel demo; each hop is a</w:t>
-      </w:r>
-      <w:r>
-        <w:t xml:space="preserve"> </w:t>
-      </w:r>
-      <w:r>
-        <w:t xml:space="preserve">rate-limit-throttled live Wikipedia round trip stacked on an agent turn.</w:t>
-      </w:r>
-      <w:r>
-        <w:t xml:space="preserve"> </w:t>
-      </w:r>
-      <w:r>
-        <w:t xml:space="preserve">Potential improvements include parallel retrieval where hops are</w:t>
-      </w:r>
-      <w:r>
-        <w:t xml:space="preserve"> </w:t>
-      </w:r>
-      <w:r>
-        <w:t xml:space="preserve">independent, caching at both layers (prompt/KV caching of the static</w:t>
-      </w:r>
-      <w:r>
-        <w:t xml:space="preserve"> </w:t>
-      </w:r>
-      <w:r>
-        <w:t xml:space="preserve">system-prompt and tool-definition prefix so each agent turn skips</w:t>
-      </w:r>
-      <w:r>
-        <w:t xml:space="preserve"> </w:t>
-      </w:r>
-      <w:r>
-        <w:t xml:space="preserve">re-processing it, plus memoizing hot Wikipedia responses server-side),</w:t>
-      </w:r>
-      <w:r>
-        <w:t xml:space="preserve"> </w:t>
-      </w:r>
-      <w:r>
-        <w:t xml:space="preserve">tighter extracts to cut per-turn input tokens, latency-aware search</w:t>
-      </w:r>
-      <w:r>
-        <w:t xml:space="preserve"> </w:t>
-      </w:r>
-      <w:r>
-        <w:t xml:space="preserve">limits (a per-question search budget with early stopping once evidence</w:t>
-      </w:r>
-      <w:r>
-        <w:t xml:space="preserve"> </w:t>
-      </w:r>
-      <w:r>
-        <w:t xml:space="preserve">suffices), relaxing the fixed 0.6s throttle in favor of adaptive backoff,</w:t>
-      </w:r>
-      <w:r>
-        <w:t xml:space="preserve"> </w:t>
-      </w:r>
-      <w:r>
-        <w:t xml:space="preserve">and streaming answers so perceived latency drops even when total time</w:t>
-      </w:r>
-      <w:r>
-        <w:t xml:space="preserve"> </w:t>
-      </w:r>
-      <w:r>
-        <w:t xml:space="preserve">does not.</w:t>
+        <w:t xml:space="preserve">per-tool-call latency, especially for interactive use. Multi-hop queries</w:t>
+      </w:r>
+      <w:r>
+        <w:t xml:space="preserve"> </w:t>
+      </w:r>
+      <w:r>
+        <w:t xml:space="preserve">run sequential searches and can take up to ~30s in the Vercel demo.</w:t>
+      </w:r>
+      <w:r>
+        <w:t xml:space="preserve"> </w:t>
+      </w:r>
+      <w:r>
+        <w:t xml:space="preserve">Levers: parallel retrieval for independent hops, prompt/KV caching of the</w:t>
+      </w:r>
+      <w:r>
+        <w:t xml:space="preserve"> </w:t>
+      </w:r>
+      <w:r>
+        <w:t xml:space="preserve">static prefix plus Wikipedia response caching, tighter extracts,</w:t>
+      </w:r>
+      <w:r>
+        <w:t xml:space="preserve"> </w:t>
+      </w:r>
+      <w:r>
+        <w:t xml:space="preserve">latency-aware search budgets with early stopping, adaptive backoff</w:t>
+      </w:r>
+      <w:r>
+        <w:t xml:space="preserve"> </w:t>
+      </w:r>
+      <w:r>
+        <w:t xml:space="preserve">instead of the fixed throttle, and streaming for perceived latency.</w:t>
       </w:r>
     </w:p>
     <w:p>

</xml_diff>

<commit_message>
RATIONALE: metric-progression plots from run artifacts
Six panels (search recall/precision, evidence sufficiency, right-article,
tool-call success, groundedness incl. side-claims, pass rate) built by
eval/make_plots.py directly from eval/runs/ summaries and case files;
nothing hand-entered. Real trajectories: recall 0.33->0.95 with precision
flat at 1.0; dips annotated honestly (run-3 429 outage, run-6 multi-hop
cases added) rather than smoothed. Docx regenerated with embedded figure.

Co-Authored-By: Claude Fable 5 <noreply@anthropic.com>
</commit_message>
<xml_diff>
--- a/RATIONALE.docx
+++ b/RATIONALE.docx
@@ -2400,9 +2400,154 @@
     </w:p>
     <w:p>
       <w:pPr>
+        <w:pStyle w:val="Heading3"/>
+      </w:pPr>
+      <w:bookmarkStart w:id="27" w:name="metric-progression"/>
+      <w:r>
+        <w:t xml:space="preserve">Metric progression</w:t>
+      </w:r>
+      <w:bookmarkEnd w:id="27"/>
+    </w:p>
+    <w:p>
+      <w:pPr>
+        <w:pStyle w:val="CaptionedFigure"/>
+      </w:pPr>
+      <w:r>
+        <w:drawing>
+          <wp:inline>
+            <wp:extent cx="5334000" cy="2968486"/>
+            <wp:effectExtent b="0" l="0" r="0" t="0"/>
+            <wp:docPr descr="Metric progression across eval runs" title="" id="1" name="Picture"/>
+            <a:graphic>
+              <a:graphicData uri="http://schemas.openxmlformats.org/drawingml/2006/picture">
+                <pic:pic>
+                  <pic:nvPicPr>
+                    <pic:cNvPr descr="eval/plots/metrics_progression.png" id="0" name="Picture"/>
+                    <pic:cNvPicPr>
+                      <a:picLocks noChangeArrowheads="1" noChangeAspect="1"/>
+                    </pic:cNvPicPr>
+                  </pic:nvPicPr>
+                  <pic:blipFill>
+                    <a:blip r:embed="rId28"/>
+                    <a:stretch>
+                      <a:fillRect/>
+                    </a:stretch>
+                  </pic:blipFill>
+                  <pic:spPr bwMode="auto">
+                    <a:xfrm>
+                      <a:off x="0" y="0"/>
+                      <a:ext cx="5334000" cy="2968486"/>
+                    </a:xfrm>
+                    <a:prstGeom prst="rect">
+                      <a:avLst/>
+                    </a:prstGeom>
+                    <a:noFill/>
+                    <a:ln w="9525">
+                      <a:noFill/>
+                      <a:headEnd/>
+                      <a:tailEnd/>
+                    </a:ln>
+                  </pic:spPr>
+                </pic:pic>
+              </a:graphicData>
+            </a:graphic>
+          </wp:inline>
+        </w:drawing>
+      </w:r>
+    </w:p>
+    <w:p>
+      <w:pPr>
+        <w:pStyle w:val="ImageCaption"/>
+      </w:pPr>
+      <w:r>
+        <w:t xml:space="preserve">Metric progression across eval runs</w:t>
+      </w:r>
+    </w:p>
+    <w:p>
+      <w:pPr>
         <w:pStyle w:val="BodyText"/>
       </w:pPr>
       <w:r>
+        <w:t xml:space="preserve">All values are read from the checked-in run artifacts (regenerate with</w:t>
+      </w:r>
+      <w:r>
+        <w:t xml:space="preserve"> </w:t>
+      </w:r>
+      <w:r>
+        <w:rPr>
+          <w:rStyle w:val="VerbatimChar"/>
+        </w:rPr>
+        <w:t xml:space="preserve">python eval/make_plots.py</w:t>
+      </w:r>
+      <w:r>
+        <w:t xml:space="preserve">); runs 9-10 replay runs 7-8’s frozen</w:t>
+      </w:r>
+      <w:r>
+        <w:t xml:space="preserve"> </w:t>
+      </w:r>
+      <w:r>
+        <w:t xml:space="preserve">transcripts, so behavior metrics are plotted once and the side-claims</w:t>
+      </w:r>
+      <w:r>
+        <w:t xml:space="preserve"> </w:t>
+      </w:r>
+      <w:r>
+        <w:t xml:space="preserve">series starts at run 9, where its rubric was introduced. Reading the</w:t>
+      </w:r>
+      <w:r>
+        <w:t xml:space="preserve"> </w:t>
+      </w:r>
+      <w:r>
+        <w:t xml:space="preserve">trends: search recall triples (0.33 to 0.95) while precision never leaves</w:t>
+      </w:r>
+      <w:r>
+        <w:t xml:space="preserve"> </w:t>
+      </w:r>
+      <w:r>
+        <w:t xml:space="preserve">1.0; evidence sufficiency, right-article rate, faithfulness, and</w:t>
+      </w:r>
+      <w:r>
+        <w:t xml:space="preserve"> </w:t>
+      </w:r>
+      <w:r>
+        <w:t xml:space="preserve">side-claim groundedness all climb to or near ceiling; tool-call success is</w:t>
+      </w:r>
+      <w:r>
+        <w:t xml:space="preserve"> </w:t>
+      </w:r>
+      <w:r>
+        <w:t xml:space="preserve">flat at 1.0 apart from the annotated run-3 Wikipedia outage. The two</w:t>
+      </w:r>
+      <w:r>
+        <w:t xml:space="preserve"> </w:t>
+      </w:r>
+      <w:r>
+        <w:t xml:space="preserve">visible dips are real and annotated rather than smoothed away: run 3 is</w:t>
+      </w:r>
+      <w:r>
+        <w:t xml:space="preserve"> </w:t>
+      </w:r>
+      <w:r>
+        <w:t xml:space="preserve">the 429 outage (infrastructure, later fixed with retries and throttling),</w:t>
+      </w:r>
+      <w:r>
+        <w:t xml:space="preserve"> </w:t>
+      </w:r>
+      <w:r>
+        <w:t xml:space="preserve">and run 6 is the moment eight harder multi-hop cases entered the suite,</w:t>
+      </w:r>
+      <w:r>
+        <w:t xml:space="preserve"> </w:t>
+      </w:r>
+      <w:r>
+        <w:t xml:space="preserve">resetting a saturated metric before the v1.3 fixes recovered it.</w:t>
+      </w:r>
+    </w:p>
+    <w:p>
+      <w:pPr>
+        <w:pStyle w:val="BodyText"/>
+      </w:pPr>
+      <w:r>
         <w:rPr>
           <w:b/>
         </w:rPr>
@@ -2473,11 +2618,11 @@
       <w:pPr>
         <w:pStyle w:val="Heading2"/>
       </w:pPr>
-      <w:bookmarkStart w:id="27" w:name="Xc3247faa838c2ddbf5d26769fcdacd2a0e69eee"/>
+      <w:bookmarkStart w:id="29" w:name="Xc3247faa838c2ddbf5d26769fcdacd2a0e69eee"/>
       <w:r>
         <w:t xml:space="preserve">4. Where it succeeds, where it fails, what we learned</w:t>
       </w:r>
-      <w:bookmarkEnd w:id="27"/>
+      <w:bookmarkEnd w:id="29"/>
     </w:p>
     <w:p>
       <w:pPr>
@@ -3158,11 +3303,11 @@
       <w:pPr>
         <w:pStyle w:val="Heading2"/>
       </w:pPr>
-      <w:bookmarkStart w:id="28" w:name="with-more-time"/>
+      <w:bookmarkStart w:id="30" w:name="with-more-time"/>
       <w:r>
         <w:t xml:space="preserve">5. With more time</w:t>
       </w:r>
-      <w:bookmarkEnd w:id="28"/>
+      <w:bookmarkEnd w:id="30"/>
     </w:p>
     <w:p>
       <w:pPr>
@@ -3333,7 +3478,7 @@
       <w:r>
         <w:t xml:space="preserve">approach with APO (</w:t>
       </w:r>
-      <w:hyperlink r:id="rId29">
+      <w:hyperlink r:id="rId31">
         <w:r>
           <w:rPr>
             <w:rStyle w:val="Hyperlink"/>
@@ -3356,7 +3501,7 @@
       <w:r>
         <w:t xml:space="preserve">(</w:t>
       </w:r>
-      <w:hyperlink r:id="rId30">
+      <w:hyperlink r:id="rId32">
         <w:r>
           <w:rPr>
             <w:rStyle w:val="Hyperlink"/>

</xml_diff>

<commit_message>
RATIONALE: explain every plot dip and each metric below ceiling
Per-dip accounting (run-3 outage, runs 4-5 noise band, run-6 multi-hop
reset, run-7 source self-contradiction) and per-metric headroom notes
(recall noise band vs precision tradeoff, sufficiency's by-design
dead-end floor plus truncation residual, default-mode side claims vs
cite mode, and the iterated-against-suite caveat pointing at the P0
expanded-eval item). Docx regenerated.

Co-Authored-By: Claude Fable 5 <noreply@anthropic.com>
</commit_message>
<xml_diff>
--- a/RATIONALE.docx
+++ b/RATIONALE.docx
@@ -2516,31 +2516,7 @@
         <w:t xml:space="preserve"> </w:t>
       </w:r>
       <w:r>
-        <w:t xml:space="preserve">flat at 1.0 apart from the annotated run-3 Wikipedia outage. The two</w:t>
-      </w:r>
-      <w:r>
-        <w:t xml:space="preserve"> </w:t>
-      </w:r>
-      <w:r>
-        <w:t xml:space="preserve">visible dips are real and annotated rather than smoothed away: run 3 is</w:t>
-      </w:r>
-      <w:r>
-        <w:t xml:space="preserve"> </w:t>
-      </w:r>
-      <w:r>
-        <w:t xml:space="preserve">the 429 outage (infrastructure, later fixed with retries and throttling),</w:t>
-      </w:r>
-      <w:r>
-        <w:t xml:space="preserve"> </w:t>
-      </w:r>
-      <w:r>
-        <w:t xml:space="preserve">and run 6 is the moment eight harder multi-hop cases entered the suite,</w:t>
-      </w:r>
-      <w:r>
-        <w:t xml:space="preserve"> </w:t>
-      </w:r>
-      <w:r>
-        <w:t xml:space="preserve">resetting a saturated metric before the v1.3 fixes recovered it.</w:t>
+        <w:t xml:space="preserve">flat at 1.0 apart from the annotated run-3 Wikipedia outage.</w:t>
       </w:r>
     </w:p>
     <w:p>
@@ -2551,6 +2527,469 @@
         <w:rPr>
           <w:b/>
         </w:rPr>
+        <w:t xml:space="preserve">Every dip in the plots, explained.</w:t>
+      </w:r>
+      <w:r>
+        <w:t xml:space="preserve"> </w:t>
+      </w:r>
+      <w:r>
+        <w:t xml:space="preserve">The dips are real and annotated</w:t>
+      </w:r>
+      <w:r>
+        <w:t xml:space="preserve"> </w:t>
+      </w:r>
+      <w:r>
+        <w:t xml:space="preserve">rather than smoothed away:</w:t>
+      </w:r>
+    </w:p>
+    <w:p>
+      <w:pPr>
+        <w:numPr>
+          <w:ilvl w:val="0"/>
+          <w:numId w:val="1009"/>
+        </w:numPr>
+        <w:pStyle w:val="Compact"/>
+      </w:pPr>
+      <w:r>
+        <w:rPr>
+          <w:b/>
+        </w:rPr>
+        <w:t xml:space="preserve">Run 3, tool-call success 1.0 to 0.48 (and sufficiency / right-article</w:t>
+      </w:r>
+      <w:r>
+        <w:rPr>
+          <w:b/>
+        </w:rPr>
+        <w:t xml:space="preserve"> </w:t>
+      </w:r>
+      <w:r>
+        <w:rPr>
+          <w:b/>
+        </w:rPr>
+        <w:t xml:space="preserve">to 0.8):</w:t>
+      </w:r>
+      <w:r>
+        <w:t xml:space="preserve"> </w:t>
+      </w:r>
+      <w:r>
+        <w:t xml:space="preserve">Wikipedia rate-limited 15 of 29 tool calls mid-run. This was</w:t>
+      </w:r>
+      <w:r>
+        <w:t xml:space="preserve"> </w:t>
+      </w:r>
+      <w:r>
+        <w:t xml:space="preserve">infrastructure, not model behavior; retries, backoff, and throttling in</w:t>
+      </w:r>
+      <w:r>
+        <w:t xml:space="preserve"> </w:t>
+      </w:r>
+      <w:r>
+        <w:t xml:space="preserve">v1.1 returned tool success to 1.0 for every subsequent run, and the</w:t>
+      </w:r>
+      <w:r>
+        <w:t xml:space="preserve"> </w:t>
+      </w:r>
+      <w:r>
+        <w:rPr>
+          <w:rStyle w:val="VerbatimChar"/>
+        </w:rPr>
+        <w:t xml:space="preserve">tool_error_rate</w:t>
+      </w:r>
+      <w:r>
+        <w:t xml:space="preserve"> </w:t>
+      </w:r>
+      <w:r>
+        <w:t xml:space="preserve">metric was added so infra failures can never again</w:t>
+      </w:r>
+      <w:r>
+        <w:t xml:space="preserve"> </w:t>
+      </w:r>
+      <w:r>
+        <w:t xml:space="preserve">masquerade as retrieval-quality failures.</w:t>
+      </w:r>
+    </w:p>
+    <w:p>
+      <w:pPr>
+        <w:numPr>
+          <w:ilvl w:val="0"/>
+          <w:numId w:val="1009"/>
+        </w:numPr>
+        <w:pStyle w:val="Compact"/>
+      </w:pPr>
+      <w:r>
+        <w:rPr>
+          <w:b/>
+        </w:rPr>
+        <w:t xml:space="preserve">Runs 4-5, recall 0.93 to 0.87:</w:t>
+      </w:r>
+      <w:r>
+        <w:t xml:space="preserve"> </w:t>
+      </w:r>
+      <w:r>
+        <w:t xml:space="preserve">the borderline stable-historical-year</w:t>
+      </w:r>
+      <w:r>
+        <w:t xml:space="preserve"> </w:t>
+      </w:r>
+      <w:r>
+        <w:t xml:space="preserve">cases (r08/r09) flickered between searching and answering correctly from</w:t>
+      </w:r>
+      <w:r>
+        <w:t xml:space="preserve"> </w:t>
+      </w:r>
+      <w:r>
+        <w:t xml:space="preserve">memory. This is the accepted noise band, roughly one case wide, kept in</w:t>
+      </w:r>
+      <w:r>
+        <w:t xml:space="preserve"> </w:t>
+      </w:r>
+      <w:r>
+        <w:t xml:space="preserve">preference to trigger wording aggressive enough to endanger the 1.0</w:t>
+      </w:r>
+      <w:r>
+        <w:t xml:space="preserve"> </w:t>
+      </w:r>
+      <w:r>
+        <w:t xml:space="preserve">precision streak.</w:t>
+      </w:r>
+    </w:p>
+    <w:p>
+      <w:pPr>
+        <w:numPr>
+          <w:ilvl w:val="0"/>
+          <w:numId w:val="1009"/>
+        </w:numPr>
+        <w:pStyle w:val="Compact"/>
+      </w:pPr>
+      <w:r>
+        <w:rPr>
+          <w:b/>
+        </w:rPr>
+        <w:t xml:space="preserve">Run 6, sufficiency 1.0 to 0.86 and pass 1.0 to 0.975:</w:t>
+      </w:r>
+      <w:r>
+        <w:t xml:space="preserve"> </w:t>
+      </w:r>
+      <w:r>
+        <w:t xml:space="preserve">eight harder</w:t>
+      </w:r>
+      <w:r>
+        <w:t xml:space="preserve"> </w:t>
+      </w:r>
+      <w:r>
+        <w:t xml:space="preserve">multi-hop cases entered the suite, deliberately resetting saturated</w:t>
+      </w:r>
+      <w:r>
+        <w:t xml:space="preserve"> </w:t>
+      </w:r>
+      <w:r>
+        <w:t xml:space="preserve">metrics. The new failures (chain collapse into memory, infobox-blind</w:t>
+      </w:r>
+      <w:r>
+        <w:t xml:space="preserve"> </w:t>
+      </w:r>
+      <w:r>
+        <w:t xml:space="preserve">retrieval) were exactly what the category was designed to surface, and</w:t>
+      </w:r>
+      <w:r>
+        <w:t xml:space="preserve"> </w:t>
+      </w:r>
+      <w:r>
+        <w:t xml:space="preserve">the v1.3 fixes recovered both metrics on the same expanded suite.</w:t>
+      </w:r>
+    </w:p>
+    <w:p>
+      <w:pPr>
+        <w:numPr>
+          <w:ilvl w:val="0"/>
+          <w:numId w:val="1009"/>
+        </w:numPr>
+        <w:pStyle w:val="Compact"/>
+      </w:pPr>
+      <w:r>
+        <w:rPr>
+          <w:b/>
+        </w:rPr>
+        <w:t xml:space="preserve">Run 7, pass 0.975:</w:t>
+      </w:r>
+      <w:r>
+        <w:t xml:space="preserve"> </w:t>
+      </w:r>
+      <w:r>
+        <w:t xml:space="preserve">the single miss (r09) traced to Wikipedia’s own</w:t>
+      </w:r>
+      <w:r>
+        <w:t xml:space="preserve"> </w:t>
+      </w:r>
+      <w:r>
+        <w:t xml:space="preserve">article contradicting itself (prose 1906 vs infobox 1907); the model’s</w:t>
+      </w:r>
+      <w:r>
+        <w:t xml:space="preserve"> </w:t>
+      </w:r>
+      <w:r>
+        <w:t xml:space="preserve">answer was faithful to retrieved evidence. Graded as a miss under the</w:t>
+      </w:r>
+      <w:r>
+        <w:t xml:space="preserve"> </w:t>
+      </w:r>
+      <w:r>
+        <w:t xml:space="preserve">then-current notes; the calibration is disclosed in the transparency</w:t>
+      </w:r>
+      <w:r>
+        <w:t xml:space="preserve"> </w:t>
+      </w:r>
+      <w:r>
+        <w:t xml:space="preserve">note above.</w:t>
+      </w:r>
+    </w:p>
+    <w:p>
+      <w:pPr>
+        <w:pStyle w:val="FirstParagraph"/>
+      </w:pPr>
+      <w:r>
+        <w:rPr>
+          <w:b/>
+        </w:rPr>
+        <w:t xml:space="preserve">Metrics not yet at full performance, and why.</w:t>
+      </w:r>
+      <w:r>
+        <w:t xml:space="preserve"> </w:t>
+      </w:r>
+      <w:r>
+        <w:t xml:space="preserve">Not every line ends at</w:t>
+      </w:r>
+      <w:r>
+        <w:t xml:space="preserve"> </w:t>
+      </w:r>
+      <w:r>
+        <w:t xml:space="preserve">1.0, deliberately:</w:t>
+      </w:r>
+    </w:p>
+    <w:p>
+      <w:pPr>
+        <w:numPr>
+          <w:ilvl w:val="0"/>
+          <w:numId w:val="1010"/>
+        </w:numPr>
+        <w:pStyle w:val="Compact"/>
+      </w:pPr>
+      <w:r>
+        <w:rPr>
+          <w:b/>
+        </w:rPr>
+        <w:t xml:space="preserve">Search recall, 0.955:</w:t>
+      </w:r>
+      <w:r>
+        <w:t xml:space="preserve"> </w:t>
+      </w:r>
+      <w:r>
+        <w:t xml:space="preserve">the r08 noise band remains. The model</w:t>
+      </w:r>
+      <w:r>
+        <w:t xml:space="preserve"> </w:t>
+      </w:r>
+      <w:r>
+        <w:t xml:space="preserve">occasionally answers a stable, decades-old year from memory (correctly</w:t>
+      </w:r>
+      <w:r>
+        <w:t xml:space="preserve"> </w:t>
+      </w:r>
+      <w:r>
+        <w:t xml:space="preserve">in every observed run). Closing the last 4.5 points would require</w:t>
+      </w:r>
+      <w:r>
+        <w:t xml:space="preserve"> </w:t>
+      </w:r>
+      <w:r>
+        <w:t xml:space="preserve">trigger wording aggressive enough to risk spurious searches, trading a</w:t>
+      </w:r>
+      <w:r>
+        <w:t xml:space="preserve"> </w:t>
+      </w:r>
+      <w:r>
+        <w:t xml:space="preserve">cosmetic recall gain for a real precision loss.</w:t>
+      </w:r>
+    </w:p>
+    <w:p>
+      <w:pPr>
+        <w:numPr>
+          <w:ilvl w:val="0"/>
+          <w:numId w:val="1010"/>
+        </w:numPr>
+        <w:pStyle w:val="Compact"/>
+      </w:pPr>
+      <w:r>
+        <w:rPr>
+          <w:b/>
+        </w:rPr>
+        <w:t xml:space="preserve">Evidence sufficiency, 0.952:</w:t>
+      </w:r>
+      <w:r>
+        <w:t xml:space="preserve"> </w:t>
+      </w:r>
+      <w:r>
+        <w:t xml:space="preserve">the one</w:t>
+      </w:r>
+      <w:r>
+        <w:t xml:space="preserve"> </w:t>
+      </w:r>
+      <w:r>
+        <w:t xml:space="preserve">“</w:t>
+      </w:r>
+      <w:r>
+        <w:t xml:space="preserve">insufficient</w:t>
+      </w:r>
+      <w:r>
+        <w:t xml:space="preserve">”</w:t>
+      </w:r>
+      <w:r>
+        <w:t xml:space="preserve"> </w:t>
+      </w:r>
+      <w:r>
+        <w:t xml:space="preserve">case in every</w:t>
+      </w:r>
+      <w:r>
+        <w:t xml:space="preserve"> </w:t>
+      </w:r>
+      <w:r>
+        <w:t xml:space="preserve">final run is mh-08, the deliberate dead-end chain whose correct outcome</w:t>
+      </w:r>
+      <w:r>
+        <w:t xml:space="preserve"> </w:t>
+      </w:r>
+      <w:r>
+        <w:t xml:space="preserve">is finding no evidence. Its abstention passes; the metric honestly</w:t>
+      </w:r>
+      <w:r>
+        <w:t xml:space="preserve"> </w:t>
+      </w:r>
+      <w:r>
+        <w:t xml:space="preserve">records that retrieval found nothing, because there is nothing to find.</w:t>
+      </w:r>
+      <w:r>
+        <w:t xml:space="preserve"> </w:t>
+      </w:r>
+      <w:r>
+        <w:t xml:space="preserve">Effective ceiling given the case design. The genuine (unmeasured</w:t>
+      </w:r>
+      <w:r>
+        <w:t xml:space="preserve"> </w:t>
+      </w:r>
+      <w:r>
+        <w:t xml:space="preserve">residual) limit is long-article truncation: facts deeper than the</w:t>
+      </w:r>
+      <w:r>
+        <w:t xml:space="preserve"> </w:t>
+      </w:r>
+      <w:r>
+        <w:t xml:space="preserve">6,000-character extract cut, which snippets and infobox extraction</w:t>
+      </w:r>
+      <w:r>
+        <w:t xml:space="preserve"> </w:t>
+      </w:r>
+      <w:r>
+        <w:t xml:space="preserve">mitigate but do not eliminate.</w:t>
+      </w:r>
+    </w:p>
+    <w:p>
+      <w:pPr>
+        <w:numPr>
+          <w:ilvl w:val="0"/>
+          <w:numId w:val="1010"/>
+        </w:numPr>
+        <w:pStyle w:val="Compact"/>
+      </w:pPr>
+      <w:r>
+        <w:rPr>
+          <w:b/>
+        </w:rPr>
+        <w:t xml:space="preserve">Side-claim groundedness, 0.95 in default mode (runs 9-10):</w:t>
+      </w:r>
+      <w:r>
+        <w:t xml:space="preserve"> </w:t>
+      </w:r>
+      <w:r>
+        <w:t xml:space="preserve">roughly</w:t>
+      </w:r>
+      <w:r>
+        <w:t xml:space="preserve"> </w:t>
+      </w:r>
+      <w:r>
+        <w:t xml:space="preserve">one searched answer per run carries a small unverified embellishment.</w:t>
+      </w:r>
+      <w:r>
+        <w:t xml:space="preserve"> </w:t>
+      </w:r>
+      <w:r>
+        <w:t xml:space="preserve">Measured, tracked, and consciously left unfixed in default mode (the</w:t>
+      </w:r>
+      <w:r>
+        <w:t xml:space="preserve"> </w:t>
+      </w:r>
+      <w:r>
+        <w:t xml:space="preserve">prompt remedy risked degrading answer quality for a two-claim problem);</w:t>
+      </w:r>
+      <w:r>
+        <w:t xml:space="preserve"> </w:t>
+      </w:r>
+      <w:r>
+        <w:t xml:space="preserve">citation mode (run 11) drives it to 1.0.</w:t>
+      </w:r>
+    </w:p>
+    <w:p>
+      <w:pPr>
+        <w:numPr>
+          <w:ilvl w:val="0"/>
+          <w:numId w:val="1010"/>
+        </w:numPr>
+        <w:pStyle w:val="Compact"/>
+      </w:pPr>
+      <w:r>
+        <w:rPr>
+          <w:b/>
+        </w:rPr>
+        <w:t xml:space="preserve">Recall and sufficiency share one more caveat:</w:t>
+      </w:r>
+      <w:r>
+        <w:t xml:space="preserve"> </w:t>
+      </w:r>
+      <w:r>
+        <w:t xml:space="preserve">both are measured on a</w:t>
+      </w:r>
+      <w:r>
+        <w:t xml:space="preserve"> </w:t>
+      </w:r>
+      <w:r>
+        <w:t xml:space="preserve">40-case suite that the prompt has been iterated against. The honest</w:t>
+      </w:r>
+      <w:r>
+        <w:t xml:space="preserve"> </w:t>
+      </w:r>
+      <w:r>
+        <w:t xml:space="preserve">expectation is that all near-ceiling numbers would drop on a larger</w:t>
+      </w:r>
+      <w:r>
+        <w:t xml:space="preserve"> </w:t>
+      </w:r>
+      <w:r>
+        <w:t xml:space="preserve">held-out set, which is why expanded, repeated evals are the P0 item in</w:t>
+      </w:r>
+      <w:r>
+        <w:t xml:space="preserve"> </w:t>
+      </w:r>
+      <w:r>
+        <w:t xml:space="preserve">section 5.</w:t>
+      </w:r>
+    </w:p>
+    <w:p>
+      <w:pPr>
+        <w:pStyle w:val="FirstParagraph"/>
+      </w:pPr>
+      <w:r>
+        <w:rPr>
+          <w:b/>
+        </w:rPr>
         <w:t xml:space="preserve">Transparency note on the final 40/40 score:</w:t>
       </w:r>
       <w:r>
@@ -2636,7 +3075,7 @@
       <w:pPr>
         <w:numPr>
           <w:ilvl w:val="0"/>
-          <w:numId w:val="1009"/>
+          <w:numId w:val="1011"/>
         </w:numPr>
         <w:pStyle w:val="Compact"/>
       </w:pPr>
@@ -2669,7 +3108,7 @@
       <w:pPr>
         <w:numPr>
           <w:ilvl w:val="0"/>
-          <w:numId w:val="1009"/>
+          <w:numId w:val="1011"/>
         </w:numPr>
         <w:pStyle w:val="Compact"/>
       </w:pPr>
@@ -2696,7 +3135,7 @@
       <w:pPr>
         <w:numPr>
           <w:ilvl w:val="0"/>
-          <w:numId w:val="1009"/>
+          <w:numId w:val="1011"/>
         </w:numPr>
         <w:pStyle w:val="Compact"/>
       </w:pPr>
@@ -2729,7 +3168,7 @@
       <w:pPr>
         <w:numPr>
           <w:ilvl w:val="0"/>
-          <w:numId w:val="1009"/>
+          <w:numId w:val="1011"/>
         </w:numPr>
         <w:pStyle w:val="Compact"/>
       </w:pPr>
@@ -2762,7 +3201,7 @@
       <w:pPr>
         <w:numPr>
           <w:ilvl w:val="0"/>
-          <w:numId w:val="1009"/>
+          <w:numId w:val="1011"/>
         </w:numPr>
         <w:pStyle w:val="Compact"/>
       </w:pPr>
@@ -2795,7 +3234,7 @@
       <w:pPr>
         <w:numPr>
           <w:ilvl w:val="0"/>
-          <w:numId w:val="1009"/>
+          <w:numId w:val="1011"/>
         </w:numPr>
         <w:pStyle w:val="Compact"/>
       </w:pPr>
@@ -2863,7 +3302,7 @@
       <w:pPr>
         <w:numPr>
           <w:ilvl w:val="0"/>
-          <w:numId w:val="1010"/>
+          <w:numId w:val="1012"/>
         </w:numPr>
         <w:pStyle w:val="Compact"/>
       </w:pPr>
@@ -2926,7 +3365,7 @@
       <w:pPr>
         <w:numPr>
           <w:ilvl w:val="0"/>
-          <w:numId w:val="1010"/>
+          <w:numId w:val="1012"/>
         </w:numPr>
         <w:pStyle w:val="Compact"/>
       </w:pPr>
@@ -2995,7 +3434,7 @@
       <w:pPr>
         <w:numPr>
           <w:ilvl w:val="0"/>
-          <w:numId w:val="1010"/>
+          <w:numId w:val="1012"/>
         </w:numPr>
         <w:pStyle w:val="Compact"/>
       </w:pPr>
@@ -3040,7 +3479,7 @@
       <w:pPr>
         <w:numPr>
           <w:ilvl w:val="0"/>
-          <w:numId w:val="1010"/>
+          <w:numId w:val="1012"/>
         </w:numPr>
         <w:pStyle w:val="Compact"/>
       </w:pPr>
@@ -3093,7 +3532,7 @@
       <w:pPr>
         <w:numPr>
           <w:ilvl w:val="0"/>
-          <w:numId w:val="1011"/>
+          <w:numId w:val="1013"/>
         </w:numPr>
         <w:pStyle w:val="Compact"/>
       </w:pPr>
@@ -3144,7 +3583,7 @@
       <w:pPr>
         <w:numPr>
           <w:ilvl w:val="0"/>
-          <w:numId w:val="1011"/>
+          <w:numId w:val="1013"/>
         </w:numPr>
         <w:pStyle w:val="Compact"/>
       </w:pPr>
@@ -3195,7 +3634,7 @@
       <w:pPr>
         <w:numPr>
           <w:ilvl w:val="0"/>
-          <w:numId w:val="1011"/>
+          <w:numId w:val="1013"/>
         </w:numPr>
         <w:pStyle w:val="Compact"/>
       </w:pPr>
@@ -3246,7 +3685,7 @@
       <w:pPr>
         <w:numPr>
           <w:ilvl w:val="0"/>
-          <w:numId w:val="1011"/>
+          <w:numId w:val="1013"/>
         </w:numPr>
         <w:pStyle w:val="Compact"/>
       </w:pPr>
@@ -3321,7 +3760,7 @@
       <w:pPr>
         <w:numPr>
           <w:ilvl w:val="0"/>
-          <w:numId w:val="1012"/>
+          <w:numId w:val="1014"/>
         </w:numPr>
         <w:pStyle w:val="Compact"/>
       </w:pPr>
@@ -3354,7 +3793,7 @@
       <w:pPr>
         <w:numPr>
           <w:ilvl w:val="0"/>
-          <w:numId w:val="1012"/>
+          <w:numId w:val="1014"/>
         </w:numPr>
         <w:pStyle w:val="Compact"/>
       </w:pPr>
@@ -3399,7 +3838,7 @@
       <w:pPr>
         <w:numPr>
           <w:ilvl w:val="0"/>
-          <w:numId w:val="1012"/>
+          <w:numId w:val="1014"/>
         </w:numPr>
         <w:pStyle w:val="Compact"/>
       </w:pPr>
@@ -3456,7 +3895,7 @@
       <w:pPr>
         <w:numPr>
           <w:ilvl w:val="0"/>
-          <w:numId w:val="1012"/>
+          <w:numId w:val="1014"/>
         </w:numPr>
         <w:pStyle w:val="Compact"/>
       </w:pPr>
@@ -3541,7 +3980,7 @@
       <w:pPr>
         <w:numPr>
           <w:ilvl w:val="0"/>
-          <w:numId w:val="1012"/>
+          <w:numId w:val="1014"/>
         </w:numPr>
         <w:pStyle w:val="Compact"/>
       </w:pPr>
@@ -3574,7 +4013,7 @@
       <w:pPr>
         <w:numPr>
           <w:ilvl w:val="0"/>
-          <w:numId w:val="1012"/>
+          <w:numId w:val="1014"/>
         </w:numPr>
         <w:pStyle w:val="Compact"/>
       </w:pPr>
@@ -3607,7 +4046,7 @@
       <w:pPr>
         <w:numPr>
           <w:ilvl w:val="0"/>
-          <w:numId w:val="1012"/>
+          <w:numId w:val="1014"/>
         </w:numPr>
         <w:pStyle w:val="Compact"/>
       </w:pPr>
@@ -3927,6 +4366,12 @@
     <w:abstractNumId w:val="991"/>
   </w:num>
   <w:num w:numId="1012">
+    <w:abstractNumId w:val="991"/>
+  </w:num>
+  <w:num w:numId="1013">
+    <w:abstractNumId w:val="991"/>
+  </w:num>
+  <w:num w:numId="1014">
     <w:abstractNumId w:val="991"/>
   </w:num>
 </w:numbering>

</xml_diff>

<commit_message>
RATIONALE: section 5 as prioritized feature roadmap
Aman's rewrite (held-out eval framing, expanded IAA, latency bullet) plus
a new P1 bullet for explicit query rewriting and decomposition: names the
current instruction-driven reformulation and emergent decomposition, why
the 40-case suite never justified dedicated machinery, and what would
(harder held-out cases), tying the planner to parallel retrieval under
the latency item. ArXiv links restored on APO/AlphaEvolve. Docx
regenerated.

Co-Authored-By: Claude Fable 5 <noreply@anthropic.com>
</commit_message>
<xml_diff>
--- a/RATIONALE.docx
+++ b/RATIONALE.docx
@@ -3742,22 +3742,14 @@
       <w:pPr>
         <w:pStyle w:val="Heading2"/>
       </w:pPr>
-      <w:bookmarkStart w:id="30" w:name="with-more-time"/>
-      <w:r>
-        <w:t xml:space="preserve">5. With more time</w:t>
+      <w:bookmarkStart w:id="30" w:name="priority-sorted-feature-roadmap"/>
+      <w:r>
+        <w:t xml:space="preserve">5. Priority-sorted Feature Roadmap</w:t>
       </w:r>
       <w:bookmarkEnd w:id="30"/>
     </w:p>
     <w:p>
       <w:pPr>
-        <w:pStyle w:val="FirstParagraph"/>
-      </w:pPr>
-      <w:r>
-        <w:t xml:space="preserve">Priority-sorted (P0 = first):</w:t>
-      </w:r>
-    </w:p>
-    <w:p>
-      <w:pPr>
         <w:numPr>
           <w:ilvl w:val="0"/>
           <w:numId w:val="1014"/>
@@ -3768,25 +3760,43 @@
         <w:rPr>
           <w:b/>
         </w:rPr>
-        <w:t xml:space="preserve">[P0] Larger, repeated evals:</w:t>
-      </w:r>
-      <w:r>
-        <w:t xml:space="preserve"> </w:t>
-      </w:r>
-      <w:r>
-        <w:t xml:space="preserve">Expand beyond the 40-case suite and run</w:t>
-      </w:r>
-      <w:r>
-        <w:t xml:space="preserve"> </w:t>
-      </w:r>
-      <w:r>
-        <w:t xml:space="preserve">each configuration multiple times to measure variance and report</w:t>
-      </w:r>
-      <w:r>
-        <w:t xml:space="preserve"> </w:t>
-      </w:r>
-      <w:r>
-        <w:t xml:space="preserve">confidence intervals, rather than relying on a single saturated run.</w:t>
+        <w:t xml:space="preserve">[P0] Larger dev set and held-out evaluation:</w:t>
+      </w:r>
+      <w:r>
+        <w:t xml:space="preserve"> </w:t>
+      </w:r>
+      <w:r>
+        <w:t xml:space="preserve">The current 40-case</w:t>
+      </w:r>
+      <w:r>
+        <w:t xml:space="preserve"> </w:t>
+      </w:r>
+      <w:r>
+        <w:t xml:space="preserve">suite, used as a dev set to optimize the loop, should be expanded for</w:t>
+      </w:r>
+      <w:r>
+        <w:t xml:space="preserve"> </w:t>
+      </w:r>
+      <w:r>
+        <w:t xml:space="preserve">broader failure coverage, and a separate held-out set of real-world</w:t>
+      </w:r>
+      <w:r>
+        <w:t xml:space="preserve"> </w:t>
+      </w:r>
+      <w:r>
+        <w:t xml:space="preserve">queries should be added to assess real-world performance. Run each</w:t>
+      </w:r>
+      <w:r>
+        <w:t xml:space="preserve"> </w:t>
+      </w:r>
+      <w:r>
+        <w:t xml:space="preserve">configuration multiple times to measure variance and confidence</w:t>
+      </w:r>
+      <w:r>
+        <w:t xml:space="preserve"> </w:t>
+      </w:r>
+      <w:r>
+        <w:t xml:space="preserve">intervals.</w:t>
       </w:r>
     </w:p>
     <w:p>
@@ -3807,31 +3817,43 @@
         <w:t xml:space="preserve"> </w:t>
       </w:r>
       <w:r>
-        <w:t xml:space="preserve">Have a human independently</w:t>
-      </w:r>
-      <w:r>
-        <w:t xml:space="preserve"> </w:t>
-      </w:r>
-      <w:r>
-        <w:t xml:space="preserve">grade a stratified 20–30% sample of the test suite, then measure agreement</w:t>
-      </w:r>
-      <w:r>
-        <w:t xml:space="preserve"> </w:t>
-      </w:r>
-      <w:r>
-        <w:t xml:space="preserve">with the LLM judge using percent agreement and Cohen’s kappa. Manually</w:t>
-      </w:r>
-      <w:r>
-        <w:t xml:space="preserve"> </w:t>
-      </w:r>
-      <w:r>
-        <w:t xml:space="preserve">review disagreements to identify systematic judge errors and refine the</w:t>
-      </w:r>
-      <w:r>
-        <w:t xml:space="preserve"> </w:t>
-      </w:r>
-      <w:r>
-        <w:t xml:space="preserve">rubric.</w:t>
+        <w:t xml:space="preserve">While human-judge</w:t>
+      </w:r>
+      <w:r>
+        <w:t xml:space="preserve"> </w:t>
+      </w:r>
+      <w:r>
+        <w:t xml:space="preserve">correlation was established with 10 samples in this exercise, as the</w:t>
+      </w:r>
+      <w:r>
+        <w:t xml:space="preserve"> </w:t>
+      </w:r>
+      <w:r>
+        <w:t xml:space="preserve">dataset scales, it is important to have a human independently grade a</w:t>
+      </w:r>
+      <w:r>
+        <w:t xml:space="preserve"> </w:t>
+      </w:r>
+      <w:r>
+        <w:t xml:space="preserve">stratified 20-30% random sample, then measure agreement with the LLM</w:t>
+      </w:r>
+      <w:r>
+        <w:t xml:space="preserve"> </w:t>
+      </w:r>
+      <w:r>
+        <w:t xml:space="preserve">judge using percent agreement and a relevant per-domain inter-annotator</w:t>
+      </w:r>
+      <w:r>
+        <w:t xml:space="preserve"> </w:t>
+      </w:r>
+      <w:r>
+        <w:t xml:space="preserve">agreement metric such as Cohen’s kappa. Review disagreements to identify</w:t>
+      </w:r>
+      <w:r>
+        <w:t xml:space="preserve"> </w:t>
+      </w:r>
+      <w:r>
+        <w:t xml:space="preserve">systematic judge errors and refine the rubric.</w:t>
       </w:r>
     </w:p>
     <w:p>
@@ -3858,37 +3880,43 @@
         <w:t xml:space="preserve"> </w:t>
       </w:r>
       <w:r>
-        <w:t xml:space="preserve">per-tool-call latency, especially for interactive use. Multi-hop queries</w:t>
-      </w:r>
-      <w:r>
-        <w:t xml:space="preserve"> </w:t>
-      </w:r>
-      <w:r>
-        <w:t xml:space="preserve">run sequential searches and can take up to ~30s in the Vercel demo.</w:t>
-      </w:r>
-      <w:r>
-        <w:t xml:space="preserve"> </w:t>
-      </w:r>
-      <w:r>
-        <w:t xml:space="preserve">Levers: parallel retrieval for independent hops, prompt/KV caching of the</w:t>
-      </w:r>
-      <w:r>
-        <w:t xml:space="preserve"> </w:t>
-      </w:r>
-      <w:r>
-        <w:t xml:space="preserve">static prefix plus Wikipedia response caching, tighter extracts,</w:t>
-      </w:r>
-      <w:r>
-        <w:t xml:space="preserve"> </w:t>
-      </w:r>
-      <w:r>
-        <w:t xml:space="preserve">latency-aware search budgets with early stopping, adaptive backoff</w:t>
-      </w:r>
-      <w:r>
-        <w:t xml:space="preserve"> </w:t>
-      </w:r>
-      <w:r>
-        <w:t xml:space="preserve">instead of the fixed throttle, and streaming for perceived latency.</w:t>
+        <w:t xml:space="preserve">per-tool-call latency, especially for interactive use cases. Multi-hop</w:t>
+      </w:r>
+      <w:r>
+        <w:t xml:space="preserve"> </w:t>
+      </w:r>
+      <w:r>
+        <w:t xml:space="preserve">queries require sequential searches and can take ~30s, as seen</w:t>
+      </w:r>
+      <w:r>
+        <w:t xml:space="preserve"> </w:t>
+      </w:r>
+      <w:r>
+        <w:t xml:space="preserve">occasionally in the Vercel demo; potential improvements include parallel</w:t>
+      </w:r>
+      <w:r>
+        <w:t xml:space="preserve"> </w:t>
+      </w:r>
+      <w:r>
+        <w:t xml:space="preserve">retrieval for independent hops, prompt/KV caching of the static prefix</w:t>
+      </w:r>
+      <w:r>
+        <w:t xml:space="preserve"> </w:t>
+      </w:r>
+      <w:r>
+        <w:t xml:space="preserve">plus Wikipedia response caching, latency-aware search budgets with early</w:t>
+      </w:r>
+      <w:r>
+        <w:t xml:space="preserve"> </w:t>
+      </w:r>
+      <w:r>
+        <w:t xml:space="preserve">stopping, adaptive backoff instead of the fixed throttle, streaming for</w:t>
+      </w:r>
+      <w:r>
+        <w:t xml:space="preserve"> </w:t>
+      </w:r>
+      <w:r>
+        <w:t xml:space="preserve">perceived latency, etc.</w:t>
       </w:r>
     </w:p>
     <w:p>
@@ -3903,19 +3931,100 @@
         <w:rPr>
           <w:b/>
         </w:rPr>
+        <w:t xml:space="preserve">[P1] Explicit query rewriting and decomposition:</w:t>
+      </w:r>
+      <w:r>
+        <w:t xml:space="preserve"> </w:t>
+      </w:r>
+      <w:r>
+        <w:t xml:space="preserve">The current system</w:t>
+      </w:r>
+      <w:r>
+        <w:t xml:space="preserve"> </w:t>
+      </w:r>
+      <w:r>
+        <w:t xml:space="preserve">relies on instruction-driven reformulation (retry with a more specific</w:t>
+      </w:r>
+      <w:r>
+        <w:t xml:space="preserve"> </w:t>
+      </w:r>
+      <w:r>
+        <w:t xml:space="preserve">article title, follow surfaced alternate titles) and the model’s</w:t>
+      </w:r>
+      <w:r>
+        <w:t xml:space="preserve"> </w:t>
+      </w:r>
+      <w:r>
+        <w:t xml:space="preserve">emergent chain decomposition, which the 40-case suite never falsified</w:t>
+      </w:r>
+      <w:r>
+        <w:t xml:space="preserve"> </w:t>
+      </w:r>
+      <w:r>
+        <w:t xml:space="preserve">(multi-hop 8/8). A larger held-out set with harder cases (&gt;2-hop chains,</w:t>
+      </w:r>
+      <w:r>
+        <w:t xml:space="preserve"> </w:t>
+      </w:r>
+      <w:r>
+        <w:t xml:space="preserve">low-recall queries where the first search misses) will likely justify</w:t>
+      </w:r>
+      <w:r>
+        <w:t xml:space="preserve"> </w:t>
+      </w:r>
+      <w:r>
+        <w:t xml:space="preserve">dedicated machinery: an explicit query-rewrite step triggered on</w:t>
+      </w:r>
+      <w:r>
+        <w:t xml:space="preserve"> </w:t>
+      </w:r>
+      <w:r>
+        <w:t xml:space="preserve">retrieval misses, and a lightweight planner that decomposes multi-hop</w:t>
+      </w:r>
+      <w:r>
+        <w:t xml:space="preserve"> </w:t>
+      </w:r>
+      <w:r>
+        <w:t xml:space="preserve">questions into sub-queries up front, which also unlocks the parallel</w:t>
+      </w:r>
+      <w:r>
+        <w:t xml:space="preserve"> </w:t>
+      </w:r>
+      <w:r>
+        <w:t xml:space="preserve">retrieval called out under latency optimization.</w:t>
+      </w:r>
+    </w:p>
+    <w:p>
+      <w:pPr>
+        <w:numPr>
+          <w:ilvl w:val="0"/>
+          <w:numId w:val="1014"/>
+        </w:numPr>
+        <w:pStyle w:val="Compact"/>
+      </w:pPr>
+      <w:r>
+        <w:rPr>
+          <w:b/>
+        </w:rPr>
         <w:t xml:space="preserve">[P1] Automated prompt optimization:</w:t>
       </w:r>
       <w:r>
         <w:t xml:space="preserve"> </w:t>
       </w:r>
       <w:r>
-        <w:t xml:space="preserve">Compare the manual loop-engineering</w:t>
-      </w:r>
-      <w:r>
-        <w:t xml:space="preserve"> </w:t>
-      </w:r>
-      <w:r>
-        <w:t xml:space="preserve">approach with APO (</w:t>
+        <w:t xml:space="preserve">Compare the loop-engineering</w:t>
+      </w:r>
+      <w:r>
+        <w:t xml:space="preserve"> </w:t>
+      </w:r>
+      <w:r>
+        <w:t xml:space="preserve">approach with Automatic Prompt Optimization</w:t>
+      </w:r>
+      <w:r>
+        <w:t xml:space="preserve"> </w:t>
+      </w:r>
+      <w:r>
+        <w:t xml:space="preserve">(</w:t>
       </w:r>
       <w:hyperlink r:id="rId31">
         <w:r>
@@ -3926,13 +4035,13 @@
         </w:r>
       </w:hyperlink>
       <w:r>
-        <w:t xml:space="preserve">)</w:t>
-      </w:r>
-      <w:r>
-        <w:t xml:space="preserve"> </w:t>
-      </w:r>
-      <w:r>
-        <w:t xml:space="preserve">and AlphaEvolve-style prompt evolution</w:t>
+        <w:t xml:space="preserve">) and</w:t>
+      </w:r>
+      <w:r>
+        <w:t xml:space="preserve"> </w:t>
+      </w:r>
+      <w:r>
+        <w:t xml:space="preserve">AlphaEvolve-style prompt evolution</w:t>
       </w:r>
       <w:r>
         <w:t xml:space="preserve"> </w:t>
@@ -3949,31 +4058,25 @@
         </w:r>
       </w:hyperlink>
       <w:r>
-        <w:t xml:space="preserve">) using the same</w:t>
-      </w:r>
-      <w:r>
-        <w:t xml:space="preserve"> </w:t>
-      </w:r>
-      <w:r>
-        <w:t xml:space="preserve">eval suite and token budget. I have used AlphaEvolve’s evolutionary</w:t>
-      </w:r>
-      <w:r>
-        <w:t xml:space="preserve"> </w:t>
-      </w:r>
-      <w:r>
-        <w:t xml:space="preserve">approach to optimize prompts in my work at DeepMind, while APO’s</w:t>
-      </w:r>
-      <w:r>
-        <w:t xml:space="preserve"> </w:t>
-      </w:r>
-      <w:r>
-        <w:t xml:space="preserve">textual-feedback loop offers a complementary method for iterative</w:t>
-      </w:r>
-      <w:r>
-        <w:t xml:space="preserve"> </w:t>
-      </w:r>
-      <w:r>
-        <w:t xml:space="preserve">refinement.</w:t>
+        <w:t xml:space="preserve">) using the</w:t>
+      </w:r>
+      <w:r>
+        <w:t xml:space="preserve"> </w:t>
+      </w:r>
+      <w:r>
+        <w:t xml:space="preserve">same eval suite and token budget. I have used AlphaEvolve’s evolutionary</w:t>
+      </w:r>
+      <w:r>
+        <w:t xml:space="preserve"> </w:t>
+      </w:r>
+      <w:r>
+        <w:t xml:space="preserve">approach at DeepMind, while APO provides a complementary</w:t>
+      </w:r>
+      <w:r>
+        <w:t xml:space="preserve"> </w:t>
+      </w:r>
+      <w:r>
+        <w:t xml:space="preserve">textual-feedback loop.</w:t>
       </w:r>
     </w:p>
     <w:p>
@@ -3988,25 +4091,25 @@
         <w:rPr>
           <w:b/>
         </w:rPr>
-        <w:t xml:space="preserve">[P2] Failure-analysis dashboard:</w:t>
-      </w:r>
-      <w:r>
-        <w:t xml:space="preserve"> </w:t>
-      </w:r>
-      <w:r>
-        <w:t xml:space="preserve">Build a dashboard over the existing</w:t>
-      </w:r>
-      <w:r>
-        <w:t xml:space="preserve"> </w:t>
-      </w:r>
-      <w:r>
-        <w:t xml:space="preserve">structured per-case transcripts to slice failures by category, pipeline</w:t>
-      </w:r>
-      <w:r>
-        <w:t xml:space="preserve"> </w:t>
-      </w:r>
-      <w:r>
-        <w:t xml:space="preserve">stage, prompt version, model, and run.</w:t>
+        <w:t xml:space="preserve">[P2] Performance dashboard with failure-analysis:</w:t>
+      </w:r>
+      <w:r>
+        <w:t xml:space="preserve"> </w:t>
+      </w:r>
+      <w:r>
+        <w:t xml:space="preserve">Build a dashboard</w:t>
+      </w:r>
+      <w:r>
+        <w:t xml:space="preserve"> </w:t>
+      </w:r>
+      <w:r>
+        <w:t xml:space="preserve">over the structured transcripts to analyze performance and bucketize</w:t>
+      </w:r>
+      <w:r>
+        <w:t xml:space="preserve"> </w:t>
+      </w:r>
+      <w:r>
+        <w:t xml:space="preserve">failures by category, pipeline stage, prompt version, model, etc.</w:t>
       </w:r>
     </w:p>
     <w:p>
@@ -4027,13 +4130,13 @@
         <w:t xml:space="preserve"> </w:t>
       </w:r>
       <w:r>
-        <w:t xml:space="preserve">Extend the currently English-only suite</w:t>
-      </w:r>
-      <w:r>
-        <w:t xml:space="preserve"> </w:t>
-      </w:r>
-      <w:r>
-        <w:t xml:space="preserve">across languages and test retrieval, disambiguation, grounding, and</w:t>
+        <w:t xml:space="preserve">Extend the English-only suite across</w:t>
+      </w:r>
+      <w:r>
+        <w:t xml:space="preserve"> </w:t>
+      </w:r>
+      <w:r>
+        <w:t xml:space="preserve">languages and evaluate retrieval, disambiguation, grounding, and</w:t>
       </w:r>
       <w:r>
         <w:t xml:space="preserve"> </w:t>
@@ -4066,31 +4169,31 @@
         <w:t xml:space="preserve"> </w:t>
       </w:r>
       <w:r>
-        <w:t xml:space="preserve">cases, where requirements for faithfulness, source quality, uncertainty</w:t>
-      </w:r>
-      <w:r>
-        <w:t xml:space="preserve"> </w:t>
-      </w:r>
-      <w:r>
-        <w:t xml:space="preserve">calibration, and appropriate abstention should be stricter. IAA matters</w:t>
-      </w:r>
-      <w:r>
-        <w:t xml:space="preserve"> </w:t>
-      </w:r>
-      <w:r>
-        <w:t xml:space="preserve">most here: judge agreement should be re-measured against domain-expert</w:t>
-      </w:r>
-      <w:r>
-        <w:t xml:space="preserve"> </w:t>
-      </w:r>
-      <w:r>
-        <w:t xml:space="preserve">human graders (clinicians, lawyers, financial analysts) with per-domain</w:t>
-      </w:r>
-      <w:r>
-        <w:t xml:space="preserve"> </w:t>
-      </w:r>
-      <w:r>
-        <w:t xml:space="preserve">Cohen’s kappa before trusting LLM-judge verdicts in these settings.</w:t>
+        <w:t xml:space="preserve">cases with stricter standards for source quality, faithfulness,</w:t>
+      </w:r>
+      <w:r>
+        <w:t xml:space="preserve"> </w:t>
+      </w:r>
+      <w:r>
+        <w:t xml:space="preserve">uncertainty, and abstention. Re-measure judge agreement against domain</w:t>
+      </w:r>
+      <w:r>
+        <w:t xml:space="preserve"> </w:t>
+      </w:r>
+      <w:r>
+        <w:t xml:space="preserve">experts (with at least a stratified 20-30% randomly sampled data</w:t>
+      </w:r>
+      <w:r>
+        <w:t xml:space="preserve"> </w:t>
+      </w:r>
+      <w:r>
+        <w:t xml:space="preserve">slice), such as clinicians, lawyers, and financial analysts, using a</w:t>
+      </w:r>
+      <w:r>
+        <w:t xml:space="preserve"> </w:t>
+      </w:r>
+      <w:r>
+        <w:t xml:space="preserve">relevant per-domain inter-annotator agreement metric.</w:t>
       </w:r>
     </w:p>
     <w:sectPr/>

</xml_diff>

<commit_message>
RATIONALE: appendix table of per-run metrics and change log
One row per run (1-11): pass, recall/precision, sufficiency,
right-article, tool errors, unfaithful, side claims, plus the prompt /
tool / judge change each iteration introduced. Values from checked-in
summaries; runs 1-3 tool-error rates computed retroactively from saved
tool results; post-run-11 cite-formatting refinements (v1.5/v1.5.1)
noted as verified live rather than re-run. Docx regenerated.

Co-Authored-By: Claude Fable 5 <noreply@anthropic.com>
</commit_message>
<xml_diff>
--- a/RATIONALE.docx
+++ b/RATIONALE.docx
@@ -4194,6 +4194,1949 @@
       </w:r>
       <w:r>
         <w:t xml:space="preserve">relevant per-domain inter-annotator agreement metric.</w:t>
+      </w:r>
+    </w:p>
+    <w:p>
+      <w:pPr>
+        <w:pStyle w:val="Heading2"/>
+      </w:pPr>
+      <w:bookmarkStart w:id="33" w:name="Xac72f2478f7acf5ecfb2165c119869e9664dd7f"/>
+      <w:r>
+        <w:t xml:space="preserve">Appendix A: Per-run metrics and change log</w:t>
+      </w:r>
+      <w:bookmarkEnd w:id="33"/>
+    </w:p>
+    <w:p>
+      <w:pPr>
+        <w:pStyle w:val="FirstParagraph"/>
+      </w:pPr>
+      <w:r>
+        <w:t xml:space="preserve">All values from the checked-in</w:t>
+      </w:r>
+      <w:r>
+        <w:t xml:space="preserve"> </w:t>
+      </w:r>
+      <w:r>
+        <w:rPr>
+          <w:rStyle w:val="VerbatimChar"/>
+        </w:rPr>
+        <w:t xml:space="preserve">eval/runs/</w:t>
+      </w:r>
+      <w:r>
+        <w:t xml:space="preserve"> </w:t>
+      </w:r>
+      <w:r>
+        <w:t xml:space="preserve">artifacts (</w:t>
+      </w:r>
+      <w:r>
+        <w:rPr>
+          <w:rStyle w:val="VerbatimChar"/>
+        </w:rPr>
+        <w:t xml:space="preserve">summary.json</w:t>
+      </w:r>
+      <w:r>
+        <w:t xml:space="preserve"> </w:t>
+      </w:r>
+      <w:r>
+        <w:t xml:space="preserve">per</w:t>
+      </w:r>
+      <w:r>
+        <w:t xml:space="preserve"> </w:t>
+      </w:r>
+      <w:r>
+        <w:t xml:space="preserve">run;</w:t>
+      </w:r>
+      <w:r>
+        <w:t xml:space="preserve"> </w:t>
+      </w:r>
+      <w:r>
+        <w:t xml:space="preserve">“</w:t>
+      </w:r>
+      <w:r>
+        <w:t xml:space="preserve">-</w:t>
+      </w:r>
+      <w:r>
+        <w:t xml:space="preserve">”</w:t>
+      </w:r>
+      <w:r>
+        <w:t xml:space="preserve"> </w:t>
+      </w:r>
+      <w:r>
+        <w:t xml:space="preserve">= not recorded by that era’s judge or not applicable). Runs 1-5</w:t>
+      </w:r>
+      <w:r>
+        <w:t xml:space="preserve"> </w:t>
+      </w:r>
+      <w:r>
+        <w:t xml:space="preserve">grade 32 cases; runs 6-11 grade 40 (multi-hop added). Tool-error rates for</w:t>
+      </w:r>
+      <w:r>
+        <w:t xml:space="preserve"> </w:t>
+      </w:r>
+      <w:r>
+        <w:t xml:space="preserve">runs 1-3 were computed retroactively from the saved tool results, since the</w:t>
+      </w:r>
+      <w:r>
+        <w:t xml:space="preserve"> </w:t>
+      </w:r>
+      <w:r>
+        <w:rPr>
+          <w:rStyle w:val="VerbatimChar"/>
+        </w:rPr>
+        <w:t xml:space="preserve">tool_error_rate</w:t>
+      </w:r>
+      <w:r>
+        <w:t xml:space="preserve"> </w:t>
+      </w:r>
+      <w:r>
+        <w:t xml:space="preserve">metric was added in run 4’s harness.</w:t>
+      </w:r>
+    </w:p>
+    <w:tbl>
+      <w:tblPr>
+        <w:tblStyle w:val="Table"/>
+        <w:tblW w:type="pct" w:w="5000.0"/>
+        <w:tblLook w:firstRow="1"/>
+      </w:tblPr>
+      <w:tblGrid>
+        <w:gridCol w:w="660"/>
+        <w:gridCol w:w="660"/>
+        <w:gridCol w:w="660"/>
+        <w:gridCol w:w="660"/>
+        <w:gridCol w:w="660"/>
+        <w:gridCol w:w="660"/>
+        <w:gridCol w:w="660"/>
+        <w:gridCol w:w="660"/>
+        <w:gridCol w:w="660"/>
+        <w:gridCol w:w="660"/>
+        <w:gridCol w:w="660"/>
+        <w:gridCol w:w="660"/>
+      </w:tblGrid>
+      <w:tr>
+        <w:trPr>
+          <w:cnfStyle w:firstRow="1"/>
+        </w:trPr>
+        <w:tc>
+          <w:tcPr>
+            <w:tcBorders>
+              <w:bottom w:val="single"/>
+            </w:tcBorders>
+            <w:vAlign w:val="bottom"/>
+          </w:tcPr>
+          <w:p>
+            <w:pPr>
+              <w:pStyle w:val="Compact"/>
+              <w:jc w:val="left"/>
+            </w:pPr>
+            <w:r>
+              <w:t xml:space="preserve">Run</w:t>
+            </w:r>
+          </w:p>
+        </w:tc>
+        <w:tc>
+          <w:tcPr>
+            <w:tcBorders>
+              <w:bottom w:val="single"/>
+            </w:tcBorders>
+            <w:vAlign w:val="bottom"/>
+          </w:tcPr>
+          <w:p>
+            <w:pPr>
+              <w:pStyle w:val="Compact"/>
+              <w:jc w:val="left"/>
+            </w:pPr>
+            <w:r>
+              <w:t xml:space="preserve">Config (n cases)</w:t>
+            </w:r>
+          </w:p>
+        </w:tc>
+        <w:tc>
+          <w:tcPr>
+            <w:tcBorders>
+              <w:bottom w:val="single"/>
+            </w:tcBorders>
+            <w:vAlign w:val="bottom"/>
+          </w:tcPr>
+          <w:p>
+            <w:pPr>
+              <w:pStyle w:val="Compact"/>
+              <w:jc w:val="left"/>
+            </w:pPr>
+            <w:r>
+              <w:t xml:space="preserve">Judge</w:t>
+            </w:r>
+          </w:p>
+        </w:tc>
+        <w:tc>
+          <w:tcPr>
+            <w:tcBorders>
+              <w:bottom w:val="single"/>
+            </w:tcBorders>
+            <w:vAlign w:val="bottom"/>
+          </w:tcPr>
+          <w:p>
+            <w:pPr>
+              <w:pStyle w:val="Compact"/>
+              <w:jc w:val="left"/>
+            </w:pPr>
+            <w:r>
+              <w:t xml:space="preserve">Pass</w:t>
+            </w:r>
+          </w:p>
+        </w:tc>
+        <w:tc>
+          <w:tcPr>
+            <w:tcBorders>
+              <w:bottom w:val="single"/>
+            </w:tcBorders>
+            <w:vAlign w:val="bottom"/>
+          </w:tcPr>
+          <w:p>
+            <w:pPr>
+              <w:pStyle w:val="Compact"/>
+              <w:jc w:val="left"/>
+            </w:pPr>
+            <w:r>
+              <w:t xml:space="preserve">Recall</w:t>
+            </w:r>
+          </w:p>
+        </w:tc>
+        <w:tc>
+          <w:tcPr>
+            <w:tcBorders>
+              <w:bottom w:val="single"/>
+            </w:tcBorders>
+            <w:vAlign w:val="bottom"/>
+          </w:tcPr>
+          <w:p>
+            <w:pPr>
+              <w:pStyle w:val="Compact"/>
+              <w:jc w:val="left"/>
+            </w:pPr>
+            <w:r>
+              <w:t xml:space="preserve">Prec.</w:t>
+            </w:r>
+          </w:p>
+        </w:tc>
+        <w:tc>
+          <w:tcPr>
+            <w:tcBorders>
+              <w:bottom w:val="single"/>
+            </w:tcBorders>
+            <w:vAlign w:val="bottom"/>
+          </w:tcPr>
+          <w:p>
+            <w:pPr>
+              <w:pStyle w:val="Compact"/>
+              <w:jc w:val="left"/>
+            </w:pPr>
+            <w:r>
+              <w:t xml:space="preserve">Evid. suff.</w:t>
+            </w:r>
+          </w:p>
+        </w:tc>
+        <w:tc>
+          <w:tcPr>
+            <w:tcBorders>
+              <w:bottom w:val="single"/>
+            </w:tcBorders>
+            <w:vAlign w:val="bottom"/>
+          </w:tcPr>
+          <w:p>
+            <w:pPr>
+              <w:pStyle w:val="Compact"/>
+              <w:jc w:val="left"/>
+            </w:pPr>
+            <w:r>
+              <w:t xml:space="preserve">Right art.</w:t>
+            </w:r>
+          </w:p>
+        </w:tc>
+        <w:tc>
+          <w:tcPr>
+            <w:tcBorders>
+              <w:bottom w:val="single"/>
+            </w:tcBorders>
+            <w:vAlign w:val="bottom"/>
+          </w:tcPr>
+          <w:p>
+            <w:pPr>
+              <w:pStyle w:val="Compact"/>
+              <w:jc w:val="left"/>
+            </w:pPr>
+            <w:r>
+              <w:t xml:space="preserve">Tool err.</w:t>
+            </w:r>
+          </w:p>
+        </w:tc>
+        <w:tc>
+          <w:tcPr>
+            <w:tcBorders>
+              <w:bottom w:val="single"/>
+            </w:tcBorders>
+            <w:vAlign w:val="bottom"/>
+          </w:tcPr>
+          <w:p>
+            <w:pPr>
+              <w:pStyle w:val="Compact"/>
+              <w:jc w:val="left"/>
+            </w:pPr>
+            <w:r>
+              <w:t xml:space="preserve">Unfaithful</w:t>
+            </w:r>
+          </w:p>
+        </w:tc>
+        <w:tc>
+          <w:tcPr>
+            <w:tcBorders>
+              <w:bottom w:val="single"/>
+            </w:tcBorders>
+            <w:vAlign w:val="bottom"/>
+          </w:tcPr>
+          <w:p>
+            <w:pPr>
+              <w:pStyle w:val="Compact"/>
+              <w:jc w:val="left"/>
+            </w:pPr>
+            <w:r>
+              <w:t xml:space="preserve">Side claims</w:t>
+            </w:r>
+          </w:p>
+        </w:tc>
+        <w:tc>
+          <w:tcPr>
+            <w:tcBorders>
+              <w:bottom w:val="single"/>
+            </w:tcBorders>
+            <w:vAlign w:val="bottom"/>
+          </w:tcPr>
+          <w:p>
+            <w:pPr>
+              <w:pStyle w:val="Compact"/>
+              <w:jc w:val="left"/>
+            </w:pPr>
+            <w:r>
+              <w:t xml:space="preserve">Prompt / tool / judge change in this iteration</w:t>
+            </w:r>
+          </w:p>
+        </w:tc>
+      </w:tr>
+      <w:tr>
+        <w:tc>
+          <w:p>
+            <w:pPr>
+              <w:pStyle w:val="Compact"/>
+              <w:jc w:val="left"/>
+            </w:pPr>
+            <w:r>
+              <w:t xml:space="preserve">1</w:t>
+            </w:r>
+          </w:p>
+        </w:tc>
+        <w:tc>
+          <w:p>
+            <w:pPr>
+              <w:pStyle w:val="Compact"/>
+              <w:jc w:val="left"/>
+            </w:pPr>
+            <w:r>
+              <w:t xml:space="preserve">v0 (32)</w:t>
+            </w:r>
+          </w:p>
+        </w:tc>
+        <w:tc>
+          <w:p>
+            <w:pPr>
+              <w:pStyle w:val="Compact"/>
+              <w:jc w:val="left"/>
+            </w:pPr>
+            <w:r>
+              <w:t xml:space="preserve">pre-rubric</w:t>
+            </w:r>
+          </w:p>
+        </w:tc>
+        <w:tc>
+          <w:p>
+            <w:pPr>
+              <w:pStyle w:val="Compact"/>
+              <w:jc w:val="left"/>
+            </w:pPr>
+            <w:r>
+              <w:t xml:space="preserve">0.938</w:t>
+            </w:r>
+          </w:p>
+        </w:tc>
+        <w:tc>
+          <w:p>
+            <w:pPr>
+              <w:pStyle w:val="Compact"/>
+              <w:jc w:val="left"/>
+            </w:pPr>
+            <w:r>
+              <w:t xml:space="preserve">0.333</w:t>
+            </w:r>
+          </w:p>
+        </w:tc>
+        <w:tc>
+          <w:p>
+            <w:pPr>
+              <w:pStyle w:val="Compact"/>
+              <w:jc w:val="left"/>
+            </w:pPr>
+            <w:r>
+              <w:t xml:space="preserve">1.0</w:t>
+            </w:r>
+          </w:p>
+        </w:tc>
+        <w:tc>
+          <w:p>
+            <w:pPr>
+              <w:pStyle w:val="Compact"/>
+              <w:jc w:val="left"/>
+            </w:pPr>
+            <w:r>
+              <w:t xml:space="preserve">-</w:t>
+            </w:r>
+          </w:p>
+        </w:tc>
+        <w:tc>
+          <w:p>
+            <w:pPr>
+              <w:pStyle w:val="Compact"/>
+              <w:jc w:val="left"/>
+            </w:pPr>
+            <w:r>
+              <w:t xml:space="preserve">-</w:t>
+            </w:r>
+          </w:p>
+        </w:tc>
+        <w:tc>
+          <w:p>
+            <w:pPr>
+              <w:pStyle w:val="Compact"/>
+              <w:jc w:val="left"/>
+            </w:pPr>
+            <w:r>
+              <w:t xml:space="preserve">0.0</w:t>
+            </w:r>
+          </w:p>
+        </w:tc>
+        <w:tc>
+          <w:p>
+            <w:pPr>
+              <w:pStyle w:val="Compact"/>
+              <w:jc w:val="left"/>
+            </w:pPr>
+            <w:r>
+              <w:t xml:space="preserve">-</w:t>
+            </w:r>
+          </w:p>
+        </w:tc>
+        <w:tc>
+          <w:p>
+            <w:pPr>
+              <w:pStyle w:val="Compact"/>
+              <w:jc w:val="left"/>
+            </w:pPr>
+            <w:r>
+              <w:t xml:space="preserve">-</w:t>
+            </w:r>
+          </w:p>
+        </w:tc>
+        <w:tc>
+          <w:p>
+            <w:pPr>
+              <w:pStyle w:val="Compact"/>
+              <w:jc w:val="left"/>
+            </w:pPr>
+            <w:r>
+              <w:t xml:space="preserve">Baseline: minimal</w:t>
+            </w:r>
+            <w:r>
+              <w:t xml:space="preserve"> </w:t>
+            </w:r>
+            <w:r>
+              <w:t xml:space="preserve">“</w:t>
+            </w:r>
+            <w:r>
+              <w:t xml:space="preserve">search when you’re not certain</w:t>
+            </w:r>
+            <w:r>
+              <w:t xml:space="preserve">”</w:t>
+            </w:r>
+            <w:r>
+              <w:t xml:space="preserve"> </w:t>
+            </w:r>
+            <w:r>
+              <w:t xml:space="preserve">prompt</w:t>
+            </w:r>
+          </w:p>
+        </w:tc>
+      </w:tr>
+      <w:tr>
+        <w:tc>
+          <w:p>
+            <w:pPr>
+              <w:pStyle w:val="Compact"/>
+              <w:jc w:val="left"/>
+            </w:pPr>
+            <w:r>
+              <w:t xml:space="preserve">2</w:t>
+            </w:r>
+          </w:p>
+        </w:tc>
+        <w:tc>
+          <w:p>
+            <w:pPr>
+              <w:pStyle w:val="Compact"/>
+              <w:jc w:val="left"/>
+            </w:pPr>
+            <w:r>
+              <w:t xml:space="preserve">v0 (32)</w:t>
+            </w:r>
+          </w:p>
+        </w:tc>
+        <w:tc>
+          <w:p>
+            <w:pPr>
+              <w:pStyle w:val="Compact"/>
+              <w:jc w:val="left"/>
+            </w:pPr>
+            <w:r>
+              <w:t xml:space="preserve">judge-v1</w:t>
+            </w:r>
+          </w:p>
+        </w:tc>
+        <w:tc>
+          <w:p>
+            <w:pPr>
+              <w:pStyle w:val="Compact"/>
+              <w:jc w:val="left"/>
+            </w:pPr>
+            <w:r>
+              <w:t xml:space="preserve">0.969</w:t>
+            </w:r>
+          </w:p>
+        </w:tc>
+        <w:tc>
+          <w:p>
+            <w:pPr>
+              <w:pStyle w:val="Compact"/>
+              <w:jc w:val="left"/>
+            </w:pPr>
+            <w:r>
+              <w:t xml:space="preserve">0.333</w:t>
+            </w:r>
+          </w:p>
+        </w:tc>
+        <w:tc>
+          <w:p>
+            <w:pPr>
+              <w:pStyle w:val="Compact"/>
+              <w:jc w:val="left"/>
+            </w:pPr>
+            <w:r>
+              <w:t xml:space="preserve">1.0</w:t>
+            </w:r>
+          </w:p>
+        </w:tc>
+        <w:tc>
+          <w:p>
+            <w:pPr>
+              <w:pStyle w:val="Compact"/>
+              <w:jc w:val="left"/>
+            </w:pPr>
+            <w:r>
+              <w:t xml:space="preserve">0.80</w:t>
+            </w:r>
+          </w:p>
+        </w:tc>
+        <w:tc>
+          <w:p>
+            <w:pPr>
+              <w:pStyle w:val="Compact"/>
+              <w:jc w:val="left"/>
+            </w:pPr>
+            <w:r>
+              <w:t xml:space="preserve">1.0</w:t>
+            </w:r>
+          </w:p>
+        </w:tc>
+        <w:tc>
+          <w:p>
+            <w:pPr>
+              <w:pStyle w:val="Compact"/>
+              <w:jc w:val="left"/>
+            </w:pPr>
+            <w:r>
+              <w:t xml:space="preserve">0.0</w:t>
+            </w:r>
+          </w:p>
+        </w:tc>
+        <w:tc>
+          <w:p>
+            <w:pPr>
+              <w:pStyle w:val="Compact"/>
+              <w:jc w:val="left"/>
+            </w:pPr>
+            <w:r>
+              <w:t xml:space="preserve">1</w:t>
+            </w:r>
+          </w:p>
+        </w:tc>
+        <w:tc>
+          <w:p>
+            <w:pPr>
+              <w:pStyle w:val="Compact"/>
+              <w:jc w:val="left"/>
+            </w:pPr>
+            <w:r>
+              <w:t xml:space="preserve">-</w:t>
+            </w:r>
+          </w:p>
+        </w:tc>
+        <w:tc>
+          <w:p>
+            <w:pPr>
+              <w:pStyle w:val="Compact"/>
+              <w:jc w:val="left"/>
+            </w:pPr>
+            <w:r>
+              <w:t xml:space="preserve">Judge upgraded to rubric judge (4 fields, per-notch examples); prompt unchanged</w:t>
+            </w:r>
+          </w:p>
+        </w:tc>
+      </w:tr>
+      <w:tr>
+        <w:tc>
+          <w:p>
+            <w:pPr>
+              <w:pStyle w:val="Compact"/>
+              <w:jc w:val="left"/>
+            </w:pPr>
+            <w:r>
+              <w:t xml:space="preserve">3</w:t>
+            </w:r>
+          </w:p>
+        </w:tc>
+        <w:tc>
+          <w:p>
+            <w:pPr>
+              <w:pStyle w:val="Compact"/>
+              <w:jc w:val="left"/>
+            </w:pPr>
+            <w:r>
+              <w:t xml:space="preserve">v1 (32)</w:t>
+            </w:r>
+          </w:p>
+        </w:tc>
+        <w:tc>
+          <w:p>
+            <w:pPr>
+              <w:pStyle w:val="Compact"/>
+              <w:jc w:val="left"/>
+            </w:pPr>
+            <w:r>
+              <w:t xml:space="preserve">judge-v1</w:t>
+            </w:r>
+          </w:p>
+        </w:tc>
+        <w:tc>
+          <w:p>
+            <w:pPr>
+              <w:pStyle w:val="Compact"/>
+              <w:jc w:val="left"/>
+            </w:pPr>
+            <w:r>
+              <w:t xml:space="preserve">0.969</w:t>
+            </w:r>
+          </w:p>
+        </w:tc>
+        <w:tc>
+          <w:p>
+            <w:pPr>
+              <w:pStyle w:val="Compact"/>
+              <w:jc w:val="left"/>
+            </w:pPr>
+            <w:r>
+              <w:t xml:space="preserve">0.933</w:t>
+            </w:r>
+          </w:p>
+        </w:tc>
+        <w:tc>
+          <w:p>
+            <w:pPr>
+              <w:pStyle w:val="Compact"/>
+              <w:jc w:val="left"/>
+            </w:pPr>
+            <w:r>
+              <w:t xml:space="preserve">1.0</w:t>
+            </w:r>
+          </w:p>
+        </w:tc>
+        <w:tc>
+          <w:p>
+            <w:pPr>
+              <w:pStyle w:val="Compact"/>
+              <w:jc w:val="left"/>
+            </w:pPr>
+            <w:r>
+              <w:t xml:space="preserve">0.80</w:t>
+            </w:r>
+          </w:p>
+        </w:tc>
+        <w:tc>
+          <w:p>
+            <w:pPr>
+              <w:pStyle w:val="Compact"/>
+              <w:jc w:val="left"/>
+            </w:pPr>
+            <w:r>
+              <w:t xml:space="preserve">0.80</w:t>
+            </w:r>
+          </w:p>
+        </w:tc>
+        <w:tc>
+          <w:p>
+            <w:pPr>
+              <w:pStyle w:val="Compact"/>
+              <w:jc w:val="left"/>
+            </w:pPr>
+            <w:r>
+              <w:t xml:space="preserve">0.517</w:t>
+            </w:r>
+          </w:p>
+        </w:tc>
+        <w:tc>
+          <w:p>
+            <w:pPr>
+              <w:pStyle w:val="Compact"/>
+              <w:jc w:val="left"/>
+            </w:pPr>
+            <w:r>
+              <w:t xml:space="preserve">1</w:t>
+            </w:r>
+          </w:p>
+        </w:tc>
+        <w:tc>
+          <w:p>
+            <w:pPr>
+              <w:pStyle w:val="Compact"/>
+              <w:jc w:val="left"/>
+            </w:pPr>
+            <w:r>
+              <w:t xml:space="preserve">-</w:t>
+            </w:r>
+          </w:p>
+        </w:tc>
+        <w:tc>
+          <w:p>
+            <w:pPr>
+              <w:pStyle w:val="Compact"/>
+              <w:jc w:val="left"/>
+            </w:pPr>
+            <w:r>
+              <w:t xml:space="preserve">Prompt: fact-kind trigger lists replace confidence; evidence-discipline block. Run polluted by Wikipedia 429s</w:t>
+            </w:r>
+          </w:p>
+        </w:tc>
+      </w:tr>
+      <w:tr>
+        <w:tc>
+          <w:p>
+            <w:pPr>
+              <w:pStyle w:val="Compact"/>
+              <w:jc w:val="left"/>
+            </w:pPr>
+            <w:r>
+              <w:t xml:space="preserve">4</w:t>
+            </w:r>
+          </w:p>
+        </w:tc>
+        <w:tc>
+          <w:p>
+            <w:pPr>
+              <w:pStyle w:val="Compact"/>
+              <w:jc w:val="left"/>
+            </w:pPr>
+            <w:r>
+              <w:t xml:space="preserve">v1.1 (32)</w:t>
+            </w:r>
+          </w:p>
+        </w:tc>
+        <w:tc>
+          <w:p>
+            <w:pPr>
+              <w:pStyle w:val="Compact"/>
+              <w:jc w:val="left"/>
+            </w:pPr>
+            <w:r>
+              <w:t xml:space="preserve">judge-v2</w:t>
+            </w:r>
+          </w:p>
+        </w:tc>
+        <w:tc>
+          <w:p>
+            <w:pPr>
+              <w:pStyle w:val="Compact"/>
+              <w:jc w:val="left"/>
+            </w:pPr>
+            <w:r>
+              <w:t xml:space="preserve">0.969</w:t>
+            </w:r>
+          </w:p>
+        </w:tc>
+        <w:tc>
+          <w:p>
+            <w:pPr>
+              <w:pStyle w:val="Compact"/>
+              <w:jc w:val="left"/>
+            </w:pPr>
+            <w:r>
+              <w:t xml:space="preserve">0.867</w:t>
+            </w:r>
+          </w:p>
+        </w:tc>
+        <w:tc>
+          <w:p>
+            <w:pPr>
+              <w:pStyle w:val="Compact"/>
+              <w:jc w:val="left"/>
+            </w:pPr>
+            <w:r>
+              <w:t xml:space="preserve">1.0</w:t>
+            </w:r>
+          </w:p>
+        </w:tc>
+        <w:tc>
+          <w:p>
+            <w:pPr>
+              <w:pStyle w:val="Compact"/>
+              <w:jc w:val="left"/>
+            </w:pPr>
+            <w:r>
+              <w:t xml:space="preserve">0.846</w:t>
+            </w:r>
+          </w:p>
+        </w:tc>
+        <w:tc>
+          <w:p>
+            <w:pPr>
+              <w:pStyle w:val="Compact"/>
+              <w:jc w:val="left"/>
+            </w:pPr>
+            <w:r>
+              <w:t xml:space="preserve">0.923</w:t>
+            </w:r>
+          </w:p>
+        </w:tc>
+        <w:tc>
+          <w:p>
+            <w:pPr>
+              <w:pStyle w:val="Compact"/>
+              <w:jc w:val="left"/>
+            </w:pPr>
+            <w:r>
+              <w:t xml:space="preserve">0.0</w:t>
+            </w:r>
+          </w:p>
+        </w:tc>
+        <w:tc>
+          <w:p>
+            <w:pPr>
+              <w:pStyle w:val="Compact"/>
+              <w:jc w:val="left"/>
+            </w:pPr>
+            <w:r>
+              <w:t xml:space="preserve">1</w:t>
+            </w:r>
+          </w:p>
+        </w:tc>
+        <w:tc>
+          <w:p>
+            <w:pPr>
+              <w:pStyle w:val="Compact"/>
+              <w:jc w:val="left"/>
+            </w:pPr>
+            <w:r>
+              <w:t xml:space="preserve">-</w:t>
+            </w:r>
+          </w:p>
+        </w:tc>
+        <w:tc>
+          <w:p>
+            <w:pPr>
+              <w:pStyle w:val="Compact"/>
+              <w:jc w:val="left"/>
+            </w:pPr>
+            <w:r>
+              <w:t xml:space="preserve">Prompt: outage-fallback policy. Tool: 429/503 retries + throttle. Judge-v2: labeled-unverified carve-out</w:t>
+            </w:r>
+          </w:p>
+        </w:tc>
+      </w:tr>
+      <w:tr>
+        <w:tc>
+          <w:p>
+            <w:pPr>
+              <w:pStyle w:val="Compact"/>
+              <w:jc w:val="left"/>
+            </w:pPr>
+            <w:r>
+              <w:t xml:space="preserve">5</w:t>
+            </w:r>
+          </w:p>
+        </w:tc>
+        <w:tc>
+          <w:p>
+            <w:pPr>
+              <w:pStyle w:val="Compact"/>
+              <w:jc w:val="left"/>
+            </w:pPr>
+            <w:r>
+              <w:t xml:space="preserve">v1.2 (32)</w:t>
+            </w:r>
+          </w:p>
+        </w:tc>
+        <w:tc>
+          <w:p>
+            <w:pPr>
+              <w:pStyle w:val="Compact"/>
+              <w:jc w:val="left"/>
+            </w:pPr>
+            <w:r>
+              <w:t xml:space="preserve">judge-v2</w:t>
+            </w:r>
+          </w:p>
+        </w:tc>
+        <w:tc>
+          <w:p>
+            <w:pPr>
+              <w:pStyle w:val="Compact"/>
+              <w:jc w:val="left"/>
+            </w:pPr>
+            <w:r>
+              <w:rPr>
+                <w:b/>
+              </w:rPr>
+              <w:t xml:space="preserve">1.0</w:t>
+            </w:r>
+          </w:p>
+        </w:tc>
+        <w:tc>
+          <w:p>
+            <w:pPr>
+              <w:pStyle w:val="Compact"/>
+              <w:jc w:val="left"/>
+            </w:pPr>
+            <w:r>
+              <w:t xml:space="preserve">0.867</w:t>
+            </w:r>
+          </w:p>
+        </w:tc>
+        <w:tc>
+          <w:p>
+            <w:pPr>
+              <w:pStyle w:val="Compact"/>
+              <w:jc w:val="left"/>
+            </w:pPr>
+            <w:r>
+              <w:t xml:space="preserve">1.0</w:t>
+            </w:r>
+          </w:p>
+        </w:tc>
+        <w:tc>
+          <w:p>
+            <w:pPr>
+              <w:pStyle w:val="Compact"/>
+              <w:jc w:val="left"/>
+            </w:pPr>
+            <w:r>
+              <w:rPr>
+                <w:b/>
+              </w:rPr>
+              <w:t xml:space="preserve">1.0</w:t>
+            </w:r>
+          </w:p>
+        </w:tc>
+        <w:tc>
+          <w:p>
+            <w:pPr>
+              <w:pStyle w:val="Compact"/>
+              <w:jc w:val="left"/>
+            </w:pPr>
+            <w:r>
+              <w:rPr>
+                <w:b/>
+              </w:rPr>
+              <w:t xml:space="preserve">1.0</w:t>
+            </w:r>
+          </w:p>
+        </w:tc>
+        <w:tc>
+          <w:p>
+            <w:pPr>
+              <w:pStyle w:val="Compact"/>
+              <w:jc w:val="left"/>
+            </w:pPr>
+            <w:r>
+              <w:t xml:space="preserve">0.0</w:t>
+            </w:r>
+          </w:p>
+        </w:tc>
+        <w:tc>
+          <w:p>
+            <w:pPr>
+              <w:pStyle w:val="Compact"/>
+              <w:jc w:val="left"/>
+            </w:pPr>
+            <w:r>
+              <w:t xml:space="preserve">0</w:t>
+            </w:r>
+          </w:p>
+        </w:tc>
+        <w:tc>
+          <w:p>
+            <w:pPr>
+              <w:pStyle w:val="Compact"/>
+              <w:jc w:val="left"/>
+            </w:pPr>
+            <w:r>
+              <w:t xml:space="preserve">-</w:t>
+            </w:r>
+          </w:p>
+        </w:tc>
+        <w:tc>
+          <w:p>
+            <w:pPr>
+              <w:pStyle w:val="Compact"/>
+              <w:jc w:val="left"/>
+            </w:pPr>
+            <w:r>
+              <w:t xml:space="preserve">Prompt: follow alternate titles before answering. Tool: search snippets (table-borne facts)</w:t>
+            </w:r>
+          </w:p>
+        </w:tc>
+      </w:tr>
+      <w:tr>
+        <w:tc>
+          <w:p>
+            <w:pPr>
+              <w:pStyle w:val="Compact"/>
+              <w:jc w:val="left"/>
+            </w:pPr>
+            <w:r>
+              <w:t xml:space="preserve">6</w:t>
+            </w:r>
+          </w:p>
+        </w:tc>
+        <w:tc>
+          <w:p>
+            <w:pPr>
+              <w:pStyle w:val="Compact"/>
+              <w:jc w:val="left"/>
+            </w:pPr>
+            <w:r>
+              <w:t xml:space="preserve">v1.2 (40)</w:t>
+            </w:r>
+          </w:p>
+        </w:tc>
+        <w:tc>
+          <w:p>
+            <w:pPr>
+              <w:pStyle w:val="Compact"/>
+              <w:jc w:val="left"/>
+            </w:pPr>
+            <w:r>
+              <w:t xml:space="preserve">judge-v2</w:t>
+            </w:r>
+          </w:p>
+        </w:tc>
+        <w:tc>
+          <w:p>
+            <w:pPr>
+              <w:pStyle w:val="Compact"/>
+              <w:jc w:val="left"/>
+            </w:pPr>
+            <w:r>
+              <w:t xml:space="preserve">0.975</w:t>
+            </w:r>
+          </w:p>
+        </w:tc>
+        <w:tc>
+          <w:p>
+            <w:pPr>
+              <w:pStyle w:val="Compact"/>
+              <w:jc w:val="left"/>
+            </w:pPr>
+            <w:r>
+              <w:t xml:space="preserve">0.955</w:t>
+            </w:r>
+          </w:p>
+        </w:tc>
+        <w:tc>
+          <w:p>
+            <w:pPr>
+              <w:pStyle w:val="Compact"/>
+              <w:jc w:val="left"/>
+            </w:pPr>
+            <w:r>
+              <w:t xml:space="preserve">1.0</w:t>
+            </w:r>
+          </w:p>
+        </w:tc>
+        <w:tc>
+          <w:p>
+            <w:pPr>
+              <w:pStyle w:val="Compact"/>
+              <w:jc w:val="left"/>
+            </w:pPr>
+            <w:r>
+              <w:t xml:space="preserve">0.857</w:t>
+            </w:r>
+          </w:p>
+        </w:tc>
+        <w:tc>
+          <w:p>
+            <w:pPr>
+              <w:pStyle w:val="Compact"/>
+              <w:jc w:val="left"/>
+            </w:pPr>
+            <w:r>
+              <w:t xml:space="preserve">1.0</w:t>
+            </w:r>
+          </w:p>
+        </w:tc>
+        <w:tc>
+          <w:p>
+            <w:pPr>
+              <w:pStyle w:val="Compact"/>
+              <w:jc w:val="left"/>
+            </w:pPr>
+            <w:r>
+              <w:t xml:space="preserve">0.0</w:t>
+            </w:r>
+          </w:p>
+        </w:tc>
+        <w:tc>
+          <w:p>
+            <w:pPr>
+              <w:pStyle w:val="Compact"/>
+              <w:jc w:val="left"/>
+            </w:pPr>
+            <w:r>
+              <w:t xml:space="preserve">1</w:t>
+            </w:r>
+          </w:p>
+        </w:tc>
+        <w:tc>
+          <w:p>
+            <w:pPr>
+              <w:pStyle w:val="Compact"/>
+              <w:jc w:val="left"/>
+            </w:pPr>
+            <w:r>
+              <w:t xml:space="preserve">-</w:t>
+            </w:r>
+          </w:p>
+        </w:tc>
+        <w:tc>
+          <w:p>
+            <w:pPr>
+              <w:pStyle w:val="Compact"/>
+              <w:jc w:val="left"/>
+            </w:pPr>
+            <w:r>
+              <w:t xml:space="preserve">No config change: 8 multi-hop cases added to the suite</w:t>
+            </w:r>
+          </w:p>
+        </w:tc>
+      </w:tr>
+      <w:tr>
+        <w:tc>
+          <w:p>
+            <w:pPr>
+              <w:pStyle w:val="Compact"/>
+              <w:jc w:val="left"/>
+            </w:pPr>
+            <w:r>
+              <w:t xml:space="preserve">7</w:t>
+            </w:r>
+          </w:p>
+        </w:tc>
+        <w:tc>
+          <w:p>
+            <w:pPr>
+              <w:pStyle w:val="Compact"/>
+              <w:jc w:val="left"/>
+            </w:pPr>
+            <w:r>
+              <w:t xml:space="preserve">v1.3 (40)</w:t>
+            </w:r>
+          </w:p>
+        </w:tc>
+        <w:tc>
+          <w:p>
+            <w:pPr>
+              <w:pStyle w:val="Compact"/>
+              <w:jc w:val="left"/>
+            </w:pPr>
+            <w:r>
+              <w:t xml:space="preserve">judge-v2</w:t>
+            </w:r>
+          </w:p>
+        </w:tc>
+        <w:tc>
+          <w:p>
+            <w:pPr>
+              <w:pStyle w:val="Compact"/>
+              <w:jc w:val="left"/>
+            </w:pPr>
+            <w:r>
+              <w:t xml:space="preserve">0.975</w:t>
+            </w:r>
+          </w:p>
+        </w:tc>
+        <w:tc>
+          <w:p>
+            <w:pPr>
+              <w:pStyle w:val="Compact"/>
+              <w:jc w:val="left"/>
+            </w:pPr>
+            <w:r>
+              <w:t xml:space="preserve">0.955</w:t>
+            </w:r>
+          </w:p>
+        </w:tc>
+        <w:tc>
+          <w:p>
+            <w:pPr>
+              <w:pStyle w:val="Compact"/>
+              <w:jc w:val="left"/>
+            </w:pPr>
+            <w:r>
+              <w:t xml:space="preserve">1.0</w:t>
+            </w:r>
+          </w:p>
+        </w:tc>
+        <w:tc>
+          <w:p>
+            <w:pPr>
+              <w:pStyle w:val="Compact"/>
+              <w:jc w:val="left"/>
+            </w:pPr>
+            <w:r>
+              <w:t xml:space="preserve">0.955</w:t>
+            </w:r>
+          </w:p>
+        </w:tc>
+        <w:tc>
+          <w:p>
+            <w:pPr>
+              <w:pStyle w:val="Compact"/>
+              <w:jc w:val="left"/>
+            </w:pPr>
+            <w:r>
+              <w:t xml:space="preserve">1.0</w:t>
+            </w:r>
+          </w:p>
+        </w:tc>
+        <w:tc>
+          <w:p>
+            <w:pPr>
+              <w:pStyle w:val="Compact"/>
+              <w:jc w:val="left"/>
+            </w:pPr>
+            <w:r>
+              <w:t xml:space="preserve">0.0</w:t>
+            </w:r>
+          </w:p>
+        </w:tc>
+        <w:tc>
+          <w:p>
+            <w:pPr>
+              <w:pStyle w:val="Compact"/>
+              <w:jc w:val="left"/>
+            </w:pPr>
+            <w:r>
+              <w:t xml:space="preserve">0</w:t>
+            </w:r>
+          </w:p>
+        </w:tc>
+        <w:tc>
+          <w:p>
+            <w:pPr>
+              <w:pStyle w:val="Compact"/>
+              <w:jc w:val="left"/>
+            </w:pPr>
+            <w:r>
+              <w:t xml:space="preserve">-</w:t>
+            </w:r>
+          </w:p>
+        </w:tc>
+        <w:tc>
+          <w:p>
+            <w:pPr>
+              <w:pStyle w:val="Compact"/>
+              <w:jc w:val="left"/>
+            </w:pPr>
+            <w:r>
+              <w:t xml:space="preserve">Prompt: per-hop chain verification. Tool: infobox extraction</w:t>
+            </w:r>
+          </w:p>
+        </w:tc>
+      </w:tr>
+      <w:tr>
+        <w:tc>
+          <w:p>
+            <w:pPr>
+              <w:pStyle w:val="Compact"/>
+              <w:jc w:val="left"/>
+            </w:pPr>
+            <w:r>
+              <w:t xml:space="preserve">8</w:t>
+            </w:r>
+          </w:p>
+        </w:tc>
+        <w:tc>
+          <w:p>
+            <w:pPr>
+              <w:pStyle w:val="Compact"/>
+              <w:jc w:val="left"/>
+            </w:pPr>
+            <w:r>
+              <w:t xml:space="preserve">v1.3 (40)</w:t>
+            </w:r>
+          </w:p>
+        </w:tc>
+        <w:tc>
+          <w:p>
+            <w:pPr>
+              <w:pStyle w:val="Compact"/>
+              <w:jc w:val="left"/>
+            </w:pPr>
+            <w:r>
+              <w:t xml:space="preserve">judge-v2</w:t>
+            </w:r>
+          </w:p>
+        </w:tc>
+        <w:tc>
+          <w:p>
+            <w:pPr>
+              <w:pStyle w:val="Compact"/>
+              <w:jc w:val="left"/>
+            </w:pPr>
+            <w:r>
+              <w:rPr>
+                <w:b/>
+              </w:rPr>
+              <w:t xml:space="preserve">1.0</w:t>
+            </w:r>
+          </w:p>
+        </w:tc>
+        <w:tc>
+          <w:p>
+            <w:pPr>
+              <w:pStyle w:val="Compact"/>
+              <w:jc w:val="left"/>
+            </w:pPr>
+            <w:r>
+              <w:t xml:space="preserve">0.955</w:t>
+            </w:r>
+          </w:p>
+        </w:tc>
+        <w:tc>
+          <w:p>
+            <w:pPr>
+              <w:pStyle w:val="Compact"/>
+              <w:jc w:val="left"/>
+            </w:pPr>
+            <w:r>
+              <w:t xml:space="preserve">1.0</w:t>
+            </w:r>
+          </w:p>
+        </w:tc>
+        <w:tc>
+          <w:p>
+            <w:pPr>
+              <w:pStyle w:val="Compact"/>
+              <w:jc w:val="left"/>
+            </w:pPr>
+            <w:r>
+              <w:t xml:space="preserve">0.952</w:t>
+            </w:r>
+          </w:p>
+        </w:tc>
+        <w:tc>
+          <w:p>
+            <w:pPr>
+              <w:pStyle w:val="Compact"/>
+              <w:jc w:val="left"/>
+            </w:pPr>
+            <w:r>
+              <w:t xml:space="preserve">1.0</w:t>
+            </w:r>
+          </w:p>
+        </w:tc>
+        <w:tc>
+          <w:p>
+            <w:pPr>
+              <w:pStyle w:val="Compact"/>
+              <w:jc w:val="left"/>
+            </w:pPr>
+            <w:r>
+              <w:t xml:space="preserve">0.0</w:t>
+            </w:r>
+          </w:p>
+        </w:tc>
+        <w:tc>
+          <w:p>
+            <w:pPr>
+              <w:pStyle w:val="Compact"/>
+              <w:jc w:val="left"/>
+            </w:pPr>
+            <w:r>
+              <w:t xml:space="preserve">0</w:t>
+            </w:r>
+          </w:p>
+        </w:tc>
+        <w:tc>
+          <w:p>
+            <w:pPr>
+              <w:pStyle w:val="Compact"/>
+              <w:jc w:val="left"/>
+            </w:pPr>
+            <w:r>
+              <w:t xml:space="preserve">-</w:t>
+            </w:r>
+          </w:p>
+        </w:tc>
+        <w:tc>
+          <w:p>
+            <w:pPr>
+              <w:pStyle w:val="Compact"/>
+              <w:jc w:val="left"/>
+            </w:pPr>
+            <w:r>
+              <w:t xml:space="preserve">No config change: confirmation run (after the two disclosed eval-side calibrations)</w:t>
+            </w:r>
+          </w:p>
+        </w:tc>
+      </w:tr>
+      <w:tr>
+        <w:tc>
+          <w:p>
+            <w:pPr>
+              <w:pStyle w:val="Compact"/>
+              <w:jc w:val="left"/>
+            </w:pPr>
+            <w:r>
+              <w:t xml:space="preserve">9</w:t>
+            </w:r>
+          </w:p>
+        </w:tc>
+        <w:tc>
+          <w:p>
+            <w:pPr>
+              <w:pStyle w:val="Compact"/>
+              <w:jc w:val="left"/>
+            </w:pPr>
+            <w:r>
+              <w:t xml:space="preserve">v1.3 replay (40)</w:t>
+            </w:r>
+          </w:p>
+        </w:tc>
+        <w:tc>
+          <w:p>
+            <w:pPr>
+              <w:pStyle w:val="Compact"/>
+              <w:jc w:val="left"/>
+            </w:pPr>
+            <w:r>
+              <w:t xml:space="preserve">judge-v4</w:t>
+            </w:r>
+          </w:p>
+        </w:tc>
+        <w:tc>
+          <w:p>
+            <w:pPr>
+              <w:pStyle w:val="Compact"/>
+              <w:jc w:val="left"/>
+            </w:pPr>
+            <w:r>
+              <w:t xml:space="preserve">0.975</w:t>
+            </w:r>
+          </w:p>
+        </w:tc>
+        <w:tc>
+          <w:p>
+            <w:pPr>
+              <w:pStyle w:val="Compact"/>
+              <w:jc w:val="left"/>
+            </w:pPr>
+            <w:r>
+              <w:t xml:space="preserve">0.955</w:t>
+            </w:r>
+          </w:p>
+        </w:tc>
+        <w:tc>
+          <w:p>
+            <w:pPr>
+              <w:pStyle w:val="Compact"/>
+              <w:jc w:val="left"/>
+            </w:pPr>
+            <w:r>
+              <w:t xml:space="preserve">1.0</w:t>
+            </w:r>
+          </w:p>
+        </w:tc>
+        <w:tc>
+          <w:p>
+            <w:pPr>
+              <w:pStyle w:val="Compact"/>
+              <w:jc w:val="left"/>
+            </w:pPr>
+            <w:r>
+              <w:t xml:space="preserve">0.955</w:t>
+            </w:r>
+          </w:p>
+        </w:tc>
+        <w:tc>
+          <w:p>
+            <w:pPr>
+              <w:pStyle w:val="Compact"/>
+              <w:jc w:val="left"/>
+            </w:pPr>
+            <w:r>
+              <w:t xml:space="preserve">1.0</w:t>
+            </w:r>
+          </w:p>
+        </w:tc>
+        <w:tc>
+          <w:p>
+            <w:pPr>
+              <w:pStyle w:val="Compact"/>
+              <w:jc w:val="left"/>
+            </w:pPr>
+            <w:r>
+              <w:t xml:space="preserve">0.0</w:t>
+            </w:r>
+          </w:p>
+        </w:tc>
+        <w:tc>
+          <w:p>
+            <w:pPr>
+              <w:pStyle w:val="Compact"/>
+              <w:jc w:val="left"/>
+            </w:pPr>
+            <w:r>
+              <w:t xml:space="preserve">0</w:t>
+            </w:r>
+          </w:p>
+        </w:tc>
+        <w:tc>
+          <w:p>
+            <w:pPr>
+              <w:pStyle w:val="Compact"/>
+              <w:jc w:val="left"/>
+            </w:pPr>
+            <w:r>
+              <w:t xml:space="preserve">1/22</w:t>
+            </w:r>
+          </w:p>
+        </w:tc>
+        <w:tc>
+          <w:p>
+            <w:pPr>
+              <w:pStyle w:val="Compact"/>
+              <w:jc w:val="left"/>
+            </w:pPr>
+            <w:r>
+              <w:t xml:space="preserve">Judge-only replay of run 7’s frozen transcripts; judge-v4 adds side-claims rubric</w:t>
+            </w:r>
+          </w:p>
+        </w:tc>
+      </w:tr>
+      <w:tr>
+        <w:tc>
+          <w:p>
+            <w:pPr>
+              <w:pStyle w:val="Compact"/>
+              <w:jc w:val="left"/>
+            </w:pPr>
+            <w:r>
+              <w:t xml:space="preserve">10</w:t>
+            </w:r>
+          </w:p>
+        </w:tc>
+        <w:tc>
+          <w:p>
+            <w:pPr>
+              <w:pStyle w:val="Compact"/>
+              <w:jc w:val="left"/>
+            </w:pPr>
+            <w:r>
+              <w:t xml:space="preserve">v1.3 replay (40)</w:t>
+            </w:r>
+          </w:p>
+        </w:tc>
+        <w:tc>
+          <w:p>
+            <w:pPr>
+              <w:pStyle w:val="Compact"/>
+              <w:jc w:val="left"/>
+            </w:pPr>
+            <w:r>
+              <w:t xml:space="preserve">judge-v4</w:t>
+            </w:r>
+          </w:p>
+        </w:tc>
+        <w:tc>
+          <w:p>
+            <w:pPr>
+              <w:pStyle w:val="Compact"/>
+              <w:jc w:val="left"/>
+            </w:pPr>
+            <w:r>
+              <w:rPr>
+                <w:b/>
+              </w:rPr>
+              <w:t xml:space="preserve">1.0</w:t>
+            </w:r>
+          </w:p>
+        </w:tc>
+        <w:tc>
+          <w:p>
+            <w:pPr>
+              <w:pStyle w:val="Compact"/>
+              <w:jc w:val="left"/>
+            </w:pPr>
+            <w:r>
+              <w:t xml:space="preserve">0.955</w:t>
+            </w:r>
+          </w:p>
+        </w:tc>
+        <w:tc>
+          <w:p>
+            <w:pPr>
+              <w:pStyle w:val="Compact"/>
+              <w:jc w:val="left"/>
+            </w:pPr>
+            <w:r>
+              <w:t xml:space="preserve">1.0</w:t>
+            </w:r>
+          </w:p>
+        </w:tc>
+        <w:tc>
+          <w:p>
+            <w:pPr>
+              <w:pStyle w:val="Compact"/>
+              <w:jc w:val="left"/>
+            </w:pPr>
+            <w:r>
+              <w:t xml:space="preserve">0.952</w:t>
+            </w:r>
+          </w:p>
+        </w:tc>
+        <w:tc>
+          <w:p>
+            <w:pPr>
+              <w:pStyle w:val="Compact"/>
+              <w:jc w:val="left"/>
+            </w:pPr>
+            <w:r>
+              <w:t xml:space="preserve">1.0</w:t>
+            </w:r>
+          </w:p>
+        </w:tc>
+        <w:tc>
+          <w:p>
+            <w:pPr>
+              <w:pStyle w:val="Compact"/>
+              <w:jc w:val="left"/>
+            </w:pPr>
+            <w:r>
+              <w:t xml:space="preserve">0.0</w:t>
+            </w:r>
+          </w:p>
+        </w:tc>
+        <w:tc>
+          <w:p>
+            <w:pPr>
+              <w:pStyle w:val="Compact"/>
+              <w:jc w:val="left"/>
+            </w:pPr>
+            <w:r>
+              <w:t xml:space="preserve">0</w:t>
+            </w:r>
+          </w:p>
+        </w:tc>
+        <w:tc>
+          <w:p>
+            <w:pPr>
+              <w:pStyle w:val="Compact"/>
+              <w:jc w:val="left"/>
+            </w:pPr>
+            <w:r>
+              <w:t xml:space="preserve">1/21</w:t>
+            </w:r>
+          </w:p>
+        </w:tc>
+        <w:tc>
+          <w:p>
+            <w:pPr>
+              <w:pStyle w:val="Compact"/>
+              <w:jc w:val="left"/>
+            </w:pPr>
+            <w:r>
+              <w:t xml:space="preserve">Judge-only replay of run 8’s frozen transcripts</w:t>
+            </w:r>
+          </w:p>
+        </w:tc>
+      </w:tr>
+      <w:tr>
+        <w:tc>
+          <w:p>
+            <w:pPr>
+              <w:pStyle w:val="Compact"/>
+              <w:jc w:val="left"/>
+            </w:pPr>
+            <w:r>
+              <w:t xml:space="preserve">11</w:t>
+            </w:r>
+          </w:p>
+        </w:tc>
+        <w:tc>
+          <w:p>
+            <w:pPr>
+              <w:pStyle w:val="Compact"/>
+              <w:jc w:val="left"/>
+            </w:pPr>
+            <w:r>
+              <w:t xml:space="preserve">v1.4 cite (40)</w:t>
+            </w:r>
+          </w:p>
+        </w:tc>
+        <w:tc>
+          <w:p>
+            <w:pPr>
+              <w:pStyle w:val="Compact"/>
+              <w:jc w:val="left"/>
+            </w:pPr>
+            <w:r>
+              <w:t xml:space="preserve">judge-v5</w:t>
+            </w:r>
+          </w:p>
+        </w:tc>
+        <w:tc>
+          <w:p>
+            <w:pPr>
+              <w:pStyle w:val="Compact"/>
+              <w:jc w:val="left"/>
+            </w:pPr>
+            <w:r>
+              <w:rPr>
+                <w:b/>
+              </w:rPr>
+              <w:t xml:space="preserve">1.0</w:t>
+            </w:r>
+          </w:p>
+        </w:tc>
+        <w:tc>
+          <w:p>
+            <w:pPr>
+              <w:pStyle w:val="Compact"/>
+              <w:jc w:val="left"/>
+            </w:pPr>
+            <w:r>
+              <w:t xml:space="preserve">0.955</w:t>
+            </w:r>
+          </w:p>
+        </w:tc>
+        <w:tc>
+          <w:p>
+            <w:pPr>
+              <w:pStyle w:val="Compact"/>
+              <w:jc w:val="left"/>
+            </w:pPr>
+            <w:r>
+              <w:t xml:space="preserve">1.0</w:t>
+            </w:r>
+          </w:p>
+        </w:tc>
+        <w:tc>
+          <w:p>
+            <w:pPr>
+              <w:pStyle w:val="Compact"/>
+              <w:jc w:val="left"/>
+            </w:pPr>
+            <w:r>
+              <w:t xml:space="preserve">0.952</w:t>
+            </w:r>
+          </w:p>
+        </w:tc>
+        <w:tc>
+          <w:p>
+            <w:pPr>
+              <w:pStyle w:val="Compact"/>
+              <w:jc w:val="left"/>
+            </w:pPr>
+            <w:r>
+              <w:t xml:space="preserve">1.0</w:t>
+            </w:r>
+          </w:p>
+        </w:tc>
+        <w:tc>
+          <w:p>
+            <w:pPr>
+              <w:pStyle w:val="Compact"/>
+              <w:jc w:val="left"/>
+            </w:pPr>
+            <w:r>
+              <w:t xml:space="preserve">0.0</w:t>
+            </w:r>
+          </w:p>
+        </w:tc>
+        <w:tc>
+          <w:p>
+            <w:pPr>
+              <w:pStyle w:val="Compact"/>
+              <w:jc w:val="left"/>
+            </w:pPr>
+            <w:r>
+              <w:t xml:space="preserve">0</w:t>
+            </w:r>
+          </w:p>
+        </w:tc>
+        <w:tc>
+          <w:p>
+            <w:pPr>
+              <w:pStyle w:val="Compact"/>
+              <w:jc w:val="left"/>
+            </w:pPr>
+            <w:r>
+              <w:rPr>
+                <w:b/>
+              </w:rPr>
+              <w:t xml:space="preserve">0/21</w:t>
+            </w:r>
+          </w:p>
+        </w:tc>
+        <w:tc>
+          <w:p>
+            <w:pPr>
+              <w:pStyle w:val="Compact"/>
+              <w:jc w:val="left"/>
+            </w:pPr>
+            <w:r>
+              <w:t xml:space="preserve">Cite mode: citation instructions appended (default prompt unchanged); judge-v5 = v4 + citation rubrics. Citation coverage 1.0, zero invented/misattributed</w:t>
+            </w:r>
+          </w:p>
+        </w:tc>
+      </w:tr>
+    </w:tbl>
+    <w:p>
+      <w:pPr>
+        <w:pStyle w:val="BodyText"/>
+      </w:pPr>
+      <w:r>
+        <w:t xml:space="preserve">Column notes: Pass = verdict</w:t>
+      </w:r>
+      <w:r>
+        <w:t xml:space="preserve"> </w:t>
+      </w:r>
+      <w:r>
+        <w:rPr>
+          <w:rStyle w:val="VerbatimChar"/>
+        </w:rPr>
+        <w:t xml:space="preserve">correct</w:t>
+      </w:r>
+      <w:r>
+        <w:t xml:space="preserve"> </w:t>
+      </w:r>
+      <w:r>
+        <w:t xml:space="preserve">or appropriate</w:t>
+      </w:r>
+      <w:r>
+        <w:t xml:space="preserve"> </w:t>
+      </w:r>
+      <w:r>
+        <w:rPr>
+          <w:rStyle w:val="VerbatimChar"/>
+        </w:rPr>
+        <w:t xml:space="preserve">honest_abstention</w:t>
+      </w:r>
+      <w:r>
+        <w:t xml:space="preserve">;</w:t>
+      </w:r>
+      <w:r>
+        <w:t xml:space="preserve"> </w:t>
+      </w:r>
+      <w:r>
+        <w:t xml:space="preserve">Recall/Prec. = search decision vs</w:t>
+      </w:r>
+      <w:r>
+        <w:t xml:space="preserve"> </w:t>
+      </w:r>
+      <w:r>
+        <w:rPr>
+          <w:rStyle w:val="VerbatimChar"/>
+        </w:rPr>
+        <w:t xml:space="preserve">expect_search</w:t>
+      </w:r>
+      <w:r>
+        <w:t xml:space="preserve"> </w:t>
+      </w:r>
+      <w:r>
+        <w:t xml:space="preserve">(optional cases</w:t>
+      </w:r>
+      <w:r>
+        <w:t xml:space="preserve"> </w:t>
+      </w:r>
+      <w:r>
+        <w:t xml:space="preserve">excluded); Evid. suff. and Right art. over searched cases (run 3’s dips</w:t>
+      </w:r>
+      <w:r>
+        <w:t xml:space="preserve"> </w:t>
+      </w:r>
+      <w:r>
+        <w:t xml:space="preserve">are the 429 outage; runs 7-11 include the by-design dead-end case mh-08,</w:t>
+      </w:r>
+      <w:r>
+        <w:t xml:space="preserve"> </w:t>
+      </w:r>
+      <w:r>
+        <w:t xml:space="preserve">which caps sufficiency at 0.95); Unfaithful = count of searched answers</w:t>
+      </w:r>
+      <w:r>
+        <w:t xml:space="preserve"> </w:t>
+      </w:r>
+      <w:r>
+        <w:t xml:space="preserve">whose key claim exceeded the evidence; Side claims = searched answers with</w:t>
+      </w:r>
+      <w:r>
+        <w:t xml:space="preserve"> </w:t>
+      </w:r>
+      <w:r>
+        <w:t xml:space="preserve">unsupported side details (judge-v4+ only). Later prompt refinements</w:t>
+      </w:r>
+      <w:r>
+        <w:t xml:space="preserve"> </w:t>
+      </w:r>
+      <w:r>
+        <w:t xml:space="preserve">(v1.5/v1.5.1: claim-level citation placement, one source title per line)</w:t>
+      </w:r>
+      <w:r>
+        <w:t xml:space="preserve"> </w:t>
+      </w:r>
+      <w:r>
+        <w:t xml:space="preserve">shipped after run 11 and changed cite-mode output formatting only; they</w:t>
+      </w:r>
+      <w:r>
+        <w:t xml:space="preserve"> </w:t>
+      </w:r>
+      <w:r>
+        <w:t xml:space="preserve">were verified on the live demo rather than by a full re-run.</w:t>
       </w:r>
     </w:p>
     <w:sectPr/>

</xml_diff>

<commit_message>
RATIONALE: split appendix into metrics table (A1) and change log (A2)
A1 carries the eleven runs' metrics only; A2 gives per-run prompt, tool,
and judge/suite changes in separate columns, making config changes vs
suite changes vs grading changes explicit. Docx regenerated.

Co-Authored-By: Claude Fable 5 <noreply@anthropic.com>
</commit_message>
<xml_diff>
--- a/RATIONALE.docx
+++ b/RATIONALE.docx
@@ -4292,6 +4292,16 @@
         <w:t xml:space="preserve">metric was added in run 4’s harness.</w:t>
       </w:r>
     </w:p>
+    <w:p>
+      <w:pPr>
+        <w:pStyle w:val="Heading3"/>
+      </w:pPr>
+      <w:bookmarkStart w:id="34" w:name="table-a1-metrics-per-run"/>
+      <w:r>
+        <w:t xml:space="preserve">Table A1: Metrics per run</w:t>
+      </w:r>
+      <w:bookmarkEnd w:id="34"/>
+    </w:p>
     <w:tbl>
       <w:tblPr>
         <w:tblStyle w:val="Table"/>
@@ -4299,18 +4309,17 @@
         <w:tblLook w:firstRow="1"/>
       </w:tblPr>
       <w:tblGrid>
-        <w:gridCol w:w="660"/>
-        <w:gridCol w:w="660"/>
-        <w:gridCol w:w="660"/>
-        <w:gridCol w:w="660"/>
-        <w:gridCol w:w="660"/>
-        <w:gridCol w:w="660"/>
-        <w:gridCol w:w="660"/>
-        <w:gridCol w:w="660"/>
-        <w:gridCol w:w="660"/>
-        <w:gridCol w:w="660"/>
-        <w:gridCol w:w="660"/>
-        <w:gridCol w:w="660"/>
+        <w:gridCol w:w="719"/>
+        <w:gridCol w:w="719"/>
+        <w:gridCol w:w="719"/>
+        <w:gridCol w:w="719"/>
+        <w:gridCol w:w="719"/>
+        <w:gridCol w:w="719"/>
+        <w:gridCol w:w="719"/>
+        <w:gridCol w:w="719"/>
+        <w:gridCol w:w="719"/>
+        <w:gridCol w:w="719"/>
+        <w:gridCol w:w="719"/>
       </w:tblGrid>
       <w:tr>
         <w:trPr>
@@ -4503,6 +4512,1500 @@
             </w:r>
           </w:p>
         </w:tc>
+      </w:tr>
+      <w:tr>
+        <w:tc>
+          <w:p>
+            <w:pPr>
+              <w:pStyle w:val="Compact"/>
+              <w:jc w:val="left"/>
+            </w:pPr>
+            <w:r>
+              <w:t xml:space="preserve">1</w:t>
+            </w:r>
+          </w:p>
+        </w:tc>
+        <w:tc>
+          <w:p>
+            <w:pPr>
+              <w:pStyle w:val="Compact"/>
+              <w:jc w:val="left"/>
+            </w:pPr>
+            <w:r>
+              <w:t xml:space="preserve">v0 (32)</w:t>
+            </w:r>
+          </w:p>
+        </w:tc>
+        <w:tc>
+          <w:p>
+            <w:pPr>
+              <w:pStyle w:val="Compact"/>
+              <w:jc w:val="left"/>
+            </w:pPr>
+            <w:r>
+              <w:t xml:space="preserve">pre-rubric</w:t>
+            </w:r>
+          </w:p>
+        </w:tc>
+        <w:tc>
+          <w:p>
+            <w:pPr>
+              <w:pStyle w:val="Compact"/>
+              <w:jc w:val="left"/>
+            </w:pPr>
+            <w:r>
+              <w:t xml:space="preserve">0.938</w:t>
+            </w:r>
+          </w:p>
+        </w:tc>
+        <w:tc>
+          <w:p>
+            <w:pPr>
+              <w:pStyle w:val="Compact"/>
+              <w:jc w:val="left"/>
+            </w:pPr>
+            <w:r>
+              <w:t xml:space="preserve">0.333</w:t>
+            </w:r>
+          </w:p>
+        </w:tc>
+        <w:tc>
+          <w:p>
+            <w:pPr>
+              <w:pStyle w:val="Compact"/>
+              <w:jc w:val="left"/>
+            </w:pPr>
+            <w:r>
+              <w:t xml:space="preserve">1.0</w:t>
+            </w:r>
+          </w:p>
+        </w:tc>
+        <w:tc>
+          <w:p>
+            <w:pPr>
+              <w:pStyle w:val="Compact"/>
+              <w:jc w:val="left"/>
+            </w:pPr>
+            <w:r>
+              <w:t xml:space="preserve">-</w:t>
+            </w:r>
+          </w:p>
+        </w:tc>
+        <w:tc>
+          <w:p>
+            <w:pPr>
+              <w:pStyle w:val="Compact"/>
+              <w:jc w:val="left"/>
+            </w:pPr>
+            <w:r>
+              <w:t xml:space="preserve">-</w:t>
+            </w:r>
+          </w:p>
+        </w:tc>
+        <w:tc>
+          <w:p>
+            <w:pPr>
+              <w:pStyle w:val="Compact"/>
+              <w:jc w:val="left"/>
+            </w:pPr>
+            <w:r>
+              <w:t xml:space="preserve">0.0</w:t>
+            </w:r>
+          </w:p>
+        </w:tc>
+        <w:tc>
+          <w:p>
+            <w:pPr>
+              <w:pStyle w:val="Compact"/>
+              <w:jc w:val="left"/>
+            </w:pPr>
+            <w:r>
+              <w:t xml:space="preserve">-</w:t>
+            </w:r>
+          </w:p>
+        </w:tc>
+        <w:tc>
+          <w:p>
+            <w:pPr>
+              <w:pStyle w:val="Compact"/>
+              <w:jc w:val="left"/>
+            </w:pPr>
+            <w:r>
+              <w:t xml:space="preserve">-</w:t>
+            </w:r>
+          </w:p>
+        </w:tc>
+      </w:tr>
+      <w:tr>
+        <w:tc>
+          <w:p>
+            <w:pPr>
+              <w:pStyle w:val="Compact"/>
+              <w:jc w:val="left"/>
+            </w:pPr>
+            <w:r>
+              <w:t xml:space="preserve">2</w:t>
+            </w:r>
+          </w:p>
+        </w:tc>
+        <w:tc>
+          <w:p>
+            <w:pPr>
+              <w:pStyle w:val="Compact"/>
+              <w:jc w:val="left"/>
+            </w:pPr>
+            <w:r>
+              <w:t xml:space="preserve">v0 (32)</w:t>
+            </w:r>
+          </w:p>
+        </w:tc>
+        <w:tc>
+          <w:p>
+            <w:pPr>
+              <w:pStyle w:val="Compact"/>
+              <w:jc w:val="left"/>
+            </w:pPr>
+            <w:r>
+              <w:t xml:space="preserve">judge-v1</w:t>
+            </w:r>
+          </w:p>
+        </w:tc>
+        <w:tc>
+          <w:p>
+            <w:pPr>
+              <w:pStyle w:val="Compact"/>
+              <w:jc w:val="left"/>
+            </w:pPr>
+            <w:r>
+              <w:t xml:space="preserve">0.969</w:t>
+            </w:r>
+          </w:p>
+        </w:tc>
+        <w:tc>
+          <w:p>
+            <w:pPr>
+              <w:pStyle w:val="Compact"/>
+              <w:jc w:val="left"/>
+            </w:pPr>
+            <w:r>
+              <w:t xml:space="preserve">0.333</w:t>
+            </w:r>
+          </w:p>
+        </w:tc>
+        <w:tc>
+          <w:p>
+            <w:pPr>
+              <w:pStyle w:val="Compact"/>
+              <w:jc w:val="left"/>
+            </w:pPr>
+            <w:r>
+              <w:t xml:space="preserve">1.0</w:t>
+            </w:r>
+          </w:p>
+        </w:tc>
+        <w:tc>
+          <w:p>
+            <w:pPr>
+              <w:pStyle w:val="Compact"/>
+              <w:jc w:val="left"/>
+            </w:pPr>
+            <w:r>
+              <w:t xml:space="preserve">0.80</w:t>
+            </w:r>
+          </w:p>
+        </w:tc>
+        <w:tc>
+          <w:p>
+            <w:pPr>
+              <w:pStyle w:val="Compact"/>
+              <w:jc w:val="left"/>
+            </w:pPr>
+            <w:r>
+              <w:t xml:space="preserve">1.0</w:t>
+            </w:r>
+          </w:p>
+        </w:tc>
+        <w:tc>
+          <w:p>
+            <w:pPr>
+              <w:pStyle w:val="Compact"/>
+              <w:jc w:val="left"/>
+            </w:pPr>
+            <w:r>
+              <w:t xml:space="preserve">0.0</w:t>
+            </w:r>
+          </w:p>
+        </w:tc>
+        <w:tc>
+          <w:p>
+            <w:pPr>
+              <w:pStyle w:val="Compact"/>
+              <w:jc w:val="left"/>
+            </w:pPr>
+            <w:r>
+              <w:t xml:space="preserve">1</w:t>
+            </w:r>
+          </w:p>
+        </w:tc>
+        <w:tc>
+          <w:p>
+            <w:pPr>
+              <w:pStyle w:val="Compact"/>
+              <w:jc w:val="left"/>
+            </w:pPr>
+            <w:r>
+              <w:t xml:space="preserve">-</w:t>
+            </w:r>
+          </w:p>
+        </w:tc>
+      </w:tr>
+      <w:tr>
+        <w:tc>
+          <w:p>
+            <w:pPr>
+              <w:pStyle w:val="Compact"/>
+              <w:jc w:val="left"/>
+            </w:pPr>
+            <w:r>
+              <w:t xml:space="preserve">3</w:t>
+            </w:r>
+          </w:p>
+        </w:tc>
+        <w:tc>
+          <w:p>
+            <w:pPr>
+              <w:pStyle w:val="Compact"/>
+              <w:jc w:val="left"/>
+            </w:pPr>
+            <w:r>
+              <w:t xml:space="preserve">v1 (32)</w:t>
+            </w:r>
+          </w:p>
+        </w:tc>
+        <w:tc>
+          <w:p>
+            <w:pPr>
+              <w:pStyle w:val="Compact"/>
+              <w:jc w:val="left"/>
+            </w:pPr>
+            <w:r>
+              <w:t xml:space="preserve">judge-v1</w:t>
+            </w:r>
+          </w:p>
+        </w:tc>
+        <w:tc>
+          <w:p>
+            <w:pPr>
+              <w:pStyle w:val="Compact"/>
+              <w:jc w:val="left"/>
+            </w:pPr>
+            <w:r>
+              <w:t xml:space="preserve">0.969</w:t>
+            </w:r>
+          </w:p>
+        </w:tc>
+        <w:tc>
+          <w:p>
+            <w:pPr>
+              <w:pStyle w:val="Compact"/>
+              <w:jc w:val="left"/>
+            </w:pPr>
+            <w:r>
+              <w:t xml:space="preserve">0.933</w:t>
+            </w:r>
+          </w:p>
+        </w:tc>
+        <w:tc>
+          <w:p>
+            <w:pPr>
+              <w:pStyle w:val="Compact"/>
+              <w:jc w:val="left"/>
+            </w:pPr>
+            <w:r>
+              <w:t xml:space="preserve">1.0</w:t>
+            </w:r>
+          </w:p>
+        </w:tc>
+        <w:tc>
+          <w:p>
+            <w:pPr>
+              <w:pStyle w:val="Compact"/>
+              <w:jc w:val="left"/>
+            </w:pPr>
+            <w:r>
+              <w:t xml:space="preserve">0.80</w:t>
+            </w:r>
+          </w:p>
+        </w:tc>
+        <w:tc>
+          <w:p>
+            <w:pPr>
+              <w:pStyle w:val="Compact"/>
+              <w:jc w:val="left"/>
+            </w:pPr>
+            <w:r>
+              <w:t xml:space="preserve">0.80</w:t>
+            </w:r>
+          </w:p>
+        </w:tc>
+        <w:tc>
+          <w:p>
+            <w:pPr>
+              <w:pStyle w:val="Compact"/>
+              <w:jc w:val="left"/>
+            </w:pPr>
+            <w:r>
+              <w:t xml:space="preserve">0.517</w:t>
+            </w:r>
+          </w:p>
+        </w:tc>
+        <w:tc>
+          <w:p>
+            <w:pPr>
+              <w:pStyle w:val="Compact"/>
+              <w:jc w:val="left"/>
+            </w:pPr>
+            <w:r>
+              <w:t xml:space="preserve">1</w:t>
+            </w:r>
+          </w:p>
+        </w:tc>
+        <w:tc>
+          <w:p>
+            <w:pPr>
+              <w:pStyle w:val="Compact"/>
+              <w:jc w:val="left"/>
+            </w:pPr>
+            <w:r>
+              <w:t xml:space="preserve">-</w:t>
+            </w:r>
+          </w:p>
+        </w:tc>
+      </w:tr>
+      <w:tr>
+        <w:tc>
+          <w:p>
+            <w:pPr>
+              <w:pStyle w:val="Compact"/>
+              <w:jc w:val="left"/>
+            </w:pPr>
+            <w:r>
+              <w:t xml:space="preserve">4</w:t>
+            </w:r>
+          </w:p>
+        </w:tc>
+        <w:tc>
+          <w:p>
+            <w:pPr>
+              <w:pStyle w:val="Compact"/>
+              <w:jc w:val="left"/>
+            </w:pPr>
+            <w:r>
+              <w:t xml:space="preserve">v1.1 (32)</w:t>
+            </w:r>
+          </w:p>
+        </w:tc>
+        <w:tc>
+          <w:p>
+            <w:pPr>
+              <w:pStyle w:val="Compact"/>
+              <w:jc w:val="left"/>
+            </w:pPr>
+            <w:r>
+              <w:t xml:space="preserve">judge-v2</w:t>
+            </w:r>
+          </w:p>
+        </w:tc>
+        <w:tc>
+          <w:p>
+            <w:pPr>
+              <w:pStyle w:val="Compact"/>
+              <w:jc w:val="left"/>
+            </w:pPr>
+            <w:r>
+              <w:t xml:space="preserve">0.969</w:t>
+            </w:r>
+          </w:p>
+        </w:tc>
+        <w:tc>
+          <w:p>
+            <w:pPr>
+              <w:pStyle w:val="Compact"/>
+              <w:jc w:val="left"/>
+            </w:pPr>
+            <w:r>
+              <w:t xml:space="preserve">0.867</w:t>
+            </w:r>
+          </w:p>
+        </w:tc>
+        <w:tc>
+          <w:p>
+            <w:pPr>
+              <w:pStyle w:val="Compact"/>
+              <w:jc w:val="left"/>
+            </w:pPr>
+            <w:r>
+              <w:t xml:space="preserve">1.0</w:t>
+            </w:r>
+          </w:p>
+        </w:tc>
+        <w:tc>
+          <w:p>
+            <w:pPr>
+              <w:pStyle w:val="Compact"/>
+              <w:jc w:val="left"/>
+            </w:pPr>
+            <w:r>
+              <w:t xml:space="preserve">0.846</w:t>
+            </w:r>
+          </w:p>
+        </w:tc>
+        <w:tc>
+          <w:p>
+            <w:pPr>
+              <w:pStyle w:val="Compact"/>
+              <w:jc w:val="left"/>
+            </w:pPr>
+            <w:r>
+              <w:t xml:space="preserve">0.923</w:t>
+            </w:r>
+          </w:p>
+        </w:tc>
+        <w:tc>
+          <w:p>
+            <w:pPr>
+              <w:pStyle w:val="Compact"/>
+              <w:jc w:val="left"/>
+            </w:pPr>
+            <w:r>
+              <w:t xml:space="preserve">0.0</w:t>
+            </w:r>
+          </w:p>
+        </w:tc>
+        <w:tc>
+          <w:p>
+            <w:pPr>
+              <w:pStyle w:val="Compact"/>
+              <w:jc w:val="left"/>
+            </w:pPr>
+            <w:r>
+              <w:t xml:space="preserve">1</w:t>
+            </w:r>
+          </w:p>
+        </w:tc>
+        <w:tc>
+          <w:p>
+            <w:pPr>
+              <w:pStyle w:val="Compact"/>
+              <w:jc w:val="left"/>
+            </w:pPr>
+            <w:r>
+              <w:t xml:space="preserve">-</w:t>
+            </w:r>
+          </w:p>
+        </w:tc>
+      </w:tr>
+      <w:tr>
+        <w:tc>
+          <w:p>
+            <w:pPr>
+              <w:pStyle w:val="Compact"/>
+              <w:jc w:val="left"/>
+            </w:pPr>
+            <w:r>
+              <w:t xml:space="preserve">5</w:t>
+            </w:r>
+          </w:p>
+        </w:tc>
+        <w:tc>
+          <w:p>
+            <w:pPr>
+              <w:pStyle w:val="Compact"/>
+              <w:jc w:val="left"/>
+            </w:pPr>
+            <w:r>
+              <w:t xml:space="preserve">v1.2 (32)</w:t>
+            </w:r>
+          </w:p>
+        </w:tc>
+        <w:tc>
+          <w:p>
+            <w:pPr>
+              <w:pStyle w:val="Compact"/>
+              <w:jc w:val="left"/>
+            </w:pPr>
+            <w:r>
+              <w:t xml:space="preserve">judge-v2</w:t>
+            </w:r>
+          </w:p>
+        </w:tc>
+        <w:tc>
+          <w:p>
+            <w:pPr>
+              <w:pStyle w:val="Compact"/>
+              <w:jc w:val="left"/>
+            </w:pPr>
+            <w:r>
+              <w:rPr>
+                <w:b/>
+              </w:rPr>
+              <w:t xml:space="preserve">1.0</w:t>
+            </w:r>
+          </w:p>
+        </w:tc>
+        <w:tc>
+          <w:p>
+            <w:pPr>
+              <w:pStyle w:val="Compact"/>
+              <w:jc w:val="left"/>
+            </w:pPr>
+            <w:r>
+              <w:t xml:space="preserve">0.867</w:t>
+            </w:r>
+          </w:p>
+        </w:tc>
+        <w:tc>
+          <w:p>
+            <w:pPr>
+              <w:pStyle w:val="Compact"/>
+              <w:jc w:val="left"/>
+            </w:pPr>
+            <w:r>
+              <w:t xml:space="preserve">1.0</w:t>
+            </w:r>
+          </w:p>
+        </w:tc>
+        <w:tc>
+          <w:p>
+            <w:pPr>
+              <w:pStyle w:val="Compact"/>
+              <w:jc w:val="left"/>
+            </w:pPr>
+            <w:r>
+              <w:rPr>
+                <w:b/>
+              </w:rPr>
+              <w:t xml:space="preserve">1.0</w:t>
+            </w:r>
+          </w:p>
+        </w:tc>
+        <w:tc>
+          <w:p>
+            <w:pPr>
+              <w:pStyle w:val="Compact"/>
+              <w:jc w:val="left"/>
+            </w:pPr>
+            <w:r>
+              <w:rPr>
+                <w:b/>
+              </w:rPr>
+              <w:t xml:space="preserve">1.0</w:t>
+            </w:r>
+          </w:p>
+        </w:tc>
+        <w:tc>
+          <w:p>
+            <w:pPr>
+              <w:pStyle w:val="Compact"/>
+              <w:jc w:val="left"/>
+            </w:pPr>
+            <w:r>
+              <w:t xml:space="preserve">0.0</w:t>
+            </w:r>
+          </w:p>
+        </w:tc>
+        <w:tc>
+          <w:p>
+            <w:pPr>
+              <w:pStyle w:val="Compact"/>
+              <w:jc w:val="left"/>
+            </w:pPr>
+            <w:r>
+              <w:t xml:space="preserve">0</w:t>
+            </w:r>
+          </w:p>
+        </w:tc>
+        <w:tc>
+          <w:p>
+            <w:pPr>
+              <w:pStyle w:val="Compact"/>
+              <w:jc w:val="left"/>
+            </w:pPr>
+            <w:r>
+              <w:t xml:space="preserve">-</w:t>
+            </w:r>
+          </w:p>
+        </w:tc>
+      </w:tr>
+      <w:tr>
+        <w:tc>
+          <w:p>
+            <w:pPr>
+              <w:pStyle w:val="Compact"/>
+              <w:jc w:val="left"/>
+            </w:pPr>
+            <w:r>
+              <w:t xml:space="preserve">6</w:t>
+            </w:r>
+          </w:p>
+        </w:tc>
+        <w:tc>
+          <w:p>
+            <w:pPr>
+              <w:pStyle w:val="Compact"/>
+              <w:jc w:val="left"/>
+            </w:pPr>
+            <w:r>
+              <w:t xml:space="preserve">v1.2 (40)</w:t>
+            </w:r>
+          </w:p>
+        </w:tc>
+        <w:tc>
+          <w:p>
+            <w:pPr>
+              <w:pStyle w:val="Compact"/>
+              <w:jc w:val="left"/>
+            </w:pPr>
+            <w:r>
+              <w:t xml:space="preserve">judge-v2</w:t>
+            </w:r>
+          </w:p>
+        </w:tc>
+        <w:tc>
+          <w:p>
+            <w:pPr>
+              <w:pStyle w:val="Compact"/>
+              <w:jc w:val="left"/>
+            </w:pPr>
+            <w:r>
+              <w:t xml:space="preserve">0.975</w:t>
+            </w:r>
+          </w:p>
+        </w:tc>
+        <w:tc>
+          <w:p>
+            <w:pPr>
+              <w:pStyle w:val="Compact"/>
+              <w:jc w:val="left"/>
+            </w:pPr>
+            <w:r>
+              <w:t xml:space="preserve">0.955</w:t>
+            </w:r>
+          </w:p>
+        </w:tc>
+        <w:tc>
+          <w:p>
+            <w:pPr>
+              <w:pStyle w:val="Compact"/>
+              <w:jc w:val="left"/>
+            </w:pPr>
+            <w:r>
+              <w:t xml:space="preserve">1.0</w:t>
+            </w:r>
+          </w:p>
+        </w:tc>
+        <w:tc>
+          <w:p>
+            <w:pPr>
+              <w:pStyle w:val="Compact"/>
+              <w:jc w:val="left"/>
+            </w:pPr>
+            <w:r>
+              <w:t xml:space="preserve">0.857</w:t>
+            </w:r>
+          </w:p>
+        </w:tc>
+        <w:tc>
+          <w:p>
+            <w:pPr>
+              <w:pStyle w:val="Compact"/>
+              <w:jc w:val="left"/>
+            </w:pPr>
+            <w:r>
+              <w:t xml:space="preserve">1.0</w:t>
+            </w:r>
+          </w:p>
+        </w:tc>
+        <w:tc>
+          <w:p>
+            <w:pPr>
+              <w:pStyle w:val="Compact"/>
+              <w:jc w:val="left"/>
+            </w:pPr>
+            <w:r>
+              <w:t xml:space="preserve">0.0</w:t>
+            </w:r>
+          </w:p>
+        </w:tc>
+        <w:tc>
+          <w:p>
+            <w:pPr>
+              <w:pStyle w:val="Compact"/>
+              <w:jc w:val="left"/>
+            </w:pPr>
+            <w:r>
+              <w:t xml:space="preserve">1</w:t>
+            </w:r>
+          </w:p>
+        </w:tc>
+        <w:tc>
+          <w:p>
+            <w:pPr>
+              <w:pStyle w:val="Compact"/>
+              <w:jc w:val="left"/>
+            </w:pPr>
+            <w:r>
+              <w:t xml:space="preserve">-</w:t>
+            </w:r>
+          </w:p>
+        </w:tc>
+      </w:tr>
+      <w:tr>
+        <w:tc>
+          <w:p>
+            <w:pPr>
+              <w:pStyle w:val="Compact"/>
+              <w:jc w:val="left"/>
+            </w:pPr>
+            <w:r>
+              <w:t xml:space="preserve">7</w:t>
+            </w:r>
+          </w:p>
+        </w:tc>
+        <w:tc>
+          <w:p>
+            <w:pPr>
+              <w:pStyle w:val="Compact"/>
+              <w:jc w:val="left"/>
+            </w:pPr>
+            <w:r>
+              <w:t xml:space="preserve">v1.3 (40)</w:t>
+            </w:r>
+          </w:p>
+        </w:tc>
+        <w:tc>
+          <w:p>
+            <w:pPr>
+              <w:pStyle w:val="Compact"/>
+              <w:jc w:val="left"/>
+            </w:pPr>
+            <w:r>
+              <w:t xml:space="preserve">judge-v2</w:t>
+            </w:r>
+          </w:p>
+        </w:tc>
+        <w:tc>
+          <w:p>
+            <w:pPr>
+              <w:pStyle w:val="Compact"/>
+              <w:jc w:val="left"/>
+            </w:pPr>
+            <w:r>
+              <w:t xml:space="preserve">0.975</w:t>
+            </w:r>
+          </w:p>
+        </w:tc>
+        <w:tc>
+          <w:p>
+            <w:pPr>
+              <w:pStyle w:val="Compact"/>
+              <w:jc w:val="left"/>
+            </w:pPr>
+            <w:r>
+              <w:t xml:space="preserve">0.955</w:t>
+            </w:r>
+          </w:p>
+        </w:tc>
+        <w:tc>
+          <w:p>
+            <w:pPr>
+              <w:pStyle w:val="Compact"/>
+              <w:jc w:val="left"/>
+            </w:pPr>
+            <w:r>
+              <w:t xml:space="preserve">1.0</w:t>
+            </w:r>
+          </w:p>
+        </w:tc>
+        <w:tc>
+          <w:p>
+            <w:pPr>
+              <w:pStyle w:val="Compact"/>
+              <w:jc w:val="left"/>
+            </w:pPr>
+            <w:r>
+              <w:t xml:space="preserve">0.955</w:t>
+            </w:r>
+          </w:p>
+        </w:tc>
+        <w:tc>
+          <w:p>
+            <w:pPr>
+              <w:pStyle w:val="Compact"/>
+              <w:jc w:val="left"/>
+            </w:pPr>
+            <w:r>
+              <w:t xml:space="preserve">1.0</w:t>
+            </w:r>
+          </w:p>
+        </w:tc>
+        <w:tc>
+          <w:p>
+            <w:pPr>
+              <w:pStyle w:val="Compact"/>
+              <w:jc w:val="left"/>
+            </w:pPr>
+            <w:r>
+              <w:t xml:space="preserve">0.0</w:t>
+            </w:r>
+          </w:p>
+        </w:tc>
+        <w:tc>
+          <w:p>
+            <w:pPr>
+              <w:pStyle w:val="Compact"/>
+              <w:jc w:val="left"/>
+            </w:pPr>
+            <w:r>
+              <w:t xml:space="preserve">0</w:t>
+            </w:r>
+          </w:p>
+        </w:tc>
+        <w:tc>
+          <w:p>
+            <w:pPr>
+              <w:pStyle w:val="Compact"/>
+              <w:jc w:val="left"/>
+            </w:pPr>
+            <w:r>
+              <w:t xml:space="preserve">-</w:t>
+            </w:r>
+          </w:p>
+        </w:tc>
+      </w:tr>
+      <w:tr>
+        <w:tc>
+          <w:p>
+            <w:pPr>
+              <w:pStyle w:val="Compact"/>
+              <w:jc w:val="left"/>
+            </w:pPr>
+            <w:r>
+              <w:t xml:space="preserve">8</w:t>
+            </w:r>
+          </w:p>
+        </w:tc>
+        <w:tc>
+          <w:p>
+            <w:pPr>
+              <w:pStyle w:val="Compact"/>
+              <w:jc w:val="left"/>
+            </w:pPr>
+            <w:r>
+              <w:t xml:space="preserve">v1.3 (40)</w:t>
+            </w:r>
+          </w:p>
+        </w:tc>
+        <w:tc>
+          <w:p>
+            <w:pPr>
+              <w:pStyle w:val="Compact"/>
+              <w:jc w:val="left"/>
+            </w:pPr>
+            <w:r>
+              <w:t xml:space="preserve">judge-v2</w:t>
+            </w:r>
+          </w:p>
+        </w:tc>
+        <w:tc>
+          <w:p>
+            <w:pPr>
+              <w:pStyle w:val="Compact"/>
+              <w:jc w:val="left"/>
+            </w:pPr>
+            <w:r>
+              <w:rPr>
+                <w:b/>
+              </w:rPr>
+              <w:t xml:space="preserve">1.0</w:t>
+            </w:r>
+          </w:p>
+        </w:tc>
+        <w:tc>
+          <w:p>
+            <w:pPr>
+              <w:pStyle w:val="Compact"/>
+              <w:jc w:val="left"/>
+            </w:pPr>
+            <w:r>
+              <w:t xml:space="preserve">0.955</w:t>
+            </w:r>
+          </w:p>
+        </w:tc>
+        <w:tc>
+          <w:p>
+            <w:pPr>
+              <w:pStyle w:val="Compact"/>
+              <w:jc w:val="left"/>
+            </w:pPr>
+            <w:r>
+              <w:t xml:space="preserve">1.0</w:t>
+            </w:r>
+          </w:p>
+        </w:tc>
+        <w:tc>
+          <w:p>
+            <w:pPr>
+              <w:pStyle w:val="Compact"/>
+              <w:jc w:val="left"/>
+            </w:pPr>
+            <w:r>
+              <w:t xml:space="preserve">0.952</w:t>
+            </w:r>
+          </w:p>
+        </w:tc>
+        <w:tc>
+          <w:p>
+            <w:pPr>
+              <w:pStyle w:val="Compact"/>
+              <w:jc w:val="left"/>
+            </w:pPr>
+            <w:r>
+              <w:t xml:space="preserve">1.0</w:t>
+            </w:r>
+          </w:p>
+        </w:tc>
+        <w:tc>
+          <w:p>
+            <w:pPr>
+              <w:pStyle w:val="Compact"/>
+              <w:jc w:val="left"/>
+            </w:pPr>
+            <w:r>
+              <w:t xml:space="preserve">0.0</w:t>
+            </w:r>
+          </w:p>
+        </w:tc>
+        <w:tc>
+          <w:p>
+            <w:pPr>
+              <w:pStyle w:val="Compact"/>
+              <w:jc w:val="left"/>
+            </w:pPr>
+            <w:r>
+              <w:t xml:space="preserve">0</w:t>
+            </w:r>
+          </w:p>
+        </w:tc>
+        <w:tc>
+          <w:p>
+            <w:pPr>
+              <w:pStyle w:val="Compact"/>
+              <w:jc w:val="left"/>
+            </w:pPr>
+            <w:r>
+              <w:t xml:space="preserve">-</w:t>
+            </w:r>
+          </w:p>
+        </w:tc>
+      </w:tr>
+      <w:tr>
+        <w:tc>
+          <w:p>
+            <w:pPr>
+              <w:pStyle w:val="Compact"/>
+              <w:jc w:val="left"/>
+            </w:pPr>
+            <w:r>
+              <w:t xml:space="preserve">9</w:t>
+            </w:r>
+          </w:p>
+        </w:tc>
+        <w:tc>
+          <w:p>
+            <w:pPr>
+              <w:pStyle w:val="Compact"/>
+              <w:jc w:val="left"/>
+            </w:pPr>
+            <w:r>
+              <w:t xml:space="preserve">v1.3 replay (40)</w:t>
+            </w:r>
+          </w:p>
+        </w:tc>
+        <w:tc>
+          <w:p>
+            <w:pPr>
+              <w:pStyle w:val="Compact"/>
+              <w:jc w:val="left"/>
+            </w:pPr>
+            <w:r>
+              <w:t xml:space="preserve">judge-v4</w:t>
+            </w:r>
+          </w:p>
+        </w:tc>
+        <w:tc>
+          <w:p>
+            <w:pPr>
+              <w:pStyle w:val="Compact"/>
+              <w:jc w:val="left"/>
+            </w:pPr>
+            <w:r>
+              <w:t xml:space="preserve">0.975</w:t>
+            </w:r>
+          </w:p>
+        </w:tc>
+        <w:tc>
+          <w:p>
+            <w:pPr>
+              <w:pStyle w:val="Compact"/>
+              <w:jc w:val="left"/>
+            </w:pPr>
+            <w:r>
+              <w:t xml:space="preserve">0.955</w:t>
+            </w:r>
+          </w:p>
+        </w:tc>
+        <w:tc>
+          <w:p>
+            <w:pPr>
+              <w:pStyle w:val="Compact"/>
+              <w:jc w:val="left"/>
+            </w:pPr>
+            <w:r>
+              <w:t xml:space="preserve">1.0</w:t>
+            </w:r>
+          </w:p>
+        </w:tc>
+        <w:tc>
+          <w:p>
+            <w:pPr>
+              <w:pStyle w:val="Compact"/>
+              <w:jc w:val="left"/>
+            </w:pPr>
+            <w:r>
+              <w:t xml:space="preserve">0.955</w:t>
+            </w:r>
+          </w:p>
+        </w:tc>
+        <w:tc>
+          <w:p>
+            <w:pPr>
+              <w:pStyle w:val="Compact"/>
+              <w:jc w:val="left"/>
+            </w:pPr>
+            <w:r>
+              <w:t xml:space="preserve">1.0</w:t>
+            </w:r>
+          </w:p>
+        </w:tc>
+        <w:tc>
+          <w:p>
+            <w:pPr>
+              <w:pStyle w:val="Compact"/>
+              <w:jc w:val="left"/>
+            </w:pPr>
+            <w:r>
+              <w:t xml:space="preserve">0.0</w:t>
+            </w:r>
+          </w:p>
+        </w:tc>
+        <w:tc>
+          <w:p>
+            <w:pPr>
+              <w:pStyle w:val="Compact"/>
+              <w:jc w:val="left"/>
+            </w:pPr>
+            <w:r>
+              <w:t xml:space="preserve">0</w:t>
+            </w:r>
+          </w:p>
+        </w:tc>
+        <w:tc>
+          <w:p>
+            <w:pPr>
+              <w:pStyle w:val="Compact"/>
+              <w:jc w:val="left"/>
+            </w:pPr>
+            <w:r>
+              <w:t xml:space="preserve">1/22</w:t>
+            </w:r>
+          </w:p>
+        </w:tc>
+      </w:tr>
+      <w:tr>
+        <w:tc>
+          <w:p>
+            <w:pPr>
+              <w:pStyle w:val="Compact"/>
+              <w:jc w:val="left"/>
+            </w:pPr>
+            <w:r>
+              <w:t xml:space="preserve">10</w:t>
+            </w:r>
+          </w:p>
+        </w:tc>
+        <w:tc>
+          <w:p>
+            <w:pPr>
+              <w:pStyle w:val="Compact"/>
+              <w:jc w:val="left"/>
+            </w:pPr>
+            <w:r>
+              <w:t xml:space="preserve">v1.3 replay (40)</w:t>
+            </w:r>
+          </w:p>
+        </w:tc>
+        <w:tc>
+          <w:p>
+            <w:pPr>
+              <w:pStyle w:val="Compact"/>
+              <w:jc w:val="left"/>
+            </w:pPr>
+            <w:r>
+              <w:t xml:space="preserve">judge-v4</w:t>
+            </w:r>
+          </w:p>
+        </w:tc>
+        <w:tc>
+          <w:p>
+            <w:pPr>
+              <w:pStyle w:val="Compact"/>
+              <w:jc w:val="left"/>
+            </w:pPr>
+            <w:r>
+              <w:rPr>
+                <w:b/>
+              </w:rPr>
+              <w:t xml:space="preserve">1.0</w:t>
+            </w:r>
+          </w:p>
+        </w:tc>
+        <w:tc>
+          <w:p>
+            <w:pPr>
+              <w:pStyle w:val="Compact"/>
+              <w:jc w:val="left"/>
+            </w:pPr>
+            <w:r>
+              <w:t xml:space="preserve">0.955</w:t>
+            </w:r>
+          </w:p>
+        </w:tc>
+        <w:tc>
+          <w:p>
+            <w:pPr>
+              <w:pStyle w:val="Compact"/>
+              <w:jc w:val="left"/>
+            </w:pPr>
+            <w:r>
+              <w:t xml:space="preserve">1.0</w:t>
+            </w:r>
+          </w:p>
+        </w:tc>
+        <w:tc>
+          <w:p>
+            <w:pPr>
+              <w:pStyle w:val="Compact"/>
+              <w:jc w:val="left"/>
+            </w:pPr>
+            <w:r>
+              <w:t xml:space="preserve">0.952</w:t>
+            </w:r>
+          </w:p>
+        </w:tc>
+        <w:tc>
+          <w:p>
+            <w:pPr>
+              <w:pStyle w:val="Compact"/>
+              <w:jc w:val="left"/>
+            </w:pPr>
+            <w:r>
+              <w:t xml:space="preserve">1.0</w:t>
+            </w:r>
+          </w:p>
+        </w:tc>
+        <w:tc>
+          <w:p>
+            <w:pPr>
+              <w:pStyle w:val="Compact"/>
+              <w:jc w:val="left"/>
+            </w:pPr>
+            <w:r>
+              <w:t xml:space="preserve">0.0</w:t>
+            </w:r>
+          </w:p>
+        </w:tc>
+        <w:tc>
+          <w:p>
+            <w:pPr>
+              <w:pStyle w:val="Compact"/>
+              <w:jc w:val="left"/>
+            </w:pPr>
+            <w:r>
+              <w:t xml:space="preserve">0</w:t>
+            </w:r>
+          </w:p>
+        </w:tc>
+        <w:tc>
+          <w:p>
+            <w:pPr>
+              <w:pStyle w:val="Compact"/>
+              <w:jc w:val="left"/>
+            </w:pPr>
+            <w:r>
+              <w:t xml:space="preserve">1/21</w:t>
+            </w:r>
+          </w:p>
+        </w:tc>
+      </w:tr>
+      <w:tr>
+        <w:tc>
+          <w:p>
+            <w:pPr>
+              <w:pStyle w:val="Compact"/>
+              <w:jc w:val="left"/>
+            </w:pPr>
+            <w:r>
+              <w:t xml:space="preserve">11</w:t>
+            </w:r>
+          </w:p>
+        </w:tc>
+        <w:tc>
+          <w:p>
+            <w:pPr>
+              <w:pStyle w:val="Compact"/>
+              <w:jc w:val="left"/>
+            </w:pPr>
+            <w:r>
+              <w:t xml:space="preserve">v1.4 cite (40)</w:t>
+            </w:r>
+          </w:p>
+        </w:tc>
+        <w:tc>
+          <w:p>
+            <w:pPr>
+              <w:pStyle w:val="Compact"/>
+              <w:jc w:val="left"/>
+            </w:pPr>
+            <w:r>
+              <w:t xml:space="preserve">judge-v5</w:t>
+            </w:r>
+          </w:p>
+        </w:tc>
+        <w:tc>
+          <w:p>
+            <w:pPr>
+              <w:pStyle w:val="Compact"/>
+              <w:jc w:val="left"/>
+            </w:pPr>
+            <w:r>
+              <w:rPr>
+                <w:b/>
+              </w:rPr>
+              <w:t xml:space="preserve">1.0</w:t>
+            </w:r>
+          </w:p>
+        </w:tc>
+        <w:tc>
+          <w:p>
+            <w:pPr>
+              <w:pStyle w:val="Compact"/>
+              <w:jc w:val="left"/>
+            </w:pPr>
+            <w:r>
+              <w:t xml:space="preserve">0.955</w:t>
+            </w:r>
+          </w:p>
+        </w:tc>
+        <w:tc>
+          <w:p>
+            <w:pPr>
+              <w:pStyle w:val="Compact"/>
+              <w:jc w:val="left"/>
+            </w:pPr>
+            <w:r>
+              <w:t xml:space="preserve">1.0</w:t>
+            </w:r>
+          </w:p>
+        </w:tc>
+        <w:tc>
+          <w:p>
+            <w:pPr>
+              <w:pStyle w:val="Compact"/>
+              <w:jc w:val="left"/>
+            </w:pPr>
+            <w:r>
+              <w:t xml:space="preserve">0.952</w:t>
+            </w:r>
+          </w:p>
+        </w:tc>
+        <w:tc>
+          <w:p>
+            <w:pPr>
+              <w:pStyle w:val="Compact"/>
+              <w:jc w:val="left"/>
+            </w:pPr>
+            <w:r>
+              <w:t xml:space="preserve">1.0</w:t>
+            </w:r>
+          </w:p>
+        </w:tc>
+        <w:tc>
+          <w:p>
+            <w:pPr>
+              <w:pStyle w:val="Compact"/>
+              <w:jc w:val="left"/>
+            </w:pPr>
+            <w:r>
+              <w:t xml:space="preserve">0.0</w:t>
+            </w:r>
+          </w:p>
+        </w:tc>
+        <w:tc>
+          <w:p>
+            <w:pPr>
+              <w:pStyle w:val="Compact"/>
+              <w:jc w:val="left"/>
+            </w:pPr>
+            <w:r>
+              <w:t xml:space="preserve">0</w:t>
+            </w:r>
+          </w:p>
+        </w:tc>
+        <w:tc>
+          <w:p>
+            <w:pPr>
+              <w:pStyle w:val="Compact"/>
+              <w:jc w:val="left"/>
+            </w:pPr>
+            <w:r>
+              <w:rPr>
+                <w:b/>
+              </w:rPr>
+              <w:t xml:space="preserve">0/21</w:t>
+            </w:r>
+          </w:p>
+        </w:tc>
+      </w:tr>
+    </w:tbl>
+    <w:p>
+      <w:pPr>
+        <w:pStyle w:val="BodyText"/>
+      </w:pPr>
+      <w:r>
+        <w:t xml:space="preserve">Column notes: Pass = verdict</w:t>
+      </w:r>
+      <w:r>
+        <w:t xml:space="preserve"> </w:t>
+      </w:r>
+      <w:r>
+        <w:rPr>
+          <w:rStyle w:val="VerbatimChar"/>
+        </w:rPr>
+        <w:t xml:space="preserve">correct</w:t>
+      </w:r>
+      <w:r>
+        <w:t xml:space="preserve"> </w:t>
+      </w:r>
+      <w:r>
+        <w:t xml:space="preserve">or appropriate</w:t>
+      </w:r>
+      <w:r>
+        <w:t xml:space="preserve"> </w:t>
+      </w:r>
+      <w:r>
+        <w:rPr>
+          <w:rStyle w:val="VerbatimChar"/>
+        </w:rPr>
+        <w:t xml:space="preserve">honest_abstention</w:t>
+      </w:r>
+      <w:r>
+        <w:t xml:space="preserve">;</w:t>
+      </w:r>
+      <w:r>
+        <w:t xml:space="preserve"> </w:t>
+      </w:r>
+      <w:r>
+        <w:t xml:space="preserve">Recall/Prec. = search decision vs</w:t>
+      </w:r>
+      <w:r>
+        <w:t xml:space="preserve"> </w:t>
+      </w:r>
+      <w:r>
+        <w:rPr>
+          <w:rStyle w:val="VerbatimChar"/>
+        </w:rPr>
+        <w:t xml:space="preserve">expect_search</w:t>
+      </w:r>
+      <w:r>
+        <w:t xml:space="preserve"> </w:t>
+      </w:r>
+      <w:r>
+        <w:t xml:space="preserve">(optional cases</w:t>
+      </w:r>
+      <w:r>
+        <w:t xml:space="preserve"> </w:t>
+      </w:r>
+      <w:r>
+        <w:t xml:space="preserve">excluded); Evid. suff. and Right art. over searched cases (run 3’s dips</w:t>
+      </w:r>
+      <w:r>
+        <w:t xml:space="preserve"> </w:t>
+      </w:r>
+      <w:r>
+        <w:t xml:space="preserve">are the 429 outage; runs 7-11 include the by-design dead-end case mh-08,</w:t>
+      </w:r>
+      <w:r>
+        <w:t xml:space="preserve"> </w:t>
+      </w:r>
+      <w:r>
+        <w:t xml:space="preserve">which caps sufficiency at 0.95); Unfaithful = count of searched answers</w:t>
+      </w:r>
+      <w:r>
+        <w:t xml:space="preserve"> </w:t>
+      </w:r>
+      <w:r>
+        <w:t xml:space="preserve">whose key claim exceeded the evidence; Side claims = searched answers with</w:t>
+      </w:r>
+      <w:r>
+        <w:t xml:space="preserve"> </w:t>
+      </w:r>
+      <w:r>
+        <w:t xml:space="preserve">unsupported side details (judge-v4+ only). Run 11 additionally scored</w:t>
+      </w:r>
+      <w:r>
+        <w:t xml:space="preserve"> </w:t>
+      </w:r>
+      <w:r>
+        <w:t xml:space="preserve">citation coverage 1.0 with zero invented or misattributed citations.</w:t>
+      </w:r>
+    </w:p>
+    <w:p>
+      <w:pPr>
+        <w:pStyle w:val="Heading3"/>
+      </w:pPr>
+      <w:bookmarkStart w:id="35" w:name="Xb646fb9ba38cf59dc76c35ede84982a1aea8b99"/>
+      <w:r>
+        <w:t xml:space="preserve">Table A2: Prompt / tool / judge change per run</w:t>
+      </w:r>
+      <w:bookmarkEnd w:id="35"/>
+    </w:p>
+    <w:tbl>
+      <w:tblPr>
+        <w:tblStyle w:val="Table"/>
+        <w:tblW w:type="pct" w:w="5000.0"/>
+        <w:tblLook w:firstRow="1"/>
+      </w:tblPr>
+      <w:tblGrid>
+        <w:gridCol w:w="1980"/>
+        <w:gridCol w:w="1980"/>
+        <w:gridCol w:w="1980"/>
+        <w:gridCol w:w="1980"/>
+      </w:tblGrid>
+      <w:tr>
+        <w:trPr>
+          <w:cnfStyle w:firstRow="1"/>
+        </w:trPr>
         <w:tc>
           <w:tcPr>
             <w:tcBorders>
@@ -4516,7 +6019,58 @@
               <w:jc w:val="left"/>
             </w:pPr>
             <w:r>
-              <w:t xml:space="preserve">Prompt / tool / judge change in this iteration</w:t>
+              <w:t xml:space="preserve">Run</w:t>
+            </w:r>
+          </w:p>
+        </w:tc>
+        <w:tc>
+          <w:tcPr>
+            <w:tcBorders>
+              <w:bottom w:val="single"/>
+            </w:tcBorders>
+            <w:vAlign w:val="bottom"/>
+          </w:tcPr>
+          <w:p>
+            <w:pPr>
+              <w:pStyle w:val="Compact"/>
+              <w:jc w:val="left"/>
+            </w:pPr>
+            <w:r>
+              <w:t xml:space="preserve">Prompt change</w:t>
+            </w:r>
+          </w:p>
+        </w:tc>
+        <w:tc>
+          <w:tcPr>
+            <w:tcBorders>
+              <w:bottom w:val="single"/>
+            </w:tcBorders>
+            <w:vAlign w:val="bottom"/>
+          </w:tcPr>
+          <w:p>
+            <w:pPr>
+              <w:pStyle w:val="Compact"/>
+              <w:jc w:val="left"/>
+            </w:pPr>
+            <w:r>
+              <w:t xml:space="preserve">Tool change</w:t>
+            </w:r>
+          </w:p>
+        </w:tc>
+        <w:tc>
+          <w:tcPr>
+            <w:tcBorders>
+              <w:bottom w:val="single"/>
+            </w:tcBorders>
+            <w:vAlign w:val="bottom"/>
+          </w:tcPr>
+          <w:p>
+            <w:pPr>
+              <w:pStyle w:val="Compact"/>
+              <w:jc w:val="left"/>
+            </w:pPr>
+            <w:r>
+              <w:t xml:space="preserve">Judge / suite change</w:t>
             </w:r>
           </w:p>
         </w:tc>
@@ -4540,51 +6094,19 @@
               <w:jc w:val="left"/>
             </w:pPr>
             <w:r>
-              <w:t xml:space="preserve">v0 (32)</w:t>
-            </w:r>
-          </w:p>
-        </w:tc>
-        <w:tc>
-          <w:p>
-            <w:pPr>
-              <w:pStyle w:val="Compact"/>
-              <w:jc w:val="left"/>
-            </w:pPr>
-            <w:r>
-              <w:t xml:space="preserve">pre-rubric</w:t>
-            </w:r>
-          </w:p>
-        </w:tc>
-        <w:tc>
-          <w:p>
-            <w:pPr>
-              <w:pStyle w:val="Compact"/>
-              <w:jc w:val="left"/>
-            </w:pPr>
-            <w:r>
-              <w:t xml:space="preserve">0.938</w:t>
-            </w:r>
-          </w:p>
-        </w:tc>
-        <w:tc>
-          <w:p>
-            <w:pPr>
-              <w:pStyle w:val="Compact"/>
-              <w:jc w:val="left"/>
-            </w:pPr>
-            <w:r>
-              <w:t xml:space="preserve">0.333</w:t>
-            </w:r>
-          </w:p>
-        </w:tc>
-        <w:tc>
-          <w:p>
-            <w:pPr>
-              <w:pStyle w:val="Compact"/>
-              <w:jc w:val="left"/>
-            </w:pPr>
-            <w:r>
-              <w:t xml:space="preserve">1.0</w:t>
+              <w:t xml:space="preserve">v0 baseline: minimal</w:t>
+            </w:r>
+            <w:r>
+              <w:t xml:space="preserve"> </w:t>
+            </w:r>
+            <w:r>
+              <w:t xml:space="preserve">“</w:t>
+            </w:r>
+            <w:r>
+              <w:t xml:space="preserve">search when you’re not certain</w:t>
+            </w:r>
+            <w:r>
+              <w:t xml:space="preserve">”</w:t>
             </w:r>
           </w:p>
         </w:tc>
@@ -4606,69 +6128,7 @@
               <w:jc w:val="left"/>
             </w:pPr>
             <w:r>
-              <w:t xml:space="preserve">-</w:t>
-            </w:r>
-          </w:p>
-        </w:tc>
-        <w:tc>
-          <w:p>
-            <w:pPr>
-              <w:pStyle w:val="Compact"/>
-              <w:jc w:val="left"/>
-            </w:pPr>
-            <w:r>
-              <w:t xml:space="preserve">0.0</w:t>
-            </w:r>
-          </w:p>
-        </w:tc>
-        <w:tc>
-          <w:p>
-            <w:pPr>
-              <w:pStyle w:val="Compact"/>
-              <w:jc w:val="left"/>
-            </w:pPr>
-            <w:r>
-              <w:t xml:space="preserve">-</w:t>
-            </w:r>
-          </w:p>
-        </w:tc>
-        <w:tc>
-          <w:p>
-            <w:pPr>
-              <w:pStyle w:val="Compact"/>
-              <w:jc w:val="left"/>
-            </w:pPr>
-            <w:r>
-              <w:t xml:space="preserve">-</w:t>
-            </w:r>
-          </w:p>
-        </w:tc>
-        <w:tc>
-          <w:p>
-            <w:pPr>
-              <w:pStyle w:val="Compact"/>
-              <w:jc w:val="left"/>
-            </w:pPr>
-            <w:r>
-              <w:t xml:space="preserve">Baseline: minimal</w:t>
-            </w:r>
-            <w:r>
-              <w:t xml:space="preserve"> </w:t>
-            </w:r>
-            <w:r>
-              <w:t xml:space="preserve">“</w:t>
-            </w:r>
-            <w:r>
-              <w:t xml:space="preserve">search when you’re not certain</w:t>
-            </w:r>
-            <w:r>
-              <w:t xml:space="preserve">”</w:t>
-            </w:r>
-            <w:r>
-              <w:t xml:space="preserve"> </w:t>
-            </w:r>
-            <w:r>
-              <w:t xml:space="preserve">prompt</w:t>
+              <w:t xml:space="preserve">Minimal pre-rubric judge</w:t>
             </w:r>
           </w:p>
         </w:tc>
@@ -4692,105 +6152,6 @@
               <w:jc w:val="left"/>
             </w:pPr>
             <w:r>
-              <w:t xml:space="preserve">v0 (32)</w:t>
-            </w:r>
-          </w:p>
-        </w:tc>
-        <w:tc>
-          <w:p>
-            <w:pPr>
-              <w:pStyle w:val="Compact"/>
-              <w:jc w:val="left"/>
-            </w:pPr>
-            <w:r>
-              <w:t xml:space="preserve">judge-v1</w:t>
-            </w:r>
-          </w:p>
-        </w:tc>
-        <w:tc>
-          <w:p>
-            <w:pPr>
-              <w:pStyle w:val="Compact"/>
-              <w:jc w:val="left"/>
-            </w:pPr>
-            <w:r>
-              <w:t xml:space="preserve">0.969</w:t>
-            </w:r>
-          </w:p>
-        </w:tc>
-        <w:tc>
-          <w:p>
-            <w:pPr>
-              <w:pStyle w:val="Compact"/>
-              <w:jc w:val="left"/>
-            </w:pPr>
-            <w:r>
-              <w:t xml:space="preserve">0.333</w:t>
-            </w:r>
-          </w:p>
-        </w:tc>
-        <w:tc>
-          <w:p>
-            <w:pPr>
-              <w:pStyle w:val="Compact"/>
-              <w:jc w:val="left"/>
-            </w:pPr>
-            <w:r>
-              <w:t xml:space="preserve">1.0</w:t>
-            </w:r>
-          </w:p>
-        </w:tc>
-        <w:tc>
-          <w:p>
-            <w:pPr>
-              <w:pStyle w:val="Compact"/>
-              <w:jc w:val="left"/>
-            </w:pPr>
-            <w:r>
-              <w:t xml:space="preserve">0.80</w:t>
-            </w:r>
-          </w:p>
-        </w:tc>
-        <w:tc>
-          <w:p>
-            <w:pPr>
-              <w:pStyle w:val="Compact"/>
-              <w:jc w:val="left"/>
-            </w:pPr>
-            <w:r>
-              <w:t xml:space="preserve">1.0</w:t>
-            </w:r>
-          </w:p>
-        </w:tc>
-        <w:tc>
-          <w:p>
-            <w:pPr>
-              <w:pStyle w:val="Compact"/>
-              <w:jc w:val="left"/>
-            </w:pPr>
-            <w:r>
-              <w:t xml:space="preserve">0.0</w:t>
-            </w:r>
-          </w:p>
-        </w:tc>
-        <w:tc>
-          <w:p>
-            <w:pPr>
-              <w:pStyle w:val="Compact"/>
-              <w:jc w:val="left"/>
-            </w:pPr>
-            <w:r>
-              <w:t xml:space="preserve">1</w:t>
-            </w:r>
-          </w:p>
-        </w:tc>
-        <w:tc>
-          <w:p>
-            <w:pPr>
-              <w:pStyle w:val="Compact"/>
-              <w:jc w:val="left"/>
-            </w:pPr>
-            <w:r>
               <w:t xml:space="preserve">-</w:t>
             </w:r>
           </w:p>
@@ -4802,7 +6163,18 @@
               <w:jc w:val="left"/>
             </w:pPr>
             <w:r>
-              <w:t xml:space="preserve">Judge upgraded to rubric judge (4 fields, per-notch examples); prompt unchanged</w:t>
+              <w:t xml:space="preserve">-</w:t>
+            </w:r>
+          </w:p>
+        </w:tc>
+        <w:tc>
+          <w:p>
+            <w:pPr>
+              <w:pStyle w:val="Compact"/>
+              <w:jc w:val="left"/>
+            </w:pPr>
+            <w:r>
+              <w:t xml:space="preserve">Rubric judge (judge-v1): 4 fields, per-notch examples, authoritative case notes</w:t>
             </w:r>
           </w:p>
         </w:tc>
@@ -4826,95 +6198,7 @@
               <w:jc w:val="left"/>
             </w:pPr>
             <w:r>
-              <w:t xml:space="preserve">v1 (32)</w:t>
-            </w:r>
-          </w:p>
-        </w:tc>
-        <w:tc>
-          <w:p>
-            <w:pPr>
-              <w:pStyle w:val="Compact"/>
-              <w:jc w:val="left"/>
-            </w:pPr>
-            <w:r>
-              <w:t xml:space="preserve">judge-v1</w:t>
-            </w:r>
-          </w:p>
-        </w:tc>
-        <w:tc>
-          <w:p>
-            <w:pPr>
-              <w:pStyle w:val="Compact"/>
-              <w:jc w:val="left"/>
-            </w:pPr>
-            <w:r>
-              <w:t xml:space="preserve">0.969</w:t>
-            </w:r>
-          </w:p>
-        </w:tc>
-        <w:tc>
-          <w:p>
-            <w:pPr>
-              <w:pStyle w:val="Compact"/>
-              <w:jc w:val="left"/>
-            </w:pPr>
-            <w:r>
-              <w:t xml:space="preserve">0.933</w:t>
-            </w:r>
-          </w:p>
-        </w:tc>
-        <w:tc>
-          <w:p>
-            <w:pPr>
-              <w:pStyle w:val="Compact"/>
-              <w:jc w:val="left"/>
-            </w:pPr>
-            <w:r>
-              <w:t xml:space="preserve">1.0</w:t>
-            </w:r>
-          </w:p>
-        </w:tc>
-        <w:tc>
-          <w:p>
-            <w:pPr>
-              <w:pStyle w:val="Compact"/>
-              <w:jc w:val="left"/>
-            </w:pPr>
-            <w:r>
-              <w:t xml:space="preserve">0.80</w:t>
-            </w:r>
-          </w:p>
-        </w:tc>
-        <w:tc>
-          <w:p>
-            <w:pPr>
-              <w:pStyle w:val="Compact"/>
-              <w:jc w:val="left"/>
-            </w:pPr>
-            <w:r>
-              <w:t xml:space="preserve">0.80</w:t>
-            </w:r>
-          </w:p>
-        </w:tc>
-        <w:tc>
-          <w:p>
-            <w:pPr>
-              <w:pStyle w:val="Compact"/>
-              <w:jc w:val="left"/>
-            </w:pPr>
-            <w:r>
-              <w:t xml:space="preserve">0.517</w:t>
-            </w:r>
-          </w:p>
-        </w:tc>
-        <w:tc>
-          <w:p>
-            <w:pPr>
-              <w:pStyle w:val="Compact"/>
-              <w:jc w:val="left"/>
-            </w:pPr>
-            <w:r>
-              <w:t xml:space="preserve">1</w:t>
+              <w:t xml:space="preserve">v1: fact-kind trigger lists replace confidence; evidence-discipline block</w:t>
             </w:r>
           </w:p>
         </w:tc>
@@ -4936,7 +6220,7 @@
               <w:jc w:val="left"/>
             </w:pPr>
             <w:r>
-              <w:t xml:space="preserve">Prompt: fact-kind trigger lists replace confidence; evidence-discipline block. Run polluted by Wikipedia 429s</w:t>
+              <w:t xml:space="preserve">Run polluted by Wikipedia 429s (52% of tool calls)</w:t>
             </w:r>
           </w:p>
         </w:tc>
@@ -4960,117 +6244,29 @@
               <w:jc w:val="left"/>
             </w:pPr>
             <w:r>
-              <w:t xml:space="preserve">v1.1 (32)</w:t>
-            </w:r>
-          </w:p>
-        </w:tc>
-        <w:tc>
-          <w:p>
-            <w:pPr>
-              <w:pStyle w:val="Compact"/>
-              <w:jc w:val="left"/>
-            </w:pPr>
-            <w:r>
-              <w:t xml:space="preserve">judge-v2</w:t>
-            </w:r>
-          </w:p>
-        </w:tc>
-        <w:tc>
-          <w:p>
-            <w:pPr>
-              <w:pStyle w:val="Compact"/>
-              <w:jc w:val="left"/>
-            </w:pPr>
-            <w:r>
-              <w:t xml:space="preserve">0.969</w:t>
-            </w:r>
-          </w:p>
-        </w:tc>
-        <w:tc>
-          <w:p>
-            <w:pPr>
-              <w:pStyle w:val="Compact"/>
-              <w:jc w:val="left"/>
-            </w:pPr>
-            <w:r>
-              <w:t xml:space="preserve">0.867</w:t>
-            </w:r>
-          </w:p>
-        </w:tc>
-        <w:tc>
-          <w:p>
-            <w:pPr>
-              <w:pStyle w:val="Compact"/>
-              <w:jc w:val="left"/>
-            </w:pPr>
-            <w:r>
-              <w:t xml:space="preserve">1.0</w:t>
-            </w:r>
-          </w:p>
-        </w:tc>
-        <w:tc>
-          <w:p>
-            <w:pPr>
-              <w:pStyle w:val="Compact"/>
-              <w:jc w:val="left"/>
-            </w:pPr>
-            <w:r>
-              <w:t xml:space="preserve">0.846</w:t>
-            </w:r>
-          </w:p>
-        </w:tc>
-        <w:tc>
-          <w:p>
-            <w:pPr>
-              <w:pStyle w:val="Compact"/>
-              <w:jc w:val="left"/>
-            </w:pPr>
-            <w:r>
-              <w:t xml:space="preserve">0.923</w:t>
-            </w:r>
-          </w:p>
-        </w:tc>
-        <w:tc>
-          <w:p>
-            <w:pPr>
-              <w:pStyle w:val="Compact"/>
-              <w:jc w:val="left"/>
-            </w:pPr>
-            <w:r>
-              <w:t xml:space="preserve">0.0</w:t>
-            </w:r>
-          </w:p>
-        </w:tc>
-        <w:tc>
-          <w:p>
-            <w:pPr>
-              <w:pStyle w:val="Compact"/>
-              <w:jc w:val="left"/>
-            </w:pPr>
-            <w:r>
-              <w:t xml:space="preserve">1</w:t>
-            </w:r>
-          </w:p>
-        </w:tc>
-        <w:tc>
-          <w:p>
-            <w:pPr>
-              <w:pStyle w:val="Compact"/>
-              <w:jc w:val="left"/>
-            </w:pPr>
-            <w:r>
-              <w:t xml:space="preserve">-</w:t>
-            </w:r>
-          </w:p>
-        </w:tc>
-        <w:tc>
-          <w:p>
-            <w:pPr>
-              <w:pStyle w:val="Compact"/>
-              <w:jc w:val="left"/>
-            </w:pPr>
-            <w:r>
-              <w:t xml:space="preserve">Prompt: outage-fallback policy. Tool: 429/503 retries + throttle. Judge-v2: labeled-unverified carve-out</w:t>
+              <w:t xml:space="preserve">v1.1: outage-fallback policy</w:t>
+            </w:r>
+          </w:p>
+        </w:tc>
+        <w:tc>
+          <w:p>
+            <w:pPr>
+              <w:pStyle w:val="Compact"/>
+              <w:jc w:val="left"/>
+            </w:pPr>
+            <w:r>
+              <w:t xml:space="preserve">429/503 retries + process-wide throttle</w:t>
+            </w:r>
+          </w:p>
+        </w:tc>
+        <w:tc>
+          <w:p>
+            <w:pPr>
+              <w:pStyle w:val="Compact"/>
+              <w:jc w:val="left"/>
+            </w:pPr>
+            <w:r>
+              <w:t xml:space="preserve">judge-v2: labeled-unverified-under-outage carve-out</w:t>
             </w:r>
           </w:p>
         </w:tc>
@@ -5094,104 +6290,18 @@
               <w:jc w:val="left"/>
             </w:pPr>
             <w:r>
-              <w:t xml:space="preserve">v1.2 (32)</w:t>
-            </w:r>
-          </w:p>
-        </w:tc>
-        <w:tc>
-          <w:p>
-            <w:pPr>
-              <w:pStyle w:val="Compact"/>
-              <w:jc w:val="left"/>
-            </w:pPr>
-            <w:r>
-              <w:t xml:space="preserve">judge-v2</w:t>
-            </w:r>
-          </w:p>
-        </w:tc>
-        <w:tc>
-          <w:p>
-            <w:pPr>
-              <w:pStyle w:val="Compact"/>
-              <w:jc w:val="left"/>
-            </w:pPr>
-            <w:r>
-              <w:rPr>
-                <w:b/>
-              </w:rPr>
-              <w:t xml:space="preserve">1.0</w:t>
-            </w:r>
-          </w:p>
-        </w:tc>
-        <w:tc>
-          <w:p>
-            <w:pPr>
-              <w:pStyle w:val="Compact"/>
-              <w:jc w:val="left"/>
-            </w:pPr>
-            <w:r>
-              <w:t xml:space="preserve">0.867</w:t>
-            </w:r>
-          </w:p>
-        </w:tc>
-        <w:tc>
-          <w:p>
-            <w:pPr>
-              <w:pStyle w:val="Compact"/>
-              <w:jc w:val="left"/>
-            </w:pPr>
-            <w:r>
-              <w:t xml:space="preserve">1.0</w:t>
-            </w:r>
-          </w:p>
-        </w:tc>
-        <w:tc>
-          <w:p>
-            <w:pPr>
-              <w:pStyle w:val="Compact"/>
-              <w:jc w:val="left"/>
-            </w:pPr>
-            <w:r>
-              <w:rPr>
-                <w:b/>
-              </w:rPr>
-              <w:t xml:space="preserve">1.0</w:t>
-            </w:r>
-          </w:p>
-        </w:tc>
-        <w:tc>
-          <w:p>
-            <w:pPr>
-              <w:pStyle w:val="Compact"/>
-              <w:jc w:val="left"/>
-            </w:pPr>
-            <w:r>
-              <w:rPr>
-                <w:b/>
-              </w:rPr>
-              <w:t xml:space="preserve">1.0</w:t>
-            </w:r>
-          </w:p>
-        </w:tc>
-        <w:tc>
-          <w:p>
-            <w:pPr>
-              <w:pStyle w:val="Compact"/>
-              <w:jc w:val="left"/>
-            </w:pPr>
-            <w:r>
-              <w:t xml:space="preserve">0.0</w:t>
-            </w:r>
-          </w:p>
-        </w:tc>
-        <w:tc>
-          <w:p>
-            <w:pPr>
-              <w:pStyle w:val="Compact"/>
-              <w:jc w:val="left"/>
-            </w:pPr>
-            <w:r>
-              <w:t xml:space="preserve">0</w:t>
+              <w:t xml:space="preserve">v1.2: follow alternate titles before answering</w:t>
+            </w:r>
+          </w:p>
+        </w:tc>
+        <w:tc>
+          <w:p>
+            <w:pPr>
+              <w:pStyle w:val="Compact"/>
+              <w:jc w:val="left"/>
+            </w:pPr>
+            <w:r>
+              <w:t xml:space="preserve">Search snippets included (covers table-borne facts)</w:t>
             </w:r>
           </w:p>
         </w:tc>
@@ -5203,17 +6313,6 @@
             </w:pPr>
             <w:r>
               <w:t xml:space="preserve">-</w:t>
-            </w:r>
-          </w:p>
-        </w:tc>
-        <w:tc>
-          <w:p>
-            <w:pPr>
-              <w:pStyle w:val="Compact"/>
-              <w:jc w:val="left"/>
-            </w:pPr>
-            <w:r>
-              <w:t xml:space="preserve">Prompt: follow alternate titles before answering. Tool: search snippets (table-borne facts)</w:t>
             </w:r>
           </w:p>
         </w:tc>
@@ -5237,105 +6336,6 @@
               <w:jc w:val="left"/>
             </w:pPr>
             <w:r>
-              <w:t xml:space="preserve">v1.2 (40)</w:t>
-            </w:r>
-          </w:p>
-        </w:tc>
-        <w:tc>
-          <w:p>
-            <w:pPr>
-              <w:pStyle w:val="Compact"/>
-              <w:jc w:val="left"/>
-            </w:pPr>
-            <w:r>
-              <w:t xml:space="preserve">judge-v2</w:t>
-            </w:r>
-          </w:p>
-        </w:tc>
-        <w:tc>
-          <w:p>
-            <w:pPr>
-              <w:pStyle w:val="Compact"/>
-              <w:jc w:val="left"/>
-            </w:pPr>
-            <w:r>
-              <w:t xml:space="preserve">0.975</w:t>
-            </w:r>
-          </w:p>
-        </w:tc>
-        <w:tc>
-          <w:p>
-            <w:pPr>
-              <w:pStyle w:val="Compact"/>
-              <w:jc w:val="left"/>
-            </w:pPr>
-            <w:r>
-              <w:t xml:space="preserve">0.955</w:t>
-            </w:r>
-          </w:p>
-        </w:tc>
-        <w:tc>
-          <w:p>
-            <w:pPr>
-              <w:pStyle w:val="Compact"/>
-              <w:jc w:val="left"/>
-            </w:pPr>
-            <w:r>
-              <w:t xml:space="preserve">1.0</w:t>
-            </w:r>
-          </w:p>
-        </w:tc>
-        <w:tc>
-          <w:p>
-            <w:pPr>
-              <w:pStyle w:val="Compact"/>
-              <w:jc w:val="left"/>
-            </w:pPr>
-            <w:r>
-              <w:t xml:space="preserve">0.857</w:t>
-            </w:r>
-          </w:p>
-        </w:tc>
-        <w:tc>
-          <w:p>
-            <w:pPr>
-              <w:pStyle w:val="Compact"/>
-              <w:jc w:val="left"/>
-            </w:pPr>
-            <w:r>
-              <w:t xml:space="preserve">1.0</w:t>
-            </w:r>
-          </w:p>
-        </w:tc>
-        <w:tc>
-          <w:p>
-            <w:pPr>
-              <w:pStyle w:val="Compact"/>
-              <w:jc w:val="left"/>
-            </w:pPr>
-            <w:r>
-              <w:t xml:space="preserve">0.0</w:t>
-            </w:r>
-          </w:p>
-        </w:tc>
-        <w:tc>
-          <w:p>
-            <w:pPr>
-              <w:pStyle w:val="Compact"/>
-              <w:jc w:val="left"/>
-            </w:pPr>
-            <w:r>
-              <w:t xml:space="preserve">1</w:t>
-            </w:r>
-          </w:p>
-        </w:tc>
-        <w:tc>
-          <w:p>
-            <w:pPr>
-              <w:pStyle w:val="Compact"/>
-              <w:jc w:val="left"/>
-            </w:pPr>
-            <w:r>
               <w:t xml:space="preserve">-</w:t>
             </w:r>
           </w:p>
@@ -5347,7 +6347,18 @@
               <w:jc w:val="left"/>
             </w:pPr>
             <w:r>
-              <w:t xml:space="preserve">No config change: 8 multi-hop cases added to the suite</w:t>
+              <w:t xml:space="preserve">-</w:t>
+            </w:r>
+          </w:p>
+        </w:tc>
+        <w:tc>
+          <w:p>
+            <w:pPr>
+              <w:pStyle w:val="Compact"/>
+              <w:jc w:val="left"/>
+            </w:pPr>
+            <w:r>
+              <w:t xml:space="preserve">Suite: 8 multi-hop cases added (n=32 to 40)</w:t>
             </w:r>
           </w:p>
         </w:tc>
@@ -5371,95 +6382,18 @@
               <w:jc w:val="left"/>
             </w:pPr>
             <w:r>
-              <w:t xml:space="preserve">v1.3 (40)</w:t>
-            </w:r>
-          </w:p>
-        </w:tc>
-        <w:tc>
-          <w:p>
-            <w:pPr>
-              <w:pStyle w:val="Compact"/>
-              <w:jc w:val="left"/>
-            </w:pPr>
-            <w:r>
-              <w:t xml:space="preserve">judge-v2</w:t>
-            </w:r>
-          </w:p>
-        </w:tc>
-        <w:tc>
-          <w:p>
-            <w:pPr>
-              <w:pStyle w:val="Compact"/>
-              <w:jc w:val="left"/>
-            </w:pPr>
-            <w:r>
-              <w:t xml:space="preserve">0.975</w:t>
-            </w:r>
-          </w:p>
-        </w:tc>
-        <w:tc>
-          <w:p>
-            <w:pPr>
-              <w:pStyle w:val="Compact"/>
-              <w:jc w:val="left"/>
-            </w:pPr>
-            <w:r>
-              <w:t xml:space="preserve">0.955</w:t>
-            </w:r>
-          </w:p>
-        </w:tc>
-        <w:tc>
-          <w:p>
-            <w:pPr>
-              <w:pStyle w:val="Compact"/>
-              <w:jc w:val="left"/>
-            </w:pPr>
-            <w:r>
-              <w:t xml:space="preserve">1.0</w:t>
-            </w:r>
-          </w:p>
-        </w:tc>
-        <w:tc>
-          <w:p>
-            <w:pPr>
-              <w:pStyle w:val="Compact"/>
-              <w:jc w:val="left"/>
-            </w:pPr>
-            <w:r>
-              <w:t xml:space="preserve">0.955</w:t>
-            </w:r>
-          </w:p>
-        </w:tc>
-        <w:tc>
-          <w:p>
-            <w:pPr>
-              <w:pStyle w:val="Compact"/>
-              <w:jc w:val="left"/>
-            </w:pPr>
-            <w:r>
-              <w:t xml:space="preserve">1.0</w:t>
-            </w:r>
-          </w:p>
-        </w:tc>
-        <w:tc>
-          <w:p>
-            <w:pPr>
-              <w:pStyle w:val="Compact"/>
-              <w:jc w:val="left"/>
-            </w:pPr>
-            <w:r>
-              <w:t xml:space="preserve">0.0</w:t>
-            </w:r>
-          </w:p>
-        </w:tc>
-        <w:tc>
-          <w:p>
-            <w:pPr>
-              <w:pStyle w:val="Compact"/>
-              <w:jc w:val="left"/>
-            </w:pPr>
-            <w:r>
-              <w:t xml:space="preserve">0</w:t>
+              <w:t xml:space="preserve">v1.3: per-hop chain verification</w:t>
+            </w:r>
+          </w:p>
+        </w:tc>
+        <w:tc>
+          <w:p>
+            <w:pPr>
+              <w:pStyle w:val="Compact"/>
+              <w:jc w:val="left"/>
+            </w:pPr>
+            <w:r>
+              <w:t xml:space="preserve">Infobox extraction from wikitext</w:t>
             </w:r>
           </w:p>
         </w:tc>
@@ -5471,17 +6405,6 @@
             </w:pPr>
             <w:r>
               <w:t xml:space="preserve">-</w:t>
-            </w:r>
-          </w:p>
-        </w:tc>
-        <w:tc>
-          <w:p>
-            <w:pPr>
-              <w:pStyle w:val="Compact"/>
-              <w:jc w:val="left"/>
-            </w:pPr>
-            <w:r>
-              <w:t xml:space="preserve">Prompt: per-hop chain verification. Tool: infobox extraction</w:t>
             </w:r>
           </w:p>
         </w:tc>
@@ -5505,108 +6428,6 @@
               <w:jc w:val="left"/>
             </w:pPr>
             <w:r>
-              <w:t xml:space="preserve">v1.3 (40)</w:t>
-            </w:r>
-          </w:p>
-        </w:tc>
-        <w:tc>
-          <w:p>
-            <w:pPr>
-              <w:pStyle w:val="Compact"/>
-              <w:jc w:val="left"/>
-            </w:pPr>
-            <w:r>
-              <w:t xml:space="preserve">judge-v2</w:t>
-            </w:r>
-          </w:p>
-        </w:tc>
-        <w:tc>
-          <w:p>
-            <w:pPr>
-              <w:pStyle w:val="Compact"/>
-              <w:jc w:val="left"/>
-            </w:pPr>
-            <w:r>
-              <w:rPr>
-                <w:b/>
-              </w:rPr>
-              <w:t xml:space="preserve">1.0</w:t>
-            </w:r>
-          </w:p>
-        </w:tc>
-        <w:tc>
-          <w:p>
-            <w:pPr>
-              <w:pStyle w:val="Compact"/>
-              <w:jc w:val="left"/>
-            </w:pPr>
-            <w:r>
-              <w:t xml:space="preserve">0.955</w:t>
-            </w:r>
-          </w:p>
-        </w:tc>
-        <w:tc>
-          <w:p>
-            <w:pPr>
-              <w:pStyle w:val="Compact"/>
-              <w:jc w:val="left"/>
-            </w:pPr>
-            <w:r>
-              <w:t xml:space="preserve">1.0</w:t>
-            </w:r>
-          </w:p>
-        </w:tc>
-        <w:tc>
-          <w:p>
-            <w:pPr>
-              <w:pStyle w:val="Compact"/>
-              <w:jc w:val="left"/>
-            </w:pPr>
-            <w:r>
-              <w:t xml:space="preserve">0.952</w:t>
-            </w:r>
-          </w:p>
-        </w:tc>
-        <w:tc>
-          <w:p>
-            <w:pPr>
-              <w:pStyle w:val="Compact"/>
-              <w:jc w:val="left"/>
-            </w:pPr>
-            <w:r>
-              <w:t xml:space="preserve">1.0</w:t>
-            </w:r>
-          </w:p>
-        </w:tc>
-        <w:tc>
-          <w:p>
-            <w:pPr>
-              <w:pStyle w:val="Compact"/>
-              <w:jc w:val="left"/>
-            </w:pPr>
-            <w:r>
-              <w:t xml:space="preserve">0.0</w:t>
-            </w:r>
-          </w:p>
-        </w:tc>
-        <w:tc>
-          <w:p>
-            <w:pPr>
-              <w:pStyle w:val="Compact"/>
-              <w:jc w:val="left"/>
-            </w:pPr>
-            <w:r>
-              <w:t xml:space="preserve">0</w:t>
-            </w:r>
-          </w:p>
-        </w:tc>
-        <w:tc>
-          <w:p>
-            <w:pPr>
-              <w:pStyle w:val="Compact"/>
-              <w:jc w:val="left"/>
-            </w:pPr>
-            <w:r>
               <w:t xml:space="preserve">-</w:t>
             </w:r>
           </w:p>
@@ -5618,7 +6439,18 @@
               <w:jc w:val="left"/>
             </w:pPr>
             <w:r>
-              <w:t xml:space="preserve">No config change: confirmation run (after the two disclosed eval-side calibrations)</w:t>
+              <w:t xml:space="preserve">-</w:t>
+            </w:r>
+          </w:p>
+        </w:tc>
+        <w:tc>
+          <w:p>
+            <w:pPr>
+              <w:pStyle w:val="Compact"/>
+              <w:jc w:val="left"/>
+            </w:pPr>
+            <w:r>
+              <w:t xml:space="preserve">Confirmation run; the two disclosed eval-side calibrations applied</w:t>
             </w:r>
           </w:p>
         </w:tc>
@@ -5642,117 +6474,29 @@
               <w:jc w:val="left"/>
             </w:pPr>
             <w:r>
-              <w:t xml:space="preserve">v1.3 replay (40)</w:t>
-            </w:r>
-          </w:p>
-        </w:tc>
-        <w:tc>
-          <w:p>
-            <w:pPr>
-              <w:pStyle w:val="Compact"/>
-              <w:jc w:val="left"/>
-            </w:pPr>
-            <w:r>
-              <w:t xml:space="preserve">judge-v4</w:t>
-            </w:r>
-          </w:p>
-        </w:tc>
-        <w:tc>
-          <w:p>
-            <w:pPr>
-              <w:pStyle w:val="Compact"/>
-              <w:jc w:val="left"/>
-            </w:pPr>
-            <w:r>
-              <w:t xml:space="preserve">0.975</w:t>
-            </w:r>
-          </w:p>
-        </w:tc>
-        <w:tc>
-          <w:p>
-            <w:pPr>
-              <w:pStyle w:val="Compact"/>
-              <w:jc w:val="left"/>
-            </w:pPr>
-            <w:r>
-              <w:t xml:space="preserve">0.955</w:t>
-            </w:r>
-          </w:p>
-        </w:tc>
-        <w:tc>
-          <w:p>
-            <w:pPr>
-              <w:pStyle w:val="Compact"/>
-              <w:jc w:val="left"/>
-            </w:pPr>
-            <w:r>
-              <w:t xml:space="preserve">1.0</w:t>
-            </w:r>
-          </w:p>
-        </w:tc>
-        <w:tc>
-          <w:p>
-            <w:pPr>
-              <w:pStyle w:val="Compact"/>
-              <w:jc w:val="left"/>
-            </w:pPr>
-            <w:r>
-              <w:t xml:space="preserve">0.955</w:t>
-            </w:r>
-          </w:p>
-        </w:tc>
-        <w:tc>
-          <w:p>
-            <w:pPr>
-              <w:pStyle w:val="Compact"/>
-              <w:jc w:val="left"/>
-            </w:pPr>
-            <w:r>
-              <w:t xml:space="preserve">1.0</w:t>
-            </w:r>
-          </w:p>
-        </w:tc>
-        <w:tc>
-          <w:p>
-            <w:pPr>
-              <w:pStyle w:val="Compact"/>
-              <w:jc w:val="left"/>
-            </w:pPr>
-            <w:r>
-              <w:t xml:space="preserve">0.0</w:t>
-            </w:r>
-          </w:p>
-        </w:tc>
-        <w:tc>
-          <w:p>
-            <w:pPr>
-              <w:pStyle w:val="Compact"/>
-              <w:jc w:val="left"/>
-            </w:pPr>
-            <w:r>
-              <w:t xml:space="preserve">0</w:t>
-            </w:r>
-          </w:p>
-        </w:tc>
-        <w:tc>
-          <w:p>
-            <w:pPr>
-              <w:pStyle w:val="Compact"/>
-              <w:jc w:val="left"/>
-            </w:pPr>
-            <w:r>
-              <w:t xml:space="preserve">1/22</w:t>
-            </w:r>
-          </w:p>
-        </w:tc>
-        <w:tc>
-          <w:p>
-            <w:pPr>
-              <w:pStyle w:val="Compact"/>
-              <w:jc w:val="left"/>
-            </w:pPr>
-            <w:r>
-              <w:t xml:space="preserve">Judge-only replay of run 7’s frozen transcripts; judge-v4 adds side-claims rubric</w:t>
+              <w:t xml:space="preserve">-</w:t>
+            </w:r>
+          </w:p>
+        </w:tc>
+        <w:tc>
+          <w:p>
+            <w:pPr>
+              <w:pStyle w:val="Compact"/>
+              <w:jc w:val="left"/>
+            </w:pPr>
+            <w:r>
+              <w:t xml:space="preserve">-</w:t>
+            </w:r>
+          </w:p>
+        </w:tc>
+        <w:tc>
+          <w:p>
+            <w:pPr>
+              <w:pStyle w:val="Compact"/>
+              <w:jc w:val="left"/>
+            </w:pPr>
+            <w:r>
+              <w:t xml:space="preserve">judge-v4: side-claims hallucination rubric; replay of run 7’s frozen transcripts</w:t>
             </w:r>
           </w:p>
         </w:tc>
@@ -5776,120 +6520,29 @@
               <w:jc w:val="left"/>
             </w:pPr>
             <w:r>
-              <w:t xml:space="preserve">v1.3 replay (40)</w:t>
-            </w:r>
-          </w:p>
-        </w:tc>
-        <w:tc>
-          <w:p>
-            <w:pPr>
-              <w:pStyle w:val="Compact"/>
-              <w:jc w:val="left"/>
-            </w:pPr>
-            <w:r>
-              <w:t xml:space="preserve">judge-v4</w:t>
-            </w:r>
-          </w:p>
-        </w:tc>
-        <w:tc>
-          <w:p>
-            <w:pPr>
-              <w:pStyle w:val="Compact"/>
-              <w:jc w:val="left"/>
-            </w:pPr>
-            <w:r>
-              <w:rPr>
-                <w:b/>
-              </w:rPr>
-              <w:t xml:space="preserve">1.0</w:t>
-            </w:r>
-          </w:p>
-        </w:tc>
-        <w:tc>
-          <w:p>
-            <w:pPr>
-              <w:pStyle w:val="Compact"/>
-              <w:jc w:val="left"/>
-            </w:pPr>
-            <w:r>
-              <w:t xml:space="preserve">0.955</w:t>
-            </w:r>
-          </w:p>
-        </w:tc>
-        <w:tc>
-          <w:p>
-            <w:pPr>
-              <w:pStyle w:val="Compact"/>
-              <w:jc w:val="left"/>
-            </w:pPr>
-            <w:r>
-              <w:t xml:space="preserve">1.0</w:t>
-            </w:r>
-          </w:p>
-        </w:tc>
-        <w:tc>
-          <w:p>
-            <w:pPr>
-              <w:pStyle w:val="Compact"/>
-              <w:jc w:val="left"/>
-            </w:pPr>
-            <w:r>
-              <w:t xml:space="preserve">0.952</w:t>
-            </w:r>
-          </w:p>
-        </w:tc>
-        <w:tc>
-          <w:p>
-            <w:pPr>
-              <w:pStyle w:val="Compact"/>
-              <w:jc w:val="left"/>
-            </w:pPr>
-            <w:r>
-              <w:t xml:space="preserve">1.0</w:t>
-            </w:r>
-          </w:p>
-        </w:tc>
-        <w:tc>
-          <w:p>
-            <w:pPr>
-              <w:pStyle w:val="Compact"/>
-              <w:jc w:val="left"/>
-            </w:pPr>
-            <w:r>
-              <w:t xml:space="preserve">0.0</w:t>
-            </w:r>
-          </w:p>
-        </w:tc>
-        <w:tc>
-          <w:p>
-            <w:pPr>
-              <w:pStyle w:val="Compact"/>
-              <w:jc w:val="left"/>
-            </w:pPr>
-            <w:r>
-              <w:t xml:space="preserve">0</w:t>
-            </w:r>
-          </w:p>
-        </w:tc>
-        <w:tc>
-          <w:p>
-            <w:pPr>
-              <w:pStyle w:val="Compact"/>
-              <w:jc w:val="left"/>
-            </w:pPr>
-            <w:r>
-              <w:t xml:space="preserve">1/21</w:t>
-            </w:r>
-          </w:p>
-        </w:tc>
-        <w:tc>
-          <w:p>
-            <w:pPr>
-              <w:pStyle w:val="Compact"/>
-              <w:jc w:val="left"/>
-            </w:pPr>
-            <w:r>
-              <w:t xml:space="preserve">Judge-only replay of run 8’s frozen transcripts</w:t>
+              <w:t xml:space="preserve">-</w:t>
+            </w:r>
+          </w:p>
+        </w:tc>
+        <w:tc>
+          <w:p>
+            <w:pPr>
+              <w:pStyle w:val="Compact"/>
+              <w:jc w:val="left"/>
+            </w:pPr>
+            <w:r>
+              <w:t xml:space="preserve">-</w:t>
+            </w:r>
+          </w:p>
+        </w:tc>
+        <w:tc>
+          <w:p>
+            <w:pPr>
+              <w:pStyle w:val="Compact"/>
+              <w:jc w:val="left"/>
+            </w:pPr>
+            <w:r>
+              <w:t xml:space="preserve">judge-v4 replay of run 8’s frozen transcripts</w:t>
             </w:r>
           </w:p>
         </w:tc>
@@ -5913,123 +6566,29 @@
               <w:jc w:val="left"/>
             </w:pPr>
             <w:r>
-              <w:t xml:space="preserve">v1.4 cite (40)</w:t>
-            </w:r>
-          </w:p>
-        </w:tc>
-        <w:tc>
-          <w:p>
-            <w:pPr>
-              <w:pStyle w:val="Compact"/>
-              <w:jc w:val="left"/>
-            </w:pPr>
-            <w:r>
-              <w:t xml:space="preserve">judge-v5</w:t>
-            </w:r>
-          </w:p>
-        </w:tc>
-        <w:tc>
-          <w:p>
-            <w:pPr>
-              <w:pStyle w:val="Compact"/>
-              <w:jc w:val="left"/>
-            </w:pPr>
-            <w:r>
-              <w:rPr>
-                <w:b/>
-              </w:rPr>
-              <w:t xml:space="preserve">1.0</w:t>
-            </w:r>
-          </w:p>
-        </w:tc>
-        <w:tc>
-          <w:p>
-            <w:pPr>
-              <w:pStyle w:val="Compact"/>
-              <w:jc w:val="left"/>
-            </w:pPr>
-            <w:r>
-              <w:t xml:space="preserve">0.955</w:t>
-            </w:r>
-          </w:p>
-        </w:tc>
-        <w:tc>
-          <w:p>
-            <w:pPr>
-              <w:pStyle w:val="Compact"/>
-              <w:jc w:val="left"/>
-            </w:pPr>
-            <w:r>
-              <w:t xml:space="preserve">1.0</w:t>
-            </w:r>
-          </w:p>
-        </w:tc>
-        <w:tc>
-          <w:p>
-            <w:pPr>
-              <w:pStyle w:val="Compact"/>
-              <w:jc w:val="left"/>
-            </w:pPr>
-            <w:r>
-              <w:t xml:space="preserve">0.952</w:t>
-            </w:r>
-          </w:p>
-        </w:tc>
-        <w:tc>
-          <w:p>
-            <w:pPr>
-              <w:pStyle w:val="Compact"/>
-              <w:jc w:val="left"/>
-            </w:pPr>
-            <w:r>
-              <w:t xml:space="preserve">1.0</w:t>
-            </w:r>
-          </w:p>
-        </w:tc>
-        <w:tc>
-          <w:p>
-            <w:pPr>
-              <w:pStyle w:val="Compact"/>
-              <w:jc w:val="left"/>
-            </w:pPr>
-            <w:r>
-              <w:t xml:space="preserve">0.0</w:t>
-            </w:r>
-          </w:p>
-        </w:tc>
-        <w:tc>
-          <w:p>
-            <w:pPr>
-              <w:pStyle w:val="Compact"/>
-              <w:jc w:val="left"/>
-            </w:pPr>
-            <w:r>
-              <w:t xml:space="preserve">0</w:t>
-            </w:r>
-          </w:p>
-        </w:tc>
-        <w:tc>
-          <w:p>
-            <w:pPr>
-              <w:pStyle w:val="Compact"/>
-              <w:jc w:val="left"/>
-            </w:pPr>
-            <w:r>
-              <w:rPr>
-                <w:b/>
-              </w:rPr>
-              <w:t xml:space="preserve">0/21</w:t>
-            </w:r>
-          </w:p>
-        </w:tc>
-        <w:tc>
-          <w:p>
-            <w:pPr>
-              <w:pStyle w:val="Compact"/>
-              <w:jc w:val="left"/>
-            </w:pPr>
-            <w:r>
-              <w:t xml:space="preserve">Cite mode: citation instructions appended (default prompt unchanged); judge-v5 = v4 + citation rubrics. Citation coverage 1.0, zero invented/misattributed</w:t>
+              <w:t xml:space="preserve">v1.4: citation instructions appended in cite mode (default prompt unchanged)</w:t>
+            </w:r>
+          </w:p>
+        </w:tc>
+        <w:tc>
+          <w:p>
+            <w:pPr>
+              <w:pStyle w:val="Compact"/>
+              <w:jc w:val="left"/>
+            </w:pPr>
+            <w:r>
+              <w:t xml:space="preserve">-</w:t>
+            </w:r>
+          </w:p>
+        </w:tc>
+        <w:tc>
+          <w:p>
+            <w:pPr>
+              <w:pStyle w:val="Compact"/>
+              <w:jc w:val="left"/>
+            </w:pPr>
+            <w:r>
+              <w:t xml:space="preserve">judge-v5 = v4 + citation rubrics; cite-mode baseline + replay</w:t>
             </w:r>
           </w:p>
         </w:tc>
@@ -6040,103 +6599,25 @@
         <w:pStyle w:val="BodyText"/>
       </w:pPr>
       <w:r>
-        <w:t xml:space="preserve">Column notes: Pass = verdict</w:t>
-      </w:r>
-      <w:r>
-        <w:t xml:space="preserve"> </w:t>
-      </w:r>
-      <w:r>
-        <w:rPr>
-          <w:rStyle w:val="VerbatimChar"/>
-        </w:rPr>
-        <w:t xml:space="preserve">correct</w:t>
-      </w:r>
-      <w:r>
-        <w:t xml:space="preserve"> </w:t>
-      </w:r>
-      <w:r>
-        <w:t xml:space="preserve">or appropriate</w:t>
-      </w:r>
-      <w:r>
-        <w:t xml:space="preserve"> </w:t>
-      </w:r>
-      <w:r>
-        <w:rPr>
-          <w:rStyle w:val="VerbatimChar"/>
-        </w:rPr>
-        <w:t xml:space="preserve">honest_abstention</w:t>
-      </w:r>
-      <w:r>
-        <w:t xml:space="preserve">;</w:t>
-      </w:r>
-      <w:r>
-        <w:t xml:space="preserve"> </w:t>
-      </w:r>
-      <w:r>
-        <w:t xml:space="preserve">Recall/Prec. = search decision vs</w:t>
-      </w:r>
-      <w:r>
-        <w:t xml:space="preserve"> </w:t>
-      </w:r>
-      <w:r>
-        <w:rPr>
-          <w:rStyle w:val="VerbatimChar"/>
-        </w:rPr>
-        <w:t xml:space="preserve">expect_search</w:t>
-      </w:r>
-      <w:r>
-        <w:t xml:space="preserve"> </w:t>
-      </w:r>
-      <w:r>
-        <w:t xml:space="preserve">(optional cases</w:t>
-      </w:r>
-      <w:r>
-        <w:t xml:space="preserve"> </w:t>
-      </w:r>
-      <w:r>
-        <w:t xml:space="preserve">excluded); Evid. suff. and Right art. over searched cases (run 3’s dips</w:t>
-      </w:r>
-      <w:r>
-        <w:t xml:space="preserve"> </w:t>
-      </w:r>
-      <w:r>
-        <w:t xml:space="preserve">are the 429 outage; runs 7-11 include the by-design dead-end case mh-08,</w:t>
-      </w:r>
-      <w:r>
-        <w:t xml:space="preserve"> </w:t>
-      </w:r>
-      <w:r>
-        <w:t xml:space="preserve">which caps sufficiency at 0.95); Unfaithful = count of searched answers</w:t>
-      </w:r>
-      <w:r>
-        <w:t xml:space="preserve"> </w:t>
-      </w:r>
-      <w:r>
-        <w:t xml:space="preserve">whose key claim exceeded the evidence; Side claims = searched answers with</w:t>
-      </w:r>
-      <w:r>
-        <w:t xml:space="preserve"> </w:t>
-      </w:r>
-      <w:r>
-        <w:t xml:space="preserve">unsupported side details (judge-v4+ only). Later prompt refinements</w:t>
-      </w:r>
-      <w:r>
-        <w:t xml:space="preserve"> </w:t>
-      </w:r>
-      <w:r>
-        <w:t xml:space="preserve">(v1.5/v1.5.1: claim-level citation placement, one source title per line)</w:t>
-      </w:r>
-      <w:r>
-        <w:t xml:space="preserve"> </w:t>
-      </w:r>
-      <w:r>
-        <w:t xml:space="preserve">shipped after run 11 and changed cite-mode output formatting only; they</w:t>
-      </w:r>
-      <w:r>
-        <w:t xml:space="preserve"> </w:t>
-      </w:r>
-      <w:r>
-        <w:t xml:space="preserve">were verified on the live demo rather than by a full re-run.</w:t>
+        <w:t xml:space="preserve">Later prompt refinements (v1.5/v1.5.1: claim-level citation placement, one</w:t>
+      </w:r>
+      <w:r>
+        <w:t xml:space="preserve"> </w:t>
+      </w:r>
+      <w:r>
+        <w:t xml:space="preserve">source title per line) shipped after run 11 and changed cite-mode output</w:t>
+      </w:r>
+      <w:r>
+        <w:t xml:space="preserve"> </w:t>
+      </w:r>
+      <w:r>
+        <w:t xml:space="preserve">formatting only; they were verified on the live demo rather than by a full</w:t>
+      </w:r>
+      <w:r>
+        <w:t xml:space="preserve"> </w:t>
+      </w:r>
+      <w:r>
+        <w:t xml:space="preserve">re-run.</w:t>
       </w:r>
     </w:p>
     <w:sectPr/>

</xml_diff>